<commit_message>
set up title page
</commit_message>
<xml_diff>
--- a/Documentation/Dokumentācija.docx
+++ b/Documentation/Dokumentācija.docx
@@ -4,6 +4,74 @@
   <w:body>
     <w:p>
       <w:pPr>
+        <w:ind w:firstLine="0"/>
+        <w:jc w:val="center"/>
+      </w:pPr>
+      <w:r>
+        <w:rPr>
+          <w:noProof/>
+        </w:rPr>
+        <w:drawing>
+          <wp:inline distT="0" distB="0" distL="0" distR="0" wp14:anchorId="19E74D89" wp14:editId="5996501E">
+            <wp:extent cx="1343025" cy="485775"/>
+            <wp:effectExtent l="0" t="0" r="9525" b="9525"/>
+            <wp:docPr id="1976030885" name="Attēls 2"/>
+            <wp:cNvGraphicFramePr>
+              <a:graphicFrameLocks xmlns:a="http://schemas.openxmlformats.org/drawingml/2006/main" noChangeAspect="1"/>
+            </wp:cNvGraphicFramePr>
+            <a:graphic xmlns:a="http://schemas.openxmlformats.org/drawingml/2006/main">
+              <a:graphicData uri="http://schemas.openxmlformats.org/drawingml/2006/picture">
+                <pic:pic xmlns:pic="http://schemas.openxmlformats.org/drawingml/2006/picture">
+                  <pic:nvPicPr>
+                    <pic:cNvPr id="1976030885" name="Attēls 2"/>
+                    <pic:cNvPicPr>
+                      <a:picLocks noChangeAspect="1"/>
+                    </pic:cNvPicPr>
+                  </pic:nvPicPr>
+                  <pic:blipFill>
+                    <a:blip r:embed="rId8">
+                      <a:extLst>
+                        <a:ext uri="{28A0092B-C50C-407E-A947-70E740481C1C}">
+                          <a14:useLocalDpi xmlns:a14="http://schemas.microsoft.com/office/drawing/2010/main" val="0"/>
+                        </a:ext>
+                      </a:extLst>
+                    </a:blip>
+                    <a:srcRect/>
+                    <a:stretch>
+                      <a:fillRect/>
+                    </a:stretch>
+                  </pic:blipFill>
+                  <pic:spPr bwMode="auto">
+                    <a:xfrm>
+                      <a:off x="0" y="0"/>
+                      <a:ext cx="1343025" cy="485775"/>
+                    </a:xfrm>
+                    <a:prstGeom prst="rect">
+                      <a:avLst/>
+                    </a:prstGeom>
+                    <a:noFill/>
+                    <a:ln>
+                      <a:noFill/>
+                    </a:ln>
+                  </pic:spPr>
+                </pic:pic>
+              </a:graphicData>
+            </a:graphic>
+          </wp:inline>
+        </w:drawing>
+      </w:r>
+    </w:p>
+    <w:p>
+      <w:pPr>
+        <w:pStyle w:val="Subtitle"/>
+        <w:spacing w:after="3120"/>
+      </w:pPr>
+      <w:r>
+        <w:t>Liepājas Valsts tehnikums</w:t>
+      </w:r>
+    </w:p>
+    <w:p>
+      <w:pPr>
         <w:pStyle w:val="Title"/>
       </w:pPr>
       <w:r>
@@ -13,6 +81,7 @@
     <w:p>
       <w:pPr>
         <w:pStyle w:val="Subtitle"/>
+        <w:spacing w:after="2520"/>
       </w:pPr>
       <w:r>
         <w:t>Kvalifikācijas eksāmena praktiskās daļas dokumentācija</w:t>
@@ -20,15 +89,46 @@
     </w:p>
     <w:p>
       <w:pPr>
-        <w:spacing w:after="160" w:line="259" w:lineRule="auto"/>
-        <w:ind w:firstLine="0"/>
+        <w:pStyle w:val="Subtitle"/>
+        <w:spacing w:after="840"/>
+        <w:jc w:val="right"/>
+      </w:pPr>
+      <w:r>
+        <w:t>Darba autors:</w:t>
+      </w:r>
+      <w:r>
+        <w:br/>
+        <w:t>Leons Pīgoznis, 4PT</w:t>
+      </w:r>
+      <w:r>
+        <w:br/>
+      </w:r>
+      <w:r>
+        <w:br/>
+        <w:t>Darba vadītājs:</w:t>
+      </w:r>
+      <w:r>
+        <w:br/>
+        <w:t>Skolotājs, Kristaps Rāvalds</w:t>
+      </w:r>
+    </w:p>
+    <w:p>
+      <w:pPr>
+        <w:pStyle w:val="Subtitle"/>
+        <w:spacing w:after="1320"/>
         <w:jc w:val="left"/>
-        <w:rPr>
-          <w:rFonts w:eastAsiaTheme="majorEastAsia"/>
-          <w:sz w:val="28"/>
-          <w:szCs w:val="28"/>
-        </w:rPr>
-      </w:pPr>
+      </w:pPr>
+      <w:r>
+        <w:t>Eksāmena datums: 2026. gada 16. jūnijs</w:t>
+      </w:r>
+    </w:p>
+    <w:p>
+      <w:pPr>
+        <w:pStyle w:val="Subtitle"/>
+      </w:pPr>
+      <w:r>
+        <w:t>Liepāja 2026</w:t>
+      </w:r>
       <w:r>
         <w:br w:type="page"/>
       </w:r>
@@ -411,16 +511,19 @@
       <w:pPr>
         <w:pStyle w:val="Heading1"/>
       </w:pPr>
+      <w:proofErr w:type="spellStart"/>
       <w:r>
         <w:lastRenderedPageBreak/>
         <w:t>erwerwerwerewr</w:t>
       </w:r>
+      <w:proofErr w:type="spellEnd"/>
     </w:p>
     <w:p>
       <w:pPr>
         <w:pStyle w:val="Heading2"/>
       </w:pPr>
       <w:bookmarkStart w:id="0" w:name="_Toc225628934"/>
+      <w:proofErr w:type="spellStart"/>
       <w:r>
         <w:t>F</w:t>
       </w:r>
@@ -428,6 +531,7 @@
         <w:t>ffffffffff</w:t>
       </w:r>
       <w:bookmarkEnd w:id="0"/>
+      <w:proofErr w:type="spellEnd"/>
     </w:p>
     <w:p>
       <w:pPr>
@@ -435,6 +539,7 @@
       </w:pPr>
       <w:bookmarkStart w:id="1" w:name="_Toc225628778"/>
       <w:bookmarkStart w:id="2" w:name="_Toc225628935"/>
+      <w:proofErr w:type="spellStart"/>
       <w:r>
         <w:t>D</w:t>
       </w:r>
@@ -443,10 +548,11 @@
       </w:r>
       <w:bookmarkEnd w:id="1"/>
       <w:bookmarkEnd w:id="2"/>
+      <w:proofErr w:type="spellEnd"/>
     </w:p>
     <w:p/>
     <w:sectPr>
-      <w:footerReference w:type="default" r:id="rId8"/>
+      <w:footerReference w:type="default" r:id="rId9"/>
       <w:pgSz w:w="12240" w:h="15840"/>
       <w:pgMar w:top="1134" w:right="1134" w:bottom="1134" w:left="1418" w:header="709" w:footer="709" w:gutter="0"/>
       <w:cols w:space="708"/>
@@ -1693,9 +1799,10 @@
     <w:link w:val="TitleChar"/>
     <w:uiPriority w:val="10"/>
     <w:qFormat/>
-    <w:rsid w:val="002F5CF5"/>
+    <w:rsid w:val="00226E74"/>
     <w:pPr>
-      <w:spacing w:after="80" w:line="240" w:lineRule="auto"/>
+      <w:spacing w:after="80"/>
+      <w:ind w:firstLine="0"/>
       <w:contextualSpacing/>
       <w:jc w:val="center"/>
     </w:pPr>
@@ -1714,7 +1821,7 @@
     <w:basedOn w:val="DefaultParagraphFont"/>
     <w:link w:val="Title"/>
     <w:uiPriority w:val="10"/>
-    <w:rsid w:val="002F5CF5"/>
+    <w:rsid w:val="00226E74"/>
     <w:rPr>
       <w:rFonts w:ascii="Times New Roman" w:eastAsiaTheme="majorEastAsia" w:hAnsi="Times New Roman" w:cs="Times New Roman"/>
       <w:b/>

</xml_diff>

<commit_message>
add second section titles
</commit_message>
<xml_diff>
--- a/Documentation/Dokumentācija.docx
+++ b/Documentation/Dokumentācija.docx
@@ -218,7 +218,7 @@
           <w:r>
             <w:fldChar w:fldCharType="separate"/>
           </w:r>
-          <w:hyperlink w:anchor="_Toc225686052" w:history="1">
+          <w:hyperlink w:anchor="_Toc225687638" w:history="1">
             <w:r>
               <w:rPr>
                 <w:rStyle w:val="Hyperlink"/>
@@ -245,7 +245,7 @@
                 <w:noProof/>
                 <w:webHidden/>
               </w:rPr>
-              <w:instrText xml:space="preserve"> PAGEREF _Toc225686052 \h </w:instrText>
+              <w:instrText xml:space="preserve"> PAGEREF _Toc225687638 \h </w:instrText>
             </w:r>
             <w:r>
               <w:rPr>
@@ -286,7 +286,7 @@
               <w:lang w:eastAsia="lv-LV"/>
             </w:rPr>
           </w:pPr>
-          <w:hyperlink w:anchor="_Toc225686053" w:history="1">
+          <w:hyperlink w:anchor="_Toc225687639" w:history="1">
             <w:r>
               <w:rPr>
                 <w:rStyle w:val="Hyperlink"/>
@@ -329,7 +329,7 @@
                 <w:noProof/>
                 <w:webHidden/>
               </w:rPr>
-              <w:instrText xml:space="preserve"> PAGEREF _Toc225686053 \h </w:instrText>
+              <w:instrText xml:space="preserve"> PAGEREF _Toc225687639 \h </w:instrText>
             </w:r>
             <w:r>
               <w:rPr>
@@ -370,7 +370,7 @@
               <w:lang w:eastAsia="lv-LV"/>
             </w:rPr>
           </w:pPr>
-          <w:hyperlink w:anchor="_Toc225686054" w:history="1">
+          <w:hyperlink w:anchor="_Toc225687640" w:history="1">
             <w:r>
               <w:rPr>
                 <w:rStyle w:val="Hyperlink"/>
@@ -413,7 +413,7 @@
                 <w:noProof/>
                 <w:webHidden/>
               </w:rPr>
-              <w:instrText xml:space="preserve"> PAGEREF _Toc225686054 \h </w:instrText>
+              <w:instrText xml:space="preserve"> PAGEREF _Toc225687640 \h </w:instrText>
             </w:r>
             <w:r>
               <w:rPr>
@@ -454,7 +454,7 @@
               <w:lang w:eastAsia="lv-LV"/>
             </w:rPr>
           </w:pPr>
-          <w:hyperlink w:anchor="_Toc225686055" w:history="1">
+          <w:hyperlink w:anchor="_Toc225687641" w:history="1">
             <w:r>
               <w:rPr>
                 <w:rStyle w:val="Hyperlink"/>
@@ -497,7 +497,7 @@
                 <w:noProof/>
                 <w:webHidden/>
               </w:rPr>
-              <w:instrText xml:space="preserve"> PAGEREF _Toc225686055 \h </w:instrText>
+              <w:instrText xml:space="preserve"> PAGEREF _Toc225687641 \h </w:instrText>
             </w:r>
             <w:r>
               <w:rPr>
@@ -538,7 +538,7 @@
               <w:lang w:eastAsia="lv-LV"/>
             </w:rPr>
           </w:pPr>
-          <w:hyperlink w:anchor="_Toc225686056" w:history="1">
+          <w:hyperlink w:anchor="_Toc225687642" w:history="1">
             <w:r>
               <w:rPr>
                 <w:rStyle w:val="Hyperlink"/>
@@ -581,7 +581,7 @@
                 <w:noProof/>
                 <w:webHidden/>
               </w:rPr>
-              <w:instrText xml:space="preserve"> PAGEREF _Toc225686056 \h </w:instrText>
+              <w:instrText xml:space="preserve"> PAGEREF _Toc225687642 \h </w:instrText>
             </w:r>
             <w:r>
               <w:rPr>
@@ -602,6 +602,174 @@
                 <w:webHidden/>
               </w:rPr>
               <w:t>4</w:t>
+            </w:r>
+            <w:r>
+              <w:rPr>
+                <w:noProof/>
+                <w:webHidden/>
+              </w:rPr>
+              <w:fldChar w:fldCharType="end"/>
+            </w:r>
+          </w:hyperlink>
+        </w:p>
+        <w:p>
+          <w:pPr>
+            <w:pStyle w:val="TOC2"/>
+            <w:rPr>
+              <w:rFonts w:asciiTheme="minorHAnsi" w:eastAsiaTheme="minorEastAsia" w:hAnsiTheme="minorHAnsi" w:cstheme="minorBidi"/>
+              <w:noProof/>
+              <w:kern w:val="2"/>
+              <w:lang w:eastAsia="lv-LV"/>
+            </w:rPr>
+          </w:pPr>
+          <w:hyperlink w:anchor="_Toc225687643" w:history="1">
+            <w:r>
+              <w:rPr>
+                <w:rStyle w:val="Hyperlink"/>
+                <w:noProof/>
+              </w:rPr>
+              <w:t>1.4.</w:t>
+            </w:r>
+            <w:r>
+              <w:rPr>
+                <w:rFonts w:asciiTheme="minorHAnsi" w:eastAsiaTheme="minorEastAsia" w:hAnsiTheme="minorHAnsi" w:cstheme="minorBidi"/>
+                <w:noProof/>
+                <w:kern w:val="2"/>
+                <w:lang w:eastAsia="lv-LV"/>
+              </w:rPr>
+              <w:tab/>
+            </w:r>
+            <w:r>
+              <w:rPr>
+                <w:rStyle w:val="Hyperlink"/>
+                <w:noProof/>
+              </w:rPr>
+              <w:t>Testēšanas formulējums</w:t>
+            </w:r>
+            <w:r>
+              <w:rPr>
+                <w:noProof/>
+                <w:webHidden/>
+              </w:rPr>
+              <w:tab/>
+            </w:r>
+            <w:r>
+              <w:rPr>
+                <w:noProof/>
+                <w:webHidden/>
+              </w:rPr>
+              <w:fldChar w:fldCharType="begin"/>
+            </w:r>
+            <w:r>
+              <w:rPr>
+                <w:noProof/>
+                <w:webHidden/>
+              </w:rPr>
+              <w:instrText xml:space="preserve"> PAGEREF _Toc225687643 \h </w:instrText>
+            </w:r>
+            <w:r>
+              <w:rPr>
+                <w:noProof/>
+                <w:webHidden/>
+              </w:rPr>
+            </w:r>
+            <w:r>
+              <w:rPr>
+                <w:noProof/>
+                <w:webHidden/>
+              </w:rPr>
+              <w:fldChar w:fldCharType="separate"/>
+            </w:r>
+            <w:r>
+              <w:rPr>
+                <w:noProof/>
+                <w:webHidden/>
+              </w:rPr>
+              <w:t>5</w:t>
+            </w:r>
+            <w:r>
+              <w:rPr>
+                <w:noProof/>
+                <w:webHidden/>
+              </w:rPr>
+              <w:fldChar w:fldCharType="end"/>
+            </w:r>
+          </w:hyperlink>
+        </w:p>
+        <w:p>
+          <w:pPr>
+            <w:pStyle w:val="TOC1"/>
+            <w:rPr>
+              <w:rFonts w:asciiTheme="minorHAnsi" w:eastAsiaTheme="minorEastAsia" w:hAnsiTheme="minorHAnsi" w:cstheme="minorBidi"/>
+              <w:noProof/>
+              <w:kern w:val="2"/>
+              <w:lang w:eastAsia="lv-LV"/>
+            </w:rPr>
+          </w:pPr>
+          <w:hyperlink w:anchor="_Toc225687644" w:history="1">
+            <w:r>
+              <w:rPr>
+                <w:rStyle w:val="Hyperlink"/>
+                <w:noProof/>
+              </w:rPr>
+              <w:t>2.</w:t>
+            </w:r>
+            <w:r>
+              <w:rPr>
+                <w:rFonts w:asciiTheme="minorHAnsi" w:eastAsiaTheme="minorEastAsia" w:hAnsiTheme="minorHAnsi" w:cstheme="minorBidi"/>
+                <w:noProof/>
+                <w:kern w:val="2"/>
+                <w:lang w:eastAsia="lv-LV"/>
+              </w:rPr>
+              <w:tab/>
+            </w:r>
+            <w:r>
+              <w:rPr>
+                <w:rStyle w:val="Hyperlink"/>
+                <w:noProof/>
+              </w:rPr>
+              <w:t>Programmatūras prasību specifikācija</w:t>
+            </w:r>
+            <w:r>
+              <w:rPr>
+                <w:noProof/>
+                <w:webHidden/>
+              </w:rPr>
+              <w:tab/>
+            </w:r>
+            <w:r>
+              <w:rPr>
+                <w:noProof/>
+                <w:webHidden/>
+              </w:rPr>
+              <w:fldChar w:fldCharType="begin"/>
+            </w:r>
+            <w:r>
+              <w:rPr>
+                <w:noProof/>
+                <w:webHidden/>
+              </w:rPr>
+              <w:instrText xml:space="preserve"> PAGEREF _Toc225687644 \h </w:instrText>
+            </w:r>
+            <w:r>
+              <w:rPr>
+                <w:noProof/>
+                <w:webHidden/>
+              </w:rPr>
+            </w:r>
+            <w:r>
+              <w:rPr>
+                <w:noProof/>
+                <w:webHidden/>
+              </w:rPr>
+              <w:fldChar w:fldCharType="separate"/>
+            </w:r>
+            <w:r>
+              <w:rPr>
+                <w:noProof/>
+                <w:webHidden/>
+              </w:rPr>
+              <w:t>6</w:t>
             </w:r>
             <w:r>
               <w:rPr>
@@ -654,7 +822,7 @@
           <w:numId w:val="0"/>
         </w:numPr>
       </w:pPr>
-      <w:bookmarkStart w:id="0" w:name="_Toc225686052"/>
+      <w:bookmarkStart w:id="0" w:name="_Toc225687638"/>
       <w:r>
         <w:lastRenderedPageBreak/>
         <w:t>Ievads</w:t>
@@ -772,7 +940,7 @@
       <w:pPr>
         <w:pStyle w:val="Heading1"/>
       </w:pPr>
-      <w:bookmarkStart w:id="1" w:name="_Toc225686053"/>
+      <w:bookmarkStart w:id="1" w:name="_Toc225687639"/>
       <w:r>
         <w:lastRenderedPageBreak/>
         <w:t>Uzdevuma formulējums</w:t>
@@ -783,7 +951,7 @@
       <w:pPr>
         <w:pStyle w:val="Heading2"/>
       </w:pPr>
-      <w:bookmarkStart w:id="2" w:name="_Toc225686054"/>
+      <w:bookmarkStart w:id="2" w:name="_Toc225687640"/>
       <w:r>
         <w:t>Vispārīgais formulējums</w:t>
       </w:r>
@@ -875,7 +1043,7 @@
       <w:pPr>
         <w:pStyle w:val="Heading2"/>
       </w:pPr>
-      <w:bookmarkStart w:id="3" w:name="_Toc225686055"/>
+      <w:bookmarkStart w:id="3" w:name="_Toc225687641"/>
       <w:r>
         <w:t>Projektēšanas formulējums</w:t>
       </w:r>
@@ -919,7 +1087,7 @@
       <w:pPr>
         <w:pStyle w:val="Heading2"/>
       </w:pPr>
-      <w:bookmarkStart w:id="4" w:name="_Toc225686056"/>
+      <w:bookmarkStart w:id="4" w:name="_Toc225687642"/>
       <w:r>
         <w:t>Izstrādes formulējums</w:t>
       </w:r>
@@ -937,10 +1105,12 @@
       <w:pPr>
         <w:pStyle w:val="Heading2"/>
       </w:pPr>
+      <w:bookmarkStart w:id="5" w:name="_Toc225687643"/>
       <w:r>
         <w:lastRenderedPageBreak/>
         <w:t>Testēšanas formulējums</w:t>
       </w:r>
+      <w:bookmarkEnd w:id="5"/>
     </w:p>
     <w:p>
       <w:r>
@@ -972,12 +1142,94 @@
       <w:pPr>
         <w:pStyle w:val="Heading1"/>
       </w:pPr>
+      <w:bookmarkStart w:id="6" w:name="_Toc225687644"/>
       <w:r>
         <w:lastRenderedPageBreak/>
         <w:t>Programmatūras prasību specifikācija</w:t>
       </w:r>
-    </w:p>
-    <w:p/>
+      <w:bookmarkEnd w:id="6"/>
+    </w:p>
+    <w:p>
+      <w:r>
+        <w:t>Šī sadaļa precizēs projekta perspektīvu, tās gala lietotāja rakstura iezīmes, sasniedzamus mērķus, funkcionalitātes, un pārējās prasības, kuras neietekmē paredzētu funkcionalitāti, taču nosaka, piemēram, projekta darbības ierobežojumus un atlasītu programmatūru un rīkus izstrādei.</w:t>
+      </w:r>
+    </w:p>
+    <w:p>
+      <w:pPr>
+        <w:pStyle w:val="Heading2"/>
+      </w:pPr>
+      <w:r>
+        <w:t>Projekta perspektīva</w:t>
+      </w:r>
+    </w:p>
+    <w:p>
+      <w:r>
+        <w:t xml:space="preserve">Šis projekts ir datorspēle, kura pārbauda spēlētāja zināšanas </w:t>
+      </w:r>
+      <w:r>
+        <w:t xml:space="preserve">militārās iemaņās, piemēram, </w:t>
+      </w:r>
+      <w:r>
+        <w:t>topogrāfijā, izdomātā sižetā, kurā spēlētājam ir dots uzdevums atbalstīt tās armijas uzdevumu atgūt sal</w:t>
+      </w:r>
+      <w:r>
+        <w:t>u</w:t>
+      </w:r>
+      <w:r>
+        <w:t>. Salā ir atzīmēti punkti jeb līmeņi, kuriem ir lineārā secībā ir sekmīgi jāieņem līdz pēdējam līmenim, lai pilnīgi atgūtu salu. Katrs līmenis pārbaudīs spēlētāja visas noteiktas prasmes un zināšanas, kā arī taktisko domāšanu.</w:t>
+      </w:r>
+    </w:p>
+    <w:p>
+      <w:pPr>
+        <w:pStyle w:val="Heading2"/>
+      </w:pPr>
+      <w:r>
+        <w:t>Funkcionālās prasības</w:t>
+      </w:r>
+    </w:p>
+    <w:p>
+      <w:pPr>
+        <w:pStyle w:val="Heading3"/>
+      </w:pPr>
+      <w:r>
+        <w:t>Galvenā izvēlne</w:t>
+      </w:r>
+    </w:p>
+    <w:p>
+      <w:pPr>
+        <w:pStyle w:val="Heading3"/>
+      </w:pPr>
+      <w:r>
+        <w:t>Līmeņu atlase</w:t>
+      </w:r>
+      <w:r>
+        <w:t>s aina</w:t>
+      </w:r>
+    </w:p>
+    <w:p>
+      <w:pPr>
+        <w:pStyle w:val="Heading3"/>
+      </w:pPr>
+      <w:r>
+        <w:t>Spēles laukuma aina</w:t>
+      </w:r>
+    </w:p>
+    <w:p>
+      <w:pPr>
+        <w:pStyle w:val="Heading2"/>
+      </w:pPr>
+      <w:r>
+        <w:t>Nefunkcionālās prasības</w:t>
+      </w:r>
+    </w:p>
+    <w:p>
+      <w:pPr>
+        <w:pStyle w:val="Heading2"/>
+      </w:pPr>
+      <w:r>
+        <w:t>Gala lietotāja rakstura iezīmes</w:t>
+      </w:r>
+    </w:p>
     <w:p/>
     <w:sectPr>
       <w:footerReference w:type="default" r:id="rId9"/>

</xml_diff>

<commit_message>
add class diagrams: 1
</commit_message>
<xml_diff>
--- a/Documentation/Dokumentācija.docx
+++ b/Documentation/Dokumentācija.docx
@@ -1327,7 +1327,19 @@
         <w:t xml:space="preserve"> norāda</w:t>
       </w:r>
       <w:r>
-        <w:t xml:space="preserve"> datorspēles vispārējo struktūru ar pārvaldniekiem.</w:t>
+        <w:t xml:space="preserve"> datorspēles vispārējo struktūru ar pārvaldniekiem</w:t>
+      </w:r>
+      <w:r>
+        <w:t xml:space="preserve"> un būtisku komponenti</w:t>
+      </w:r>
+      <w:r>
+        <w:t xml:space="preserve"> (karte)</w:t>
+      </w:r>
+      <w:r>
+        <w:t xml:space="preserve"> šim projektam</w:t>
+      </w:r>
+      <w:r>
+        <w:t>.</w:t>
       </w:r>
     </w:p>
     <w:p>
@@ -1393,107 +1405,33 @@
     <w:p>
       <w:pPr>
         <w:pStyle w:val="Caption"/>
-        <w:jc w:val="center"/>
-        <w:rPr>
-          <w:b/>
-          <w:bCs/>
-          <w:i w:val="0"/>
-          <w:iCs w:val="0"/>
-          <w:sz w:val="20"/>
-          <w:szCs w:val="20"/>
-        </w:rPr>
-      </w:pPr>
-      <w:r>
-        <w:rPr>
-          <w:b/>
-          <w:bCs/>
-          <w:i w:val="0"/>
-          <w:iCs w:val="0"/>
-          <w:sz w:val="20"/>
-          <w:szCs w:val="20"/>
-        </w:rPr>
+      </w:pPr>
+      <w:r>
         <w:fldChar w:fldCharType="begin"/>
       </w:r>
       <w:r>
-        <w:rPr>
-          <w:b/>
-          <w:bCs/>
-          <w:i w:val="0"/>
-          <w:iCs w:val="0"/>
-          <w:sz w:val="20"/>
-          <w:szCs w:val="20"/>
-        </w:rPr>
         <w:instrText xml:space="preserve"> SEQ attēls \* ARABIC </w:instrText>
       </w:r>
       <w:r>
-        <w:rPr>
-          <w:b/>
-          <w:bCs/>
-          <w:i w:val="0"/>
-          <w:iCs w:val="0"/>
-          <w:sz w:val="20"/>
-          <w:szCs w:val="20"/>
-        </w:rPr>
         <w:fldChar w:fldCharType="separate"/>
       </w:r>
       <w:r>
-        <w:rPr>
-          <w:b/>
-          <w:bCs/>
-          <w:i w:val="0"/>
-          <w:iCs w:val="0"/>
-          <w:noProof/>
-          <w:sz w:val="20"/>
-          <w:szCs w:val="20"/>
-        </w:rPr>
         <w:t>1</w:t>
       </w:r>
       <w:r>
-        <w:rPr>
-          <w:b/>
-          <w:bCs/>
-          <w:i w:val="0"/>
-          <w:iCs w:val="0"/>
-          <w:sz w:val="20"/>
-          <w:szCs w:val="20"/>
-        </w:rPr>
         <w:fldChar w:fldCharType="end"/>
       </w:r>
       <w:r>
-        <w:rPr>
-          <w:b/>
-          <w:bCs/>
-          <w:i w:val="0"/>
-          <w:iCs w:val="0"/>
-          <w:sz w:val="20"/>
-          <w:szCs w:val="20"/>
-        </w:rPr>
-        <w:t xml:space="preserve">. </w:t>
-      </w:r>
-      <w:r>
-        <w:rPr>
-          <w:b/>
-          <w:bCs/>
-          <w:i w:val="0"/>
-          <w:iCs w:val="0"/>
-          <w:sz w:val="20"/>
-          <w:szCs w:val="20"/>
-        </w:rPr>
-        <w:t>attēls</w:t>
+        <w:t>. attēls</w:t>
       </w:r>
       <w:bookmarkEnd w:id="8"/>
       <w:r>
-        <w:rPr>
-          <w:b/>
-          <w:bCs/>
-          <w:i w:val="0"/>
-          <w:iCs w:val="0"/>
-          <w:sz w:val="20"/>
-          <w:szCs w:val="20"/>
-        </w:rPr>
         <w:t>. Komponenšu modelis</w:t>
       </w:r>
       <w:bookmarkEnd w:id="7"/>
+      <w:r>
+        <w:t xml:space="preserve"> spēles mezglu saknē</w:t>
+      </w:r>
     </w:p>
     <w:p>
       <w:pPr>
@@ -1513,7 +1451,84 @@
       </w:pPr>
       <w:r>
         <w:lastRenderedPageBreak/>
-        <w:t>Klašu diagramma</w:t>
+        <w:t>Klašu modeļi</w:t>
+      </w:r>
+    </w:p>
+    <w:p>
+      <w:r>
+        <w:t>Šajā sadaļā</w:t>
+      </w:r>
+      <w:r>
+        <w:t xml:space="preserve"> tiks attēloti klases struktūras, mainīgie un metodes.</w:t>
+      </w:r>
+    </w:p>
+    <w:p>
+      <w:pPr>
+        <w:keepNext/>
+        <w:ind w:firstLine="0"/>
+        <w:jc w:val="left"/>
+      </w:pPr>
+      <w:r>
+        <w:rPr>
+          <w:noProof/>
+        </w:rPr>
+        <w:drawing>
+          <wp:inline distT="0" distB="0" distL="0" distR="0" wp14:anchorId="30AD2754" wp14:editId="598B147C">
+            <wp:extent cx="6151880" cy="4724400"/>
+            <wp:effectExtent l="0" t="0" r="1270" b="0"/>
+            <wp:docPr id="999694253" name="Picture 3"/>
+            <wp:cNvGraphicFramePr>
+              <a:graphicFrameLocks xmlns:a="http://schemas.openxmlformats.org/drawingml/2006/main" noChangeAspect="1"/>
+            </wp:cNvGraphicFramePr>
+            <a:graphic xmlns:a="http://schemas.openxmlformats.org/drawingml/2006/main">
+              <a:graphicData uri="http://schemas.openxmlformats.org/drawingml/2006/picture">
+                <pic:pic xmlns:pic="http://schemas.openxmlformats.org/drawingml/2006/picture">
+                  <pic:nvPicPr>
+                    <pic:cNvPr id="999694253" name="Picture 999694253"/>
+                    <pic:cNvPicPr/>
+                  </pic:nvPicPr>
+                  <pic:blipFill>
+                    <a:blip r:embed="rId11">
+                      <a:extLst>
+                        <a:ext uri="{28A0092B-C50C-407E-A947-70E740481C1C}">
+                          <a14:useLocalDpi xmlns:a14="http://schemas.microsoft.com/office/drawing/2010/main" val="0"/>
+                        </a:ext>
+                      </a:extLst>
+                    </a:blip>
+                    <a:stretch>
+                      <a:fillRect/>
+                    </a:stretch>
+                  </pic:blipFill>
+                  <pic:spPr>
+                    <a:xfrm>
+                      <a:off x="0" y="0"/>
+                      <a:ext cx="6151880" cy="4724400"/>
+                    </a:xfrm>
+                    <a:prstGeom prst="rect">
+                      <a:avLst/>
+                    </a:prstGeom>
+                  </pic:spPr>
+                </pic:pic>
+              </a:graphicData>
+            </a:graphic>
+          </wp:inline>
+        </w:drawing>
+      </w:r>
+    </w:p>
+    <w:p>
+      <w:pPr>
+        <w:pStyle w:val="Caption"/>
+      </w:pPr>
+      <w:fldSimple w:instr=" SEQ attēls \* ARABIC ">
+        <w:r>
+          <w:rPr>
+            <w:noProof/>
+          </w:rPr>
+          <w:t>2</w:t>
+        </w:r>
+      </w:fldSimple>
+      <w:r>
+        <w:t>. attēls. Mezglu saknes komponenšu klases</w:t>
       </w:r>
     </w:p>
     <w:sectPr>
@@ -3124,16 +3139,17 @@
     <w:uiPriority w:val="35"/>
     <w:unhideWhenUsed/>
     <w:qFormat/>
-    <w:rsid w:val="00483C19"/>
+    <w:rsid w:val="00DE613F"/>
     <w:pPr>
       <w:spacing w:after="200" w:line="240" w:lineRule="auto"/>
+      <w:jc w:val="center"/>
     </w:pPr>
     <w:rPr>
-      <w:i/>
-      <w:iCs/>
+      <w:b/>
+      <w:bCs/>
       <w:color w:val="0E2841" w:themeColor="text2"/>
-      <w:sz w:val="18"/>
-      <w:szCs w:val="18"/>
+      <w:sz w:val="20"/>
+      <w:szCs w:val="20"/>
     </w:rPr>
   </w:style>
 </w:styles>

</xml_diff>

<commit_message>
add all the prcs
Holy fuck, man
</commit_message>
<xml_diff>
--- a/Documentation/Dokumentācija.docx
+++ b/Documentation/Dokumentācija.docx
@@ -223,7 +223,7 @@
           <w:r>
             <w:fldChar w:fldCharType="separate"/>
           </w:r>
-          <w:hyperlink w:anchor="_Toc225717436" w:history="1">
+          <w:hyperlink w:anchor="_Toc225723225" w:history="1">
             <w:r>
               <w:rPr>
                 <w:rStyle w:val="Hyperlink"/>
@@ -250,7 +250,7 @@
                 <w:noProof/>
                 <w:webHidden/>
               </w:rPr>
-              <w:instrText xml:space="preserve"> PAGEREF _Toc225717436 \h </w:instrText>
+              <w:instrText xml:space="preserve"> PAGEREF _Toc225723225 \h </w:instrText>
             </w:r>
             <w:r>
               <w:rPr>
@@ -291,7 +291,7 @@
               <w:lang w:eastAsia="lv-LV"/>
             </w:rPr>
           </w:pPr>
-          <w:hyperlink w:anchor="_Toc225717437" w:history="1">
+          <w:hyperlink w:anchor="_Toc225723226" w:history="1">
             <w:r>
               <w:rPr>
                 <w:rStyle w:val="Hyperlink"/>
@@ -334,7 +334,7 @@
                 <w:noProof/>
                 <w:webHidden/>
               </w:rPr>
-              <w:instrText xml:space="preserve"> PAGEREF _Toc225717437 \h </w:instrText>
+              <w:instrText xml:space="preserve"> PAGEREF _Toc225723226 \h </w:instrText>
             </w:r>
             <w:r>
               <w:rPr>
@@ -375,7 +375,7 @@
               <w:lang w:eastAsia="lv-LV"/>
             </w:rPr>
           </w:pPr>
-          <w:hyperlink w:anchor="_Toc225717438" w:history="1">
+          <w:hyperlink w:anchor="_Toc225723227" w:history="1">
             <w:r>
               <w:rPr>
                 <w:rStyle w:val="Hyperlink"/>
@@ -418,7 +418,7 @@
                 <w:noProof/>
                 <w:webHidden/>
               </w:rPr>
-              <w:instrText xml:space="preserve"> PAGEREF _Toc225717438 \h </w:instrText>
+              <w:instrText xml:space="preserve"> PAGEREF _Toc225723227 \h </w:instrText>
             </w:r>
             <w:r>
               <w:rPr>
@@ -459,7 +459,7 @@
               <w:lang w:eastAsia="lv-LV"/>
             </w:rPr>
           </w:pPr>
-          <w:hyperlink w:anchor="_Toc225717439" w:history="1">
+          <w:hyperlink w:anchor="_Toc225723228" w:history="1">
             <w:r>
               <w:rPr>
                 <w:rStyle w:val="Hyperlink"/>
@@ -502,7 +502,7 @@
                 <w:noProof/>
                 <w:webHidden/>
               </w:rPr>
-              <w:instrText xml:space="preserve"> PAGEREF _Toc225717439 \h </w:instrText>
+              <w:instrText xml:space="preserve"> PAGEREF _Toc225723228 \h </w:instrText>
             </w:r>
             <w:r>
               <w:rPr>
@@ -543,7 +543,7 @@
               <w:lang w:eastAsia="lv-LV"/>
             </w:rPr>
           </w:pPr>
-          <w:hyperlink w:anchor="_Toc225717440" w:history="1">
+          <w:hyperlink w:anchor="_Toc225723229" w:history="1">
             <w:r>
               <w:rPr>
                 <w:rStyle w:val="Hyperlink"/>
@@ -586,7 +586,7 @@
                 <w:noProof/>
                 <w:webHidden/>
               </w:rPr>
-              <w:instrText xml:space="preserve"> PAGEREF _Toc225717440 \h </w:instrText>
+              <w:instrText xml:space="preserve"> PAGEREF _Toc225723229 \h </w:instrText>
             </w:r>
             <w:r>
               <w:rPr>
@@ -627,7 +627,7 @@
               <w:lang w:eastAsia="lv-LV"/>
             </w:rPr>
           </w:pPr>
-          <w:hyperlink w:anchor="_Toc225717441" w:history="1">
+          <w:hyperlink w:anchor="_Toc225723230" w:history="1">
             <w:r>
               <w:rPr>
                 <w:rStyle w:val="Hyperlink"/>
@@ -670,7 +670,7 @@
                 <w:noProof/>
                 <w:webHidden/>
               </w:rPr>
-              <w:instrText xml:space="preserve"> PAGEREF _Toc225717441 \h </w:instrText>
+              <w:instrText xml:space="preserve"> PAGEREF _Toc225723230 \h </w:instrText>
             </w:r>
             <w:r>
               <w:rPr>
@@ -711,7 +711,7 @@
               <w:lang w:eastAsia="lv-LV"/>
             </w:rPr>
           </w:pPr>
-          <w:hyperlink w:anchor="_Toc225717442" w:history="1">
+          <w:hyperlink w:anchor="_Toc225723231" w:history="1">
             <w:r>
               <w:rPr>
                 <w:rStyle w:val="Hyperlink"/>
@@ -754,7 +754,7 @@
                 <w:noProof/>
                 <w:webHidden/>
               </w:rPr>
-              <w:instrText xml:space="preserve"> PAGEREF _Toc225717442 \h </w:instrText>
+              <w:instrText xml:space="preserve"> PAGEREF _Toc225723231 \h </w:instrText>
             </w:r>
             <w:r>
               <w:rPr>
@@ -795,7 +795,7 @@
               <w:lang w:eastAsia="lv-LV"/>
             </w:rPr>
           </w:pPr>
-          <w:hyperlink w:anchor="_Toc225717443" w:history="1">
+          <w:hyperlink w:anchor="_Toc225723232" w:history="1">
             <w:r>
               <w:rPr>
                 <w:rStyle w:val="Hyperlink"/>
@@ -838,7 +838,7 @@
                 <w:noProof/>
                 <w:webHidden/>
               </w:rPr>
-              <w:instrText xml:space="preserve"> PAGEREF _Toc225717443 \h </w:instrText>
+              <w:instrText xml:space="preserve"> PAGEREF _Toc225723232 \h </w:instrText>
             </w:r>
             <w:r>
               <w:rPr>
@@ -879,7 +879,7 @@
               <w:lang w:eastAsia="lv-LV"/>
             </w:rPr>
           </w:pPr>
-          <w:hyperlink w:anchor="_Toc225717444" w:history="1">
+          <w:hyperlink w:anchor="_Toc225723233" w:history="1">
             <w:r>
               <w:rPr>
                 <w:rStyle w:val="Hyperlink"/>
@@ -922,7 +922,7 @@
                 <w:noProof/>
                 <w:webHidden/>
               </w:rPr>
-              <w:instrText xml:space="preserve"> PAGEREF _Toc225717444 \h </w:instrText>
+              <w:instrText xml:space="preserve"> PAGEREF _Toc225723233 \h </w:instrText>
             </w:r>
             <w:r>
               <w:rPr>
@@ -963,7 +963,7 @@
               <w:lang w:eastAsia="lv-LV"/>
             </w:rPr>
           </w:pPr>
-          <w:hyperlink w:anchor="_Toc225717445" w:history="1">
+          <w:hyperlink w:anchor="_Toc225723234" w:history="1">
             <w:r>
               <w:rPr>
                 <w:rStyle w:val="Hyperlink"/>
@@ -1006,7 +1006,7 @@
                 <w:noProof/>
                 <w:webHidden/>
               </w:rPr>
-              <w:instrText xml:space="preserve"> PAGEREF _Toc225717445 \h </w:instrText>
+              <w:instrText xml:space="preserve"> PAGEREF _Toc225723234 \h </w:instrText>
             </w:r>
             <w:r>
               <w:rPr>
@@ -1047,7 +1047,7 @@
               <w:lang w:eastAsia="lv-LV"/>
             </w:rPr>
           </w:pPr>
-          <w:hyperlink w:anchor="_Toc225717446" w:history="1">
+          <w:hyperlink w:anchor="_Toc225723235" w:history="1">
             <w:r>
               <w:rPr>
                 <w:rStyle w:val="Hyperlink"/>
@@ -1090,7 +1090,7 @@
                 <w:noProof/>
                 <w:webHidden/>
               </w:rPr>
-              <w:instrText xml:space="preserve"> PAGEREF _Toc225717446 \h </w:instrText>
+              <w:instrText xml:space="preserve"> PAGEREF _Toc225723235 \h </w:instrText>
             </w:r>
             <w:r>
               <w:rPr>
@@ -1131,7 +1131,7 @@
               <w:lang w:eastAsia="lv-LV"/>
             </w:rPr>
           </w:pPr>
-          <w:hyperlink w:anchor="_Toc225717447" w:history="1">
+          <w:hyperlink w:anchor="_Toc225723236" w:history="1">
             <w:r>
               <w:rPr>
                 <w:rStyle w:val="Hyperlink"/>
@@ -1174,7 +1174,7 @@
                 <w:noProof/>
                 <w:webHidden/>
               </w:rPr>
-              <w:instrText xml:space="preserve"> PAGEREF _Toc225717447 \h </w:instrText>
+              <w:instrText xml:space="preserve"> PAGEREF _Toc225723236 \h </w:instrText>
             </w:r>
             <w:r>
               <w:rPr>
@@ -1194,7 +1194,7 @@
                 <w:noProof/>
                 <w:webHidden/>
               </w:rPr>
-              <w:t>8</w:t>
+              <w:t>9</w:t>
             </w:r>
             <w:r>
               <w:rPr>
@@ -1215,7 +1215,7 @@
               <w:lang w:eastAsia="lv-LV"/>
             </w:rPr>
           </w:pPr>
-          <w:hyperlink w:anchor="_Toc225717448" w:history="1">
+          <w:hyperlink w:anchor="_Toc225723237" w:history="1">
             <w:r>
               <w:rPr>
                 <w:rStyle w:val="Hyperlink"/>
@@ -1258,7 +1258,7 @@
                 <w:noProof/>
                 <w:webHidden/>
               </w:rPr>
-              <w:instrText xml:space="preserve"> PAGEREF _Toc225717448 \h </w:instrText>
+              <w:instrText xml:space="preserve"> PAGEREF _Toc225723237 \h </w:instrText>
             </w:r>
             <w:r>
               <w:rPr>
@@ -1278,7 +1278,7 @@
                 <w:noProof/>
                 <w:webHidden/>
               </w:rPr>
-              <w:t>9</w:t>
+              <w:t>13</w:t>
             </w:r>
             <w:r>
               <w:rPr>
@@ -1299,7 +1299,7 @@
               <w:lang w:eastAsia="lv-LV"/>
             </w:rPr>
           </w:pPr>
-          <w:hyperlink w:anchor="_Toc225717449" w:history="1">
+          <w:hyperlink w:anchor="_Toc225723238" w:history="1">
             <w:r>
               <w:rPr>
                 <w:rStyle w:val="Hyperlink"/>
@@ -1342,7 +1342,7 @@
                 <w:noProof/>
                 <w:webHidden/>
               </w:rPr>
-              <w:instrText xml:space="preserve"> PAGEREF _Toc225717449 \h </w:instrText>
+              <w:instrText xml:space="preserve"> PAGEREF _Toc225723238 \h </w:instrText>
             </w:r>
             <w:r>
               <w:rPr>
@@ -1362,7 +1362,7 @@
                 <w:noProof/>
                 <w:webHidden/>
               </w:rPr>
-              <w:t>9</w:t>
+              <w:t>13</w:t>
             </w:r>
             <w:r>
               <w:rPr>
@@ -1383,7 +1383,7 @@
               <w:lang w:eastAsia="lv-LV"/>
             </w:rPr>
           </w:pPr>
-          <w:hyperlink w:anchor="_Toc225717450" w:history="1">
+          <w:hyperlink w:anchor="_Toc225723239" w:history="1">
             <w:r>
               <w:rPr>
                 <w:rStyle w:val="Hyperlink"/>
@@ -1426,7 +1426,7 @@
                 <w:noProof/>
                 <w:webHidden/>
               </w:rPr>
-              <w:instrText xml:space="preserve"> PAGEREF _Toc225717450 \h </w:instrText>
+              <w:instrText xml:space="preserve"> PAGEREF _Toc225723239 \h </w:instrText>
             </w:r>
             <w:r>
               <w:rPr>
@@ -1446,7 +1446,7 @@
                 <w:noProof/>
                 <w:webHidden/>
               </w:rPr>
-              <w:t>10</w:t>
+              <w:t>13</w:t>
             </w:r>
             <w:r>
               <w:rPr>
@@ -1467,7 +1467,7 @@
               <w:lang w:eastAsia="lv-LV"/>
             </w:rPr>
           </w:pPr>
-          <w:hyperlink w:anchor="_Toc225717451" w:history="1">
+          <w:hyperlink w:anchor="_Toc225723240" w:history="1">
             <w:r>
               <w:rPr>
                 <w:rStyle w:val="Hyperlink"/>
@@ -1510,7 +1510,7 @@
                 <w:noProof/>
                 <w:webHidden/>
               </w:rPr>
-              <w:instrText xml:space="preserve"> PAGEREF _Toc225717451 \h </w:instrText>
+              <w:instrText xml:space="preserve"> PAGEREF _Toc225723240 \h </w:instrText>
             </w:r>
             <w:r>
               <w:rPr>
@@ -1530,7 +1530,7 @@
                 <w:noProof/>
                 <w:webHidden/>
               </w:rPr>
-              <w:t>10</w:t>
+              <w:t>13</w:t>
             </w:r>
             <w:r>
               <w:rPr>
@@ -1551,7 +1551,7 @@
               <w:lang w:eastAsia="lv-LV"/>
             </w:rPr>
           </w:pPr>
-          <w:hyperlink w:anchor="_Toc225717452" w:history="1">
+          <w:hyperlink w:anchor="_Toc225723241" w:history="1">
             <w:r>
               <w:rPr>
                 <w:rStyle w:val="Hyperlink"/>
@@ -1594,7 +1594,7 @@
                 <w:noProof/>
                 <w:webHidden/>
               </w:rPr>
-              <w:instrText xml:space="preserve"> PAGEREF _Toc225717452 \h </w:instrText>
+              <w:instrText xml:space="preserve"> PAGEREF _Toc225723241 \h </w:instrText>
             </w:r>
             <w:r>
               <w:rPr>
@@ -1614,7 +1614,7 @@
                 <w:noProof/>
                 <w:webHidden/>
               </w:rPr>
-              <w:t>10</w:t>
+              <w:t>14</w:t>
             </w:r>
             <w:r>
               <w:rPr>
@@ -1635,7 +1635,7 @@
               <w:lang w:eastAsia="lv-LV"/>
             </w:rPr>
           </w:pPr>
-          <w:hyperlink w:anchor="_Toc225717453" w:history="1">
+          <w:hyperlink w:anchor="_Toc225723242" w:history="1">
             <w:r>
               <w:rPr>
                 <w:rStyle w:val="Hyperlink"/>
@@ -1678,7 +1678,7 @@
                 <w:noProof/>
                 <w:webHidden/>
               </w:rPr>
-              <w:instrText xml:space="preserve"> PAGEREF _Toc225717453 \h </w:instrText>
+              <w:instrText xml:space="preserve"> PAGEREF _Toc225723242 \h </w:instrText>
             </w:r>
             <w:r>
               <w:rPr>
@@ -1698,7 +1698,7 @@
                 <w:noProof/>
                 <w:webHidden/>
               </w:rPr>
-              <w:t>11</w:t>
+              <w:t>15</w:t>
             </w:r>
             <w:r>
               <w:rPr>
@@ -1719,7 +1719,7 @@
               <w:lang w:eastAsia="lv-LV"/>
             </w:rPr>
           </w:pPr>
-          <w:hyperlink w:anchor="_Toc225717454" w:history="1">
+          <w:hyperlink w:anchor="_Toc225723243" w:history="1">
             <w:r>
               <w:rPr>
                 <w:rStyle w:val="Hyperlink"/>
@@ -1762,7 +1762,7 @@
                 <w:noProof/>
                 <w:webHidden/>
               </w:rPr>
-              <w:instrText xml:space="preserve"> PAGEREF _Toc225717454 \h </w:instrText>
+              <w:instrText xml:space="preserve"> PAGEREF _Toc225723243 \h </w:instrText>
             </w:r>
             <w:r>
               <w:rPr>
@@ -1782,7 +1782,7 @@
                 <w:noProof/>
                 <w:webHidden/>
               </w:rPr>
-              <w:t>11</w:t>
+              <w:t>15</w:t>
             </w:r>
             <w:r>
               <w:rPr>
@@ -1803,7 +1803,7 @@
               <w:lang w:eastAsia="lv-LV"/>
             </w:rPr>
           </w:pPr>
-          <w:hyperlink w:anchor="_Toc225717455" w:history="1">
+          <w:hyperlink w:anchor="_Toc225723244" w:history="1">
             <w:r>
               <w:rPr>
                 <w:rStyle w:val="Hyperlink"/>
@@ -1846,7 +1846,7 @@
                 <w:noProof/>
                 <w:webHidden/>
               </w:rPr>
-              <w:instrText xml:space="preserve"> PAGEREF _Toc225717455 \h </w:instrText>
+              <w:instrText xml:space="preserve"> PAGEREF _Toc225723244 \h </w:instrText>
             </w:r>
             <w:r>
               <w:rPr>
@@ -1866,7 +1866,7 @@
                 <w:noProof/>
                 <w:webHidden/>
               </w:rPr>
-              <w:t>11</w:t>
+              <w:t>15</w:t>
             </w:r>
             <w:r>
               <w:rPr>
@@ -1887,7 +1887,7 @@
               <w:lang w:eastAsia="lv-LV"/>
             </w:rPr>
           </w:pPr>
-          <w:hyperlink w:anchor="_Toc225717456" w:history="1">
+          <w:hyperlink w:anchor="_Toc225723245" w:history="1">
             <w:r>
               <w:rPr>
                 <w:rStyle w:val="Hyperlink"/>
@@ -1930,7 +1930,7 @@
                 <w:noProof/>
                 <w:webHidden/>
               </w:rPr>
-              <w:instrText xml:space="preserve"> PAGEREF _Toc225717456 \h </w:instrText>
+              <w:instrText xml:space="preserve"> PAGEREF _Toc225723245 \h </w:instrText>
             </w:r>
             <w:r>
               <w:rPr>
@@ -1950,7 +1950,7 @@
                 <w:noProof/>
                 <w:webHidden/>
               </w:rPr>
-              <w:t>11</w:t>
+              <w:t>15</w:t>
             </w:r>
             <w:r>
               <w:rPr>
@@ -1971,7 +1971,7 @@
               <w:lang w:eastAsia="lv-LV"/>
             </w:rPr>
           </w:pPr>
-          <w:hyperlink w:anchor="_Toc225717457" w:history="1">
+          <w:hyperlink w:anchor="_Toc225723246" w:history="1">
             <w:r>
               <w:rPr>
                 <w:rStyle w:val="Hyperlink"/>
@@ -2014,7 +2014,7 @@
                 <w:noProof/>
                 <w:webHidden/>
               </w:rPr>
-              <w:instrText xml:space="preserve"> PAGEREF _Toc225717457 \h </w:instrText>
+              <w:instrText xml:space="preserve"> PAGEREF _Toc225723246 \h </w:instrText>
             </w:r>
             <w:r>
               <w:rPr>
@@ -2034,7 +2034,7 @@
                 <w:noProof/>
                 <w:webHidden/>
               </w:rPr>
-              <w:t>11</w:t>
+              <w:t>15</w:t>
             </w:r>
             <w:r>
               <w:rPr>
@@ -2055,7 +2055,7 @@
               <w:lang w:eastAsia="lv-LV"/>
             </w:rPr>
           </w:pPr>
-          <w:hyperlink w:anchor="_Toc225717458" w:history="1">
+          <w:hyperlink w:anchor="_Toc225723247" w:history="1">
             <w:r>
               <w:rPr>
                 <w:rStyle w:val="Hyperlink"/>
@@ -2098,7 +2098,7 @@
                 <w:noProof/>
                 <w:webHidden/>
               </w:rPr>
-              <w:instrText xml:space="preserve"> PAGEREF _Toc225717458 \h </w:instrText>
+              <w:instrText xml:space="preserve"> PAGEREF _Toc225723247 \h </w:instrText>
             </w:r>
             <w:r>
               <w:rPr>
@@ -2118,7 +2118,7 @@
                 <w:noProof/>
                 <w:webHidden/>
               </w:rPr>
-              <w:t>12</w:t>
+              <w:t>16</w:t>
             </w:r>
             <w:r>
               <w:rPr>
@@ -2139,7 +2139,7 @@
               <w:lang w:eastAsia="lv-LV"/>
             </w:rPr>
           </w:pPr>
-          <w:hyperlink w:anchor="_Toc225717459" w:history="1">
+          <w:hyperlink w:anchor="_Toc225723248" w:history="1">
             <w:r>
               <w:rPr>
                 <w:rStyle w:val="Hyperlink"/>
@@ -2182,7 +2182,7 @@
                 <w:noProof/>
                 <w:webHidden/>
               </w:rPr>
-              <w:instrText xml:space="preserve"> PAGEREF _Toc225717459 \h </w:instrText>
+              <w:instrText xml:space="preserve"> PAGEREF _Toc225723248 \h </w:instrText>
             </w:r>
             <w:r>
               <w:rPr>
@@ -2202,7 +2202,7 @@
                 <w:noProof/>
                 <w:webHidden/>
               </w:rPr>
-              <w:t>12</w:t>
+              <w:t>16</w:t>
             </w:r>
             <w:r>
               <w:rPr>
@@ -2223,7 +2223,7 @@
               <w:lang w:eastAsia="lv-LV"/>
             </w:rPr>
           </w:pPr>
-          <w:hyperlink w:anchor="_Toc225717460" w:history="1">
+          <w:hyperlink w:anchor="_Toc225723249" w:history="1">
             <w:r>
               <w:rPr>
                 <w:rStyle w:val="Hyperlink"/>
@@ -2266,7 +2266,7 @@
                 <w:noProof/>
                 <w:webHidden/>
               </w:rPr>
-              <w:instrText xml:space="preserve"> PAGEREF _Toc225717460 \h </w:instrText>
+              <w:instrText xml:space="preserve"> PAGEREF _Toc225723249 \h </w:instrText>
             </w:r>
             <w:r>
               <w:rPr>
@@ -2286,7 +2286,7 @@
                 <w:noProof/>
                 <w:webHidden/>
               </w:rPr>
-              <w:t>12</w:t>
+              <w:t>16</w:t>
             </w:r>
             <w:r>
               <w:rPr>
@@ -2307,7 +2307,7 @@
               <w:lang w:eastAsia="lv-LV"/>
             </w:rPr>
           </w:pPr>
-          <w:hyperlink w:anchor="_Toc225717461" w:history="1">
+          <w:hyperlink w:anchor="_Toc225723250" w:history="1">
             <w:r>
               <w:rPr>
                 <w:rStyle w:val="Hyperlink"/>
@@ -2350,7 +2350,7 @@
                 <w:noProof/>
                 <w:webHidden/>
               </w:rPr>
-              <w:instrText xml:space="preserve"> PAGEREF _Toc225717461 \h </w:instrText>
+              <w:instrText xml:space="preserve"> PAGEREF _Toc225723250 \h </w:instrText>
             </w:r>
             <w:r>
               <w:rPr>
@@ -2370,7 +2370,7 @@
                 <w:noProof/>
                 <w:webHidden/>
               </w:rPr>
-              <w:t>12</w:t>
+              <w:t>16</w:t>
             </w:r>
             <w:r>
               <w:rPr>
@@ -2391,7 +2391,7 @@
               <w:lang w:eastAsia="lv-LV"/>
             </w:rPr>
           </w:pPr>
-          <w:hyperlink w:anchor="_Toc225717462" w:history="1">
+          <w:hyperlink w:anchor="_Toc225723251" w:history="1">
             <w:r>
               <w:rPr>
                 <w:rStyle w:val="Hyperlink"/>
@@ -2434,7 +2434,7 @@
                 <w:noProof/>
                 <w:webHidden/>
               </w:rPr>
-              <w:instrText xml:space="preserve"> PAGEREF _Toc225717462 \h </w:instrText>
+              <w:instrText xml:space="preserve"> PAGEREF _Toc225723251 \h </w:instrText>
             </w:r>
             <w:r>
               <w:rPr>
@@ -2454,7 +2454,7 @@
                 <w:noProof/>
                 <w:webHidden/>
               </w:rPr>
-              <w:t>13</w:t>
+              <w:t>17</w:t>
             </w:r>
             <w:r>
               <w:rPr>
@@ -2475,7 +2475,7 @@
               <w:lang w:eastAsia="lv-LV"/>
             </w:rPr>
           </w:pPr>
-          <w:hyperlink w:anchor="_Toc225717463" w:history="1">
+          <w:hyperlink w:anchor="_Toc225723252" w:history="1">
             <w:r>
               <w:rPr>
                 <w:rStyle w:val="Hyperlink"/>
@@ -2518,7 +2518,7 @@
                 <w:noProof/>
                 <w:webHidden/>
               </w:rPr>
-              <w:instrText xml:space="preserve"> PAGEREF _Toc225717463 \h </w:instrText>
+              <w:instrText xml:space="preserve"> PAGEREF _Toc225723252 \h </w:instrText>
             </w:r>
             <w:r>
               <w:rPr>
@@ -2538,7 +2538,7 @@
                 <w:noProof/>
                 <w:webHidden/>
               </w:rPr>
-              <w:t>13</w:t>
+              <w:t>17</w:t>
             </w:r>
             <w:r>
               <w:rPr>
@@ -2559,7 +2559,7 @@
               <w:lang w:eastAsia="lv-LV"/>
             </w:rPr>
           </w:pPr>
-          <w:hyperlink w:anchor="_Toc225717464" w:history="1">
+          <w:hyperlink w:anchor="_Toc225723253" w:history="1">
             <w:r>
               <w:rPr>
                 <w:rStyle w:val="Hyperlink"/>
@@ -2602,7 +2602,7 @@
                 <w:noProof/>
                 <w:webHidden/>
               </w:rPr>
-              <w:instrText xml:space="preserve"> PAGEREF _Toc225717464 \h </w:instrText>
+              <w:instrText xml:space="preserve"> PAGEREF _Toc225723253 \h </w:instrText>
             </w:r>
             <w:r>
               <w:rPr>
@@ -2622,7 +2622,7 @@
                 <w:noProof/>
                 <w:webHidden/>
               </w:rPr>
-              <w:t>14</w:t>
+              <w:t>18</w:t>
             </w:r>
             <w:r>
               <w:rPr>
@@ -2643,7 +2643,7 @@
               <w:lang w:eastAsia="lv-LV"/>
             </w:rPr>
           </w:pPr>
-          <w:hyperlink w:anchor="_Toc225717465" w:history="1">
+          <w:hyperlink w:anchor="_Toc225723254" w:history="1">
             <w:r>
               <w:rPr>
                 <w:rStyle w:val="Hyperlink"/>
@@ -2686,7 +2686,7 @@
                 <w:noProof/>
                 <w:webHidden/>
               </w:rPr>
-              <w:instrText xml:space="preserve"> PAGEREF _Toc225717465 \h </w:instrText>
+              <w:instrText xml:space="preserve"> PAGEREF _Toc225723254 \h </w:instrText>
             </w:r>
             <w:r>
               <w:rPr>
@@ -2706,7 +2706,7 @@
                 <w:noProof/>
                 <w:webHidden/>
               </w:rPr>
-              <w:t>14</w:t>
+              <w:t>18</w:t>
             </w:r>
             <w:r>
               <w:rPr>
@@ -2727,7 +2727,7 @@
               <w:lang w:eastAsia="lv-LV"/>
             </w:rPr>
           </w:pPr>
-          <w:hyperlink w:anchor="_Toc225717466" w:history="1">
+          <w:hyperlink w:anchor="_Toc225723255" w:history="1">
             <w:r>
               <w:rPr>
                 <w:rStyle w:val="Hyperlink"/>
@@ -2770,7 +2770,7 @@
                 <w:noProof/>
                 <w:webHidden/>
               </w:rPr>
-              <w:instrText xml:space="preserve"> PAGEREF _Toc225717466 \h </w:instrText>
+              <w:instrText xml:space="preserve"> PAGEREF _Toc225723255 \h </w:instrText>
             </w:r>
             <w:r>
               <w:rPr>
@@ -2790,7 +2790,7 @@
                 <w:noProof/>
                 <w:webHidden/>
               </w:rPr>
-              <w:t>14</w:t>
+              <w:t>18</w:t>
             </w:r>
             <w:r>
               <w:rPr>
@@ -2811,7 +2811,7 @@
               <w:lang w:eastAsia="lv-LV"/>
             </w:rPr>
           </w:pPr>
-          <w:hyperlink w:anchor="_Toc225717467" w:history="1">
+          <w:hyperlink w:anchor="_Toc225723256" w:history="1">
             <w:r>
               <w:rPr>
                 <w:rStyle w:val="Hyperlink"/>
@@ -2854,7 +2854,7 @@
                 <w:noProof/>
                 <w:webHidden/>
               </w:rPr>
-              <w:instrText xml:space="preserve"> PAGEREF _Toc225717467 \h </w:instrText>
+              <w:instrText xml:space="preserve"> PAGEREF _Toc225723256 \h </w:instrText>
             </w:r>
             <w:r>
               <w:rPr>
@@ -2874,7 +2874,7 @@
                 <w:noProof/>
                 <w:webHidden/>
               </w:rPr>
-              <w:t>15</w:t>
+              <w:t>19</w:t>
             </w:r>
             <w:r>
               <w:rPr>
@@ -2895,7 +2895,7 @@
               <w:lang w:eastAsia="lv-LV"/>
             </w:rPr>
           </w:pPr>
-          <w:hyperlink w:anchor="_Toc225717468" w:history="1">
+          <w:hyperlink w:anchor="_Toc225723257" w:history="1">
             <w:r>
               <w:rPr>
                 <w:rStyle w:val="Hyperlink"/>
@@ -2938,7 +2938,7 @@
                 <w:noProof/>
                 <w:webHidden/>
               </w:rPr>
-              <w:instrText xml:space="preserve"> PAGEREF _Toc225717468 \h </w:instrText>
+              <w:instrText xml:space="preserve"> PAGEREF _Toc225723257 \h </w:instrText>
             </w:r>
             <w:r>
               <w:rPr>
@@ -2958,7 +2958,7 @@
                 <w:noProof/>
                 <w:webHidden/>
               </w:rPr>
-              <w:t>17</w:t>
+              <w:t>21</w:t>
             </w:r>
             <w:r>
               <w:rPr>
@@ -2979,7 +2979,7 @@
               <w:lang w:eastAsia="lv-LV"/>
             </w:rPr>
           </w:pPr>
-          <w:hyperlink w:anchor="_Toc225717469" w:history="1">
+          <w:hyperlink w:anchor="_Toc225723258" w:history="1">
             <w:r>
               <w:rPr>
                 <w:rStyle w:val="Hyperlink"/>
@@ -3022,7 +3022,7 @@
                 <w:noProof/>
                 <w:webHidden/>
               </w:rPr>
-              <w:instrText xml:space="preserve"> PAGEREF _Toc225717469 \h </w:instrText>
+              <w:instrText xml:space="preserve"> PAGEREF _Toc225723258 \h </w:instrText>
             </w:r>
             <w:r>
               <w:rPr>
@@ -3042,7 +3042,7 @@
                 <w:noProof/>
                 <w:webHidden/>
               </w:rPr>
-              <w:t>17</w:t>
+              <w:t>21</w:t>
             </w:r>
             <w:r>
               <w:rPr>
@@ -3063,7 +3063,7 @@
               <w:lang w:eastAsia="lv-LV"/>
             </w:rPr>
           </w:pPr>
-          <w:hyperlink w:anchor="_Toc225717470" w:history="1">
+          <w:hyperlink w:anchor="_Toc225723259" w:history="1">
             <w:r>
               <w:rPr>
                 <w:rStyle w:val="Hyperlink"/>
@@ -3106,7 +3106,7 @@
                 <w:noProof/>
                 <w:webHidden/>
               </w:rPr>
-              <w:instrText xml:space="preserve"> PAGEREF _Toc225717470 \h </w:instrText>
+              <w:instrText xml:space="preserve"> PAGEREF _Toc225723259 \h </w:instrText>
             </w:r>
             <w:r>
               <w:rPr>
@@ -3126,7 +3126,7 @@
                 <w:noProof/>
                 <w:webHidden/>
               </w:rPr>
-              <w:t>18</w:t>
+              <w:t>22</w:t>
             </w:r>
             <w:r>
               <w:rPr>
@@ -3147,7 +3147,7 @@
               <w:lang w:eastAsia="lv-LV"/>
             </w:rPr>
           </w:pPr>
-          <w:hyperlink w:anchor="_Toc225717471" w:history="1">
+          <w:hyperlink w:anchor="_Toc225723260" w:history="1">
             <w:r>
               <w:rPr>
                 <w:rStyle w:val="Hyperlink"/>
@@ -3190,7 +3190,7 @@
                 <w:noProof/>
                 <w:webHidden/>
               </w:rPr>
-              <w:instrText xml:space="preserve"> PAGEREF _Toc225717471 \h </w:instrText>
+              <w:instrText xml:space="preserve"> PAGEREF _Toc225723260 \h </w:instrText>
             </w:r>
             <w:r>
               <w:rPr>
@@ -3210,7 +3210,7 @@
                 <w:noProof/>
                 <w:webHidden/>
               </w:rPr>
-              <w:t>19</w:t>
+              <w:t>23</w:t>
             </w:r>
             <w:r>
               <w:rPr>
@@ -3263,7 +3263,7 @@
           <w:numId w:val="0"/>
         </w:numPr>
       </w:pPr>
-      <w:bookmarkStart w:id="0" w:name="_Toc225717436"/>
+      <w:bookmarkStart w:id="0" w:name="_Toc225723225"/>
       <w:r>
         <w:lastRenderedPageBreak/>
         <w:t>Ievads</w:t>
@@ -3381,7 +3381,7 @@
       <w:pPr>
         <w:pStyle w:val="Heading1"/>
       </w:pPr>
-      <w:bookmarkStart w:id="1" w:name="_Toc225717437"/>
+      <w:bookmarkStart w:id="1" w:name="_Toc225723226"/>
       <w:r>
         <w:lastRenderedPageBreak/>
         <w:t>Uzdevuma formulējums</w:t>
@@ -3392,7 +3392,7 @@
       <w:pPr>
         <w:pStyle w:val="Heading2"/>
       </w:pPr>
-      <w:bookmarkStart w:id="2" w:name="_Toc225717438"/>
+      <w:bookmarkStart w:id="2" w:name="_Toc225723227"/>
       <w:r>
         <w:t>Vispārīgais formulējums</w:t>
       </w:r>
@@ -3484,7 +3484,7 @@
       <w:pPr>
         <w:pStyle w:val="Heading2"/>
       </w:pPr>
-      <w:bookmarkStart w:id="3" w:name="_Toc225717439"/>
+      <w:bookmarkStart w:id="3" w:name="_Toc225723228"/>
       <w:r>
         <w:t>Projektēšanas formulējums</w:t>
       </w:r>
@@ -3528,7 +3528,7 @@
       <w:pPr>
         <w:pStyle w:val="Heading2"/>
       </w:pPr>
-      <w:bookmarkStart w:id="4" w:name="_Toc225717440"/>
+      <w:bookmarkStart w:id="4" w:name="_Toc225723229"/>
       <w:r>
         <w:t>Izstrādes formulējums</w:t>
       </w:r>
@@ -3546,7 +3546,7 @@
       <w:pPr>
         <w:pStyle w:val="Heading2"/>
       </w:pPr>
-      <w:bookmarkStart w:id="5" w:name="_Toc225717441"/>
+      <w:bookmarkStart w:id="5" w:name="_Toc225723230"/>
       <w:r>
         <w:lastRenderedPageBreak/>
         <w:t>Testēšanas formulējums</w:t>
@@ -3583,7 +3583,7 @@
       <w:pPr>
         <w:pStyle w:val="Heading1"/>
       </w:pPr>
-      <w:bookmarkStart w:id="6" w:name="_Toc225717442"/>
+      <w:bookmarkStart w:id="6" w:name="_Toc225723231"/>
       <w:r>
         <w:lastRenderedPageBreak/>
         <w:t>Programmatūras prasību specifikācija</w:t>
@@ -3599,7 +3599,7 @@
       <w:pPr>
         <w:pStyle w:val="Heading2"/>
       </w:pPr>
-      <w:bookmarkStart w:id="7" w:name="_Toc225717443"/>
+      <w:bookmarkStart w:id="7" w:name="_Toc225723232"/>
       <w:r>
         <w:t>Projekta perspektīva</w:t>
       </w:r>
@@ -3626,7 +3626,7 @@
       <w:pPr>
         <w:pStyle w:val="Heading2"/>
       </w:pPr>
-      <w:bookmarkStart w:id="8" w:name="_Toc225717444"/>
+      <w:bookmarkStart w:id="8" w:name="_Toc225723233"/>
       <w:r>
         <w:t>Funkcionālās prasības</w:t>
       </w:r>
@@ -3636,7 +3636,7 @@
       <w:pPr>
         <w:pStyle w:val="Heading3"/>
       </w:pPr>
-      <w:bookmarkStart w:id="9" w:name="_Toc225717445"/>
+      <w:bookmarkStart w:id="9" w:name="_Toc225723234"/>
       <w:r>
         <w:t>Galvenā izvēlne</w:t>
       </w:r>
@@ -3982,7 +3982,7 @@
       <w:pPr>
         <w:pStyle w:val="Heading3"/>
       </w:pPr>
-      <w:bookmarkStart w:id="10" w:name="_Toc225717446"/>
+      <w:bookmarkStart w:id="10" w:name="_Toc225723235"/>
       <w:r>
         <w:t>Līmeņu atlase</w:t>
       </w:r>
@@ -4439,7 +4439,7 @@
       <w:pPr>
         <w:pStyle w:val="Heading3"/>
       </w:pPr>
-      <w:bookmarkStart w:id="12" w:name="_Toc225717447"/>
+      <w:bookmarkStart w:id="12" w:name="_Toc225723236"/>
       <w:r>
         <w:t>Spēles laukuma aina</w:t>
       </w:r>
@@ -5196,6 +5196,9 @@
         <w:t xml:space="preserve"> Noņem ierīci no laukuma un atlikušo atlasīto ierīču skaitu palielina.</w:t>
       </w:r>
     </w:p>
+    <w:p/>
+    <w:p/>
+    <w:p/>
     <w:p>
       <w:pPr>
         <w:pStyle w:val="ListParagraph"/>
@@ -5213,15 +5216,84 @@
           <w:b/>
           <w:bCs/>
         </w:rPr>
+        <w:lastRenderedPageBreak/>
         <w:t>Pārvirze uz izlūku vai ierīču koriģēšanu</w:t>
       </w:r>
     </w:p>
     <w:p>
+      <w:r>
+        <w:rPr>
+          <w:u w:val="single"/>
+        </w:rPr>
+        <w:t>Mērķis</w:t>
+      </w:r>
+      <w:r>
+        <w:t xml:space="preserve">: </w:t>
+      </w:r>
+      <w:r>
+        <w:t>Turpināt spēles gaitu pēc ierīču ievietošanu laukumā</w:t>
+      </w:r>
+      <w:r>
+        <w:t>.</w:t>
+      </w:r>
+    </w:p>
+    <w:p>
+      <w:r>
+        <w:rPr>
+          <w:u w:val="single"/>
+        </w:rPr>
+        <w:t>Ievaddati</w:t>
+      </w:r>
+      <w:r>
+        <w:t xml:space="preserve">: </w:t>
+      </w:r>
+      <w:r>
+        <w:t>“Turpināt” poga</w:t>
+      </w:r>
+      <w:r>
+        <w:t>.</w:t>
+      </w:r>
+    </w:p>
+    <w:p>
+      <w:r>
+        <w:rPr>
+          <w:u w:val="single"/>
+        </w:rPr>
+        <w:t>Apstrāde</w:t>
+      </w:r>
+      <w:r>
+        <w:t>:</w:t>
+      </w:r>
+    </w:p>
+    <w:p>
+      <w:pPr>
+        <w:pStyle w:val="ListParagraph"/>
+        <w:numPr>
+          <w:ilvl w:val="0"/>
+          <w:numId w:val="15"/>
+        </w:numPr>
+      </w:pPr>
+      <w:r>
+        <w:t>Pārbauda līmeņa nosacījumus</w:t>
+      </w:r>
+    </w:p>
+    <w:p>
+      <w:pPr>
+        <w:pStyle w:val="ListParagraph"/>
+        <w:numPr>
+          <w:ilvl w:val="0"/>
+          <w:numId w:val="15"/>
+        </w:numPr>
+      </w:pPr>
+      <w:r>
+        <w:t>Ja atbilst nosacījumi, tad notiek pārvirze vai izlūku izsaukšana, ja laukumā ir aizklāti laukumi.</w:t>
+      </w:r>
+    </w:p>
+    <w:p>
       <w:pPr>
         <w:pStyle w:val="Heading4"/>
       </w:pPr>
       <w:r>
-        <w:lastRenderedPageBreak/>
         <w:t>Izlūku izsaukšana</w:t>
       </w:r>
     </w:p>
@@ -5246,6 +5318,104 @@
       </w:r>
     </w:p>
     <w:p>
+      <w:r>
+        <w:rPr>
+          <w:u w:val="single"/>
+        </w:rPr>
+        <w:t>Mērķis</w:t>
+      </w:r>
+      <w:r>
+        <w:t xml:space="preserve">: </w:t>
+      </w:r>
+      <w:r>
+        <w:t>Pēc līmeņa nosacījuma piedāvāt izlūku, lai noņemtu aizsegušus laukumus pēc loterijas</w:t>
+      </w:r>
+      <w:r>
+        <w:t>.</w:t>
+      </w:r>
+    </w:p>
+    <w:p>
+      <w:r>
+        <w:rPr>
+          <w:u w:val="single"/>
+        </w:rPr>
+        <w:t>Ievaddati</w:t>
+      </w:r>
+      <w:r>
+        <w:t xml:space="preserve">: </w:t>
+      </w:r>
+      <w:r>
+        <w:t>Piedāvājuma dialoglogs</w:t>
+      </w:r>
+      <w:r>
+        <w:t>.</w:t>
+      </w:r>
+    </w:p>
+    <w:p>
+      <w:r>
+        <w:rPr>
+          <w:u w:val="single"/>
+        </w:rPr>
+        <w:t>Apstrāde</w:t>
+      </w:r>
+      <w:r>
+        <w:t>:</w:t>
+      </w:r>
+    </w:p>
+    <w:p>
+      <w:pPr>
+        <w:pStyle w:val="ListParagraph"/>
+        <w:numPr>
+          <w:ilvl w:val="0"/>
+          <w:numId w:val="17"/>
+        </w:numPr>
+      </w:pPr>
+      <w:r>
+        <w:t xml:space="preserve">Nejauši izvēlas skaitli no 1 līdz desmit, kuru laimīgais skaits var svārstīties no </w:t>
+      </w:r>
+      <w:r>
+        <w:t>4 līdz 8.</w:t>
+      </w:r>
+    </w:p>
+    <w:p>
+      <w:pPr>
+        <w:pStyle w:val="ListParagraph"/>
+        <w:numPr>
+          <w:ilvl w:val="0"/>
+          <w:numId w:val="17"/>
+        </w:numPr>
+      </w:pPr>
+      <w:r>
+        <w:t>Ja tiek izvēlēts laimīgais skaitlis, tad noņemt aizsegušus laukumus</w:t>
+      </w:r>
+      <w:r>
+        <w:t>,</w:t>
+      </w:r>
+      <w:r>
+        <w:t xml:space="preserve"> </w:t>
+      </w:r>
+      <w:r>
+        <w:t>tad</w:t>
+      </w:r>
+      <w:r>
+        <w:t xml:space="preserve"> pārvirza uz ierīču koriģēšanas stadiju</w:t>
+      </w:r>
+      <w:r>
+        <w:t xml:space="preserve"> neatkarīgi no laimīgā skaitļa atlases</w:t>
+      </w:r>
+      <w:r>
+        <w:t>.</w:t>
+      </w:r>
+    </w:p>
+    <w:p>
+      <w:pPr>
+        <w:pStyle w:val="Heading4"/>
+      </w:pPr>
+      <w:r>
+        <w:t>Ierīču koriģēšana</w:t>
+      </w:r>
+    </w:p>
+    <w:p>
       <w:pPr>
         <w:pStyle w:val="ListParagraph"/>
         <w:numPr>
@@ -5262,7 +5432,79 @@
           <w:b/>
           <w:bCs/>
         </w:rPr>
-        <w:t>Slēpto laukumu rādīšana</w:t>
+        <w:t>Ierī</w:t>
+      </w:r>
+      <w:r>
+        <w:rPr>
+          <w:b/>
+          <w:bCs/>
+        </w:rPr>
+        <w:t>ces</w:t>
+      </w:r>
+      <w:r>
+        <w:rPr>
+          <w:b/>
+          <w:bCs/>
+        </w:rPr>
+        <w:t xml:space="preserve"> atlase</w:t>
+      </w:r>
+      <w:r>
+        <w:rPr>
+          <w:b/>
+          <w:bCs/>
+        </w:rPr>
+        <w:t xml:space="preserve"> laukumā</w:t>
+      </w:r>
+    </w:p>
+    <w:p>
+      <w:r>
+        <w:rPr>
+          <w:u w:val="single"/>
+        </w:rPr>
+        <w:t>Mērķis</w:t>
+      </w:r>
+      <w:r>
+        <w:t xml:space="preserve">: </w:t>
+      </w:r>
+      <w:r>
+        <w:t>Dot iespēju spēlētājam atlasīt ierīci laukumā, lai veiktu koriģēšanu.</w:t>
+      </w:r>
+      <w:r>
+        <w:t xml:space="preserve"> </w:t>
+      </w:r>
+    </w:p>
+    <w:p>
+      <w:r>
+        <w:rPr>
+          <w:u w:val="single"/>
+        </w:rPr>
+        <w:t>Ievaddati</w:t>
+      </w:r>
+      <w:r>
+        <w:t xml:space="preserve">: </w:t>
+      </w:r>
+      <w:r>
+        <w:t>Spēlētāja ierīce, kura ir atzīmēta laukumā</w:t>
+      </w:r>
+    </w:p>
+    <w:p>
+      <w:r>
+        <w:rPr>
+          <w:u w:val="single"/>
+        </w:rPr>
+        <w:t>Apstrāde</w:t>
+      </w:r>
+      <w:r>
+        <w:t>:</w:t>
+      </w:r>
+      <w:r>
+        <w:t xml:space="preserve"> Pēc nospiešanas ierīce tiek atlasīta šajā stadijā</w:t>
+      </w:r>
+      <w:r>
+        <w:t xml:space="preserve"> un rodas koriģēšanas logs</w:t>
+      </w:r>
+      <w:r>
+        <w:t>.</w:t>
       </w:r>
     </w:p>
     <w:p>
@@ -5282,15 +5524,47 @@
           <w:b/>
           <w:bCs/>
         </w:rPr>
-        <w:t>Pārvirze uz ierīču koriģēšanu</w:t>
-      </w:r>
-    </w:p>
-    <w:p>
-      <w:pPr>
-        <w:pStyle w:val="Heading4"/>
-      </w:pPr>
-      <w:r>
-        <w:t>Ierīču koriģēšana</w:t>
+        <w:t>Ierīces atlases noņemšana</w:t>
+      </w:r>
+    </w:p>
+    <w:p>
+      <w:r>
+        <w:rPr>
+          <w:u w:val="single"/>
+        </w:rPr>
+        <w:t>Mērķis</w:t>
+      </w:r>
+      <w:r>
+        <w:t>: Dot iespēju spēlētājam</w:t>
+      </w:r>
+      <w:r>
+        <w:t xml:space="preserve"> noņemt ierīces atlasi.</w:t>
+      </w:r>
+    </w:p>
+    <w:p>
+      <w:r>
+        <w:rPr>
+          <w:u w:val="single"/>
+        </w:rPr>
+        <w:t>Apstrāde</w:t>
+      </w:r>
+      <w:r>
+        <w:t xml:space="preserve">: </w:t>
+      </w:r>
+      <w:r>
+        <w:t>Spēlētājs nospiež</w:t>
+      </w:r>
+      <w:r>
+        <w:t xml:space="preserve"> jebkurā citā vietā laukumā un atlase tiek noņemta</w:t>
+      </w:r>
+      <w:r>
+        <w:t xml:space="preserve">, slēpjot </w:t>
+      </w:r>
+      <w:r>
+        <w:t>koriģēšanas logu</w:t>
+      </w:r>
+      <w:r>
+        <w:t>.</w:t>
       </w:r>
     </w:p>
     <w:p>
@@ -5310,7 +5584,52 @@
           <w:b/>
           <w:bCs/>
         </w:rPr>
-        <w:t>Ierīces atlasīšana</w:t>
+        <w:t>Ierīces horizontālā leņķa iestatīšana</w:t>
+      </w:r>
+    </w:p>
+    <w:p>
+      <w:r>
+        <w:rPr>
+          <w:u w:val="single"/>
+        </w:rPr>
+        <w:t>Mērķis</w:t>
+      </w:r>
+      <w:r>
+        <w:t>:</w:t>
+      </w:r>
+      <w:r>
+        <w:t xml:space="preserve"> Mainīt atlasītās ierīces horizontālo leņķi, sākotnēji azimutu, tad leņķi no azimuta pēc ierīces ierobežojumiem</w:t>
+      </w:r>
+    </w:p>
+    <w:p>
+      <w:r>
+        <w:rPr>
+          <w:u w:val="single"/>
+        </w:rPr>
+        <w:t>Ievaddati</w:t>
+      </w:r>
+      <w:r>
+        <w:t xml:space="preserve">: </w:t>
+      </w:r>
+      <w:r>
+        <w:t>Slīdne ar norādīto leņķi.</w:t>
+      </w:r>
+    </w:p>
+    <w:p>
+      <w:r>
+        <w:rPr>
+          <w:u w:val="single"/>
+        </w:rPr>
+        <w:t>Apstrāde</w:t>
+      </w:r>
+      <w:r>
+        <w:t>:</w:t>
+      </w:r>
+      <w:r>
+        <w:t xml:space="preserve"> Turot slīdni, tās ierīces horizontālais leņķis tiek mainīts pēc azimuta laukumā</w:t>
+      </w:r>
+      <w:r>
+        <w:t>.</w:t>
       </w:r>
     </w:p>
     <w:p>
@@ -5330,7 +5649,53 @@
           <w:b/>
           <w:bCs/>
         </w:rPr>
-        <w:t>Ierīces atlases noņemšana</w:t>
+        <w:lastRenderedPageBreak/>
+        <w:t>Ierīces vertikālā leņķa iestatīšana</w:t>
+      </w:r>
+    </w:p>
+    <w:p>
+      <w:r>
+        <w:rPr>
+          <w:u w:val="single"/>
+        </w:rPr>
+        <w:t>Mērķis</w:t>
+      </w:r>
+      <w:r>
+        <w:t xml:space="preserve">: Mainīt atlasītās ierīces </w:t>
+      </w:r>
+      <w:r>
+        <w:t xml:space="preserve">vertikālo </w:t>
+      </w:r>
+      <w:r>
+        <w:t>leņķi pēc ierīces ierobežojumiem</w:t>
+      </w:r>
+    </w:p>
+    <w:p>
+      <w:r>
+        <w:rPr>
+          <w:u w:val="single"/>
+        </w:rPr>
+        <w:t>Ievaddati</w:t>
+      </w:r>
+      <w:r>
+        <w:t>: Slīdne ar norādīto leņķi.</w:t>
+      </w:r>
+    </w:p>
+    <w:p>
+      <w:r>
+        <w:rPr>
+          <w:u w:val="single"/>
+        </w:rPr>
+        <w:t>Apstrāde</w:t>
+      </w:r>
+      <w:r>
+        <w:t>: Turot slīdni, tās ierīces</w:t>
+      </w:r>
+      <w:r>
+        <w:t xml:space="preserve"> vertikālais </w:t>
+      </w:r>
+      <w:r>
+        <w:t>leņķis tiek mainīts pēc azimuta laukumā.</w:t>
       </w:r>
     </w:p>
     <w:p>
@@ -5350,7 +5715,60 @@
           <w:b/>
           <w:bCs/>
         </w:rPr>
-        <w:t>Ierīces horizontālā leņķa iestatīšana</w:t>
+        <w:t>Pārvirze uz uguņošanu</w:t>
+      </w:r>
+    </w:p>
+    <w:p>
+      <w:r>
+        <w:rPr>
+          <w:u w:val="single"/>
+        </w:rPr>
+        <w:t>Mērķis</w:t>
+      </w:r>
+      <w:r>
+        <w:t xml:space="preserve">: </w:t>
+      </w:r>
+      <w:r>
+        <w:t>Pārvirzīt uz uguņošanas stadiju pēc ierīču koriģēšanas.</w:t>
+      </w:r>
+    </w:p>
+    <w:p>
+      <w:r>
+        <w:rPr>
+          <w:u w:val="single"/>
+        </w:rPr>
+        <w:t>Ievaddati</w:t>
+      </w:r>
+      <w:r>
+        <w:t xml:space="preserve">: </w:t>
+      </w:r>
+      <w:r>
+        <w:t>Poga uz pārvirzi “Fire!”;</w:t>
+      </w:r>
+    </w:p>
+    <w:p>
+      <w:r>
+        <w:rPr>
+          <w:u w:val="single"/>
+        </w:rPr>
+        <w:t>Apstrāde</w:t>
+      </w:r>
+      <w:r>
+        <w:t>:</w:t>
+      </w:r>
+      <w:r>
+        <w:t xml:space="preserve"> Pārvirze uz uguņošanas stadiju</w:t>
+      </w:r>
+      <w:r>
+        <w:t>.</w:t>
+      </w:r>
+    </w:p>
+    <w:p>
+      <w:pPr>
+        <w:pStyle w:val="Heading4"/>
+      </w:pPr>
+      <w:r>
+        <w:t>Uguņošana</w:t>
       </w:r>
     </w:p>
     <w:p>
@@ -5370,7 +5788,77 @@
           <w:b/>
           <w:bCs/>
         </w:rPr>
-        <w:t>Ierīces vertikālā leņķa iestatīšana</w:t>
+        <w:t>Uguņošana</w:t>
+      </w:r>
+    </w:p>
+    <w:p>
+      <w:r>
+        <w:rPr>
+          <w:u w:val="single"/>
+        </w:rPr>
+        <w:t>Mērķis</w:t>
+      </w:r>
+      <w:r>
+        <w:t>:</w:t>
+      </w:r>
+      <w:r>
+        <w:t xml:space="preserve"> Veikt spēlētāja un pretinieka ierīces uguņošanu, </w:t>
+      </w:r>
+      <w:r>
+        <w:t>šaujot lādiņus un iznīcinot objektus, kur pieskaras lādiņi</w:t>
+      </w:r>
+      <w:r>
+        <w:t>.</w:t>
+      </w:r>
+    </w:p>
+    <w:p>
+      <w:r>
+        <w:rPr>
+          <w:u w:val="single"/>
+        </w:rPr>
+        <w:t>Apstrāde</w:t>
+      </w:r>
+      <w:r>
+        <w:t>:</w:t>
+      </w:r>
+    </w:p>
+    <w:p>
+      <w:pPr>
+        <w:pStyle w:val="ListParagraph"/>
+        <w:numPr>
+          <w:ilvl w:val="0"/>
+          <w:numId w:val="19"/>
+        </w:numPr>
+      </w:pPr>
+      <w:r>
+        <w:t>Spēlētāja ierīces šauj lādiņus, kuras nolaižas un iznīcina ierīces;</w:t>
+      </w:r>
+    </w:p>
+    <w:p>
+      <w:pPr>
+        <w:pStyle w:val="ListParagraph"/>
+        <w:numPr>
+          <w:ilvl w:val="0"/>
+          <w:numId w:val="19"/>
+        </w:numPr>
+      </w:pPr>
+      <w:r>
+        <w:t>Kad spēlētāja lādiņi tiek nolaisti, tad pretinieka ierīces šauj lādiņus, kuras var iznīcināt spēlētāja ierīces</w:t>
+      </w:r>
+      <w:r>
+        <w:t>;</w:t>
+      </w:r>
+    </w:p>
+    <w:p>
+      <w:pPr>
+        <w:pStyle w:val="ListParagraph"/>
+        <w:numPr>
+          <w:ilvl w:val="0"/>
+          <w:numId w:val="19"/>
+        </w:numPr>
+      </w:pPr>
+      <w:r>
+        <w:t>Tad tiek veikta uzvaras nosacījumu pārbaude.</w:t>
       </w:r>
     </w:p>
     <w:p>
@@ -5390,7 +5878,136 @@
           <w:b/>
           <w:bCs/>
         </w:rPr>
-        <w:t>Pārvirze uz uguņošanu</w:t>
+        <w:t>Uzvaras</w:t>
+      </w:r>
+      <w:r>
+        <w:rPr>
+          <w:b/>
+          <w:bCs/>
+        </w:rPr>
+        <w:t xml:space="preserve"> nosacījumu</w:t>
+      </w:r>
+      <w:r>
+        <w:rPr>
+          <w:b/>
+          <w:bCs/>
+        </w:rPr>
+        <w:t xml:space="preserve"> pārbaude</w:t>
+      </w:r>
+    </w:p>
+    <w:p>
+      <w:r>
+        <w:rPr>
+          <w:u w:val="single"/>
+        </w:rPr>
+        <w:t>Mērķis</w:t>
+      </w:r>
+      <w:r>
+        <w:t xml:space="preserve">: </w:t>
+      </w:r>
+      <w:r>
+        <w:t>Pārbaudīt, vai pēc uguņošanas līmeņa nosacītie uzdevumi tika izpildīti</w:t>
+      </w:r>
+      <w:r>
+        <w:t>.</w:t>
+      </w:r>
+    </w:p>
+    <w:p>
+      <w:r>
+        <w:rPr>
+          <w:u w:val="single"/>
+        </w:rPr>
+        <w:t>Apstrāde</w:t>
+      </w:r>
+      <w:r>
+        <w:t>:</w:t>
+      </w:r>
+    </w:p>
+    <w:p>
+      <w:pPr>
+        <w:pStyle w:val="ListParagraph"/>
+        <w:numPr>
+          <w:ilvl w:val="0"/>
+          <w:numId w:val="20"/>
+        </w:numPr>
+      </w:pPr>
+      <w:r>
+        <w:t xml:space="preserve">Pārbauda, vai </w:t>
+      </w:r>
+      <w:r>
+        <w:t xml:space="preserve">taimeris </w:t>
+      </w:r>
+      <w:r>
+        <w:t xml:space="preserve">vēl nav </w:t>
+      </w:r>
+      <w:r>
+        <w:t xml:space="preserve">beidzis </w:t>
+      </w:r>
+      <w:r>
+        <w:t>savu darbību pēc laika limita</w:t>
+      </w:r>
+      <w:r>
+        <w:t>;</w:t>
+      </w:r>
+    </w:p>
+    <w:p>
+      <w:pPr>
+        <w:pStyle w:val="ListParagraph"/>
+        <w:numPr>
+          <w:ilvl w:val="0"/>
+          <w:numId w:val="20"/>
+        </w:numPr>
+      </w:pPr>
+      <w:r>
+        <w:t>Pārbauda, vai spēlētājam vēl ir izmantojamas ierīces pēc pretinieka uguns;</w:t>
+      </w:r>
+    </w:p>
+    <w:p>
+      <w:pPr>
+        <w:pStyle w:val="ListParagraph"/>
+        <w:numPr>
+          <w:ilvl w:val="0"/>
+          <w:numId w:val="20"/>
+        </w:numPr>
+      </w:pPr>
+      <w:r>
+        <w:t>Pārbauda, vai norādītie mērķi tika iznīcināti;</w:t>
+      </w:r>
+    </w:p>
+    <w:p>
+      <w:pPr>
+        <w:pStyle w:val="ListParagraph"/>
+        <w:numPr>
+          <w:ilvl w:val="0"/>
+          <w:numId w:val="20"/>
+        </w:numPr>
+      </w:pPr>
+      <w:r>
+        <w:t>Ja visi šie nosacījumu ir patiesi, tad pārvirze uz beigu stadiju ar uzvaras logu;</w:t>
+      </w:r>
+    </w:p>
+    <w:p>
+      <w:pPr>
+        <w:pStyle w:val="ListParagraph"/>
+        <w:numPr>
+          <w:ilvl w:val="0"/>
+          <w:numId w:val="20"/>
+        </w:numPr>
+      </w:pPr>
+      <w:r>
+        <w:t>Ja tikai pirmie divi nosacījumi ir patiesi, tad pārvirze uz ierīču koriģēšanas stadiju;</w:t>
+      </w:r>
+    </w:p>
+    <w:p>
+      <w:pPr>
+        <w:pStyle w:val="ListParagraph"/>
+        <w:numPr>
+          <w:ilvl w:val="0"/>
+          <w:numId w:val="20"/>
+        </w:numPr>
+      </w:pPr>
+      <w:r>
+        <w:t>Citādi pārvirze uz beigu stadiju ar zaudēšanas logu.</w:t>
       </w:r>
     </w:p>
     <w:p>
@@ -5398,7 +6015,7 @@
         <w:pStyle w:val="Heading4"/>
       </w:pPr>
       <w:r>
-        <w:t>Uguņošana</w:t>
+        <w:t>Beigas</w:t>
       </w:r>
     </w:p>
     <w:p>
@@ -5418,8 +6035,47 @@
           <w:b/>
           <w:bCs/>
         </w:rPr>
-        <w:t>Uguņošana</w:t>
-      </w:r>
+        <w:t>Beigas</w:t>
+      </w:r>
+    </w:p>
+    <w:p>
+      <w:r>
+        <w:rPr>
+          <w:u w:val="single"/>
+        </w:rPr>
+        <w:t>Mērķis</w:t>
+      </w:r>
+      <w:r>
+        <w:t xml:space="preserve">: </w:t>
+      </w:r>
+      <w:r>
+        <w:t>Rādīt lietotājam iespējas pēc spēles beigas</w:t>
+      </w:r>
+      <w:r>
+        <w:t>.</w:t>
+      </w:r>
+    </w:p>
+    <w:p>
+      <w:r>
+        <w:rPr>
+          <w:u w:val="single"/>
+        </w:rPr>
+        <w:t>Izvaddati</w:t>
+      </w:r>
+      <w:r>
+        <w:t xml:space="preserve">: </w:t>
+      </w:r>
+      <w:r>
+        <w:t>Uzvaras vai zaudēšanas logs</w:t>
+      </w:r>
+      <w:r>
+        <w:t>.</w:t>
+      </w:r>
+    </w:p>
+    <w:p>
+      <w:pPr>
+        <w:ind w:firstLine="0"/>
+      </w:pPr>
     </w:p>
     <w:p>
       <w:pPr>
@@ -5438,21 +6094,49 @@
           <w:b/>
           <w:bCs/>
         </w:rPr>
-        <w:t>Uzvaras</w:t>
-      </w:r>
-      <w:r>
+        <w:lastRenderedPageBreak/>
+        <w:t>Uzvaras logs</w:t>
+      </w:r>
+    </w:p>
+    <w:p>
+      <w:r>
+        <w:rPr>
+          <w:u w:val="single"/>
+        </w:rPr>
+        <w:t>Mērķis</w:t>
+      </w:r>
+      <w:r>
+        <w:t xml:space="preserve">: </w:t>
+      </w:r>
+      <w:r>
+        <w:t xml:space="preserve">Informēt spēlētājam par spēles </w:t>
+      </w:r>
+      <w:r>
+        <w:t>uzvaru</w:t>
+      </w:r>
+      <w:r>
+        <w:t>.</w:t>
+      </w:r>
+    </w:p>
+    <w:p>
+      <w:pPr>
+        <w:ind w:left="131" w:firstLine="720"/>
         <w:rPr>
           <w:b/>
           <w:bCs/>
         </w:rPr>
-        <w:t xml:space="preserve"> nosacījumu</w:t>
-      </w:r>
-      <w:r>
-        <w:rPr>
-          <w:b/>
-          <w:bCs/>
-        </w:rPr>
-        <w:t xml:space="preserve"> pārbaude</w:t>
+      </w:pPr>
+      <w:r>
+        <w:rPr>
+          <w:u w:val="single"/>
+        </w:rPr>
+        <w:t>Izvaddati</w:t>
+      </w:r>
+      <w:r>
+        <w:t xml:space="preserve">: Uzvaras </w:t>
+      </w:r>
+      <w:r>
+        <w:t>logs un pārvirze uz līmeņu atlases logu.</w:t>
       </w:r>
     </w:p>
     <w:p>
@@ -5472,15 +6156,36 @@
           <w:b/>
           <w:bCs/>
         </w:rPr>
-        <w:t>Pārvirze uz ierīču koriģēšanu</w:t>
-      </w:r>
-    </w:p>
-    <w:p>
-      <w:pPr>
-        <w:pStyle w:val="Heading4"/>
-      </w:pPr>
-      <w:r>
-        <w:t>Beigas</w:t>
+        <w:t>Zaudēšanas logs</w:t>
+      </w:r>
+    </w:p>
+    <w:p>
+      <w:r>
+        <w:rPr>
+          <w:u w:val="single"/>
+        </w:rPr>
+        <w:t>Mērķis</w:t>
+      </w:r>
+      <w:r>
+        <w:t>: Informēt spēlētājam par spēles uzvaru.</w:t>
+      </w:r>
+    </w:p>
+    <w:p>
+      <w:pPr>
+        <w:ind w:left="131" w:firstLine="720"/>
+        <w:rPr>
+          <w:b/>
+          <w:bCs/>
+        </w:rPr>
+      </w:pPr>
+      <w:r>
+        <w:rPr>
+          <w:u w:val="single"/>
+        </w:rPr>
+        <w:t>Izvaddati</w:t>
+      </w:r>
+      <w:r>
+        <w:t>: Uzvaras logs un pārvirze uz līmeņu atlases logu.</w:t>
       </w:r>
     </w:p>
     <w:p>
@@ -5500,7 +6205,45 @@
           <w:b/>
           <w:bCs/>
         </w:rPr>
-        <w:t>Beigas</w:t>
+        <w:t>Pārvirze uz līmeņu atlas</w:t>
+      </w:r>
+      <w:r>
+        <w:rPr>
+          <w:b/>
+          <w:bCs/>
+        </w:rPr>
+        <w:t>i</w:t>
+      </w:r>
+    </w:p>
+    <w:p>
+      <w:r>
+        <w:rPr>
+          <w:u w:val="single"/>
+        </w:rPr>
+        <w:t>Mērķis</w:t>
+      </w:r>
+      <w:r>
+        <w:t xml:space="preserve">: </w:t>
+      </w:r>
+      <w:r>
+        <w:t>Pārvirzīt uz līmeņu atlases ainu</w:t>
+      </w:r>
+      <w:r>
+        <w:t>.</w:t>
+      </w:r>
+    </w:p>
+    <w:p>
+      <w:pPr>
+        <w:ind w:left="131" w:firstLine="720"/>
+      </w:pPr>
+      <w:r>
+        <w:rPr>
+          <w:u w:val="single"/>
+        </w:rPr>
+        <w:t>Apstrāde</w:t>
+      </w:r>
+      <w:r>
+        <w:t>:</w:t>
       </w:r>
     </w:p>
     <w:p>
@@ -5508,7 +6251,7 @@
         <w:pStyle w:val="ListParagraph"/>
         <w:numPr>
           <w:ilvl w:val="0"/>
-          <w:numId w:val="5"/>
+          <w:numId w:val="21"/>
         </w:numPr>
         <w:rPr>
           <w:b/>
@@ -5516,11 +6259,7 @@
         </w:rPr>
       </w:pPr>
       <w:r>
-        <w:rPr>
-          <w:b/>
-          <w:bCs/>
-        </w:rPr>
-        <w:t>Uzvaras logs</w:t>
+        <w:t>Ja logs ir uzvaras logs, dati tiek saglabāti un nākošais līmenis tiek atbloķēts\</w:t>
       </w:r>
     </w:p>
     <w:p>
@@ -5528,7 +6267,7 @@
         <w:pStyle w:val="ListParagraph"/>
         <w:numPr>
           <w:ilvl w:val="0"/>
-          <w:numId w:val="5"/>
+          <w:numId w:val="21"/>
         </w:numPr>
         <w:rPr>
           <w:b/>
@@ -5536,50 +6275,23 @@
         </w:rPr>
       </w:pPr>
       <w:r>
+        <w:t>Citādi vienkārša pārvirze uz līmeņu atlass ainu pēc zaudēšanas.</w:t>
+      </w:r>
+    </w:p>
+    <w:p>
+      <w:pPr>
+        <w:ind w:firstLine="0"/>
         <w:rPr>
           <w:b/>
           <w:bCs/>
         </w:rPr>
-        <w:t>Zaudēšanas logs</w:t>
-      </w:r>
-    </w:p>
-    <w:p>
-      <w:pPr>
-        <w:pStyle w:val="ListParagraph"/>
-        <w:numPr>
-          <w:ilvl w:val="0"/>
-          <w:numId w:val="5"/>
-        </w:numPr>
-      </w:pPr>
-      <w:r>
-        <w:rPr>
-          <w:b/>
-          <w:bCs/>
-        </w:rPr>
-        <w:t>Pārvirze uz līmeņu atlas</w:t>
-      </w:r>
-      <w:r>
-        <w:rPr>
-          <w:b/>
-          <w:bCs/>
-        </w:rPr>
-        <w:t>i</w:t>
-      </w:r>
-    </w:p>
-    <w:p>
-      <w:pPr>
-        <w:ind w:firstLine="0"/>
-        <w:rPr>
-          <w:b/>
-          <w:bCs/>
-        </w:rPr>
       </w:pPr>
     </w:p>
     <w:p>
       <w:pPr>
         <w:pStyle w:val="Heading2"/>
       </w:pPr>
-      <w:bookmarkStart w:id="13" w:name="_Toc225717448"/>
+      <w:bookmarkStart w:id="13" w:name="_Toc225723237"/>
       <w:r>
         <w:t>Nefunkcionālās prasības</w:t>
       </w:r>
@@ -5589,7 +6301,7 @@
       <w:pPr>
         <w:pStyle w:val="Heading3"/>
       </w:pPr>
-      <w:bookmarkStart w:id="14" w:name="_Toc225717449"/>
+      <w:bookmarkStart w:id="14" w:name="_Toc225723238"/>
       <w:r>
         <w:t>Palaišana un veiktspēja</w:t>
       </w:r>
@@ -5626,9 +6338,8 @@
       <w:pPr>
         <w:pStyle w:val="Heading3"/>
       </w:pPr>
-      <w:bookmarkStart w:id="15" w:name="_Toc225717450"/>
-      <w:r>
-        <w:lastRenderedPageBreak/>
+      <w:bookmarkStart w:id="15" w:name="_Toc225723239"/>
+      <w:r>
         <w:t>Saskarsne</w:t>
       </w:r>
       <w:bookmarkEnd w:id="15"/>
@@ -5648,7 +6359,15 @@
       </w:r>
       <w:r>
         <w:tab/>
-        <w:t>Datorspēles grafikai un lietotāja saskarnei jābūt minimālai, taču viegli pārskatāmai;</w:t>
+        <w:t xml:space="preserve">Datorspēles grafikai un lietotāja </w:t>
+      </w:r>
+      <w:proofErr w:type="spellStart"/>
+      <w:r>
+        <w:t>saskarnei</w:t>
+      </w:r>
+      <w:proofErr w:type="spellEnd"/>
+      <w:r>
+        <w:t xml:space="preserve"> jābūt minimālai, taču viegli pārskatāmai;</w:t>
       </w:r>
     </w:p>
     <w:p>
@@ -5657,7 +6376,15 @@
       </w:r>
       <w:r>
         <w:tab/>
-        <w:t>Darbības ar klaviatūru ir jābūt norādītas lietotāja saskarnē;</w:t>
+        <w:t xml:space="preserve">Darbības ar klaviatūru ir jābūt norādītas lietotāja </w:t>
+      </w:r>
+      <w:proofErr w:type="spellStart"/>
+      <w:r>
+        <w:t>saskarnē</w:t>
+      </w:r>
+      <w:proofErr w:type="spellEnd"/>
+      <w:r>
+        <w:t>;</w:t>
       </w:r>
     </w:p>
     <w:p>
@@ -5666,7 +6393,15 @@
       </w:r>
       <w:r>
         <w:tab/>
-        <w:t>Lietotāja saskarnei ir jābūt pielāgojamai dažādos ekrānu izmēros vai izšķirtspējās;</w:t>
+        <w:t xml:space="preserve">Lietotāja </w:t>
+      </w:r>
+      <w:proofErr w:type="spellStart"/>
+      <w:r>
+        <w:t>saskarnei</w:t>
+      </w:r>
+      <w:proofErr w:type="spellEnd"/>
+      <w:r>
+        <w:t xml:space="preserve"> ir jābūt pielāgojamai dažādos ekrānu izmēros vai izšķirtspējās;</w:t>
       </w:r>
     </w:p>
     <w:p>
@@ -5675,14 +6410,22 @@
       </w:r>
       <w:r>
         <w:tab/>
-        <w:t>Datorspēles saskarnes valodai jābūt angļu valodai;</w:t>
+        <w:t xml:space="preserve">Datorspēles </w:t>
+      </w:r>
+      <w:proofErr w:type="spellStart"/>
+      <w:r>
+        <w:t>saskarnes</w:t>
+      </w:r>
+      <w:proofErr w:type="spellEnd"/>
+      <w:r>
+        <w:t xml:space="preserve"> valodai jābūt angļu valodai;</w:t>
       </w:r>
     </w:p>
     <w:p>
       <w:pPr>
         <w:pStyle w:val="Heading3"/>
       </w:pPr>
-      <w:bookmarkStart w:id="16" w:name="_Toc225717451"/>
+      <w:bookmarkStart w:id="16" w:name="_Toc225723240"/>
       <w:r>
         <w:t>Datu drošība</w:t>
       </w:r>
@@ -5699,6 +6442,7 @@
     </w:p>
     <w:p>
       <w:r>
+        <w:lastRenderedPageBreak/>
         <w:t>10)</w:t>
       </w:r>
       <w:r>
@@ -5719,7 +6463,7 @@
       <w:pPr>
         <w:pStyle w:val="Heading2"/>
       </w:pPr>
-      <w:bookmarkStart w:id="17" w:name="_Toc225717452"/>
+      <w:bookmarkStart w:id="17" w:name="_Toc225723241"/>
       <w:r>
         <w:t>Gala lietotāja rakstura iezīmes</w:t>
       </w:r>
@@ -5752,7 +6496,7 @@
       <w:pPr>
         <w:pStyle w:val="Heading1"/>
       </w:pPr>
-      <w:bookmarkStart w:id="18" w:name="_Toc225717453"/>
+      <w:bookmarkStart w:id="18" w:name="_Toc225723242"/>
       <w:r>
         <w:lastRenderedPageBreak/>
         <w:t>Izstrādes līdzekļu, rīku apraksts un izvēles pamatojums</w:t>
@@ -5774,7 +6518,7 @@
       <w:pPr>
         <w:pStyle w:val="Heading2"/>
       </w:pPr>
-      <w:bookmarkStart w:id="19" w:name="_Toc225717454"/>
+      <w:bookmarkStart w:id="19" w:name="_Toc225723243"/>
       <w:r>
         <w:t>Izvēlēto risinājuma līdzekļu un valodu aprakst</w:t>
       </w:r>
@@ -5787,7 +6531,7 @@
       <w:pPr>
         <w:pStyle w:val="Heading3"/>
       </w:pPr>
-      <w:bookmarkStart w:id="20" w:name="_Toc225717455"/>
+      <w:bookmarkStart w:id="20" w:name="_Toc225723244"/>
       <w:r>
         <w:t>Ietvars</w:t>
       </w:r>
@@ -5820,7 +6564,7 @@
       <w:pPr>
         <w:pStyle w:val="Heading3"/>
       </w:pPr>
-      <w:bookmarkStart w:id="21" w:name="_Toc225717456"/>
+      <w:bookmarkStart w:id="21" w:name="_Toc225723245"/>
       <w:r>
         <w:t>Valoda</w:t>
       </w:r>
@@ -5841,7 +6585,7 @@
       <w:pPr>
         <w:pStyle w:val="Heading3"/>
       </w:pPr>
-      <w:bookmarkStart w:id="22" w:name="_Toc225717457"/>
+      <w:bookmarkStart w:id="22" w:name="_Toc225723246"/>
       <w:r>
         <w:t>Izstrādes vide</w:t>
       </w:r>
@@ -5849,7 +6593,47 @@
     </w:p>
     <w:p>
       <w:r>
-        <w:t xml:space="preserve">“JetBrains Rider” ir izstrādes vide, kura no “JetBrains” produkta klāsta ir īpaši pielāgota “.NET” ietvaram, kura iekļauj izvēlēto “C#” valodu. Šīs izstrādes vides funkcionalitāte piedāvā advancētu pirmkoda analīzi, jau iebūvētu atkļūdošanu, automātisko kodu aizpildīšanu (ang. val. “Code completion”) un tā tālāk, taču tās programmatūras licencēšana prasa izmaksas komerciālā un profesionālā vidē un jebkuram lietotājam reģistrēties. Neskatoties no licencēšanas, kura nepiepilda </w:t>
+        <w:t>“</w:t>
+      </w:r>
+      <w:proofErr w:type="spellStart"/>
+      <w:r>
+        <w:t>JetBrains</w:t>
+      </w:r>
+      <w:proofErr w:type="spellEnd"/>
+      <w:r>
+        <w:t xml:space="preserve"> </w:t>
+      </w:r>
+      <w:proofErr w:type="spellStart"/>
+      <w:r>
+        <w:t>Rider</w:t>
+      </w:r>
+      <w:proofErr w:type="spellEnd"/>
+      <w:r>
+        <w:t>” ir izstrādes vide, kura no “</w:t>
+      </w:r>
+      <w:proofErr w:type="spellStart"/>
+      <w:r>
+        <w:t>JetBrains</w:t>
+      </w:r>
+      <w:proofErr w:type="spellEnd"/>
+      <w:r>
+        <w:t>” produkta klāsta ir īpaši pielāgota “.NET” ietvaram, kura iekļauj izvēlēto “C#” valodu. Šīs izstrādes vides funkcionalitāte piedāvā advancētu pirmkoda analīzi, jau iebūvētu atkļūdošanu, automātisko kodu aizpildīšanu (</w:t>
+      </w:r>
+      <w:proofErr w:type="spellStart"/>
+      <w:r>
+        <w:t>ang</w:t>
+      </w:r>
+      <w:proofErr w:type="spellEnd"/>
+      <w:r>
+        <w:t xml:space="preserve">. val. “Code </w:t>
+      </w:r>
+      <w:proofErr w:type="spellStart"/>
+      <w:r>
+        <w:t>completion</w:t>
+      </w:r>
+      <w:proofErr w:type="spellEnd"/>
+      <w:r>
+        <w:t xml:space="preserve">”) un tā tālāk, taču tās programmatūras licencēšana prasa izmaksas komerciālā un profesionālā vidē un jebkuram lietotājam reģistrēties. Neskatoties no licencēšanas, kura nepiepilda </w:t>
       </w:r>
       <w:r>
         <w:lastRenderedPageBreak/>
@@ -5860,7 +6644,7 @@
       <w:pPr>
         <w:pStyle w:val="Heading3"/>
       </w:pPr>
-      <w:bookmarkStart w:id="23" w:name="_Toc225717458"/>
+      <w:bookmarkStart w:id="23" w:name="_Toc225723247"/>
       <w:r>
         <w:t>Versiju kontrole un repozitorijas mitināšana</w:t>
       </w:r>
@@ -5868,14 +6652,24 @@
     </w:p>
     <w:p>
       <w:r>
-        <w:t>“Git” tiks izmantots versiju kontrolei un tīmeklī tiks izmantots ”</w:t>
+        <w:t>“</w:t>
+      </w:r>
+      <w:proofErr w:type="spellStart"/>
+      <w:r>
+        <w:t>Git</w:t>
+      </w:r>
+      <w:proofErr w:type="spellEnd"/>
+      <w:r>
+        <w:t>” tiks izmantots versiju kontrolei un tīmeklī tiks izmantots ”</w:t>
       </w:r>
       <w:r>
         <w:t xml:space="preserve"> </w:t>
       </w:r>
+      <w:proofErr w:type="spellStart"/>
       <w:r>
         <w:t>GitHub</w:t>
       </w:r>
+      <w:proofErr w:type="spellEnd"/>
       <w:r>
         <w:t>”, lai mitinātu šo projekta avotkodu.</w:t>
       </w:r>
@@ -5884,7 +6678,7 @@
       <w:pPr>
         <w:pStyle w:val="Heading2"/>
       </w:pPr>
-      <w:bookmarkStart w:id="24" w:name="_Toc225717459"/>
+      <w:bookmarkStart w:id="24" w:name="_Toc225723248"/>
       <w:r>
         <w:t>Iespējamo risinājuma līdzekļu un valodu apraksts</w:t>
       </w:r>
@@ -5899,7 +6693,7 @@
       <w:pPr>
         <w:pStyle w:val="Heading3"/>
       </w:pPr>
-      <w:bookmarkStart w:id="25" w:name="_Toc225717460"/>
+      <w:bookmarkStart w:id="25" w:name="_Toc225723249"/>
       <w:r>
         <w:t>Ietvari</w:t>
       </w:r>
@@ -5907,14 +6701,110 @@
     </w:p>
     <w:p>
       <w:r>
-        <w:t>Populārākos ietvarus datorspēļu un citu mediju izstrādē iekļauj “Unity”, “Unreal Engine”,  “CryEngine”. Ietvari “Unreal Engine” un “CryEngine” nav pielāgoti divdimensiju datorspēļu izveidei ietvara ierobežojumu dēļ, kura no tās izslēdz izmantošanu, ja ne arī neprasa veiktspējīgu datorsistēmu, kura ir pretrunā ar projekta mērķiem, taču “Unity” ietvars neprasa salīdzinoši veiktspējīgu datorsistēmu un ir pielāgojama divdimensiju videi, taču licencēšana nav brīva un prasa lietotāja reģistrāciju un papildizmaksas, ja šis projekts paplašināties komercdarbības nolūkiem.</w:t>
+        <w:t>Populārākos ietvarus datorspēļu un citu mediju izstrādē iekļauj “</w:t>
+      </w:r>
+      <w:proofErr w:type="spellStart"/>
+      <w:r>
+        <w:t>Unity</w:t>
+      </w:r>
+      <w:proofErr w:type="spellEnd"/>
+      <w:r>
+        <w:t>”, “</w:t>
+      </w:r>
+      <w:proofErr w:type="spellStart"/>
+      <w:r>
+        <w:t>Unreal</w:t>
+      </w:r>
+      <w:proofErr w:type="spellEnd"/>
+      <w:r>
+        <w:t xml:space="preserve"> </w:t>
+      </w:r>
+      <w:proofErr w:type="spellStart"/>
+      <w:r>
+        <w:t>Engine</w:t>
+      </w:r>
+      <w:proofErr w:type="spellEnd"/>
+      <w:r>
+        <w:t>”,  “</w:t>
+      </w:r>
+      <w:proofErr w:type="spellStart"/>
+      <w:r>
+        <w:t>CryEngine</w:t>
+      </w:r>
+      <w:proofErr w:type="spellEnd"/>
+      <w:r>
+        <w:t>”. Ietvari “</w:t>
+      </w:r>
+      <w:proofErr w:type="spellStart"/>
+      <w:r>
+        <w:t>Unreal</w:t>
+      </w:r>
+      <w:proofErr w:type="spellEnd"/>
+      <w:r>
+        <w:t xml:space="preserve"> </w:t>
+      </w:r>
+      <w:proofErr w:type="spellStart"/>
+      <w:r>
+        <w:t>Engine</w:t>
+      </w:r>
+      <w:proofErr w:type="spellEnd"/>
+      <w:r>
+        <w:t>” un “</w:t>
+      </w:r>
+      <w:proofErr w:type="spellStart"/>
+      <w:r>
+        <w:t>CryEngine</w:t>
+      </w:r>
+      <w:proofErr w:type="spellEnd"/>
+      <w:r>
+        <w:t xml:space="preserve">” nav pielāgoti </w:t>
+      </w:r>
+      <w:proofErr w:type="spellStart"/>
+      <w:r>
+        <w:t>divdimensiju</w:t>
+      </w:r>
+      <w:proofErr w:type="spellEnd"/>
+      <w:r>
+        <w:t xml:space="preserve"> datorspēļu izveidei ietvara ierobežojumu dēļ, kura no tās izslēdz izmantošanu, ja ne arī neprasa </w:t>
+      </w:r>
+      <w:proofErr w:type="spellStart"/>
+      <w:r>
+        <w:t>veiktspējīgu</w:t>
+      </w:r>
+      <w:proofErr w:type="spellEnd"/>
+      <w:r>
+        <w:t xml:space="preserve"> datorsistēmu, kura ir pretrunā ar projekta mērķiem, taču “</w:t>
+      </w:r>
+      <w:proofErr w:type="spellStart"/>
+      <w:r>
+        <w:t>Unity</w:t>
+      </w:r>
+      <w:proofErr w:type="spellEnd"/>
+      <w:r>
+        <w:t xml:space="preserve">” ietvars neprasa salīdzinoši </w:t>
+      </w:r>
+      <w:proofErr w:type="spellStart"/>
+      <w:r>
+        <w:t>veiktspējīgu</w:t>
+      </w:r>
+      <w:proofErr w:type="spellEnd"/>
+      <w:r>
+        <w:t xml:space="preserve"> datorsistēmu un ir pielāgojama </w:t>
+      </w:r>
+      <w:proofErr w:type="spellStart"/>
+      <w:r>
+        <w:t>divdimensiju</w:t>
+      </w:r>
+      <w:proofErr w:type="spellEnd"/>
+      <w:r>
+        <w:t xml:space="preserve"> videi, taču licencēšana nav brīva un prasa lietotāja reģistrāciju un papildizmaksas, ja šis projekts paplašināties komercdarbības nolūkiem.</w:t>
       </w:r>
     </w:p>
     <w:p>
       <w:pPr>
         <w:pStyle w:val="Heading3"/>
       </w:pPr>
-      <w:bookmarkStart w:id="26" w:name="_Toc225717461"/>
+      <w:bookmarkStart w:id="26" w:name="_Toc225723250"/>
       <w:r>
         <w:t>Valodas</w:t>
       </w:r>
@@ -5922,7 +6812,47 @@
     </w:p>
     <w:p>
       <w:r>
-        <w:t>Ietvari “CryEngine” un “Unreal Engine” izmanto valodu “C++”, kurā iekļauj klases un objektorientētā funkcionalitāte kā C#, taču neatlasot šos ietvarus valoda “C++” netiks izmantota. “C++” lietojuma stili ir plašāki, taču valodas funkcionalitāti un īpatnības apgūt ir sarežģītāk nekā ar “C#”, kura izstrādātājam liek lietot objektorientētā stilā, kurā visi elementi valodā ir objekti, kā arī vairums funkcionalitātes ir aizklātas ar metodēm, kura mazina izstrādes laiku salīdzinot ar “C++”, kura vairākas kompleksas funkcionalitātes nav aizklātas ar metodēm, kura var palēlināt izstrādes laiku. Izvēlētā ietvarā “Godot” ir pieejama skriptēšanas valoda “GDScript”, taču pēc nosacītiem iemesliem izvēlētai valodai šī valoda netiks izmantota.</w:t>
+        <w:t>Ietvari “</w:t>
+      </w:r>
+      <w:proofErr w:type="spellStart"/>
+      <w:r>
+        <w:t>CryEngine</w:t>
+      </w:r>
+      <w:proofErr w:type="spellEnd"/>
+      <w:r>
+        <w:t>” un “</w:t>
+      </w:r>
+      <w:proofErr w:type="spellStart"/>
+      <w:r>
+        <w:t>Unreal</w:t>
+      </w:r>
+      <w:proofErr w:type="spellEnd"/>
+      <w:r>
+        <w:t xml:space="preserve"> </w:t>
+      </w:r>
+      <w:proofErr w:type="spellStart"/>
+      <w:r>
+        <w:t>Engine</w:t>
+      </w:r>
+      <w:proofErr w:type="spellEnd"/>
+      <w:r>
+        <w:t xml:space="preserve">” izmanto valodu “C++”, kurā iekļauj klases un objektorientētā funkcionalitāte kā C#, taču neatlasot šos ietvarus valoda “C++” netiks izmantota. “C++” lietojuma stili ir plašāki, taču valodas funkcionalitāti un īpatnības apgūt ir sarežģītāk nekā ar “C#”, kura izstrādātājam liek lietot objektorientētā stilā, kurā visi elementi valodā ir objekti, kā arī vairums funkcionalitātes ir aizklātas ar metodēm, kura mazina izstrādes laiku salīdzinot ar “C++”, kura vairākas kompleksas funkcionalitātes nav aizklātas ar metodēm, kura var </w:t>
+      </w:r>
+      <w:proofErr w:type="spellStart"/>
+      <w:r>
+        <w:t>palēlināt</w:t>
+      </w:r>
+      <w:proofErr w:type="spellEnd"/>
+      <w:r>
+        <w:t xml:space="preserve"> izstrādes laiku. Izvēlētā ietvarā “Godot” ir pieejama </w:t>
+      </w:r>
+      <w:proofErr w:type="spellStart"/>
+      <w:r>
+        <w:t>skriptēšanas</w:t>
+      </w:r>
+      <w:proofErr w:type="spellEnd"/>
+      <w:r>
+        <w:t xml:space="preserve"> valoda “GDScript”, taču pēc nosacītiem iemesliem izvēlētai valodai šī valoda netiks izmantota.</w:t>
       </w:r>
     </w:p>
     <w:p>
@@ -5940,7 +6870,7 @@
       <w:pPr>
         <w:pStyle w:val="Heading3"/>
       </w:pPr>
-      <w:bookmarkStart w:id="27" w:name="_Toc225717462"/>
+      <w:bookmarkStart w:id="27" w:name="_Toc225723251"/>
       <w:r>
         <w:lastRenderedPageBreak/>
         <w:t>Izstrādes vides</w:t>
@@ -5949,24 +6879,168 @@
     </w:p>
     <w:p>
       <w:r>
-        <w:t>Tā kā valoda “C#” tiks izmantota, kura ir daļa no ietvara “.NET”, tiks izmantoti attiecīgas izstrādes programmatūras ar uzsvaru uz noteikto ietvaru un tās ekosistēmas. Populārākā izstrādes  vide tam ir “Visual Studio”, kura līdzīgi ar izvēlēto izstrādes vidi “JetBrains Rider” iekļauj detalizētu atķļūdošanu, kodu analīze, automātiskā aizpilde, u.t.t., taču netiks izmantota, jo šī programmatūra nav starpplatformu, ierobežojoties uz “Windows” platformu, kuru autors neizmanto, tātad nepieejama programmatūra autoram.</w:t>
-      </w:r>
-    </w:p>
-    <w:p>
-      <w:r>
-        <w:t>Ja ietvars kā “Unreal Engine” tiktu izmantota, kurā galvenā valoda ir “C++”, tiktu izmantotas izstrādes vides attiecīgi valodai kā “Qt Creator”, kura ir pielāgota ietvara “Qt” programmatūras izstrādei, taču iespējams izveidot projektus, kuras neizmanto minēto ietvaru, ņemot vērā to, ka funkcionalitāte un tās iespējas mazinās vai ne tik advancētas citiem projektiem,  vai “JetBrains CLion”, kurai ir līdzīga funkcionalitāte ar atlasīto izstrādes vidi “”JetBrains Rider” no “JetBrains” programmatūru klāsta.</w:t>
-      </w:r>
-    </w:p>
-    <w:p>
-      <w:r>
-        <w:t>Arī iespējams ir izmantot teksta redaktoru “Visual Studio Code”, kura ar paplašinājumiem var izmantot kā izstrādes vidi, taču noklusētā funkcionalitāte ir ierobežota salīdzinot ar iepriekšējām izstrādes programmatūrām un nepieciešama papildus iestatīšana šai programmatūrai, kura nebūtu nepieciešama pārējām izstrādes vidēm atverot sākotnēji.</w:t>
+        <w:t>Tā kā valoda “C#” tiks izmantota, kura ir daļa no ietvara “.NET”, tiks izmantoti attiecīgas izstrādes programmatūras ar uzsvaru uz noteikto ietvaru un tās ekosistēmas. Populārākā izstrādes  vide tam ir “</w:t>
+      </w:r>
+      <w:proofErr w:type="spellStart"/>
+      <w:r>
+        <w:t>Visual</w:t>
+      </w:r>
+      <w:proofErr w:type="spellEnd"/>
+      <w:r>
+        <w:t xml:space="preserve"> </w:t>
+      </w:r>
+      <w:proofErr w:type="spellStart"/>
+      <w:r>
+        <w:t>Studio</w:t>
+      </w:r>
+      <w:proofErr w:type="spellEnd"/>
+      <w:r>
+        <w:t>”, kura līdzīgi ar izvēlēto izstrādes vidi “</w:t>
+      </w:r>
+      <w:proofErr w:type="spellStart"/>
+      <w:r>
+        <w:t>JetBrains</w:t>
+      </w:r>
+      <w:proofErr w:type="spellEnd"/>
+      <w:r>
+        <w:t xml:space="preserve"> </w:t>
+      </w:r>
+      <w:proofErr w:type="spellStart"/>
+      <w:r>
+        <w:t>Rider</w:t>
+      </w:r>
+      <w:proofErr w:type="spellEnd"/>
+      <w:r>
+        <w:t xml:space="preserve">” iekļauj detalizētu </w:t>
+      </w:r>
+      <w:proofErr w:type="spellStart"/>
+      <w:r>
+        <w:t>atķļūdošanu</w:t>
+      </w:r>
+      <w:proofErr w:type="spellEnd"/>
+      <w:r>
+        <w:t>, kodu analīze, automātiskā aizpilde, u.t.t., taču netiks izmantota, jo šī programmatūra nav starpplatformu, ierobežojoties uz “Windows” platformu, kuru autors neizmanto, tātad nepieejama programmatūra autoram.</w:t>
+      </w:r>
+    </w:p>
+    <w:p>
+      <w:r>
+        <w:t>Ja ietvars kā “</w:t>
+      </w:r>
+      <w:proofErr w:type="spellStart"/>
+      <w:r>
+        <w:t>Unreal</w:t>
+      </w:r>
+      <w:proofErr w:type="spellEnd"/>
+      <w:r>
+        <w:t xml:space="preserve"> </w:t>
+      </w:r>
+      <w:proofErr w:type="spellStart"/>
+      <w:r>
+        <w:t>Engine</w:t>
+      </w:r>
+      <w:proofErr w:type="spellEnd"/>
+      <w:r>
+        <w:t>” tiktu izmantota, kurā galvenā valoda ir “C++”, tiktu izmantotas izstrādes vides attiecīgi valodai kā “</w:t>
+      </w:r>
+      <w:proofErr w:type="spellStart"/>
+      <w:r>
+        <w:t>Qt</w:t>
+      </w:r>
+      <w:proofErr w:type="spellEnd"/>
+      <w:r>
+        <w:t xml:space="preserve"> </w:t>
+      </w:r>
+      <w:proofErr w:type="spellStart"/>
+      <w:r>
+        <w:t>Creator</w:t>
+      </w:r>
+      <w:proofErr w:type="spellEnd"/>
+      <w:r>
+        <w:t>”, kura ir pielāgota ietvara “</w:t>
+      </w:r>
+      <w:proofErr w:type="spellStart"/>
+      <w:r>
+        <w:t>Qt</w:t>
+      </w:r>
+      <w:proofErr w:type="spellEnd"/>
+      <w:r>
+        <w:t xml:space="preserve">” programmatūras izstrādei, taču iespējams izveidot projektus, kuras neizmanto minēto ietvaru, ņemot vērā to, ka funkcionalitāte un tās iespējas mazinās vai ne tik </w:t>
+      </w:r>
+      <w:proofErr w:type="spellStart"/>
+      <w:r>
+        <w:t>advancētas</w:t>
+      </w:r>
+      <w:proofErr w:type="spellEnd"/>
+      <w:r>
+        <w:t xml:space="preserve"> citiem projektiem,  vai “</w:t>
+      </w:r>
+      <w:proofErr w:type="spellStart"/>
+      <w:r>
+        <w:t>JetBrains</w:t>
+      </w:r>
+      <w:proofErr w:type="spellEnd"/>
+      <w:r>
+        <w:t xml:space="preserve"> </w:t>
+      </w:r>
+      <w:proofErr w:type="spellStart"/>
+      <w:r>
+        <w:t>CLion</w:t>
+      </w:r>
+      <w:proofErr w:type="spellEnd"/>
+      <w:r>
+        <w:t>”, kurai ir līdzīga funkcionalitāte ar atlasīto izstrādes vidi “”</w:t>
+      </w:r>
+      <w:proofErr w:type="spellStart"/>
+      <w:r>
+        <w:t>JetBrains</w:t>
+      </w:r>
+      <w:proofErr w:type="spellEnd"/>
+      <w:r>
+        <w:t xml:space="preserve"> </w:t>
+      </w:r>
+      <w:proofErr w:type="spellStart"/>
+      <w:r>
+        <w:t>Rider</w:t>
+      </w:r>
+      <w:proofErr w:type="spellEnd"/>
+      <w:r>
+        <w:t>” no “</w:t>
+      </w:r>
+      <w:proofErr w:type="spellStart"/>
+      <w:r>
+        <w:t>JetBrains</w:t>
+      </w:r>
+      <w:proofErr w:type="spellEnd"/>
+      <w:r>
+        <w:t>” programmatūru klāsta.</w:t>
+      </w:r>
+    </w:p>
+    <w:p>
+      <w:r>
+        <w:t>Arī iespējams ir izmantot teksta redaktoru “</w:t>
+      </w:r>
+      <w:proofErr w:type="spellStart"/>
+      <w:r>
+        <w:t>Visual</w:t>
+      </w:r>
+      <w:proofErr w:type="spellEnd"/>
+      <w:r>
+        <w:t xml:space="preserve"> </w:t>
+      </w:r>
+      <w:proofErr w:type="spellStart"/>
+      <w:r>
+        <w:t>Studio</w:t>
+      </w:r>
+      <w:proofErr w:type="spellEnd"/>
+      <w:r>
+        <w:t xml:space="preserve"> Code”, kura ar paplašinājumiem var izmantot kā izstrādes vidi, taču noklusētā funkcionalitāte ir ierobežota salīdzinot ar iepriekšējām izstrādes programmatūrām un nepieciešama papildus iestatīšana šai programmatūrai, kura nebūtu nepieciešama pārējām izstrādes vidēm atverot sākotnēji.</w:t>
       </w:r>
     </w:p>
     <w:p>
       <w:pPr>
         <w:pStyle w:val="Heading3"/>
       </w:pPr>
-      <w:bookmarkStart w:id="28" w:name="_Toc225717463"/>
+      <w:bookmarkStart w:id="28" w:name="_Toc225723252"/>
       <w:r>
         <w:t>Versiju kontrole</w:t>
       </w:r>
@@ -5974,19 +7048,83 @@
     </w:p>
     <w:p>
       <w:r>
-        <w:t>Mazāk populāri pakalpojumi, kuri mitina avotkodu repozotorijus, izmantojot “Git” versiju kontroli, arī ir pieejami rīki, kura var automatizēt projekta kompilēšanu un pārbaudi, šādi rīki ir “GitLab”, “Gitea” un “Bitbucket”, kuri ir īpaši pielāgota CI/CD izstrādes videi, taču prasa papildizmaksas, ja šādi rīki tiek palaisti šo pakalpojumu serveros vietā pašam lietotājam mitināt šos rīkus.</w:t>
-      </w:r>
-    </w:p>
-    <w:p>
-      <w:r>
-        <w:t>Taču arī ir pieejami pakalpojumi un rīki, kuri nav atkarīga no “Git” versiju kontroles, bet kā pieejamu versiju kontroles programmatūru starp pārējām. Viens no šiem rīkiem ir “Azure Pipelines”, kuras funkcionalitāte ir plašāka salīdzinot ar iepriekš minētiem rīkiem, taču tās plaša funkcionalitātes klāsts ir radīts lielākiem projektiem, kuri iespējams nebūs lielāko daļu paredzēts izmantošanai šī projekta nolūkiem tās apjoma dēļ un lielākas izmaksas, salīdzinot ar iepriekš minētiem rīkiem.</w:t>
+        <w:t xml:space="preserve">Mazāk populāri pakalpojumi, kuri mitina avotkodu </w:t>
+      </w:r>
+      <w:proofErr w:type="spellStart"/>
+      <w:r>
+        <w:t>repozotorijus</w:t>
+      </w:r>
+      <w:proofErr w:type="spellEnd"/>
+      <w:r>
+        <w:t>, izmantojot “</w:t>
+      </w:r>
+      <w:proofErr w:type="spellStart"/>
+      <w:r>
+        <w:t>Git</w:t>
+      </w:r>
+      <w:proofErr w:type="spellEnd"/>
+      <w:r>
+        <w:t>” versiju kontroli, arī ir pieejami rīki, kura var automatizēt projekta kompilēšanu un pārbaudi, šādi rīki ir “</w:t>
+      </w:r>
+      <w:proofErr w:type="spellStart"/>
+      <w:r>
+        <w:t>GitLab</w:t>
+      </w:r>
+      <w:proofErr w:type="spellEnd"/>
+      <w:r>
+        <w:t>”, “</w:t>
+      </w:r>
+      <w:proofErr w:type="spellStart"/>
+      <w:r>
+        <w:t>Gitea</w:t>
+      </w:r>
+      <w:proofErr w:type="spellEnd"/>
+      <w:r>
+        <w:t>” un “</w:t>
+      </w:r>
+      <w:proofErr w:type="spellStart"/>
+      <w:r>
+        <w:t>Bitbucket</w:t>
+      </w:r>
+      <w:proofErr w:type="spellEnd"/>
+      <w:r>
+        <w:t>”, kuri ir īpaši pielāgota CI/CD izstrādes videi, taču prasa papildizmaksas, ja šādi rīki tiek palaisti šo pakalpojumu serveros vietā pašam lietotājam mitināt šos rīkus.</w:t>
+      </w:r>
+    </w:p>
+    <w:p>
+      <w:r>
+        <w:t>Taču arī ir pieejami pakalpojumi un rīki, kuri nav atkarīga no “</w:t>
+      </w:r>
+      <w:proofErr w:type="spellStart"/>
+      <w:r>
+        <w:t>Git</w:t>
+      </w:r>
+      <w:proofErr w:type="spellEnd"/>
+      <w:r>
+        <w:t>” versiju kontroles, bet kā pieejamu versiju kontroles programmatūru starp pārējām. Viens no šiem rīkiem ir “</w:t>
+      </w:r>
+      <w:proofErr w:type="spellStart"/>
+      <w:r>
+        <w:t>Azure</w:t>
+      </w:r>
+      <w:proofErr w:type="spellEnd"/>
+      <w:r>
+        <w:t xml:space="preserve"> </w:t>
+      </w:r>
+      <w:proofErr w:type="spellStart"/>
+      <w:r>
+        <w:t>Pipelines</w:t>
+      </w:r>
+      <w:proofErr w:type="spellEnd"/>
+      <w:r>
+        <w:t>”, kuras funkcionalitāte ir plašāka salīdzinot ar iepriekš minētiem rīkiem, taču tās plaša funkcionalitātes klāsts ir radīts lielākiem projektiem, kuri iespējams nebūs lielāko daļu paredzēts izmantošanai šī projekta nolūkiem tās apjoma dēļ un lielākas izmaksas, salīdzinot ar iepriekš minētiem rīkiem.</w:t>
       </w:r>
     </w:p>
     <w:p>
       <w:pPr>
         <w:pStyle w:val="Heading1"/>
       </w:pPr>
-      <w:bookmarkStart w:id="29" w:name="_Toc225717464"/>
+      <w:bookmarkStart w:id="29" w:name="_Toc225723253"/>
       <w:r>
         <w:lastRenderedPageBreak/>
         <w:t>Sistēmas modelēšana un projektēšana</w:t>
@@ -5997,7 +7135,7 @@
       <w:pPr>
         <w:pStyle w:val="Heading2"/>
       </w:pPr>
-      <w:bookmarkStart w:id="30" w:name="_Toc225717465"/>
+      <w:bookmarkStart w:id="30" w:name="_Toc225723254"/>
       <w:r>
         <w:t>Sistēmas struktūras modelis</w:t>
       </w:r>
@@ -6007,7 +7145,7 @@
       <w:pPr>
         <w:pStyle w:val="Heading3"/>
       </w:pPr>
-      <w:bookmarkStart w:id="31" w:name="_Toc225717466"/>
+      <w:bookmarkStart w:id="31" w:name="_Toc225723255"/>
       <w:r>
         <w:t>Sistēmas struktūra</w:t>
       </w:r>
@@ -6181,7 +7319,7 @@
       <w:pPr>
         <w:pStyle w:val="Heading3"/>
       </w:pPr>
-      <w:bookmarkStart w:id="34" w:name="_Toc225717467"/>
+      <w:bookmarkStart w:id="34" w:name="_Toc225723256"/>
       <w:r>
         <w:lastRenderedPageBreak/>
         <w:t>Klašu modeļi</w:t>
@@ -6378,7 +7516,7 @@
       <w:pPr>
         <w:pStyle w:val="Heading2"/>
       </w:pPr>
-      <w:bookmarkStart w:id="35" w:name="_Toc225717468"/>
+      <w:bookmarkStart w:id="35" w:name="_Toc225723257"/>
       <w:r>
         <w:lastRenderedPageBreak/>
         <w:t>Funkcionālie un dinamiskie modeļi</w:t>
@@ -6389,7 +7527,7 @@
       <w:pPr>
         <w:pStyle w:val="Heading2"/>
       </w:pPr>
-      <w:bookmarkStart w:id="36" w:name="_Toc225717469"/>
+      <w:bookmarkStart w:id="36" w:name="_Toc225723258"/>
       <w:r>
         <w:t>Datu struktūru apraksts</w:t>
       </w:r>
@@ -6399,7 +7537,7 @@
       <w:pPr>
         <w:pStyle w:val="Heading1"/>
       </w:pPr>
-      <w:bookmarkStart w:id="37" w:name="_Toc225717470"/>
+      <w:bookmarkStart w:id="37" w:name="_Toc225723259"/>
       <w:r>
         <w:lastRenderedPageBreak/>
         <w:t>Lietotāju ceļvedis</w:t>
@@ -6410,7 +7548,7 @@
       <w:pPr>
         <w:pStyle w:val="Heading1"/>
       </w:pPr>
-      <w:bookmarkStart w:id="38" w:name="_Toc225717471"/>
+      <w:bookmarkStart w:id="38" w:name="_Toc225723260"/>
       <w:r>
         <w:lastRenderedPageBreak/>
         <w:t>Testēšanas dokumentācija</w:t>
@@ -6621,292 +7759,7 @@
     </w:lvl>
   </w:abstractNum>
   <w:abstractNum w:abstractNumId="1" w15:restartNumberingAfterBreak="0">
-    <w:nsid w:val="14814166"/>
-    <w:multiLevelType w:val="hybridMultilevel"/>
-    <w:tmpl w:val="9424BF12"/>
-    <w:lvl w:ilvl="0" w:tplc="04260011">
-      <w:start w:val="1"/>
-      <w:numFmt w:val="decimal"/>
-      <w:lvlText w:val="%1)"/>
-      <w:lvlJc w:val="left"/>
-      <w:pPr>
-        <w:ind w:left="1440" w:hanging="360"/>
-      </w:pPr>
-    </w:lvl>
-    <w:lvl w:ilvl="1" w:tplc="FFFFFFFF">
-      <w:start w:val="1"/>
-      <w:numFmt w:val="lowerLetter"/>
-      <w:lvlText w:val="%2."/>
-      <w:lvlJc w:val="left"/>
-      <w:pPr>
-        <w:ind w:left="2160" w:hanging="360"/>
-      </w:pPr>
-    </w:lvl>
-    <w:lvl w:ilvl="2" w:tplc="FFFFFFFF">
-      <w:start w:val="1"/>
-      <w:numFmt w:val="lowerRoman"/>
-      <w:lvlText w:val="%3."/>
-      <w:lvlJc w:val="right"/>
-      <w:pPr>
-        <w:ind w:left="2880" w:hanging="180"/>
-      </w:pPr>
-    </w:lvl>
-    <w:lvl w:ilvl="3" w:tplc="FFFFFFFF">
-      <w:start w:val="1"/>
-      <w:numFmt w:val="decimal"/>
-      <w:lvlText w:val="%4."/>
-      <w:lvlJc w:val="left"/>
-      <w:pPr>
-        <w:ind w:left="3600" w:hanging="360"/>
-      </w:pPr>
-    </w:lvl>
-    <w:lvl w:ilvl="4" w:tplc="FFFFFFFF">
-      <w:start w:val="1"/>
-      <w:numFmt w:val="lowerLetter"/>
-      <w:lvlText w:val="%5."/>
-      <w:lvlJc w:val="left"/>
-      <w:pPr>
-        <w:ind w:left="4320" w:hanging="360"/>
-      </w:pPr>
-    </w:lvl>
-    <w:lvl w:ilvl="5" w:tplc="FFFFFFFF">
-      <w:start w:val="1"/>
-      <w:numFmt w:val="lowerRoman"/>
-      <w:lvlText w:val="%6."/>
-      <w:lvlJc w:val="right"/>
-      <w:pPr>
-        <w:ind w:left="5040" w:hanging="180"/>
-      </w:pPr>
-    </w:lvl>
-    <w:lvl w:ilvl="6" w:tplc="FFFFFFFF">
-      <w:start w:val="1"/>
-      <w:numFmt w:val="decimal"/>
-      <w:lvlText w:val="%7."/>
-      <w:lvlJc w:val="left"/>
-      <w:pPr>
-        <w:ind w:left="5760" w:hanging="360"/>
-      </w:pPr>
-    </w:lvl>
-    <w:lvl w:ilvl="7" w:tplc="FFFFFFFF">
-      <w:start w:val="1"/>
-      <w:numFmt w:val="lowerLetter"/>
-      <w:lvlText w:val="%8."/>
-      <w:lvlJc w:val="left"/>
-      <w:pPr>
-        <w:ind w:left="6480" w:hanging="360"/>
-      </w:pPr>
-    </w:lvl>
-    <w:lvl w:ilvl="8" w:tplc="FFFFFFFF">
-      <w:start w:val="1"/>
-      <w:numFmt w:val="lowerRoman"/>
-      <w:lvlText w:val="%9."/>
-      <w:lvlJc w:val="right"/>
-      <w:pPr>
-        <w:ind w:left="7200" w:hanging="180"/>
-      </w:pPr>
-    </w:lvl>
-  </w:abstractNum>
-  <w:abstractNum w:abstractNumId="2" w15:restartNumberingAfterBreak="0">
-    <w:nsid w:val="1E8871B5"/>
-    <w:multiLevelType w:val="multilevel"/>
-    <w:tmpl w:val="4224D438"/>
-    <w:lvl w:ilvl="0">
-      <w:start w:val="1"/>
-      <w:numFmt w:val="decimal"/>
-      <w:lvlText w:val="%1."/>
-      <w:lvlJc w:val="left"/>
-      <w:pPr>
-        <w:ind w:left="360" w:hanging="360"/>
-      </w:pPr>
-      <w:rPr>
-        <w:rFonts w:hint="default"/>
-      </w:rPr>
-    </w:lvl>
-    <w:lvl w:ilvl="1">
-      <w:start w:val="1"/>
-      <w:numFmt w:val="decimal"/>
-      <w:lvlText w:val="%1.%2."/>
-      <w:lvlJc w:val="left"/>
-      <w:pPr>
-        <w:ind w:left="720" w:hanging="360"/>
-      </w:pPr>
-      <w:rPr>
-        <w:rFonts w:hint="default"/>
-      </w:rPr>
-    </w:lvl>
-    <w:lvl w:ilvl="2">
-      <w:start w:val="1"/>
-      <w:numFmt w:val="decimal"/>
-      <w:lvlText w:val="%1.%2.%3."/>
-      <w:lvlJc w:val="left"/>
-      <w:pPr>
-        <w:ind w:left="1080" w:hanging="360"/>
-      </w:pPr>
-      <w:rPr>
-        <w:rFonts w:hint="default"/>
-      </w:rPr>
-    </w:lvl>
-    <w:lvl w:ilvl="3">
-      <w:start w:val="1"/>
-      <w:numFmt w:val="decimal"/>
-      <w:lvlText w:val="%1.%2.%3.%4"/>
-      <w:lvlJc w:val="left"/>
-      <w:pPr>
-        <w:ind w:left="1440" w:hanging="360"/>
-      </w:pPr>
-      <w:rPr>
-        <w:rFonts w:hint="default"/>
-      </w:rPr>
-    </w:lvl>
-    <w:lvl w:ilvl="4">
-      <w:start w:val="1"/>
-      <w:numFmt w:val="lowerLetter"/>
-      <w:lvlText w:val="(%5)"/>
-      <w:lvlJc w:val="left"/>
-      <w:pPr>
-        <w:ind w:left="1800" w:hanging="360"/>
-      </w:pPr>
-      <w:rPr>
-        <w:rFonts w:hint="default"/>
-      </w:rPr>
-    </w:lvl>
-    <w:lvl w:ilvl="5">
-      <w:start w:val="1"/>
-      <w:numFmt w:val="lowerRoman"/>
-      <w:lvlText w:val="(%6)"/>
-      <w:lvlJc w:val="left"/>
-      <w:pPr>
-        <w:ind w:left="2160" w:hanging="360"/>
-      </w:pPr>
-      <w:rPr>
-        <w:rFonts w:hint="default"/>
-      </w:rPr>
-    </w:lvl>
-    <w:lvl w:ilvl="6">
-      <w:start w:val="1"/>
-      <w:numFmt w:val="decimal"/>
-      <w:lvlText w:val="%7."/>
-      <w:lvlJc w:val="left"/>
-      <w:pPr>
-        <w:ind w:left="2520" w:hanging="360"/>
-      </w:pPr>
-      <w:rPr>
-        <w:rFonts w:hint="default"/>
-      </w:rPr>
-    </w:lvl>
-    <w:lvl w:ilvl="7">
-      <w:start w:val="1"/>
-      <w:numFmt w:val="lowerLetter"/>
-      <w:lvlText w:val="%8."/>
-      <w:lvlJc w:val="left"/>
-      <w:pPr>
-        <w:ind w:left="2880" w:hanging="360"/>
-      </w:pPr>
-      <w:rPr>
-        <w:rFonts w:hint="default"/>
-      </w:rPr>
-    </w:lvl>
-    <w:lvl w:ilvl="8">
-      <w:start w:val="1"/>
-      <w:numFmt w:val="lowerRoman"/>
-      <w:lvlText w:val="%9."/>
-      <w:lvlJc w:val="left"/>
-      <w:pPr>
-        <w:ind w:left="3240" w:hanging="360"/>
-      </w:pPr>
-      <w:rPr>
-        <w:rFonts w:hint="default"/>
-      </w:rPr>
-    </w:lvl>
-  </w:abstractNum>
-  <w:abstractNum w:abstractNumId="3" w15:restartNumberingAfterBreak="0">
-    <w:nsid w:val="1F9258A6"/>
-    <w:multiLevelType w:val="hybridMultilevel"/>
-    <w:tmpl w:val="46C2E226"/>
-    <w:lvl w:ilvl="0" w:tplc="FFFFFFFF">
-      <w:start w:val="1"/>
-      <w:numFmt w:val="decimal"/>
-      <w:lvlText w:val="%1)"/>
-      <w:lvlJc w:val="left"/>
-      <w:pPr>
-        <w:ind w:left="1440" w:hanging="360"/>
-      </w:pPr>
-    </w:lvl>
-    <w:lvl w:ilvl="1" w:tplc="FFFFFFFF">
-      <w:start w:val="1"/>
-      <w:numFmt w:val="lowerLetter"/>
-      <w:lvlText w:val="%2."/>
-      <w:lvlJc w:val="left"/>
-      <w:pPr>
-        <w:ind w:left="2160" w:hanging="360"/>
-      </w:pPr>
-    </w:lvl>
-    <w:lvl w:ilvl="2" w:tplc="FFFFFFFF">
-      <w:start w:val="1"/>
-      <w:numFmt w:val="lowerRoman"/>
-      <w:lvlText w:val="%3."/>
-      <w:lvlJc w:val="right"/>
-      <w:pPr>
-        <w:ind w:left="2880" w:hanging="180"/>
-      </w:pPr>
-    </w:lvl>
-    <w:lvl w:ilvl="3" w:tplc="FFFFFFFF">
-      <w:start w:val="1"/>
-      <w:numFmt w:val="decimal"/>
-      <w:lvlText w:val="%4."/>
-      <w:lvlJc w:val="left"/>
-      <w:pPr>
-        <w:ind w:left="3600" w:hanging="360"/>
-      </w:pPr>
-    </w:lvl>
-    <w:lvl w:ilvl="4" w:tplc="FFFFFFFF">
-      <w:start w:val="1"/>
-      <w:numFmt w:val="lowerLetter"/>
-      <w:lvlText w:val="%5."/>
-      <w:lvlJc w:val="left"/>
-      <w:pPr>
-        <w:ind w:left="4320" w:hanging="360"/>
-      </w:pPr>
-    </w:lvl>
-    <w:lvl w:ilvl="5" w:tplc="FFFFFFFF">
-      <w:start w:val="1"/>
-      <w:numFmt w:val="lowerRoman"/>
-      <w:lvlText w:val="%6."/>
-      <w:lvlJc w:val="right"/>
-      <w:pPr>
-        <w:ind w:left="5040" w:hanging="180"/>
-      </w:pPr>
-    </w:lvl>
-    <w:lvl w:ilvl="6" w:tplc="FFFFFFFF">
-      <w:start w:val="1"/>
-      <w:numFmt w:val="decimal"/>
-      <w:lvlText w:val="%7."/>
-      <w:lvlJc w:val="left"/>
-      <w:pPr>
-        <w:ind w:left="5760" w:hanging="360"/>
-      </w:pPr>
-    </w:lvl>
-    <w:lvl w:ilvl="7" w:tplc="FFFFFFFF">
-      <w:start w:val="1"/>
-      <w:numFmt w:val="lowerLetter"/>
-      <w:lvlText w:val="%8."/>
-      <w:lvlJc w:val="left"/>
-      <w:pPr>
-        <w:ind w:left="6480" w:hanging="360"/>
-      </w:pPr>
-    </w:lvl>
-    <w:lvl w:ilvl="8" w:tplc="FFFFFFFF">
-      <w:start w:val="1"/>
-      <w:numFmt w:val="lowerRoman"/>
-      <w:lvlText w:val="%9."/>
-      <w:lvlJc w:val="right"/>
-      <w:pPr>
-        <w:ind w:left="7200" w:hanging="180"/>
-      </w:pPr>
-    </w:lvl>
-  </w:abstractNum>
-  <w:abstractNum w:abstractNumId="4" w15:restartNumberingAfterBreak="0">
-    <w:nsid w:val="289B7264"/>
+    <w:nsid w:val="0EF86E54"/>
     <w:multiLevelType w:val="multilevel"/>
     <w:tmpl w:val="A0B6D666"/>
     <w:lvl w:ilvl="0">
@@ -7020,7 +7873,493 @@
       </w:rPr>
     </w:lvl>
   </w:abstractNum>
+  <w:abstractNum w:abstractNumId="2" w15:restartNumberingAfterBreak="0">
+    <w:nsid w:val="14814166"/>
+    <w:multiLevelType w:val="hybridMultilevel"/>
+    <w:tmpl w:val="9424BF12"/>
+    <w:lvl w:ilvl="0" w:tplc="04260011">
+      <w:start w:val="1"/>
+      <w:numFmt w:val="decimal"/>
+      <w:lvlText w:val="%1)"/>
+      <w:lvlJc w:val="left"/>
+      <w:pPr>
+        <w:ind w:left="1440" w:hanging="360"/>
+      </w:pPr>
+    </w:lvl>
+    <w:lvl w:ilvl="1" w:tplc="FFFFFFFF">
+      <w:start w:val="1"/>
+      <w:numFmt w:val="lowerLetter"/>
+      <w:lvlText w:val="%2."/>
+      <w:lvlJc w:val="left"/>
+      <w:pPr>
+        <w:ind w:left="2160" w:hanging="360"/>
+      </w:pPr>
+    </w:lvl>
+    <w:lvl w:ilvl="2" w:tplc="FFFFFFFF">
+      <w:start w:val="1"/>
+      <w:numFmt w:val="lowerRoman"/>
+      <w:lvlText w:val="%3."/>
+      <w:lvlJc w:val="right"/>
+      <w:pPr>
+        <w:ind w:left="2880" w:hanging="180"/>
+      </w:pPr>
+    </w:lvl>
+    <w:lvl w:ilvl="3" w:tplc="FFFFFFFF">
+      <w:start w:val="1"/>
+      <w:numFmt w:val="decimal"/>
+      <w:lvlText w:val="%4."/>
+      <w:lvlJc w:val="left"/>
+      <w:pPr>
+        <w:ind w:left="3600" w:hanging="360"/>
+      </w:pPr>
+    </w:lvl>
+    <w:lvl w:ilvl="4" w:tplc="FFFFFFFF">
+      <w:start w:val="1"/>
+      <w:numFmt w:val="lowerLetter"/>
+      <w:lvlText w:val="%5."/>
+      <w:lvlJc w:val="left"/>
+      <w:pPr>
+        <w:ind w:left="4320" w:hanging="360"/>
+      </w:pPr>
+    </w:lvl>
+    <w:lvl w:ilvl="5" w:tplc="FFFFFFFF">
+      <w:start w:val="1"/>
+      <w:numFmt w:val="lowerRoman"/>
+      <w:lvlText w:val="%6."/>
+      <w:lvlJc w:val="right"/>
+      <w:pPr>
+        <w:ind w:left="5040" w:hanging="180"/>
+      </w:pPr>
+    </w:lvl>
+    <w:lvl w:ilvl="6" w:tplc="FFFFFFFF">
+      <w:start w:val="1"/>
+      <w:numFmt w:val="decimal"/>
+      <w:lvlText w:val="%7."/>
+      <w:lvlJc w:val="left"/>
+      <w:pPr>
+        <w:ind w:left="5760" w:hanging="360"/>
+      </w:pPr>
+    </w:lvl>
+    <w:lvl w:ilvl="7" w:tplc="FFFFFFFF">
+      <w:start w:val="1"/>
+      <w:numFmt w:val="lowerLetter"/>
+      <w:lvlText w:val="%8."/>
+      <w:lvlJc w:val="left"/>
+      <w:pPr>
+        <w:ind w:left="6480" w:hanging="360"/>
+      </w:pPr>
+    </w:lvl>
+    <w:lvl w:ilvl="8" w:tplc="FFFFFFFF">
+      <w:start w:val="1"/>
+      <w:numFmt w:val="lowerRoman"/>
+      <w:lvlText w:val="%9."/>
+      <w:lvlJc w:val="right"/>
+      <w:pPr>
+        <w:ind w:left="7200" w:hanging="180"/>
+      </w:pPr>
+    </w:lvl>
+  </w:abstractNum>
+  <w:abstractNum w:abstractNumId="3" w15:restartNumberingAfterBreak="0">
+    <w:nsid w:val="1BE25AAA"/>
+    <w:multiLevelType w:val="multilevel"/>
+    <w:tmpl w:val="0426001D"/>
+    <w:lvl w:ilvl="0">
+      <w:start w:val="1"/>
+      <w:numFmt w:val="decimal"/>
+      <w:lvlText w:val="%1)"/>
+      <w:lvlJc w:val="left"/>
+      <w:pPr>
+        <w:ind w:left="1800" w:hanging="360"/>
+      </w:pPr>
+    </w:lvl>
+    <w:lvl w:ilvl="1">
+      <w:start w:val="1"/>
+      <w:numFmt w:val="lowerLetter"/>
+      <w:lvlText w:val="%2)"/>
+      <w:lvlJc w:val="left"/>
+      <w:pPr>
+        <w:ind w:left="2160" w:hanging="360"/>
+      </w:pPr>
+    </w:lvl>
+    <w:lvl w:ilvl="2">
+      <w:start w:val="1"/>
+      <w:numFmt w:val="lowerRoman"/>
+      <w:lvlText w:val="%3)"/>
+      <w:lvlJc w:val="left"/>
+      <w:pPr>
+        <w:ind w:left="2520" w:hanging="360"/>
+      </w:pPr>
+    </w:lvl>
+    <w:lvl w:ilvl="3">
+      <w:start w:val="1"/>
+      <w:numFmt w:val="decimal"/>
+      <w:lvlText w:val="(%4)"/>
+      <w:lvlJc w:val="left"/>
+      <w:pPr>
+        <w:ind w:left="2880" w:hanging="360"/>
+      </w:pPr>
+    </w:lvl>
+    <w:lvl w:ilvl="4">
+      <w:start w:val="1"/>
+      <w:numFmt w:val="lowerLetter"/>
+      <w:lvlText w:val="(%5)"/>
+      <w:lvlJc w:val="left"/>
+      <w:pPr>
+        <w:ind w:left="3240" w:hanging="360"/>
+      </w:pPr>
+    </w:lvl>
+    <w:lvl w:ilvl="5">
+      <w:start w:val="1"/>
+      <w:numFmt w:val="lowerRoman"/>
+      <w:lvlText w:val="(%6)"/>
+      <w:lvlJc w:val="left"/>
+      <w:pPr>
+        <w:ind w:left="3600" w:hanging="360"/>
+      </w:pPr>
+    </w:lvl>
+    <w:lvl w:ilvl="6">
+      <w:start w:val="1"/>
+      <w:numFmt w:val="decimal"/>
+      <w:lvlText w:val="%7."/>
+      <w:lvlJc w:val="left"/>
+      <w:pPr>
+        <w:ind w:left="3960" w:hanging="360"/>
+      </w:pPr>
+    </w:lvl>
+    <w:lvl w:ilvl="7">
+      <w:start w:val="1"/>
+      <w:numFmt w:val="lowerLetter"/>
+      <w:lvlText w:val="%8."/>
+      <w:lvlJc w:val="left"/>
+      <w:pPr>
+        <w:ind w:left="4320" w:hanging="360"/>
+      </w:pPr>
+    </w:lvl>
+    <w:lvl w:ilvl="8">
+      <w:start w:val="1"/>
+      <w:numFmt w:val="lowerRoman"/>
+      <w:lvlText w:val="%9."/>
+      <w:lvlJc w:val="left"/>
+      <w:pPr>
+        <w:ind w:left="4680" w:hanging="360"/>
+      </w:pPr>
+    </w:lvl>
+  </w:abstractNum>
+  <w:abstractNum w:abstractNumId="4" w15:restartNumberingAfterBreak="0">
+    <w:nsid w:val="1E8871B5"/>
+    <w:multiLevelType w:val="multilevel"/>
+    <w:tmpl w:val="4224D438"/>
+    <w:lvl w:ilvl="0">
+      <w:start w:val="1"/>
+      <w:numFmt w:val="decimal"/>
+      <w:lvlText w:val="%1."/>
+      <w:lvlJc w:val="left"/>
+      <w:pPr>
+        <w:ind w:left="360" w:hanging="360"/>
+      </w:pPr>
+      <w:rPr>
+        <w:rFonts w:hint="default"/>
+      </w:rPr>
+    </w:lvl>
+    <w:lvl w:ilvl="1">
+      <w:start w:val="1"/>
+      <w:numFmt w:val="decimal"/>
+      <w:lvlText w:val="%1.%2."/>
+      <w:lvlJc w:val="left"/>
+      <w:pPr>
+        <w:ind w:left="720" w:hanging="360"/>
+      </w:pPr>
+      <w:rPr>
+        <w:rFonts w:hint="default"/>
+      </w:rPr>
+    </w:lvl>
+    <w:lvl w:ilvl="2">
+      <w:start w:val="1"/>
+      <w:numFmt w:val="decimal"/>
+      <w:lvlText w:val="%1.%2.%3."/>
+      <w:lvlJc w:val="left"/>
+      <w:pPr>
+        <w:ind w:left="1080" w:hanging="360"/>
+      </w:pPr>
+      <w:rPr>
+        <w:rFonts w:hint="default"/>
+      </w:rPr>
+    </w:lvl>
+    <w:lvl w:ilvl="3">
+      <w:start w:val="1"/>
+      <w:numFmt w:val="decimal"/>
+      <w:lvlText w:val="%1.%2.%3.%4"/>
+      <w:lvlJc w:val="left"/>
+      <w:pPr>
+        <w:ind w:left="1440" w:hanging="360"/>
+      </w:pPr>
+      <w:rPr>
+        <w:rFonts w:hint="default"/>
+      </w:rPr>
+    </w:lvl>
+    <w:lvl w:ilvl="4">
+      <w:start w:val="1"/>
+      <w:numFmt w:val="lowerLetter"/>
+      <w:lvlText w:val="(%5)"/>
+      <w:lvlJc w:val="left"/>
+      <w:pPr>
+        <w:ind w:left="1800" w:hanging="360"/>
+      </w:pPr>
+      <w:rPr>
+        <w:rFonts w:hint="default"/>
+      </w:rPr>
+    </w:lvl>
+    <w:lvl w:ilvl="5">
+      <w:start w:val="1"/>
+      <w:numFmt w:val="lowerRoman"/>
+      <w:lvlText w:val="(%6)"/>
+      <w:lvlJc w:val="left"/>
+      <w:pPr>
+        <w:ind w:left="2160" w:hanging="360"/>
+      </w:pPr>
+      <w:rPr>
+        <w:rFonts w:hint="default"/>
+      </w:rPr>
+    </w:lvl>
+    <w:lvl w:ilvl="6">
+      <w:start w:val="1"/>
+      <w:numFmt w:val="decimal"/>
+      <w:lvlText w:val="%7."/>
+      <w:lvlJc w:val="left"/>
+      <w:pPr>
+        <w:ind w:left="2520" w:hanging="360"/>
+      </w:pPr>
+      <w:rPr>
+        <w:rFonts w:hint="default"/>
+      </w:rPr>
+    </w:lvl>
+    <w:lvl w:ilvl="7">
+      <w:start w:val="1"/>
+      <w:numFmt w:val="lowerLetter"/>
+      <w:lvlText w:val="%8."/>
+      <w:lvlJc w:val="left"/>
+      <w:pPr>
+        <w:ind w:left="2880" w:hanging="360"/>
+      </w:pPr>
+      <w:rPr>
+        <w:rFonts w:hint="default"/>
+      </w:rPr>
+    </w:lvl>
+    <w:lvl w:ilvl="8">
+      <w:start w:val="1"/>
+      <w:numFmt w:val="lowerRoman"/>
+      <w:lvlText w:val="%9."/>
+      <w:lvlJc w:val="left"/>
+      <w:pPr>
+        <w:ind w:left="3240" w:hanging="360"/>
+      </w:pPr>
+      <w:rPr>
+        <w:rFonts w:hint="default"/>
+      </w:rPr>
+    </w:lvl>
+  </w:abstractNum>
   <w:abstractNum w:abstractNumId="5" w15:restartNumberingAfterBreak="0">
+    <w:nsid w:val="1F9258A6"/>
+    <w:multiLevelType w:val="hybridMultilevel"/>
+    <w:tmpl w:val="46C2E226"/>
+    <w:lvl w:ilvl="0" w:tplc="FFFFFFFF">
+      <w:start w:val="1"/>
+      <w:numFmt w:val="decimal"/>
+      <w:lvlText w:val="%1)"/>
+      <w:lvlJc w:val="left"/>
+      <w:pPr>
+        <w:ind w:left="1440" w:hanging="360"/>
+      </w:pPr>
+    </w:lvl>
+    <w:lvl w:ilvl="1" w:tplc="FFFFFFFF">
+      <w:start w:val="1"/>
+      <w:numFmt w:val="lowerLetter"/>
+      <w:lvlText w:val="%2."/>
+      <w:lvlJc w:val="left"/>
+      <w:pPr>
+        <w:ind w:left="2160" w:hanging="360"/>
+      </w:pPr>
+    </w:lvl>
+    <w:lvl w:ilvl="2" w:tplc="FFFFFFFF">
+      <w:start w:val="1"/>
+      <w:numFmt w:val="lowerRoman"/>
+      <w:lvlText w:val="%3."/>
+      <w:lvlJc w:val="right"/>
+      <w:pPr>
+        <w:ind w:left="2880" w:hanging="180"/>
+      </w:pPr>
+    </w:lvl>
+    <w:lvl w:ilvl="3" w:tplc="FFFFFFFF">
+      <w:start w:val="1"/>
+      <w:numFmt w:val="decimal"/>
+      <w:lvlText w:val="%4."/>
+      <w:lvlJc w:val="left"/>
+      <w:pPr>
+        <w:ind w:left="3600" w:hanging="360"/>
+      </w:pPr>
+    </w:lvl>
+    <w:lvl w:ilvl="4" w:tplc="FFFFFFFF">
+      <w:start w:val="1"/>
+      <w:numFmt w:val="lowerLetter"/>
+      <w:lvlText w:val="%5."/>
+      <w:lvlJc w:val="left"/>
+      <w:pPr>
+        <w:ind w:left="4320" w:hanging="360"/>
+      </w:pPr>
+    </w:lvl>
+    <w:lvl w:ilvl="5" w:tplc="FFFFFFFF">
+      <w:start w:val="1"/>
+      <w:numFmt w:val="lowerRoman"/>
+      <w:lvlText w:val="%6."/>
+      <w:lvlJc w:val="right"/>
+      <w:pPr>
+        <w:ind w:left="5040" w:hanging="180"/>
+      </w:pPr>
+    </w:lvl>
+    <w:lvl w:ilvl="6" w:tplc="FFFFFFFF">
+      <w:start w:val="1"/>
+      <w:numFmt w:val="decimal"/>
+      <w:lvlText w:val="%7."/>
+      <w:lvlJc w:val="left"/>
+      <w:pPr>
+        <w:ind w:left="5760" w:hanging="360"/>
+      </w:pPr>
+    </w:lvl>
+    <w:lvl w:ilvl="7" w:tplc="FFFFFFFF">
+      <w:start w:val="1"/>
+      <w:numFmt w:val="lowerLetter"/>
+      <w:lvlText w:val="%8."/>
+      <w:lvlJc w:val="left"/>
+      <w:pPr>
+        <w:ind w:left="6480" w:hanging="360"/>
+      </w:pPr>
+    </w:lvl>
+    <w:lvl w:ilvl="8" w:tplc="FFFFFFFF">
+      <w:start w:val="1"/>
+      <w:numFmt w:val="lowerRoman"/>
+      <w:lvlText w:val="%9."/>
+      <w:lvlJc w:val="right"/>
+      <w:pPr>
+        <w:ind w:left="7200" w:hanging="180"/>
+      </w:pPr>
+    </w:lvl>
+  </w:abstractNum>
+  <w:abstractNum w:abstractNumId="6" w15:restartNumberingAfterBreak="0">
+    <w:nsid w:val="289B7264"/>
+    <w:multiLevelType w:val="multilevel"/>
+    <w:tmpl w:val="A0B6D666"/>
+    <w:lvl w:ilvl="0">
+      <w:start w:val="1"/>
+      <w:numFmt w:val="decimal"/>
+      <w:lvlText w:val="PR.%1."/>
+      <w:lvlJc w:val="left"/>
+      <w:pPr>
+        <w:ind w:left="360" w:hanging="360"/>
+      </w:pPr>
+      <w:rPr>
+        <w:rFonts w:hint="default"/>
+        <w:b/>
+        <w:bCs/>
+      </w:rPr>
+    </w:lvl>
+    <w:lvl w:ilvl="1">
+      <w:start w:val="1"/>
+      <w:numFmt w:val="lowerLetter"/>
+      <w:lvlText w:val="%2)"/>
+      <w:lvlJc w:val="left"/>
+      <w:pPr>
+        <w:ind w:left="720" w:hanging="360"/>
+      </w:pPr>
+      <w:rPr>
+        <w:rFonts w:hint="default"/>
+      </w:rPr>
+    </w:lvl>
+    <w:lvl w:ilvl="2">
+      <w:start w:val="1"/>
+      <w:numFmt w:val="lowerRoman"/>
+      <w:lvlText w:val="%3)"/>
+      <w:lvlJc w:val="left"/>
+      <w:pPr>
+        <w:ind w:left="1080" w:hanging="360"/>
+      </w:pPr>
+      <w:rPr>
+        <w:rFonts w:hint="default"/>
+      </w:rPr>
+    </w:lvl>
+    <w:lvl w:ilvl="3">
+      <w:start w:val="1"/>
+      <w:numFmt w:val="decimal"/>
+      <w:lvlText w:val="(%4)"/>
+      <w:lvlJc w:val="left"/>
+      <w:pPr>
+        <w:ind w:left="1440" w:hanging="360"/>
+      </w:pPr>
+      <w:rPr>
+        <w:rFonts w:hint="default"/>
+      </w:rPr>
+    </w:lvl>
+    <w:lvl w:ilvl="4">
+      <w:start w:val="1"/>
+      <w:numFmt w:val="lowerLetter"/>
+      <w:lvlText w:val="(%5)"/>
+      <w:lvlJc w:val="left"/>
+      <w:pPr>
+        <w:ind w:left="1800" w:hanging="360"/>
+      </w:pPr>
+      <w:rPr>
+        <w:rFonts w:hint="default"/>
+      </w:rPr>
+    </w:lvl>
+    <w:lvl w:ilvl="5">
+      <w:start w:val="1"/>
+      <w:numFmt w:val="lowerRoman"/>
+      <w:lvlText w:val="(%6)"/>
+      <w:lvlJc w:val="left"/>
+      <w:pPr>
+        <w:ind w:left="2160" w:hanging="360"/>
+      </w:pPr>
+      <w:rPr>
+        <w:rFonts w:hint="default"/>
+      </w:rPr>
+    </w:lvl>
+    <w:lvl w:ilvl="6">
+      <w:start w:val="1"/>
+      <w:numFmt w:val="decimal"/>
+      <w:lvlText w:val="%7."/>
+      <w:lvlJc w:val="left"/>
+      <w:pPr>
+        <w:ind w:left="2520" w:hanging="360"/>
+      </w:pPr>
+      <w:rPr>
+        <w:rFonts w:hint="default"/>
+      </w:rPr>
+    </w:lvl>
+    <w:lvl w:ilvl="7">
+      <w:start w:val="1"/>
+      <w:numFmt w:val="lowerLetter"/>
+      <w:lvlText w:val="%8."/>
+      <w:lvlJc w:val="left"/>
+      <w:pPr>
+        <w:ind w:left="2880" w:hanging="360"/>
+      </w:pPr>
+      <w:rPr>
+        <w:rFonts w:hint="default"/>
+      </w:rPr>
+    </w:lvl>
+    <w:lvl w:ilvl="8">
+      <w:start w:val="1"/>
+      <w:numFmt w:val="lowerRoman"/>
+      <w:lvlText w:val="%9."/>
+      <w:lvlJc w:val="left"/>
+      <w:pPr>
+        <w:ind w:left="3240" w:hanging="360"/>
+      </w:pPr>
+      <w:rPr>
+        <w:rFonts w:hint="default"/>
+      </w:rPr>
+    </w:lvl>
+  </w:abstractNum>
+  <w:abstractNum w:abstractNumId="7" w15:restartNumberingAfterBreak="0">
     <w:nsid w:val="2AC86BF6"/>
     <w:multiLevelType w:val="multilevel"/>
     <w:tmpl w:val="4A7E1FE8"/>
@@ -7133,7 +8472,97 @@
       </w:rPr>
     </w:lvl>
   </w:abstractNum>
-  <w:abstractNum w:abstractNumId="6" w15:restartNumberingAfterBreak="0">
+  <w:abstractNum w:abstractNumId="8" w15:restartNumberingAfterBreak="0">
+    <w:nsid w:val="35B40052"/>
+    <w:multiLevelType w:val="multilevel"/>
+    <w:tmpl w:val="7D36120E"/>
+    <w:lvl w:ilvl="0">
+      <w:start w:val="1"/>
+      <w:numFmt w:val="decimal"/>
+      <w:lvlText w:val="%1)"/>
+      <w:lvlJc w:val="left"/>
+      <w:pPr>
+        <w:ind w:left="1800" w:hanging="360"/>
+      </w:pPr>
+      <w:rPr>
+        <w:b w:val="0"/>
+        <w:bCs w:val="0"/>
+      </w:rPr>
+    </w:lvl>
+    <w:lvl w:ilvl="1">
+      <w:start w:val="1"/>
+      <w:numFmt w:val="lowerLetter"/>
+      <w:lvlText w:val="%2)"/>
+      <w:lvlJc w:val="left"/>
+      <w:pPr>
+        <w:ind w:left="2160" w:hanging="360"/>
+      </w:pPr>
+    </w:lvl>
+    <w:lvl w:ilvl="2">
+      <w:start w:val="1"/>
+      <w:numFmt w:val="lowerRoman"/>
+      <w:lvlText w:val="%3)"/>
+      <w:lvlJc w:val="left"/>
+      <w:pPr>
+        <w:ind w:left="2520" w:hanging="360"/>
+      </w:pPr>
+    </w:lvl>
+    <w:lvl w:ilvl="3">
+      <w:start w:val="1"/>
+      <w:numFmt w:val="decimal"/>
+      <w:lvlText w:val="(%4)"/>
+      <w:lvlJc w:val="left"/>
+      <w:pPr>
+        <w:ind w:left="2880" w:hanging="360"/>
+      </w:pPr>
+    </w:lvl>
+    <w:lvl w:ilvl="4">
+      <w:start w:val="1"/>
+      <w:numFmt w:val="lowerLetter"/>
+      <w:lvlText w:val="(%5)"/>
+      <w:lvlJc w:val="left"/>
+      <w:pPr>
+        <w:ind w:left="3240" w:hanging="360"/>
+      </w:pPr>
+    </w:lvl>
+    <w:lvl w:ilvl="5">
+      <w:start w:val="1"/>
+      <w:numFmt w:val="lowerRoman"/>
+      <w:lvlText w:val="(%6)"/>
+      <w:lvlJc w:val="left"/>
+      <w:pPr>
+        <w:ind w:left="3600" w:hanging="360"/>
+      </w:pPr>
+    </w:lvl>
+    <w:lvl w:ilvl="6">
+      <w:start w:val="1"/>
+      <w:numFmt w:val="decimal"/>
+      <w:lvlText w:val="%7."/>
+      <w:lvlJc w:val="left"/>
+      <w:pPr>
+        <w:ind w:left="3960" w:hanging="360"/>
+      </w:pPr>
+    </w:lvl>
+    <w:lvl w:ilvl="7">
+      <w:start w:val="1"/>
+      <w:numFmt w:val="lowerLetter"/>
+      <w:lvlText w:val="%8."/>
+      <w:lvlJc w:val="left"/>
+      <w:pPr>
+        <w:ind w:left="4320" w:hanging="360"/>
+      </w:pPr>
+    </w:lvl>
+    <w:lvl w:ilvl="8">
+      <w:start w:val="1"/>
+      <w:numFmt w:val="lowerRoman"/>
+      <w:lvlText w:val="%9."/>
+      <w:lvlJc w:val="left"/>
+      <w:pPr>
+        <w:ind w:left="4680" w:hanging="360"/>
+      </w:pPr>
+    </w:lvl>
+  </w:abstractNum>
+  <w:abstractNum w:abstractNumId="9" w15:restartNumberingAfterBreak="0">
     <w:nsid w:val="36644F88"/>
     <w:multiLevelType w:val="hybridMultilevel"/>
     <w:tmpl w:val="46C2E226"/>
@@ -7219,7 +8648,93 @@
       </w:pPr>
     </w:lvl>
   </w:abstractNum>
-  <w:abstractNum w:abstractNumId="7" w15:restartNumberingAfterBreak="0">
+  <w:abstractNum w:abstractNumId="10" w15:restartNumberingAfterBreak="0">
+    <w:nsid w:val="3AD83722"/>
+    <w:multiLevelType w:val="multilevel"/>
+    <w:tmpl w:val="0426001D"/>
+    <w:lvl w:ilvl="0">
+      <w:start w:val="1"/>
+      <w:numFmt w:val="decimal"/>
+      <w:lvlText w:val="%1)"/>
+      <w:lvlJc w:val="left"/>
+      <w:pPr>
+        <w:ind w:left="1800" w:hanging="360"/>
+      </w:pPr>
+    </w:lvl>
+    <w:lvl w:ilvl="1">
+      <w:start w:val="1"/>
+      <w:numFmt w:val="lowerLetter"/>
+      <w:lvlText w:val="%2)"/>
+      <w:lvlJc w:val="left"/>
+      <w:pPr>
+        <w:ind w:left="2160" w:hanging="360"/>
+      </w:pPr>
+    </w:lvl>
+    <w:lvl w:ilvl="2">
+      <w:start w:val="1"/>
+      <w:numFmt w:val="lowerRoman"/>
+      <w:lvlText w:val="%3)"/>
+      <w:lvlJc w:val="left"/>
+      <w:pPr>
+        <w:ind w:left="2520" w:hanging="360"/>
+      </w:pPr>
+    </w:lvl>
+    <w:lvl w:ilvl="3">
+      <w:start w:val="1"/>
+      <w:numFmt w:val="decimal"/>
+      <w:lvlText w:val="(%4)"/>
+      <w:lvlJc w:val="left"/>
+      <w:pPr>
+        <w:ind w:left="2880" w:hanging="360"/>
+      </w:pPr>
+    </w:lvl>
+    <w:lvl w:ilvl="4">
+      <w:start w:val="1"/>
+      <w:numFmt w:val="lowerLetter"/>
+      <w:lvlText w:val="(%5)"/>
+      <w:lvlJc w:val="left"/>
+      <w:pPr>
+        <w:ind w:left="3240" w:hanging="360"/>
+      </w:pPr>
+    </w:lvl>
+    <w:lvl w:ilvl="5">
+      <w:start w:val="1"/>
+      <w:numFmt w:val="lowerRoman"/>
+      <w:lvlText w:val="(%6)"/>
+      <w:lvlJc w:val="left"/>
+      <w:pPr>
+        <w:ind w:left="3600" w:hanging="360"/>
+      </w:pPr>
+    </w:lvl>
+    <w:lvl w:ilvl="6">
+      <w:start w:val="1"/>
+      <w:numFmt w:val="decimal"/>
+      <w:lvlText w:val="%7."/>
+      <w:lvlJc w:val="left"/>
+      <w:pPr>
+        <w:ind w:left="3960" w:hanging="360"/>
+      </w:pPr>
+    </w:lvl>
+    <w:lvl w:ilvl="7">
+      <w:start w:val="1"/>
+      <w:numFmt w:val="lowerLetter"/>
+      <w:lvlText w:val="%8."/>
+      <w:lvlJc w:val="left"/>
+      <w:pPr>
+        <w:ind w:left="4320" w:hanging="360"/>
+      </w:pPr>
+    </w:lvl>
+    <w:lvl w:ilvl="8">
+      <w:start w:val="1"/>
+      <w:numFmt w:val="lowerRoman"/>
+      <w:lvlText w:val="%9."/>
+      <w:lvlJc w:val="left"/>
+      <w:pPr>
+        <w:ind w:left="4680" w:hanging="360"/>
+      </w:pPr>
+    </w:lvl>
+  </w:abstractNum>
+  <w:abstractNum w:abstractNumId="11" w15:restartNumberingAfterBreak="0">
     <w:nsid w:val="3EEF178D"/>
     <w:multiLevelType w:val="hybridMultilevel"/>
     <w:tmpl w:val="9424BF12"/>
@@ -7305,7 +8820,7 @@
       </w:pPr>
     </w:lvl>
   </w:abstractNum>
-  <w:abstractNum w:abstractNumId="8" w15:restartNumberingAfterBreak="0">
+  <w:abstractNum w:abstractNumId="12" w15:restartNumberingAfterBreak="0">
     <w:nsid w:val="48732F06"/>
     <w:multiLevelType w:val="multilevel"/>
     <w:tmpl w:val="0426001D"/>
@@ -7391,7 +8906,7 @@
       </w:pPr>
     </w:lvl>
   </w:abstractNum>
-  <w:abstractNum w:abstractNumId="9" w15:restartNumberingAfterBreak="0">
+  <w:abstractNum w:abstractNumId="13" w15:restartNumberingAfterBreak="0">
     <w:nsid w:val="4B067BE3"/>
     <w:multiLevelType w:val="multilevel"/>
     <w:tmpl w:val="0426001D"/>
@@ -7477,7 +8992,179 @@
       </w:pPr>
     </w:lvl>
   </w:abstractNum>
-  <w:abstractNum w:abstractNumId="10" w15:restartNumberingAfterBreak="0">
+  <w:abstractNum w:abstractNumId="14" w15:restartNumberingAfterBreak="0">
+    <w:nsid w:val="4ED056BA"/>
+    <w:multiLevelType w:val="multilevel"/>
+    <w:tmpl w:val="0426001D"/>
+    <w:lvl w:ilvl="0">
+      <w:start w:val="1"/>
+      <w:numFmt w:val="decimal"/>
+      <w:lvlText w:val="%1)"/>
+      <w:lvlJc w:val="left"/>
+      <w:pPr>
+        <w:ind w:left="1800" w:hanging="360"/>
+      </w:pPr>
+    </w:lvl>
+    <w:lvl w:ilvl="1">
+      <w:start w:val="1"/>
+      <w:numFmt w:val="lowerLetter"/>
+      <w:lvlText w:val="%2)"/>
+      <w:lvlJc w:val="left"/>
+      <w:pPr>
+        <w:ind w:left="2160" w:hanging="360"/>
+      </w:pPr>
+    </w:lvl>
+    <w:lvl w:ilvl="2">
+      <w:start w:val="1"/>
+      <w:numFmt w:val="lowerRoman"/>
+      <w:lvlText w:val="%3)"/>
+      <w:lvlJc w:val="left"/>
+      <w:pPr>
+        <w:ind w:left="2520" w:hanging="360"/>
+      </w:pPr>
+    </w:lvl>
+    <w:lvl w:ilvl="3">
+      <w:start w:val="1"/>
+      <w:numFmt w:val="decimal"/>
+      <w:lvlText w:val="(%4)"/>
+      <w:lvlJc w:val="left"/>
+      <w:pPr>
+        <w:ind w:left="2880" w:hanging="360"/>
+      </w:pPr>
+    </w:lvl>
+    <w:lvl w:ilvl="4">
+      <w:start w:val="1"/>
+      <w:numFmt w:val="lowerLetter"/>
+      <w:lvlText w:val="(%5)"/>
+      <w:lvlJc w:val="left"/>
+      <w:pPr>
+        <w:ind w:left="3240" w:hanging="360"/>
+      </w:pPr>
+    </w:lvl>
+    <w:lvl w:ilvl="5">
+      <w:start w:val="1"/>
+      <w:numFmt w:val="lowerRoman"/>
+      <w:lvlText w:val="(%6)"/>
+      <w:lvlJc w:val="left"/>
+      <w:pPr>
+        <w:ind w:left="3600" w:hanging="360"/>
+      </w:pPr>
+    </w:lvl>
+    <w:lvl w:ilvl="6">
+      <w:start w:val="1"/>
+      <w:numFmt w:val="decimal"/>
+      <w:lvlText w:val="%7."/>
+      <w:lvlJc w:val="left"/>
+      <w:pPr>
+        <w:ind w:left="3960" w:hanging="360"/>
+      </w:pPr>
+    </w:lvl>
+    <w:lvl w:ilvl="7">
+      <w:start w:val="1"/>
+      <w:numFmt w:val="lowerLetter"/>
+      <w:lvlText w:val="%8."/>
+      <w:lvlJc w:val="left"/>
+      <w:pPr>
+        <w:ind w:left="4320" w:hanging="360"/>
+      </w:pPr>
+    </w:lvl>
+    <w:lvl w:ilvl="8">
+      <w:start w:val="1"/>
+      <w:numFmt w:val="lowerRoman"/>
+      <w:lvlText w:val="%9."/>
+      <w:lvlJc w:val="left"/>
+      <w:pPr>
+        <w:ind w:left="4680" w:hanging="360"/>
+      </w:pPr>
+    </w:lvl>
+  </w:abstractNum>
+  <w:abstractNum w:abstractNumId="15" w15:restartNumberingAfterBreak="0">
+    <w:nsid w:val="57A7681B"/>
+    <w:multiLevelType w:val="multilevel"/>
+    <w:tmpl w:val="0426001D"/>
+    <w:lvl w:ilvl="0">
+      <w:start w:val="1"/>
+      <w:numFmt w:val="decimal"/>
+      <w:lvlText w:val="%1)"/>
+      <w:lvlJc w:val="left"/>
+      <w:pPr>
+        <w:ind w:left="1800" w:hanging="360"/>
+      </w:pPr>
+    </w:lvl>
+    <w:lvl w:ilvl="1">
+      <w:start w:val="1"/>
+      <w:numFmt w:val="lowerLetter"/>
+      <w:lvlText w:val="%2)"/>
+      <w:lvlJc w:val="left"/>
+      <w:pPr>
+        <w:ind w:left="2160" w:hanging="360"/>
+      </w:pPr>
+    </w:lvl>
+    <w:lvl w:ilvl="2">
+      <w:start w:val="1"/>
+      <w:numFmt w:val="lowerRoman"/>
+      <w:lvlText w:val="%3)"/>
+      <w:lvlJc w:val="left"/>
+      <w:pPr>
+        <w:ind w:left="2520" w:hanging="360"/>
+      </w:pPr>
+    </w:lvl>
+    <w:lvl w:ilvl="3">
+      <w:start w:val="1"/>
+      <w:numFmt w:val="decimal"/>
+      <w:lvlText w:val="(%4)"/>
+      <w:lvlJc w:val="left"/>
+      <w:pPr>
+        <w:ind w:left="2880" w:hanging="360"/>
+      </w:pPr>
+    </w:lvl>
+    <w:lvl w:ilvl="4">
+      <w:start w:val="1"/>
+      <w:numFmt w:val="lowerLetter"/>
+      <w:lvlText w:val="(%5)"/>
+      <w:lvlJc w:val="left"/>
+      <w:pPr>
+        <w:ind w:left="3240" w:hanging="360"/>
+      </w:pPr>
+    </w:lvl>
+    <w:lvl w:ilvl="5">
+      <w:start w:val="1"/>
+      <w:numFmt w:val="lowerRoman"/>
+      <w:lvlText w:val="(%6)"/>
+      <w:lvlJc w:val="left"/>
+      <w:pPr>
+        <w:ind w:left="3600" w:hanging="360"/>
+      </w:pPr>
+    </w:lvl>
+    <w:lvl w:ilvl="6">
+      <w:start w:val="1"/>
+      <w:numFmt w:val="decimal"/>
+      <w:lvlText w:val="%7."/>
+      <w:lvlJc w:val="left"/>
+      <w:pPr>
+        <w:ind w:left="3960" w:hanging="360"/>
+      </w:pPr>
+    </w:lvl>
+    <w:lvl w:ilvl="7">
+      <w:start w:val="1"/>
+      <w:numFmt w:val="lowerLetter"/>
+      <w:lvlText w:val="%8."/>
+      <w:lvlJc w:val="left"/>
+      <w:pPr>
+        <w:ind w:left="4320" w:hanging="360"/>
+      </w:pPr>
+    </w:lvl>
+    <w:lvl w:ilvl="8">
+      <w:start w:val="1"/>
+      <w:numFmt w:val="lowerRoman"/>
+      <w:lvlText w:val="%9."/>
+      <w:lvlJc w:val="left"/>
+      <w:pPr>
+        <w:ind w:left="4680" w:hanging="360"/>
+      </w:pPr>
+    </w:lvl>
+  </w:abstractNum>
+  <w:abstractNum w:abstractNumId="16" w15:restartNumberingAfterBreak="0">
     <w:nsid w:val="664A78A8"/>
     <w:multiLevelType w:val="multilevel"/>
     <w:tmpl w:val="C0D2DD60"/>
@@ -7594,7 +9281,7 @@
       </w:rPr>
     </w:lvl>
   </w:abstractNum>
-  <w:abstractNum w:abstractNumId="11" w15:restartNumberingAfterBreak="0">
+  <w:abstractNum w:abstractNumId="17" w15:restartNumberingAfterBreak="0">
     <w:nsid w:val="677B3228"/>
     <w:multiLevelType w:val="hybridMultilevel"/>
     <w:tmpl w:val="F0021746"/>
@@ -7680,7 +9367,7 @@
       </w:pPr>
     </w:lvl>
   </w:abstractNum>
-  <w:abstractNum w:abstractNumId="12" w15:restartNumberingAfterBreak="0">
+  <w:abstractNum w:abstractNumId="18" w15:restartNumberingAfterBreak="0">
     <w:nsid w:val="6E7B44EF"/>
     <w:multiLevelType w:val="hybridMultilevel"/>
     <w:tmpl w:val="9424BF12"/>
@@ -7766,22 +9453,177 @@
       </w:pPr>
     </w:lvl>
   </w:abstractNum>
+  <w:abstractNum w:abstractNumId="19" w15:restartNumberingAfterBreak="0">
+    <w:nsid w:val="7B757EAB"/>
+    <w:multiLevelType w:val="multilevel"/>
+    <w:tmpl w:val="0426001D"/>
+    <w:lvl w:ilvl="0">
+      <w:start w:val="1"/>
+      <w:numFmt w:val="decimal"/>
+      <w:lvlText w:val="%1)"/>
+      <w:lvlJc w:val="left"/>
+      <w:pPr>
+        <w:ind w:left="1800" w:hanging="360"/>
+      </w:pPr>
+    </w:lvl>
+    <w:lvl w:ilvl="1">
+      <w:start w:val="1"/>
+      <w:numFmt w:val="lowerLetter"/>
+      <w:lvlText w:val="%2)"/>
+      <w:lvlJc w:val="left"/>
+      <w:pPr>
+        <w:ind w:left="2160" w:hanging="360"/>
+      </w:pPr>
+    </w:lvl>
+    <w:lvl w:ilvl="2">
+      <w:start w:val="1"/>
+      <w:numFmt w:val="lowerRoman"/>
+      <w:lvlText w:val="%3)"/>
+      <w:lvlJc w:val="left"/>
+      <w:pPr>
+        <w:ind w:left="2520" w:hanging="360"/>
+      </w:pPr>
+    </w:lvl>
+    <w:lvl w:ilvl="3">
+      <w:start w:val="1"/>
+      <w:numFmt w:val="decimal"/>
+      <w:lvlText w:val="(%4)"/>
+      <w:lvlJc w:val="left"/>
+      <w:pPr>
+        <w:ind w:left="2880" w:hanging="360"/>
+      </w:pPr>
+    </w:lvl>
+    <w:lvl w:ilvl="4">
+      <w:start w:val="1"/>
+      <w:numFmt w:val="lowerLetter"/>
+      <w:lvlText w:val="(%5)"/>
+      <w:lvlJc w:val="left"/>
+      <w:pPr>
+        <w:ind w:left="3240" w:hanging="360"/>
+      </w:pPr>
+    </w:lvl>
+    <w:lvl w:ilvl="5">
+      <w:start w:val="1"/>
+      <w:numFmt w:val="lowerRoman"/>
+      <w:lvlText w:val="(%6)"/>
+      <w:lvlJc w:val="left"/>
+      <w:pPr>
+        <w:ind w:left="3600" w:hanging="360"/>
+      </w:pPr>
+    </w:lvl>
+    <w:lvl w:ilvl="6">
+      <w:start w:val="1"/>
+      <w:numFmt w:val="decimal"/>
+      <w:lvlText w:val="%7."/>
+      <w:lvlJc w:val="left"/>
+      <w:pPr>
+        <w:ind w:left="3960" w:hanging="360"/>
+      </w:pPr>
+    </w:lvl>
+    <w:lvl w:ilvl="7">
+      <w:start w:val="1"/>
+      <w:numFmt w:val="lowerLetter"/>
+      <w:lvlText w:val="%8."/>
+      <w:lvlJc w:val="left"/>
+      <w:pPr>
+        <w:ind w:left="4320" w:hanging="360"/>
+      </w:pPr>
+    </w:lvl>
+    <w:lvl w:ilvl="8">
+      <w:start w:val="1"/>
+      <w:numFmt w:val="lowerRoman"/>
+      <w:lvlText w:val="%9."/>
+      <w:lvlJc w:val="left"/>
+      <w:pPr>
+        <w:ind w:left="4680" w:hanging="360"/>
+      </w:pPr>
+    </w:lvl>
+  </w:abstractNum>
   <w:num w:numId="1" w16cid:durableId="887297369">
+    <w:abstractNumId w:val="4"/>
+  </w:num>
+  <w:num w:numId="2" w16cid:durableId="2004043641">
+    <w:abstractNumId w:val="7"/>
+  </w:num>
+  <w:num w:numId="3" w16cid:durableId="807213146">
+    <w:abstractNumId w:val="16"/>
+  </w:num>
+  <w:num w:numId="4" w16cid:durableId="232856481">
+    <w:abstractNumId w:val="12"/>
+  </w:num>
+  <w:num w:numId="5" w16cid:durableId="1629556016">
+    <w:abstractNumId w:val="6"/>
+  </w:num>
+  <w:num w:numId="6" w16cid:durableId="1774588418">
+    <w:abstractNumId w:val="17"/>
+    <w:lvlOverride w:ilvl="0">
+      <w:startOverride w:val="1"/>
+    </w:lvlOverride>
+    <w:lvlOverride w:ilvl="1">
+      <w:startOverride w:val="1"/>
+    </w:lvlOverride>
+    <w:lvlOverride w:ilvl="2">
+      <w:startOverride w:val="1"/>
+    </w:lvlOverride>
+    <w:lvlOverride w:ilvl="3">
+      <w:startOverride w:val="1"/>
+    </w:lvlOverride>
+    <w:lvlOverride w:ilvl="4">
+      <w:startOverride w:val="1"/>
+    </w:lvlOverride>
+    <w:lvlOverride w:ilvl="5">
+      <w:startOverride w:val="1"/>
+    </w:lvlOverride>
+    <w:lvlOverride w:ilvl="6">
+      <w:startOverride w:val="1"/>
+    </w:lvlOverride>
+    <w:lvlOverride w:ilvl="7">
+      <w:startOverride w:val="1"/>
+    </w:lvlOverride>
+    <w:lvlOverride w:ilvl="8">
+      <w:startOverride w:val="1"/>
+    </w:lvlOverride>
+  </w:num>
+  <w:num w:numId="7" w16cid:durableId="623582671">
+    <w:abstractNumId w:val="2"/>
+    <w:lvlOverride w:ilvl="0">
+      <w:startOverride w:val="1"/>
+    </w:lvlOverride>
+    <w:lvlOverride w:ilvl="1">
+      <w:startOverride w:val="1"/>
+    </w:lvlOverride>
+    <w:lvlOverride w:ilvl="2">
+      <w:startOverride w:val="1"/>
+    </w:lvlOverride>
+    <w:lvlOverride w:ilvl="3">
+      <w:startOverride w:val="1"/>
+    </w:lvlOverride>
+    <w:lvlOverride w:ilvl="4">
+      <w:startOverride w:val="1"/>
+    </w:lvlOverride>
+    <w:lvlOverride w:ilvl="5">
+      <w:startOverride w:val="1"/>
+    </w:lvlOverride>
+    <w:lvlOverride w:ilvl="6">
+      <w:startOverride w:val="1"/>
+    </w:lvlOverride>
+    <w:lvlOverride w:ilvl="7">
+      <w:startOverride w:val="1"/>
+    </w:lvlOverride>
+    <w:lvlOverride w:ilvl="8">
+      <w:startOverride w:val="1"/>
+    </w:lvlOverride>
+  </w:num>
+  <w:num w:numId="8" w16cid:durableId="20594115">
     <w:abstractNumId w:val="2"/>
   </w:num>
-  <w:num w:numId="2" w16cid:durableId="2004043641">
-    <w:abstractNumId w:val="5"/>
+  <w:num w:numId="9" w16cid:durableId="881986857">
+    <w:abstractNumId w:val="18"/>
   </w:num>
-  <w:num w:numId="3" w16cid:durableId="807213146">
-    <w:abstractNumId w:val="10"/>
+  <w:num w:numId="10" w16cid:durableId="1286619816">
+    <w:abstractNumId w:val="0"/>
   </w:num>
-  <w:num w:numId="4" w16cid:durableId="232856481">
-    <w:abstractNumId w:val="8"/>
-  </w:num>
-  <w:num w:numId="5" w16cid:durableId="1629556016">
-    <w:abstractNumId w:val="4"/>
-  </w:num>
-  <w:num w:numId="6" w16cid:durableId="1774588418">
+  <w:num w:numId="11" w16cid:durableId="426273954">
     <w:abstractNumId w:val="11"/>
     <w:lvlOverride w:ilvl="0">
       <w:startOverride w:val="1"/>
@@ -7811,77 +9653,8 @@
       <w:startOverride w:val="1"/>
     </w:lvlOverride>
   </w:num>
-  <w:num w:numId="7" w16cid:durableId="623582671">
-    <w:abstractNumId w:val="1"/>
-    <w:lvlOverride w:ilvl="0">
-      <w:startOverride w:val="1"/>
-    </w:lvlOverride>
-    <w:lvlOverride w:ilvl="1">
-      <w:startOverride w:val="1"/>
-    </w:lvlOverride>
-    <w:lvlOverride w:ilvl="2">
-      <w:startOverride w:val="1"/>
-    </w:lvlOverride>
-    <w:lvlOverride w:ilvl="3">
-      <w:startOverride w:val="1"/>
-    </w:lvlOverride>
-    <w:lvlOverride w:ilvl="4">
-      <w:startOverride w:val="1"/>
-    </w:lvlOverride>
-    <w:lvlOverride w:ilvl="5">
-      <w:startOverride w:val="1"/>
-    </w:lvlOverride>
-    <w:lvlOverride w:ilvl="6">
-      <w:startOverride w:val="1"/>
-    </w:lvlOverride>
-    <w:lvlOverride w:ilvl="7">
-      <w:startOverride w:val="1"/>
-    </w:lvlOverride>
-    <w:lvlOverride w:ilvl="8">
-      <w:startOverride w:val="1"/>
-    </w:lvlOverride>
-  </w:num>
-  <w:num w:numId="8" w16cid:durableId="20594115">
-    <w:abstractNumId w:val="1"/>
-  </w:num>
-  <w:num w:numId="9" w16cid:durableId="881986857">
-    <w:abstractNumId w:val="12"/>
-  </w:num>
-  <w:num w:numId="10" w16cid:durableId="1286619816">
-    <w:abstractNumId w:val="0"/>
-  </w:num>
-  <w:num w:numId="11" w16cid:durableId="426273954">
-    <w:abstractNumId w:val="7"/>
-    <w:lvlOverride w:ilvl="0">
-      <w:startOverride w:val="1"/>
-    </w:lvlOverride>
-    <w:lvlOverride w:ilvl="1">
-      <w:startOverride w:val="1"/>
-    </w:lvlOverride>
-    <w:lvlOverride w:ilvl="2">
-      <w:startOverride w:val="1"/>
-    </w:lvlOverride>
-    <w:lvlOverride w:ilvl="3">
-      <w:startOverride w:val="1"/>
-    </w:lvlOverride>
-    <w:lvlOverride w:ilvl="4">
-      <w:startOverride w:val="1"/>
-    </w:lvlOverride>
-    <w:lvlOverride w:ilvl="5">
-      <w:startOverride w:val="1"/>
-    </w:lvlOverride>
-    <w:lvlOverride w:ilvl="6">
-      <w:startOverride w:val="1"/>
-    </w:lvlOverride>
-    <w:lvlOverride w:ilvl="7">
-      <w:startOverride w:val="1"/>
-    </w:lvlOverride>
-    <w:lvlOverride w:ilvl="8">
-      <w:startOverride w:val="1"/>
-    </w:lvlOverride>
-  </w:num>
   <w:num w:numId="12" w16cid:durableId="816991744">
-    <w:abstractNumId w:val="6"/>
+    <w:abstractNumId w:val="9"/>
     <w:lvlOverride w:ilvl="0">
       <w:startOverride w:val="1"/>
     </w:lvlOverride>
@@ -7911,10 +9684,31 @@
     </w:lvlOverride>
   </w:num>
   <w:num w:numId="13" w16cid:durableId="571236619">
+    <w:abstractNumId w:val="5"/>
+  </w:num>
+  <w:num w:numId="14" w16cid:durableId="723483451">
+    <w:abstractNumId w:val="13"/>
+  </w:num>
+  <w:num w:numId="15" w16cid:durableId="1996519990">
+    <w:abstractNumId w:val="10"/>
+  </w:num>
+  <w:num w:numId="16" w16cid:durableId="783111171">
+    <w:abstractNumId w:val="15"/>
+  </w:num>
+  <w:num w:numId="17" w16cid:durableId="2063822321">
     <w:abstractNumId w:val="3"/>
   </w:num>
-  <w:num w:numId="14" w16cid:durableId="723483451">
-    <w:abstractNumId w:val="9"/>
+  <w:num w:numId="18" w16cid:durableId="1720470489">
+    <w:abstractNumId w:val="1"/>
+  </w:num>
+  <w:num w:numId="19" w16cid:durableId="1287276453">
+    <w:abstractNumId w:val="14"/>
+  </w:num>
+  <w:num w:numId="20" w16cid:durableId="689141451">
+    <w:abstractNumId w:val="19"/>
+  </w:num>
+  <w:num w:numId="21" w16cid:durableId="487522988">
+    <w:abstractNumId w:val="8"/>
   </w:num>
 </w:numbering>
 </file>

</xml_diff>

<commit_message>
done adding up tests
</commit_message>
<xml_diff>
--- a/Documentation/Dokumentācija.docx
+++ b/Documentation/Dokumentācija.docx
@@ -7637,8 +7637,16 @@
           <w:p>
             <w:pPr>
               <w:pStyle w:val="talbecontent"/>
+              <w:rPr>
+                <w:b/>
+                <w:bCs/>
+              </w:rPr>
             </w:pPr>
             <w:r>
+              <w:rPr>
+                <w:b/>
+                <w:bCs/>
+              </w:rPr>
               <w:t>ID</w:t>
             </w:r>
           </w:p>
@@ -7650,8 +7658,16 @@
           <w:p>
             <w:pPr>
               <w:pStyle w:val="talbecontent"/>
+              <w:rPr>
+                <w:b/>
+                <w:bCs/>
+              </w:rPr>
             </w:pPr>
             <w:r>
+              <w:rPr>
+                <w:b/>
+                <w:bCs/>
+              </w:rPr>
               <w:t>Izpildes nosacījumi</w:t>
             </w:r>
           </w:p>
@@ -7663,8 +7679,16 @@
           <w:p>
             <w:pPr>
               <w:pStyle w:val="talbecontent"/>
+              <w:rPr>
+                <w:b/>
+                <w:bCs/>
+              </w:rPr>
             </w:pPr>
             <w:r>
+              <w:rPr>
+                <w:b/>
+                <w:bCs/>
+              </w:rPr>
               <w:t>Apraksts</w:t>
             </w:r>
           </w:p>
@@ -7676,8 +7700,16 @@
           <w:p>
             <w:pPr>
               <w:pStyle w:val="talbecontent"/>
+              <w:rPr>
+                <w:b/>
+                <w:bCs/>
+              </w:rPr>
             </w:pPr>
             <w:r>
+              <w:rPr>
+                <w:b/>
+                <w:bCs/>
+              </w:rPr>
               <w:t>Izpildes soļi</w:t>
             </w:r>
           </w:p>
@@ -7689,8 +7721,16 @@
           <w:p>
             <w:pPr>
               <w:pStyle w:val="talbecontent"/>
+              <w:rPr>
+                <w:b/>
+                <w:bCs/>
+              </w:rPr>
             </w:pPr>
             <w:r>
+              <w:rPr>
+                <w:b/>
+                <w:bCs/>
+              </w:rPr>
               <w:t>Ievades dati</w:t>
             </w:r>
           </w:p>
@@ -7702,8 +7742,16 @@
           <w:p>
             <w:pPr>
               <w:pStyle w:val="talbecontent"/>
+              <w:rPr>
+                <w:b/>
+                <w:bCs/>
+              </w:rPr>
             </w:pPr>
             <w:r>
+              <w:rPr>
+                <w:b/>
+                <w:bCs/>
+              </w:rPr>
               <w:t>Sagaidāms. rezultāts</w:t>
             </w:r>
           </w:p>
@@ -7715,8 +7763,16 @@
           <w:p>
             <w:pPr>
               <w:pStyle w:val="talbecontent"/>
+              <w:rPr>
+                <w:b/>
+                <w:bCs/>
+              </w:rPr>
             </w:pPr>
             <w:r>
+              <w:rPr>
+                <w:b/>
+                <w:bCs/>
+              </w:rPr>
               <w:t>Prasības identifikators</w:t>
             </w:r>
           </w:p>
@@ -7748,7 +7804,10 @@
               <w:pStyle w:val="talbecontent"/>
             </w:pPr>
             <w:r>
-              <w:t>Aplikācija tiek palaista</w:t>
+              <w:t xml:space="preserve">Datorspēle </w:t>
+            </w:r>
+            <w:r>
+              <w:t>tiek palaista</w:t>
             </w:r>
           </w:p>
         </w:tc>
@@ -7760,6 +7819,9 @@
             <w:pPr>
               <w:pStyle w:val="talbecontent"/>
             </w:pPr>
+            <w:r>
+              <w:t>Datorspēles palaišana</w:t>
+            </w:r>
           </w:p>
         </w:tc>
         <w:tc>
@@ -7796,6 +7858,9 @@
             <w:pPr>
               <w:pStyle w:val="talbecontent"/>
             </w:pPr>
+            <w:r>
+              <w:t>Spēle tiek palaista bez klupēm</w:t>
+            </w:r>
           </w:p>
         </w:tc>
         <w:tc>
@@ -7838,7 +7903,13 @@
               <w:pStyle w:val="talbecontent"/>
             </w:pPr>
             <w:r>
-              <w:t>Aplikācija tiek aizvērta</w:t>
+              <w:t>Datorspēle</w:t>
+            </w:r>
+            <w:r>
+              <w:t xml:space="preserve"> </w:t>
+            </w:r>
+            <w:r>
+              <w:t>tiek aizvērta</w:t>
             </w:r>
           </w:p>
         </w:tc>
@@ -7850,6 +7921,9 @@
             <w:pPr>
               <w:pStyle w:val="talbecontent"/>
             </w:pPr>
+            <w:r>
+              <w:t>Datorspēles aizvēršana</w:t>
+            </w:r>
           </w:p>
         </w:tc>
         <w:tc>
@@ -7886,6 +7960,9 @@
             <w:pPr>
               <w:pStyle w:val="talbecontent"/>
             </w:pPr>
+            <w:r>
+              <w:t>Spēle tiek aizvērta bez klupēm un saglabātiem datiem</w:t>
+            </w:r>
           </w:p>
         </w:tc>
         <w:tc>
@@ -7949,6 +8026,9 @@
             <w:pPr>
               <w:pStyle w:val="talbecontent"/>
             </w:pPr>
+            <w:r>
+              <w:t>Anotācijas loga atvēršana</w:t>
+            </w:r>
           </w:p>
         </w:tc>
         <w:tc>
@@ -7991,6 +8071,9 @@
             <w:pPr>
               <w:pStyle w:val="talbecontent"/>
             </w:pPr>
+            <w:r>
+              <w:t>Anotācijas logs ir redzams lietotājam, norādot informāciju par šo datorspēli</w:t>
+            </w:r>
           </w:p>
         </w:tc>
         <w:tc>
@@ -8051,6 +8134,9 @@
             <w:pPr>
               <w:pStyle w:val="talbecontent"/>
             </w:pPr>
+            <w:r>
+              <w:t>Anotācijas loga aizvēršana</w:t>
+            </w:r>
           </w:p>
         </w:tc>
         <w:tc>
@@ -8090,6 +8176,9 @@
             <w:pPr>
               <w:pStyle w:val="talbecontent"/>
             </w:pPr>
+            <w:r>
+              <w:t>Anotācijas logs vairs nav redzams lietotājam</w:t>
+            </w:r>
           </w:p>
         </w:tc>
         <w:tc>
@@ -8147,6 +8236,9 @@
             <w:pPr>
               <w:pStyle w:val="talbecontent"/>
             </w:pPr>
+            <w:r>
+              <w:t>Pārvirze uz līmeņu atlases ainu</w:t>
+            </w:r>
           </w:p>
         </w:tc>
         <w:tc>
@@ -8186,6 +8278,9 @@
             <w:pPr>
               <w:pStyle w:val="talbecontent"/>
             </w:pPr>
+            <w:r>
+              <w:t>Lietotājam ir redzams līmeņa atlases aina bez klupēm</w:t>
+            </w:r>
           </w:p>
         </w:tc>
         <w:tc>
@@ -8221,7 +8316,10 @@
               <w:t>LM</w:t>
             </w:r>
             <w:r>
-              <w:t>.1</w:t>
+              <w:t>.</w:t>
+            </w:r>
+            <w:r>
+              <w:t>6</w:t>
             </w:r>
           </w:p>
         </w:tc>
@@ -8234,10 +8332,7 @@
               <w:pStyle w:val="talbecontent"/>
             </w:pPr>
             <w:r>
-              <w:t>Līmeņa atlases a</w:t>
-            </w:r>
-            <w:r>
-              <w:t>ina tiek parādīta</w:t>
+              <w:t>Līmeņa atlases aina tiek parādīta</w:t>
             </w:r>
           </w:p>
         </w:tc>
@@ -8249,6 +8344,9 @@
             <w:pPr>
               <w:pStyle w:val="talbecontent"/>
             </w:pPr>
+            <w:r>
+              <w:t>Pārvirze uz līmeņu atlases ainu</w:t>
+            </w:r>
           </w:p>
         </w:tc>
         <w:tc>
@@ -8259,6 +8357,9 @@
             <w:pPr>
               <w:pStyle w:val="talbecontent"/>
             </w:pPr>
+            <w:r>
+              <w:t>Lietotājs gaida līdz ielādei</w:t>
+            </w:r>
           </w:p>
         </w:tc>
         <w:tc>
@@ -8269,6 +8370,9 @@
             <w:pPr>
               <w:pStyle w:val="talbecontent"/>
             </w:pPr>
+            <w:r>
+              <w:t>Nav</w:t>
+            </w:r>
           </w:p>
         </w:tc>
         <w:tc>
@@ -8279,6 +8383,9 @@
             <w:pPr>
               <w:pStyle w:val="talbecontent"/>
             </w:pPr>
+            <w:r>
+              <w:t>Līmeņa atlases aina</w:t>
+            </w:r>
           </w:p>
         </w:tc>
         <w:tc>
@@ -8289,6 +8396,18 @@
             <w:pPr>
               <w:pStyle w:val="talbecontent"/>
             </w:pPr>
+            <w:r>
+              <w:t>PR.</w:t>
+            </w:r>
+            <w:r>
+              <w:t>LA</w:t>
+            </w:r>
+            <w:r>
+              <w:t>.</w:t>
+            </w:r>
+            <w:r>
+              <w:t>6</w:t>
+            </w:r>
           </w:p>
         </w:tc>
       </w:tr>
@@ -8305,7 +8424,7 @@
               <w:t>TP.LM.</w:t>
             </w:r>
             <w:r>
-              <w:t>2</w:t>
+              <w:t>7</w:t>
             </w:r>
           </w:p>
         </w:tc>
@@ -8330,6 +8449,18 @@
             <w:pPr>
               <w:pStyle w:val="talbecontent"/>
             </w:pPr>
+            <w:r>
+              <w:t xml:space="preserve">Pārvirze uz līmeņu </w:t>
+            </w:r>
+            <w:r>
+              <w:t>sākuma</w:t>
+            </w:r>
+            <w:r>
+              <w:t xml:space="preserve"> </w:t>
+            </w:r>
+            <w:r>
+              <w:t>ainu</w:t>
+            </w:r>
           </w:p>
         </w:tc>
         <w:tc>
@@ -8340,6 +8471,9 @@
             <w:pPr>
               <w:pStyle w:val="talbecontent"/>
             </w:pPr>
+            <w:r>
+              <w:t>Lietotājs nospiež atgriešanas pogu</w:t>
+            </w:r>
           </w:p>
         </w:tc>
         <w:tc>
@@ -8350,6 +8484,9 @@
             <w:pPr>
               <w:pStyle w:val="talbecontent"/>
             </w:pPr>
+            <w:r>
+              <w:t>Atgriešanas poga</w:t>
+            </w:r>
           </w:p>
         </w:tc>
         <w:tc>
@@ -8360,6 +8497,9 @@
             <w:pPr>
               <w:pStyle w:val="talbecontent"/>
             </w:pPr>
+            <w:r>
+              <w:t>Lietotājs tiek pārvirzīts uz sākuma ainu</w:t>
+            </w:r>
           </w:p>
         </w:tc>
         <w:tc>
@@ -8370,6 +8510,9 @@
             <w:pPr>
               <w:pStyle w:val="talbecontent"/>
             </w:pPr>
+            <w:r>
+              <w:t>PR.LA.10</w:t>
+            </w:r>
           </w:p>
         </w:tc>
       </w:tr>
@@ -8383,10 +8526,11 @@
               <w:pStyle w:val="talbecontent"/>
             </w:pPr>
             <w:r>
+              <w:lastRenderedPageBreak/>
               <w:t>TP.LM.</w:t>
             </w:r>
             <w:r>
-              <w:t>3</w:t>
+              <w:t>8</w:t>
             </w:r>
           </w:p>
         </w:tc>
@@ -8411,6 +8555,9 @@
             <w:pPr>
               <w:pStyle w:val="talbecontent"/>
             </w:pPr>
+            <w:r>
+              <w:t>Līmeņa pamatinformācijas loga atvēršana</w:t>
+            </w:r>
           </w:p>
         </w:tc>
         <w:tc>
@@ -8421,6 +8568,9 @@
             <w:pPr>
               <w:pStyle w:val="talbecontent"/>
             </w:pPr>
+            <w:r>
+              <w:t>Lietotājs nospiež atzīmētā līmeņa punktu no laukuma</w:t>
+            </w:r>
           </w:p>
         </w:tc>
         <w:tc>
@@ -8431,6 +8581,9 @@
             <w:pPr>
               <w:pStyle w:val="talbecontent"/>
             </w:pPr>
+            <w:r>
+              <w:t>Atzīmētā līmeņa punkts kartes laukumā</w:t>
+            </w:r>
           </w:p>
         </w:tc>
         <w:tc>
@@ -8441,6 +8594,9 @@
             <w:pPr>
               <w:pStyle w:val="talbecontent"/>
             </w:pPr>
+            <w:r>
+              <w:t>Pamatinformācijas logs parādās ainas sānos ar līmeņa atvēršanas pogu</w:t>
+            </w:r>
           </w:p>
         </w:tc>
         <w:tc>
@@ -8451,6 +8607,9 @@
             <w:pPr>
               <w:pStyle w:val="talbecontent"/>
             </w:pPr>
+            <w:r>
+              <w:t>PR.LA.7</w:t>
+            </w:r>
           </w:p>
         </w:tc>
       </w:tr>
@@ -8468,11 +8627,10 @@
               </w:rPr>
             </w:pPr>
             <w:r>
-              <w:lastRenderedPageBreak/>
               <w:t>TP.LM.</w:t>
             </w:r>
             <w:r>
-              <w:t>4</w:t>
+              <w:t>9</w:t>
             </w:r>
           </w:p>
         </w:tc>
@@ -8497,6 +8655,18 @@
             <w:pPr>
               <w:pStyle w:val="talbecontent"/>
             </w:pPr>
+            <w:r>
+              <w:t xml:space="preserve">Līmeņa </w:t>
+            </w:r>
+            <w:r>
+              <w:t>p</w:t>
+            </w:r>
+            <w:r>
+              <w:t>amatinformācijas loga</w:t>
+            </w:r>
+            <w:r>
+              <w:t xml:space="preserve"> aizvēršana</w:t>
+            </w:r>
           </w:p>
         </w:tc>
         <w:tc>
@@ -8507,6 +8677,9 @@
             <w:pPr>
               <w:pStyle w:val="talbecontent"/>
             </w:pPr>
+            <w:r>
+              <w:t>Lietotājs nospiež citu vietu kartes laukumā,</w:t>
+            </w:r>
           </w:p>
         </w:tc>
         <w:tc>
@@ -8517,6 +8690,9 @@
             <w:pPr>
               <w:pStyle w:val="talbecontent"/>
             </w:pPr>
+            <w:r>
+              <w:t>Laukums kartē, kuras kursors neatrodas virs līmeņa punkta</w:t>
+            </w:r>
           </w:p>
         </w:tc>
         <w:tc>
@@ -8527,6 +8703,9 @@
             <w:pPr>
               <w:pStyle w:val="talbecontent"/>
             </w:pPr>
+            <w:r>
+              <w:t>Pamatinformācijas logs tiek aizvērts</w:t>
+            </w:r>
           </w:p>
         </w:tc>
         <w:tc>
@@ -8537,6 +8716,12 @@
             <w:pPr>
               <w:pStyle w:val="talbecontent"/>
             </w:pPr>
+            <w:r>
+              <w:t>PR.LA.</w:t>
+            </w:r>
+            <w:r>
+              <w:t>8</w:t>
+            </w:r>
           </w:p>
         </w:tc>
       </w:tr>
@@ -8553,7 +8738,7 @@
               <w:t>TP.LM.</w:t>
             </w:r>
             <w:r>
-              <w:t>5</w:t>
+              <w:t>10</w:t>
             </w:r>
           </w:p>
         </w:tc>
@@ -8566,10 +8751,7 @@
               <w:pStyle w:val="talbecontent"/>
             </w:pPr>
             <w:r>
-              <w:t>Lietotājs netiek pārvirzīts uz spēles laukuma atverot bloķētu līme</w:t>
-            </w:r>
-            <w:r>
-              <w:t>ni</w:t>
+              <w:t>Lietotājs netiek pārvirzīts uz spēles laukuma atverot bloķētu līmeni</w:t>
             </w:r>
           </w:p>
         </w:tc>
@@ -8581,6 +8763,15 @@
             <w:pPr>
               <w:pStyle w:val="talbecontent"/>
             </w:pPr>
+            <w:r>
+              <w:t xml:space="preserve">Mēģinājums atvērt </w:t>
+            </w:r>
+            <w:r>
+              <w:t xml:space="preserve">bloķētu </w:t>
+            </w:r>
+            <w:r>
+              <w:t>līmeni</w:t>
+            </w:r>
           </w:p>
         </w:tc>
         <w:tc>
@@ -8591,6 +8782,9 @@
             <w:pPr>
               <w:pStyle w:val="talbecontent"/>
             </w:pPr>
+            <w:r>
+              <w:t>Lietotājs nospiež atvēršanas pogu</w:t>
+            </w:r>
           </w:p>
         </w:tc>
         <w:tc>
@@ -8601,6 +8795,9 @@
             <w:pPr>
               <w:pStyle w:val="talbecontent"/>
             </w:pPr>
+            <w:r>
+              <w:t>Nodzisuša atvēršanas poga</w:t>
+            </w:r>
           </w:p>
         </w:tc>
         <w:tc>
@@ -8611,6 +8808,9 @@
             <w:pPr>
               <w:pStyle w:val="talbecontent"/>
             </w:pPr>
+            <w:r>
+              <w:t>Darbība netiek veikta nodzisušas pogas dēļ.</w:t>
+            </w:r>
           </w:p>
         </w:tc>
         <w:tc>
@@ -8621,6 +8821,12 @@
             <w:pPr>
               <w:pStyle w:val="talbecontent"/>
             </w:pPr>
+            <w:r>
+              <w:t>PR.LA.</w:t>
+            </w:r>
+            <w:r>
+              <w:t>9</w:t>
+            </w:r>
           </w:p>
         </w:tc>
       </w:tr>
@@ -8637,7 +8843,7 @@
               <w:t>TP.LM.</w:t>
             </w:r>
             <w:r>
-              <w:t>6</w:t>
+              <w:t>11</w:t>
             </w:r>
           </w:p>
         </w:tc>
@@ -8650,10 +8856,7 @@
               <w:pStyle w:val="talbecontent"/>
             </w:pPr>
             <w:r>
-              <w:t xml:space="preserve">Lietotājs tiek pārvirzīts uz spēles laukuma ainu </w:t>
-            </w:r>
-            <w:r>
-              <w:t>atverot pieejamu līmeni</w:t>
+              <w:t>Lietotājs tiek pārvirzīts uz spēles laukuma ainu atverot pieejamu līmeni</w:t>
             </w:r>
           </w:p>
         </w:tc>
@@ -8665,6 +8868,9 @@
             <w:pPr>
               <w:pStyle w:val="talbecontent"/>
             </w:pPr>
+            <w:r>
+              <w:t>Mēģinājums atvērt līmeni</w:t>
+            </w:r>
           </w:p>
         </w:tc>
         <w:tc>
@@ -8675,6 +8881,9 @@
             <w:pPr>
               <w:pStyle w:val="talbecontent"/>
             </w:pPr>
+            <w:r>
+              <w:t>Lietotājs nospiež atvēršanas pogu</w:t>
+            </w:r>
           </w:p>
         </w:tc>
         <w:tc>
@@ -8685,6 +8894,12 @@
             <w:pPr>
               <w:pStyle w:val="talbecontent"/>
             </w:pPr>
+            <w:r>
+              <w:t>A</w:t>
+            </w:r>
+            <w:r>
+              <w:t>tvēršanas poga</w:t>
+            </w:r>
           </w:p>
         </w:tc>
         <w:tc>
@@ -8695,6 +8910,9 @@
             <w:pPr>
               <w:pStyle w:val="talbecontent"/>
             </w:pPr>
+            <w:r>
+              <w:t>Lietotājs tiek pārvirzīts uz spēles laukuma ainu ar atlasītā līmeņa datiem</w:t>
+            </w:r>
           </w:p>
         </w:tc>
         <w:tc>
@@ -8705,6 +8923,12 @@
             <w:pPr>
               <w:pStyle w:val="talbecontent"/>
             </w:pPr>
+            <w:r>
+              <w:t>PR.LA.</w:t>
+            </w:r>
+            <w:r>
+              <w:t>9</w:t>
+            </w:r>
           </w:p>
         </w:tc>
       </w:tr>

</xml_diff>

<commit_message>
more accureate use of tools
</commit_message>
<xml_diff>
--- a/Documentation/Dokumentācija.docx
+++ b/Documentation/Dokumentācija.docx
@@ -112,13 +112,8 @@
       </w:r>
       <w:r>
         <w:br/>
-        <w:t xml:space="preserve">Skolotājs, Kristaps </w:t>
-      </w:r>
-      <w:proofErr w:type="spellStart"/>
-      <w:r>
-        <w:t>Rāvalds</w:t>
-      </w:r>
-      <w:proofErr w:type="spellEnd"/>
+        <w:t>Skolotājs, Kristaps Rāvalds</w:t>
+      </w:r>
     </w:p>
     <w:p>
       <w:pPr>
@@ -3334,15 +3329,7 @@
         <w:t xml:space="preserve">, kā arī </w:t>
       </w:r>
       <w:r>
-        <w:t xml:space="preserve">kādas datorspēlēs var iekļaut funkcionalitātes, kuras nav nepieciešams vai novērsošas projektam un tās izmantošanai kā </w:t>
-      </w:r>
-      <w:proofErr w:type="spellStart"/>
-      <w:r>
-        <w:t>pamatzināšanu</w:t>
-      </w:r>
-      <w:proofErr w:type="spellEnd"/>
-      <w:r>
-        <w:t xml:space="preserve"> apmācības materiālam.</w:t>
+        <w:t>kādas datorspēlēs var iekļaut funkcionalitātes, kuras nav nepieciešams vai novērsošas projektam un tās izmantošanai kā pamatzināšanu apmācības materiālam.</w:t>
       </w:r>
     </w:p>
     <w:p>
@@ -3457,15 +3444,7 @@
         <w:t xml:space="preserve"> </w:t>
       </w:r>
       <w:r>
-        <w:t xml:space="preserve">Pēc izstrādes šis projekts ar tās </w:t>
-      </w:r>
-      <w:proofErr w:type="spellStart"/>
-      <w:r>
-        <w:t>avotkodu</w:t>
-      </w:r>
-      <w:proofErr w:type="spellEnd"/>
-      <w:r>
-        <w:t xml:space="preserve"> tiek kompilēts datorsistēmas platformās kā </w:t>
+        <w:t xml:space="preserve">Pēc izstrādes šis projekts ar tās avotkodu tiek kompilēts datorsistēmas platformās kā </w:t>
       </w:r>
       <w:r>
         <w:rPr>
@@ -3477,7 +3456,6 @@
       <w:r>
         <w:t xml:space="preserve"> un </w:t>
       </w:r>
-      <w:proofErr w:type="spellStart"/>
       <w:r>
         <w:rPr>
           <w:i/>
@@ -3485,7 +3463,6 @@
         </w:rPr>
         <w:t>Linux</w:t>
       </w:r>
-      <w:proofErr w:type="spellEnd"/>
       <w:r>
         <w:t xml:space="preserve"> vidē.</w:t>
       </w:r>
@@ -3562,15 +3539,7 @@
         <w:t xml:space="preserve">Pēc modelēšanas tiek izstrādās projekts, pamatojoties uz iepriekš izveidotiem modeļiem. Izstrādes laikā </w:t>
       </w:r>
       <w:r>
-        <w:t xml:space="preserve">ir jāveic projektam </w:t>
-      </w:r>
-      <w:proofErr w:type="spellStart"/>
-      <w:r>
-        <w:t>versionēšanu</w:t>
-      </w:r>
-      <w:proofErr w:type="spellEnd"/>
-      <w:r>
-        <w:t xml:space="preserve"> jeb versiju kontroli, kuras vadīs projekta stadijas punktus. Praksē tā tiks izmantota, piemēram, projekta sazarošanai funkcionalitātes, būtisko izmaiņu ieviešanai, atsevišķu failu izmaiņu punktu atzīmēšanu, sazarojumu apvienošanu un versijas punktu atzīmēšanu.</w:t>
+        <w:t>ir jāveic projektam versionēšanu jeb versiju kontroli, kuras vadīs projekta stadijas punktus. Praksē tā tiks izmantota, piemēram, projekta sazarošanai funkcionalitātes, būtisko izmaiņu ieviešanai, atsevišķu failu izmaiņu punktu atzīmēšanu, sazarojumu apvienošanu un versijas punktu atzīmēšanu.</w:t>
       </w:r>
     </w:p>
     <w:p>
@@ -3785,15 +3754,7 @@
         <w:t>Izvaddati</w:t>
       </w:r>
       <w:r>
-        <w:t xml:space="preserve">: </w:t>
-      </w:r>
-      <w:proofErr w:type="spellStart"/>
-      <w:r>
-        <w:t>Uznirsts</w:t>
-      </w:r>
-      <w:proofErr w:type="spellEnd"/>
-      <w:r>
-        <w:t xml:space="preserve"> anotācijas logs.</w:t>
+        <w:t>: Uznirsts anotācijas logs.</w:t>
       </w:r>
     </w:p>
     <w:p>
@@ -4814,13 +4775,8 @@
       <w:r>
         <w:t xml:space="preserve">: </w:t>
       </w:r>
-      <w:proofErr w:type="spellStart"/>
-      <w:r>
-        <w:t>Augšjoslas</w:t>
-      </w:r>
-      <w:proofErr w:type="spellEnd"/>
-      <w:r>
-        <w:t xml:space="preserve"> pauzēšanas poga.</w:t>
+      <w:r>
+        <w:t>Augšjoslas pauzēšanas poga.</w:t>
       </w:r>
     </w:p>
     <w:p>
@@ -5028,13 +4984,8 @@
         <w:t>: Laika rādītājs</w:t>
       </w:r>
       <w:r>
-        <w:t xml:space="preserve"> </w:t>
-      </w:r>
-      <w:proofErr w:type="spellStart"/>
-      <w:r>
-        <w:t>augšjoslā</w:t>
-      </w:r>
-      <w:proofErr w:type="spellEnd"/>
+        <w:t xml:space="preserve"> augšjoslā</w:t>
+      </w:r>
       <w:r>
         <w:t>.</w:t>
       </w:r>
@@ -5093,13 +5044,8 @@
         <w:t xml:space="preserve">: </w:t>
       </w:r>
       <w:r>
-        <w:t xml:space="preserve">Kārtas skaits </w:t>
-      </w:r>
-      <w:proofErr w:type="spellStart"/>
-      <w:r>
-        <w:t>augšjoslā</w:t>
-      </w:r>
-      <w:proofErr w:type="spellEnd"/>
+        <w:t>Kārtas skaits augšjoslā</w:t>
+      </w:r>
       <w:r>
         <w:t xml:space="preserve">. </w:t>
       </w:r>
@@ -7043,15 +6989,7 @@
       </w:r>
       <w:r>
         <w:tab/>
-        <w:t>Datorspēles kompilētā programmai ir jābūt pēc iespējas pieejamai vairākās platformās vai kompilējamam vairākām operētājsistēmām, taču galvenokārt “Windows” un “</w:t>
-      </w:r>
-      <w:proofErr w:type="spellStart"/>
-      <w:r>
-        <w:t>Linux</w:t>
-      </w:r>
-      <w:proofErr w:type="spellEnd"/>
-      <w:r>
-        <w:t>” videi;</w:t>
+        <w:t>Datorspēles kompilētā programmai ir jābūt pēc iespējas pieejamai vairākās platformās vai kompilējamam vairākām operētājsistēmām, taču galvenokārt “Windows” un “Linux” videi;</w:t>
       </w:r>
     </w:p>
     <w:p>
@@ -7068,13 +7006,8 @@
         <w:pStyle w:val="Virsraksts3"/>
       </w:pPr>
       <w:r>
-        <w:t xml:space="preserve">Lietotāja </w:t>
-      </w:r>
-      <w:proofErr w:type="spellStart"/>
-      <w:r>
-        <w:t>saskarne</w:t>
-      </w:r>
-      <w:proofErr w:type="spellEnd"/>
+        <w:t>Lietotāja saskarne</w:t>
+      </w:r>
     </w:p>
     <w:p>
       <w:r>
@@ -7092,15 +7025,7 @@
       </w:r>
       <w:r>
         <w:tab/>
-        <w:t xml:space="preserve">Datorspēles grafikai un lietotāja </w:t>
-      </w:r>
-      <w:proofErr w:type="spellStart"/>
-      <w:r>
-        <w:t>saskarnei</w:t>
-      </w:r>
-      <w:proofErr w:type="spellEnd"/>
-      <w:r>
-        <w:t xml:space="preserve"> jābūt minimālai, taču viegli pārskatāmai;</w:t>
+        <w:t>Datorspēles grafikai un lietotāja saskarnei jābūt minimālai, taču viegli pārskatāmai;</w:t>
       </w:r>
     </w:p>
     <w:p>
@@ -7112,15 +7037,7 @@
       </w:r>
       <w:r>
         <w:tab/>
-        <w:t xml:space="preserve">Lietotāja </w:t>
-      </w:r>
-      <w:proofErr w:type="spellStart"/>
-      <w:r>
-        <w:t>saskarnei</w:t>
-      </w:r>
-      <w:proofErr w:type="spellEnd"/>
-      <w:r>
-        <w:t xml:space="preserve"> ir jābūt pielāgojamai dažādos ekrānu izmēros vai izšķirtspējās;</w:t>
+        <w:t>Lietotāja saskarnei ir jābūt pielāgojamai dažādos ekrānu izmēros vai izšķirtspējās;</w:t>
       </w:r>
     </w:p>
     <w:p>
@@ -7132,15 +7049,7 @@
       </w:r>
       <w:r>
         <w:tab/>
-        <w:t xml:space="preserve">Datorspēles </w:t>
-      </w:r>
-      <w:proofErr w:type="spellStart"/>
-      <w:r>
-        <w:t>saskarnes</w:t>
-      </w:r>
-      <w:proofErr w:type="spellEnd"/>
-      <w:r>
-        <w:t xml:space="preserve"> valodai jābūt angļu valodai;</w:t>
+        <w:t>Datorspēles saskarnes valodai jābūt angļu valodai;</w:t>
       </w:r>
     </w:p>
     <w:p>
@@ -7241,15 +7150,7 @@
     </w:p>
     <w:p>
       <w:r>
-        <w:t xml:space="preserve">Šī sadaļa noskaidros, kādi ir pieejami līdzekļi un rīki, lietojuma pamatojumi un tās iespējamās alternatīvās projekta īstenošanai. Rīki tiks atlasīti pēc licencēšanas, kurai ir jābūt pēc iespējas brīvai un atvērtai, </w:t>
-      </w:r>
-      <w:proofErr w:type="spellStart"/>
-      <w:r>
-        <w:t>starpplatformu</w:t>
-      </w:r>
-      <w:proofErr w:type="spellEnd"/>
-      <w:r>
-        <w:t xml:space="preserve"> pieejamības, pieejamās dimensiju vides, kuras jāiekļauj un jābūt optimizēta div</w:t>
+        <w:t>Šī sadaļa noskaidros, kādi ir pieejami līdzekļi un rīki, lietojuma pamatojumi un tās iespējamās alternatīvās projekta īstenošanai. Rīki tiks atlasīti pēc licencēšanas, kurai ir jābūt pēc iespējas brīvai un atvērtai, starpplatformu pieejamības, pieejamās dimensiju vides, kuras jāiekļauj un jābūt optimizēta div</w:t>
       </w:r>
       <w:r>
         <w:t xml:space="preserve">u </w:t>
@@ -7283,37 +7184,13 @@
     </w:p>
     <w:p>
       <w:r>
-        <w:t>Spēļu un grafikas ietvars “</w:t>
-      </w:r>
-      <w:proofErr w:type="spellStart"/>
-      <w:r>
-        <w:t>Godot</w:t>
-      </w:r>
-      <w:proofErr w:type="spellEnd"/>
-      <w:r>
-        <w:t xml:space="preserve">” ir izcelta starp pārējiem tāda veida ietvariem, jo liels skaits neliela mēra projektu kā </w:t>
-      </w:r>
-      <w:proofErr w:type="spellStart"/>
-      <w:r>
-        <w:t>pašizstrādātās</w:t>
-      </w:r>
-      <w:proofErr w:type="spellEnd"/>
-      <w:r>
-        <w:t xml:space="preserve"> vai mazo komandu izstrādātās spēles. Ne tikai pēc popularitātes dēļ, taču licencēšana norāda šo ietvaru par brīvu un atvērtu, kurai nav nepieciešama ne papildizmaksas, nedz reģistrācijas, kā arī ir salīdzinoši ar citiem ietvariem ātri un viegli apgūstama. Šis dzinis arī ir pieejams vairākās platformās, it īpaši starp operētājsistēmām. Funkcionāli tā ir optimizēta div</w:t>
+        <w:t>Spēļu un grafikas ietvars “Godot” ir izcelta starp pārējiem tāda veida ietvariem, jo liels skaits neliela mēra projektu kā pašizstrādātās vai mazo komandu izstrādātās spēles. Ne tikai pēc popularitātes dēļ, taču licencēšana norāda šo ietvaru par brīvu un atvērtu, kurai nav nepieciešama ne papildizmaksas, nedz reģistrācijas, kā arī ir salīdzinoši ar citiem ietvariem ātri un viegli apgūstama. Šis dzinis arī ir pieejams vairākās platformās, it īpaši starp operētājsistēmām. Funkcionāli tā ir optimizēta div</w:t>
       </w:r>
       <w:r>
         <w:t xml:space="preserve">u </w:t>
       </w:r>
       <w:r>
-        <w:t xml:space="preserve">dimensiju videi pēc noteiktiem kritērijiem, taču arī ir iespējams izmantot </w:t>
-      </w:r>
-      <w:proofErr w:type="spellStart"/>
-      <w:r>
-        <w:t>trīsdimensiju</w:t>
-      </w:r>
-      <w:proofErr w:type="spellEnd"/>
-      <w:r>
-        <w:t xml:space="preserve"> vidi, kura arī ir īpaši optimizēta un pielāgota. </w:t>
+        <w:t xml:space="preserve">dimensiju videi pēc noteiktiem kritērijiem, taču arī ir iespējams izmantot trīsdimensiju vidi, kura arī ir īpaši optimizēta un pielāgota. </w:t>
       </w:r>
     </w:p>
     <w:p>
@@ -7328,55 +7205,7 @@
     </w:p>
     <w:p>
       <w:r>
-        <w:t>Ietvars “</w:t>
-      </w:r>
-      <w:proofErr w:type="spellStart"/>
-      <w:r>
-        <w:t>Godot</w:t>
-      </w:r>
-      <w:proofErr w:type="spellEnd"/>
-      <w:r>
-        <w:t>” oficiāli piedāvā izmantot abas programmēšanas valodas – “</w:t>
-      </w:r>
-      <w:proofErr w:type="spellStart"/>
-      <w:r>
-        <w:t>Godot</w:t>
-      </w:r>
-      <w:proofErr w:type="spellEnd"/>
-      <w:r>
-        <w:t>” iebūvētā “</w:t>
-      </w:r>
-      <w:proofErr w:type="spellStart"/>
-      <w:r>
-        <w:t>GDScript</w:t>
-      </w:r>
-      <w:proofErr w:type="spellEnd"/>
-      <w:r>
-        <w:t>” un “.NET” ietvara valoda “C#”, kura tiks izvēlēta šī projekta izstrādei. “</w:t>
-      </w:r>
-      <w:proofErr w:type="spellStart"/>
-      <w:r>
-        <w:t>GDScript</w:t>
-      </w:r>
-      <w:proofErr w:type="spellEnd"/>
-      <w:r>
-        <w:t xml:space="preserve">” ir interpretētā valoda, kura tiek tikai apstrādāta palaišanas laikā un pēc </w:t>
-      </w:r>
-      <w:proofErr w:type="spellStart"/>
-      <w:r>
-        <w:t>avotkoda</w:t>
-      </w:r>
-      <w:proofErr w:type="spellEnd"/>
-      <w:r>
-        <w:t xml:space="preserve"> izmaiņām nav nepieciešama papildus darbības kā kompilēšanu, taču ar nepilnību, kura mazina datorspēles darbības veiktspēju. “C#” valoda tiks izmantota tam dēļ, ka veiktspēja datorspēles darbībai ir uzlabota ar nosacījumu, ka pēc jebkuras izmaiņas projektu ir nepieciešams kompilēt. “</w:t>
-      </w:r>
-      <w:proofErr w:type="spellStart"/>
-      <w:r>
-        <w:t>GDScript</w:t>
-      </w:r>
-      <w:proofErr w:type="spellEnd"/>
-      <w:r>
-        <w:t>” arī nav pilnīgi pielāgota objektorientētai izmantošanai, kamēr “C#” pēc dizaina ir objektorientētā valoda.</w:t>
+        <w:t>Ietvars “Godot” oficiāli piedāvā izmantot abas programmēšanas valodas – “Godot” iebūvētā “GDScript” un “.NET” ietvara valoda “C#”, kura tiks izvēlēta šī projekta izstrādei. “GDScript” ir interpretētā valoda, kura tiek tikai apstrādāta palaišanas laikā un pēc avotkoda izmaiņām nav nepieciešama papildus darbības kā kompilēšanu, taču ar nepilnību, kura mazina datorspēles darbības veiktspēju. “C#” valoda tiks izmantota tam dēļ, ka veiktspēja datorspēles darbībai ir uzlabota ar nosacījumu, ka pēc jebkuras izmaiņas projektu ir nepieciešams kompilēt. “GDScript” arī nav pilnīgi pielāgota objektorientētai izmantošanai, kamēr “C#” pēc dizaina ir objektorientētā valoda.</w:t>
       </w:r>
     </w:p>
     <w:p>
@@ -7391,241 +7220,71 @@
     </w:p>
     <w:p>
       <w:r>
-        <w:t>“</w:t>
-      </w:r>
-      <w:proofErr w:type="spellStart"/>
-      <w:r>
-        <w:t>JetBrains</w:t>
-      </w:r>
-      <w:proofErr w:type="spellEnd"/>
+        <w:t>“Godot” ietvaram ir jau savs projekta redaktors, kurā iekļauj koda redaktoru. Šis koda redaktors ir vairāk pielāgots ar “GDScript” valodu, taču pieejams atbalsts “C#” valodai. Pašā izstrādes vidē var viegli pārslēgties uz vizuālo redaktoru, kodu redaktoru un atkļūdošanas sadaļu</w:t>
+      </w:r>
+      <w:r>
+        <w:t xml:space="preserve"> un nenošķir kodu rakstīšanu ar vizuālo rediģēšanu</w:t>
+      </w:r>
+      <w:r>
+        <w:t xml:space="preserve">. </w:t>
+      </w:r>
+    </w:p>
+    <w:p>
+      <w:pPr>
+        <w:pStyle w:val="Virsraksts3"/>
+      </w:pPr>
+      <w:bookmarkStart w:id="22" w:name="_Toc225723247"/>
+      <w:r>
+        <w:lastRenderedPageBreak/>
+        <w:t>Versiju kontrole un repozitorijas mitināšana</w:t>
+      </w:r>
+      <w:bookmarkEnd w:id="22"/>
+    </w:p>
+    <w:p>
+      <w:r>
+        <w:t>“Git” tiks izmantots versiju kontrolei un tīmeklī tiks izmantots ”</w:t>
+      </w:r>
       <w:r>
         <w:t xml:space="preserve"> </w:t>
       </w:r>
-      <w:proofErr w:type="spellStart"/>
-      <w:r>
-        <w:t>Rider</w:t>
-      </w:r>
-      <w:proofErr w:type="spellEnd"/>
-      <w:r>
-        <w:t>” ir izstrādes vide, kura no “</w:t>
-      </w:r>
-      <w:proofErr w:type="spellStart"/>
-      <w:r>
-        <w:t>JetBrains</w:t>
-      </w:r>
-      <w:proofErr w:type="spellEnd"/>
-      <w:r>
-        <w:t xml:space="preserve">” produkta klāsta ir īpaši pielāgota “.NET” ietvaram, kura iekļauj izvēlēto “C#” valodu. Šīs izstrādes vides funkcionalitāte piedāvā </w:t>
-      </w:r>
-      <w:proofErr w:type="spellStart"/>
-      <w:r>
-        <w:t>advancētu</w:t>
-      </w:r>
-      <w:proofErr w:type="spellEnd"/>
-      <w:r>
-        <w:t xml:space="preserve"> pirmkoda analīzi, jau iebūvētu atkļūdošanu, automātisko kodu aizpildīšanu (</w:t>
-      </w:r>
-      <w:proofErr w:type="spellStart"/>
-      <w:r>
-        <w:t>ang</w:t>
-      </w:r>
-      <w:proofErr w:type="spellEnd"/>
-      <w:r>
-        <w:t xml:space="preserve">. val. “Code </w:t>
-      </w:r>
-      <w:proofErr w:type="spellStart"/>
-      <w:r>
-        <w:t>completion</w:t>
-      </w:r>
-      <w:proofErr w:type="spellEnd"/>
-      <w:r>
-        <w:t xml:space="preserve">”) un tā tālāk, taču tās programmatūras licencēšana prasa izmaksas komerciālā un profesionālā vidē un jebkuram lietotājam reģistrēties. Neskatoties no licencēšanas, kura nepiepilda </w:t>
-      </w:r>
-      <w:r>
-        <w:lastRenderedPageBreak/>
-        <w:t>nosauktos kritērijus, šī programmatūra ir pieejama vairākās operētājsistēmas vidēs nekā ar līdzīgu programmatūru, kurai nav pielāgotas valodai vai ietvaram papildus funkcionalitātes vai nav pieejama vairākās sistēmas vidēs, īpaši operētājsistēmās.</w:t>
+      <w:r>
+        <w:t>GitHub”, lai mitinātu šo projekta avotkodu.</w:t>
+      </w:r>
+    </w:p>
+    <w:p>
+      <w:pPr>
+        <w:pStyle w:val="Virsraksts2"/>
+      </w:pPr>
+      <w:bookmarkStart w:id="23" w:name="_Toc225723248"/>
+      <w:r>
+        <w:t>Iespējamo risinājuma līdzekļu un valodu apraksts</w:t>
+      </w:r>
+      <w:bookmarkEnd w:id="23"/>
+    </w:p>
+    <w:p>
+      <w:r>
+        <w:t>Taču ir ieejami ir citi rīki, vides un valodas, kuras aizstātu izvēlētos, taču pēc izpētes, nosauktiem kritērijiem vai pēc cita autora ieskatiem netika izmantoti.</w:t>
       </w:r>
     </w:p>
     <w:p>
       <w:pPr>
         <w:pStyle w:val="Virsraksts3"/>
       </w:pPr>
-      <w:bookmarkStart w:id="22" w:name="_Toc225723247"/>
-      <w:r>
-        <w:t xml:space="preserve">Versiju kontrole un </w:t>
-      </w:r>
-      <w:proofErr w:type="spellStart"/>
-      <w:r>
-        <w:t>repozitorijas</w:t>
-      </w:r>
-      <w:proofErr w:type="spellEnd"/>
-      <w:r>
-        <w:t xml:space="preserve"> mitināšana</w:t>
-      </w:r>
-      <w:bookmarkEnd w:id="22"/>
-    </w:p>
-    <w:p>
-      <w:r>
-        <w:t>“</w:t>
-      </w:r>
-      <w:proofErr w:type="spellStart"/>
-      <w:r>
-        <w:t>Git</w:t>
-      </w:r>
-      <w:proofErr w:type="spellEnd"/>
-      <w:r>
-        <w:t>” tiks izmantots versiju kontrolei un tīmeklī tiks izmantots ”</w:t>
-      </w:r>
-      <w:r>
-        <w:t xml:space="preserve"> </w:t>
-      </w:r>
-      <w:proofErr w:type="spellStart"/>
-      <w:r>
-        <w:t>GitHub</w:t>
-      </w:r>
-      <w:proofErr w:type="spellEnd"/>
-      <w:r>
-        <w:t xml:space="preserve">”, lai mitinātu šo projekta </w:t>
-      </w:r>
-      <w:proofErr w:type="spellStart"/>
-      <w:r>
-        <w:t>avotkodu</w:t>
-      </w:r>
-      <w:proofErr w:type="spellEnd"/>
-      <w:r>
-        <w:t>.</w:t>
-      </w:r>
-    </w:p>
-    <w:p>
-      <w:pPr>
-        <w:pStyle w:val="Virsraksts2"/>
-      </w:pPr>
-      <w:bookmarkStart w:id="23" w:name="_Toc225723248"/>
-      <w:r>
-        <w:t>Iespējamo risinājuma līdzekļu un valodu apraksts</w:t>
-      </w:r>
-      <w:bookmarkEnd w:id="23"/>
-    </w:p>
-    <w:p>
-      <w:r>
-        <w:t>Taču ir ieejami ir citi rīki, vides un valodas, kuras aizstātu izvēlētos, taču pēc izpētes, nosauktiem kritērijiem vai pēc cita autora ieskatiem netika izmantoti.</w:t>
+      <w:bookmarkStart w:id="24" w:name="_Toc225723249"/>
+      <w:r>
+        <w:t>Ietvari</w:t>
+      </w:r>
+      <w:bookmarkEnd w:id="24"/>
+    </w:p>
+    <w:p>
+      <w:r>
+        <w:t>Populārākos ietvarus datorspēļu un citu mediju izstrādē iekļauj “Unity”, “Unreal Engine”,  “CryEngine”. Ietvari “Unreal Engine” un “CryEngine” nav pielāgoti divdimensiju datorspēļu izveidei ietvara ierobežojumu dēļ, kura no tās izslēdz izmantošanu, ja ne arī neprasa veiktspējīgu datorsistēmu, kura ir pretrunā ar projekta mērķiem, taču “Unity” ietvars neprasa salīdzinoši veiktspējīgu datorsistēmu un ir pielāgojama divdimensiju videi, taču licencēšana nav brīva un prasa lietotāja reģistrāciju un papildizmaksas, ja šis projekts paplašināties komercdarbības nolūkiem.</w:t>
       </w:r>
     </w:p>
     <w:p>
       <w:pPr>
         <w:pStyle w:val="Virsraksts3"/>
       </w:pPr>
-      <w:bookmarkStart w:id="24" w:name="_Toc225723249"/>
-      <w:r>
-        <w:t>Ietvari</w:t>
-      </w:r>
-      <w:bookmarkEnd w:id="24"/>
-    </w:p>
-    <w:p>
-      <w:r>
-        <w:t>Populārākos ietvarus datorspēļu un citu mediju izstrādē iekļauj “</w:t>
-      </w:r>
-      <w:proofErr w:type="spellStart"/>
-      <w:r>
-        <w:t>Unity</w:t>
-      </w:r>
-      <w:proofErr w:type="spellEnd"/>
-      <w:r>
-        <w:t>”, “</w:t>
-      </w:r>
-      <w:proofErr w:type="spellStart"/>
-      <w:r>
-        <w:t>Unreal</w:t>
-      </w:r>
-      <w:proofErr w:type="spellEnd"/>
-      <w:r>
-        <w:t xml:space="preserve"> </w:t>
-      </w:r>
-      <w:proofErr w:type="spellStart"/>
-      <w:r>
-        <w:t>Engine</w:t>
-      </w:r>
-      <w:proofErr w:type="spellEnd"/>
-      <w:r>
-        <w:t>”,  “</w:t>
-      </w:r>
-      <w:proofErr w:type="spellStart"/>
-      <w:r>
-        <w:t>CryEngine</w:t>
-      </w:r>
-      <w:proofErr w:type="spellEnd"/>
-      <w:r>
-        <w:t>”. Ietvari “</w:t>
-      </w:r>
-      <w:proofErr w:type="spellStart"/>
-      <w:r>
-        <w:t>Unreal</w:t>
-      </w:r>
-      <w:proofErr w:type="spellEnd"/>
-      <w:r>
-        <w:t xml:space="preserve"> </w:t>
-      </w:r>
-      <w:proofErr w:type="spellStart"/>
-      <w:r>
-        <w:t>Engine</w:t>
-      </w:r>
-      <w:proofErr w:type="spellEnd"/>
-      <w:r>
-        <w:t>” un “</w:t>
-      </w:r>
-      <w:proofErr w:type="spellStart"/>
-      <w:r>
-        <w:t>CryEngine</w:t>
-      </w:r>
-      <w:proofErr w:type="spellEnd"/>
-      <w:r>
-        <w:t xml:space="preserve">” nav pielāgoti </w:t>
-      </w:r>
-      <w:proofErr w:type="spellStart"/>
-      <w:r>
-        <w:t>divdimensiju</w:t>
-      </w:r>
-      <w:proofErr w:type="spellEnd"/>
-      <w:r>
-        <w:t xml:space="preserve"> datorspēļu izveidei ietvara ierobežojumu dēļ, kura no tās izslēdz izmantošanu, ja ne arī neprasa </w:t>
-      </w:r>
-      <w:proofErr w:type="spellStart"/>
-      <w:r>
-        <w:t>veiktspējīgu</w:t>
-      </w:r>
-      <w:proofErr w:type="spellEnd"/>
-      <w:r>
-        <w:t xml:space="preserve"> datorsistēmu, kura ir pretrunā ar projekta mērķiem, taču “</w:t>
-      </w:r>
-      <w:proofErr w:type="spellStart"/>
-      <w:r>
-        <w:t>Unity</w:t>
-      </w:r>
-      <w:proofErr w:type="spellEnd"/>
-      <w:r>
-        <w:t xml:space="preserve">” ietvars neprasa salīdzinoši </w:t>
-      </w:r>
-      <w:proofErr w:type="spellStart"/>
-      <w:r>
-        <w:t>veiktspējīgu</w:t>
-      </w:r>
-      <w:proofErr w:type="spellEnd"/>
-      <w:r>
-        <w:t xml:space="preserve"> datorsistēmu un ir pielāgojama </w:t>
-      </w:r>
-      <w:proofErr w:type="spellStart"/>
-      <w:r>
-        <w:t>divdimensiju</w:t>
-      </w:r>
-      <w:proofErr w:type="spellEnd"/>
-      <w:r>
-        <w:t xml:space="preserve"> videi, taču licencēšana nav brīva un prasa lietotāja reģistrāciju un papildizmaksas, ja šis projekts paplašināties komercdarbības nolūkiem.</w:t>
-      </w:r>
-    </w:p>
-    <w:p>
-      <w:pPr>
-        <w:pStyle w:val="Virsraksts3"/>
-      </w:pPr>
       <w:bookmarkStart w:id="25" w:name="_Toc225723250"/>
       <w:r>
         <w:t>Valodas</w:t>
@@ -7634,63 +7293,7 @@
     </w:p>
     <w:p>
       <w:r>
-        <w:t>Ietvari “</w:t>
-      </w:r>
-      <w:proofErr w:type="spellStart"/>
-      <w:r>
-        <w:t>CryEngine</w:t>
-      </w:r>
-      <w:proofErr w:type="spellEnd"/>
-      <w:r>
-        <w:t>” un “</w:t>
-      </w:r>
-      <w:proofErr w:type="spellStart"/>
-      <w:r>
-        <w:t>Unreal</w:t>
-      </w:r>
-      <w:proofErr w:type="spellEnd"/>
-      <w:r>
-        <w:t xml:space="preserve"> </w:t>
-      </w:r>
-      <w:proofErr w:type="spellStart"/>
-      <w:r>
-        <w:t>Engine</w:t>
-      </w:r>
-      <w:proofErr w:type="spellEnd"/>
-      <w:r>
-        <w:t xml:space="preserve">” izmanto valodu “C++”, kurā iekļauj klases un objektorientētā funkcionalitāte kā C#, taču neatlasot šos ietvarus valoda “C++” netiks izmantota. “C++” lietojuma stili ir plašāki, taču valodas funkcionalitāti un īpatnības apgūt ir sarežģītāk nekā ar “C#”, kura izstrādātājam liek lietot objektorientētā stilā, kurā visi elementi valodā ir objekti, kā arī vairums funkcionalitātes ir aizklātas ar metodēm, kura mazina izstrādes laiku salīdzinot ar “C++”, kura vairākas kompleksas funkcionalitātes nav aizklātas ar metodēm, kura var </w:t>
-      </w:r>
-      <w:proofErr w:type="spellStart"/>
-      <w:r>
-        <w:t>palēlināt</w:t>
-      </w:r>
-      <w:proofErr w:type="spellEnd"/>
-      <w:r>
-        <w:t xml:space="preserve"> izstrādes laiku. Izvēlētā ietvarā “</w:t>
-      </w:r>
-      <w:proofErr w:type="spellStart"/>
-      <w:r>
-        <w:t>Godot</w:t>
-      </w:r>
-      <w:proofErr w:type="spellEnd"/>
-      <w:r>
-        <w:t xml:space="preserve">” ir pieejama </w:t>
-      </w:r>
-      <w:proofErr w:type="spellStart"/>
-      <w:r>
-        <w:t>skriptēšanas</w:t>
-      </w:r>
-      <w:proofErr w:type="spellEnd"/>
-      <w:r>
-        <w:t xml:space="preserve"> valoda “</w:t>
-      </w:r>
-      <w:proofErr w:type="spellStart"/>
-      <w:r>
-        <w:t>GDScript</w:t>
-      </w:r>
-      <w:proofErr w:type="spellEnd"/>
-      <w:r>
-        <w:t>”, taču pēc nosacītiem iemesliem izvēlētai valodai šī valoda netiks izmantota.</w:t>
+        <w:t>Ietvari “CryEngine” un “Unreal Engine” izmanto valodu “C++”, kurā iekļauj klases un objektorientētā funkcionalitāte kā C#, taču neatlasot šos ietvarus valoda “C++” netiks izmantota. “C++” lietojuma stili ir plašāki, taču valodas funkcionalitāti un īpatnības apgūt ir sarežģītāk nekā ar “C#”, kura izstrādātājam liek lietot objektorientētā stilā, kurā visi elementi valodā ir objekti, kā arī vairums funkcionalitātes ir aizklātas ar metodēm, kura mazina izstrādes laiku salīdzinot ar “C++”, kura vairākas kompleksas funkcionalitātes nav aizklātas ar metodēm, kura var palēlināt izstrādes laiku. Izvēlētā ietvarā “Godot” ir pieejama skriptēšanas valoda “GDScript”, taču pēc nosacītiem iemesliem izvēlētai valodai šī valoda netiks izmantota.</w:t>
       </w:r>
     </w:p>
     <w:p>
@@ -7717,169 +7320,17 @@
     </w:p>
     <w:p>
       <w:r>
-        <w:t>Tā kā valoda “C#” tiks izmantota, kura ir daļa no ietvara “.NET”, tiks izmantoti attiecīgas izstrādes programmatūras ar uzsvaru uz noteikto ietvaru un tās ekosistēmas. Populārākā izstrādes  vide tam ir “</w:t>
-      </w:r>
-      <w:proofErr w:type="spellStart"/>
-      <w:r>
-        <w:t>Visual</w:t>
-      </w:r>
-      <w:proofErr w:type="spellEnd"/>
-      <w:r>
-        <w:t xml:space="preserve"> </w:t>
-      </w:r>
-      <w:proofErr w:type="spellStart"/>
-      <w:r>
-        <w:t>Studio</w:t>
-      </w:r>
-      <w:proofErr w:type="spellEnd"/>
-      <w:r>
-        <w:t>”, kura līdzīgi ar izvēlēto izstrādes vidi “</w:t>
-      </w:r>
-      <w:proofErr w:type="spellStart"/>
-      <w:r>
-        <w:t>JetBrains</w:t>
-      </w:r>
-      <w:proofErr w:type="spellEnd"/>
-      <w:r>
-        <w:t xml:space="preserve"> </w:t>
-      </w:r>
-      <w:proofErr w:type="spellStart"/>
-      <w:r>
-        <w:t>Rider</w:t>
-      </w:r>
-      <w:proofErr w:type="spellEnd"/>
-      <w:r>
-        <w:t xml:space="preserve">” iekļauj detalizētu </w:t>
-      </w:r>
-      <w:proofErr w:type="spellStart"/>
-      <w:r>
-        <w:t>atķļūdošanu</w:t>
-      </w:r>
-      <w:proofErr w:type="spellEnd"/>
-      <w:r>
-        <w:t xml:space="preserve">, kodu analīze, automātiskā aizpilde, u.t.t., taču netiks izmantota, jo šī programmatūra nav </w:t>
-      </w:r>
-      <w:proofErr w:type="spellStart"/>
-      <w:r>
-        <w:t>starpplatformu</w:t>
-      </w:r>
-      <w:proofErr w:type="spellEnd"/>
-      <w:r>
-        <w:t>, ierobežojoties uz “Windows” platformu, kuru autors neizmanto, tātad nepieejama programmatūra autoram.</w:t>
-      </w:r>
-    </w:p>
-    <w:p>
-      <w:r>
-        <w:t>Ja ietvars kā “</w:t>
-      </w:r>
-      <w:proofErr w:type="spellStart"/>
-      <w:r>
-        <w:t>Unreal</w:t>
-      </w:r>
-      <w:proofErr w:type="spellEnd"/>
-      <w:r>
-        <w:t xml:space="preserve"> </w:t>
-      </w:r>
-      <w:proofErr w:type="spellStart"/>
-      <w:r>
-        <w:t>Engine</w:t>
-      </w:r>
-      <w:proofErr w:type="spellEnd"/>
-      <w:r>
-        <w:t>” tiktu izmantota, kurā galvenā valoda ir “C++”, tiktu izmantotas izstrādes vides attiecīgi valodai kā “</w:t>
-      </w:r>
-      <w:proofErr w:type="spellStart"/>
-      <w:r>
-        <w:t>Qt</w:t>
-      </w:r>
-      <w:proofErr w:type="spellEnd"/>
-      <w:r>
-        <w:t xml:space="preserve"> </w:t>
-      </w:r>
-      <w:proofErr w:type="spellStart"/>
-      <w:r>
-        <w:t>Creator</w:t>
-      </w:r>
-      <w:proofErr w:type="spellEnd"/>
-      <w:r>
-        <w:t>”, kura ir pielāgota ietvara “</w:t>
-      </w:r>
-      <w:proofErr w:type="spellStart"/>
-      <w:r>
-        <w:t>Qt</w:t>
-      </w:r>
-      <w:proofErr w:type="spellEnd"/>
-      <w:r>
-        <w:t xml:space="preserve">” programmatūras izstrādei, taču iespējams izveidot projektus, kuras neizmanto minēto ietvaru, ņemot vērā to, ka funkcionalitāte un tās iespējas mazinās vai ne tik </w:t>
-      </w:r>
-      <w:proofErr w:type="spellStart"/>
-      <w:r>
-        <w:t>advancētas</w:t>
-      </w:r>
-      <w:proofErr w:type="spellEnd"/>
-      <w:r>
-        <w:t xml:space="preserve"> citiem projektiem,  vai “</w:t>
-      </w:r>
-      <w:proofErr w:type="spellStart"/>
-      <w:r>
-        <w:t>JetBrains</w:t>
-      </w:r>
-      <w:proofErr w:type="spellEnd"/>
-      <w:r>
-        <w:t xml:space="preserve"> </w:t>
-      </w:r>
-      <w:proofErr w:type="spellStart"/>
-      <w:r>
-        <w:t>CLion</w:t>
-      </w:r>
-      <w:proofErr w:type="spellEnd"/>
-      <w:r>
-        <w:t>”, kurai ir līdzīga funkcionalitāte ar atlasīto izstrādes vidi “”</w:t>
-      </w:r>
-      <w:proofErr w:type="spellStart"/>
-      <w:r>
-        <w:t>JetBrains</w:t>
-      </w:r>
-      <w:proofErr w:type="spellEnd"/>
-      <w:r>
-        <w:t xml:space="preserve"> </w:t>
-      </w:r>
-      <w:proofErr w:type="spellStart"/>
-      <w:r>
-        <w:t>Rider</w:t>
-      </w:r>
-      <w:proofErr w:type="spellEnd"/>
-      <w:r>
-        <w:t>” no “</w:t>
-      </w:r>
-      <w:proofErr w:type="spellStart"/>
-      <w:r>
-        <w:t>JetBrains</w:t>
-      </w:r>
-      <w:proofErr w:type="spellEnd"/>
-      <w:r>
-        <w:t>” programmatūru klāsta.</w:t>
-      </w:r>
-    </w:p>
-    <w:p>
-      <w:r>
-        <w:t>Arī iespējams ir izmantot teksta redaktoru “</w:t>
-      </w:r>
-      <w:proofErr w:type="spellStart"/>
-      <w:r>
-        <w:t>Visual</w:t>
-      </w:r>
-      <w:proofErr w:type="spellEnd"/>
-      <w:r>
-        <w:t xml:space="preserve"> </w:t>
-      </w:r>
-      <w:proofErr w:type="spellStart"/>
-      <w:r>
-        <w:t>Studio</w:t>
-      </w:r>
-      <w:proofErr w:type="spellEnd"/>
-      <w:r>
-        <w:t xml:space="preserve"> Code”, kura ar paplašinājumiem var izmantot kā izstrādes vidi, taču noklusētā funkcionalitāte ir ierobežota salīdzinot ar iepriekšējām izstrādes programmatūrām un nepieciešama papildus iestatīšana šai programmatūrai, kura nebūtu nepieciešama pārējām izstrādes vidēm atverot sākotnēji.</w:t>
+        <w:t>Tā kā valoda “C#” tiks izmantota, kura ir daļa no ietvara “.NET”, tiks izmantoti attiecīgas izstrādes programmatūras ar uzsvaru uz noteikto ietvaru un tās ekosistēmas. Populārākā izstrādes  vide tam ir “Visual Studio”, kura līdzīgi ar izvēlēto izstrādes vidi “JetBrains Rider” iekļauj detalizētu atķļūdošanu, kodu analīze, automātiskā aizpilde, u.t.t., taču netiks izmantota, jo šī programmatūra nav starpplatformu, ierobežojoties uz “Windows” platformu, kuru autors neizmanto, tātad nepieejama programmatūra autoram.</w:t>
+      </w:r>
+    </w:p>
+    <w:p>
+      <w:r>
+        <w:t>Ja ietvars kā “Unreal Engine” tiktu izmantota, kurā galvenā valoda ir “C++”, tiktu izmantotas izstrādes vides attiecīgi valodai kā “Qt Creator”, kura ir pielāgota ietvara “Qt” programmatūras izstrādei, taču iespējams izveidot projektus, kuras neizmanto minēto ietvaru, ņemot vērā to, ka funkcionalitāte un tās iespējas mazinās vai ne tik advancētas citiem projektiem,  vai “JetBrains CLion”, kurai ir līdzīga funkcionalitāte ar atlasīto izstrādes vidi “”JetBrains Rider” no “JetBrains” programmatūru klāsta.</w:t>
+      </w:r>
+    </w:p>
+    <w:p>
+      <w:r>
+        <w:t>Arī iespējams ir izmantot teksta redaktoru “Visual Studio Code”, kura ar paplašinājumiem var izmantot kā izstrādes vidi, taču noklusētā funkcionalitāte ir ierobežota salīdzinot ar iepriekšējām izstrādes programmatūrām un nepieciešama papildus iestatīšana šai programmatūrai, kura nebūtu nepieciešama pārējām izstrādes vidēm atverot sākotnēji.</w:t>
       </w:r>
     </w:p>
     <w:p>
@@ -7894,84 +7345,12 @@
     </w:p>
     <w:p>
       <w:r>
-        <w:t xml:space="preserve">Mazāk populāri pakalpojumi, kuri mitina </w:t>
-      </w:r>
-      <w:proofErr w:type="spellStart"/>
-      <w:r>
-        <w:t>avotkodu</w:t>
-      </w:r>
-      <w:proofErr w:type="spellEnd"/>
-      <w:r>
-        <w:t xml:space="preserve"> </w:t>
-      </w:r>
-      <w:proofErr w:type="spellStart"/>
-      <w:r>
-        <w:t>repozotorijus</w:t>
-      </w:r>
-      <w:proofErr w:type="spellEnd"/>
-      <w:r>
-        <w:t>, izmantojot “</w:t>
-      </w:r>
-      <w:proofErr w:type="spellStart"/>
-      <w:r>
-        <w:t>Git</w:t>
-      </w:r>
-      <w:proofErr w:type="spellEnd"/>
-      <w:r>
-        <w:t>” versiju kontroli, arī ir pieejami rīki, kura var automatizēt projekta kompilēšanu un pārbaudi, šādi rīki ir “</w:t>
-      </w:r>
-      <w:proofErr w:type="spellStart"/>
-      <w:r>
-        <w:t>GitLab</w:t>
-      </w:r>
-      <w:proofErr w:type="spellEnd"/>
-      <w:r>
-        <w:t>”, “</w:t>
-      </w:r>
-      <w:proofErr w:type="spellStart"/>
-      <w:r>
-        <w:t>Gitea</w:t>
-      </w:r>
-      <w:proofErr w:type="spellEnd"/>
-      <w:r>
-        <w:t>” un “</w:t>
-      </w:r>
-      <w:proofErr w:type="spellStart"/>
-      <w:r>
-        <w:t>Bitbucket</w:t>
-      </w:r>
-      <w:proofErr w:type="spellEnd"/>
-      <w:r>
-        <w:t>”, kuri ir īpaši pielāgota CI/CD izstrādes videi, taču prasa papildizmaksas, ja šādi rīki tiek palaisti šo pakalpojumu serveros vietā pašam lietotājam mitināt šos rīkus.</w:t>
-      </w:r>
-    </w:p>
-    <w:p>
-      <w:r>
-        <w:t>Taču arī ir pieejami pakalpojumi un rīki, kuri nav atkarīga no “</w:t>
-      </w:r>
-      <w:proofErr w:type="spellStart"/>
-      <w:r>
-        <w:t>Git</w:t>
-      </w:r>
-      <w:proofErr w:type="spellEnd"/>
-      <w:r>
-        <w:t>” versiju kontroles, bet kā pieejamu versiju kontroles programmatūru starp pārējām. Viens no šiem rīkiem ir “</w:t>
-      </w:r>
-      <w:proofErr w:type="spellStart"/>
-      <w:r>
-        <w:t>Azure</w:t>
-      </w:r>
-      <w:proofErr w:type="spellEnd"/>
-      <w:r>
-        <w:t xml:space="preserve"> </w:t>
-      </w:r>
-      <w:proofErr w:type="spellStart"/>
-      <w:r>
-        <w:t>Pipelines</w:t>
-      </w:r>
-      <w:proofErr w:type="spellEnd"/>
-      <w:r>
-        <w:t>”, kuras funkcionalitāte ir plašāka salīdzinot ar iepriekš minētiem rīkiem, taču tās plaša funkcionalitātes klāsts ir radīts lielākiem projektiem, kuri iespējams nebūs lielāko daļu paredzēts izmantošanai šī projekta nolūkiem tās apjoma dēļ un lielākas izmaksas, salīdzinot ar iepriekš minētiem rīkiem.</w:t>
+        <w:t>Mazāk populāri pakalpojumi, kuri mitina avotkodu repozotorijus, izmantojot “Git” versiju kontroli, arī ir pieejami rīki, kura var automatizēt projekta kompilēšanu un pārbaudi, šādi rīki ir “GitLab”, “Gitea” un “Bitbucket”, kuri ir īpaši pielāgota CI/CD izstrādes videi, taču prasa papildizmaksas, ja šādi rīki tiek palaisti šo pakalpojumu serveros vietā pašam lietotājam mitināt šos rīkus.</w:t>
+      </w:r>
+    </w:p>
+    <w:p>
+      <w:r>
+        <w:t>Taču arī ir pieejami pakalpojumi un rīki, kuri nav atkarīga no “Git” versiju kontroles, bet kā pieejamu versiju kontroles programmatūru starp pārējām. Viens no šiem rīkiem ir “Azure Pipelines”, kuras funkcionalitāte ir plašāka salīdzinot ar iepriekš minētiem rīkiem, taču tās plaša funkcionalitātes klāsts ir radīts lielākiem projektiem, kuri iespējams nebūs lielāko daļu paredzēts izmantošanai šī projekta nolūkiem tās apjoma dēļ un lielākas izmaksas, salīdzinot ar iepriekš minētiem rīkiem.</w:t>
       </w:r>
     </w:p>
     <w:p>
@@ -8750,11 +8129,9 @@
       <w:pPr>
         <w:pStyle w:val="Virsraksts3"/>
       </w:pPr>
-      <w:proofErr w:type="spellStart"/>
       <w:r>
         <w:t>Enumerācijas</w:t>
       </w:r>
-      <w:proofErr w:type="spellEnd"/>
     </w:p>
     <w:p>
       <w:pPr>
@@ -8835,13 +8212,8 @@
         <w:fldChar w:fldCharType="end"/>
       </w:r>
       <w:r>
-        <w:t xml:space="preserve">. attēls. Saknes mezgla </w:t>
-      </w:r>
-      <w:proofErr w:type="spellStart"/>
-      <w:r>
-        <w:t>enumerācijas</w:t>
-      </w:r>
-      <w:proofErr w:type="spellEnd"/>
+        <w:t>. attēls. Saknes mezgla enumerācijas</w:t>
+      </w:r>
     </w:p>
     <w:p>
       <w:pPr>
@@ -8928,13 +8300,8 @@
         <w:fldChar w:fldCharType="end"/>
       </w:r>
       <w:r>
-        <w:t xml:space="preserve">. attēls. Kartes laukuma </w:t>
-      </w:r>
-      <w:proofErr w:type="spellStart"/>
-      <w:r>
-        <w:t>enumerācijas</w:t>
-      </w:r>
-      <w:proofErr w:type="spellEnd"/>
+        <w:t>. attēls. Kartes laukuma enumerācijas</w:t>
+      </w:r>
     </w:p>
     <w:p>
       <w:pPr>
@@ -8982,37 +8349,13 @@
     </w:p>
     <w:p>
       <w:r>
-        <w:t xml:space="preserve">Izstrādes laikā projektu jātestē un jāpārbauda funkcionalitātes pēc nepilnībām. Testēšana tiks veikta manuāli ar melnās un baltās kastes metodoloģijām, taču atsevišķas funkcionalitātes vai tās daļas testēšanu var veikt automātiski ar </w:t>
-      </w:r>
-      <w:proofErr w:type="spellStart"/>
-      <w:r>
-        <w:t>vienībtestēšanu</w:t>
-      </w:r>
-      <w:proofErr w:type="spellEnd"/>
-      <w:r>
-        <w:t>.</w:t>
+        <w:t>Izstrādes laikā projektu jātestē un jāpārbauda funkcionalitātes pēc nepilnībām. Testēšana tiks veikta manuāli ar melnās un baltās kastes metodoloģijām, taču atsevišķas funkcionalitātes vai tās daļas testēšanu var veikt automātiski ar vienībtestēšanu.</w:t>
       </w:r>
       <w:r>
         <w:t xml:space="preserve"> </w:t>
       </w:r>
       <w:r>
-        <w:t xml:space="preserve">Melnās kastes testēšana ietver pārbaudi no lietotāja skatupunkta, neredzot </w:t>
-      </w:r>
-      <w:proofErr w:type="spellStart"/>
-      <w:r>
-        <w:t>avotkodu</w:t>
-      </w:r>
-      <w:proofErr w:type="spellEnd"/>
-      <w:r>
-        <w:t xml:space="preserve"> vai atkļūdošanas informāciju, kamēr baltās kastes testēšana pārbauda </w:t>
-      </w:r>
-      <w:proofErr w:type="spellStart"/>
-      <w:r>
-        <w:t>avotkodu</w:t>
-      </w:r>
-      <w:proofErr w:type="spellEnd"/>
-      <w:r>
-        <w:t>.</w:t>
+        <w:t>Melnās kastes testēšana ietver pārbaudi no lietotāja skatupunkta, neredzot avotkodu vai atkļūdošanas informāciju, kamēr baltās kastes testēšana pārbauda avotkodu.</w:t>
       </w:r>
     </w:p>
     <w:p>
@@ -10176,13 +9519,8 @@
               <w:pStyle w:val="talbecontent"/>
             </w:pPr>
             <w:r>
-              <w:t xml:space="preserve">Lietotājs gaida līdz </w:t>
-            </w:r>
-            <w:proofErr w:type="spellStart"/>
-            <w:r>
-              <w:t>ielādei</w:t>
-            </w:r>
-            <w:proofErr w:type="spellEnd"/>
+              <w:t>Lietotājs gaida līdz ielādei</w:t>
+            </w:r>
           </w:p>
         </w:tc>
         <w:tc>

</xml_diff>

<commit_message>
more explanations in structs
</commit_message>
<xml_diff>
--- a/Documentation/Dokumentācija.docx
+++ b/Documentation/Dokumentācija.docx
@@ -112,8 +112,13 @@
       </w:r>
       <w:r>
         <w:br/>
-        <w:t>Skolotājs, Kristaps Rāvalds</w:t>
-      </w:r>
+        <w:t xml:space="preserve">Skolotājs, Kristaps </w:t>
+      </w:r>
+      <w:proofErr w:type="spellStart"/>
+      <w:r>
+        <w:t>Rāvalds</w:t>
+      </w:r>
+      <w:proofErr w:type="spellEnd"/>
     </w:p>
     <w:p>
       <w:pPr>
@@ -3329,7 +3334,15 @@
         <w:t xml:space="preserve">, kā arī </w:t>
       </w:r>
       <w:r>
-        <w:t>kādas datorspēlēs var iekļaut funkcionalitātes, kuras nav nepieciešams vai novērsošas projektam un tās izmantošanai kā pamatzināšanu apmācības materiālam.</w:t>
+        <w:t xml:space="preserve">kādas datorspēlēs var iekļaut funkcionalitātes, kuras nav nepieciešams vai novērsošas projektam un tās izmantošanai kā </w:t>
+      </w:r>
+      <w:proofErr w:type="spellStart"/>
+      <w:r>
+        <w:t>pamatzināšanu</w:t>
+      </w:r>
+      <w:proofErr w:type="spellEnd"/>
+      <w:r>
+        <w:t xml:space="preserve"> apmācības materiālam.</w:t>
       </w:r>
     </w:p>
     <w:p>
@@ -3444,7 +3457,15 @@
         <w:t xml:space="preserve"> </w:t>
       </w:r>
       <w:r>
-        <w:t xml:space="preserve">Pēc izstrādes šis projekts ar tās avotkodu tiek kompilēts datorsistēmas platformās kā </w:t>
+        <w:t xml:space="preserve">Pēc izstrādes šis projekts ar tās </w:t>
+      </w:r>
+      <w:proofErr w:type="spellStart"/>
+      <w:r>
+        <w:t>avotkodu</w:t>
+      </w:r>
+      <w:proofErr w:type="spellEnd"/>
+      <w:r>
+        <w:t xml:space="preserve"> tiek kompilēts datorsistēmas platformās kā </w:t>
       </w:r>
       <w:r>
         <w:rPr>
@@ -3456,6 +3477,7 @@
       <w:r>
         <w:t xml:space="preserve"> un </w:t>
       </w:r>
+      <w:proofErr w:type="spellStart"/>
       <w:r>
         <w:rPr>
           <w:i/>
@@ -3463,6 +3485,7 @@
         </w:rPr>
         <w:t>Linux</w:t>
       </w:r>
+      <w:proofErr w:type="spellEnd"/>
       <w:r>
         <w:t xml:space="preserve"> vidē.</w:t>
       </w:r>
@@ -3539,7 +3562,15 @@
         <w:t xml:space="preserve">Pēc modelēšanas tiek izstrādās projekts, pamatojoties uz iepriekš izveidotiem modeļiem. Izstrādes laikā </w:t>
       </w:r>
       <w:r>
-        <w:t>ir jāveic projektam versionēšanu jeb versiju kontroli, kuras vadīs projekta stadijas punktus. Praksē tā tiks izmantota, piemēram, projekta sazarošanai funkcionalitātes, būtisko izmaiņu ieviešanai, atsevišķu failu izmaiņu punktu atzīmēšanu, sazarojumu apvienošanu un versijas punktu atzīmēšanu.</w:t>
+        <w:t xml:space="preserve">ir jāveic projektam </w:t>
+      </w:r>
+      <w:proofErr w:type="spellStart"/>
+      <w:r>
+        <w:t>versionēšanu</w:t>
+      </w:r>
+      <w:proofErr w:type="spellEnd"/>
+      <w:r>
+        <w:t xml:space="preserve"> jeb versiju kontroli, kuras vadīs projekta stadijas punktus. Praksē tā tiks izmantota, piemēram, projekta sazarošanai funkcionalitātes, būtisko izmaiņu ieviešanai, atsevišķu failu izmaiņu punktu atzīmēšanu, sazarojumu apvienošanu un versijas punktu atzīmēšanu.</w:t>
       </w:r>
     </w:p>
     <w:p>
@@ -3754,7 +3785,15 @@
         <w:t>Izvaddati</w:t>
       </w:r>
       <w:r>
-        <w:t>: Uznirsts anotācijas logs.</w:t>
+        <w:t xml:space="preserve">: </w:t>
+      </w:r>
+      <w:proofErr w:type="spellStart"/>
+      <w:r>
+        <w:t>Uznirsts</w:t>
+      </w:r>
+      <w:proofErr w:type="spellEnd"/>
+      <w:r>
+        <w:t xml:space="preserve"> anotācijas logs.</w:t>
       </w:r>
     </w:p>
     <w:p>
@@ -4775,8 +4814,13 @@
       <w:r>
         <w:t xml:space="preserve">: </w:t>
       </w:r>
-      <w:r>
-        <w:t>Augšjoslas pauzēšanas poga.</w:t>
+      <w:proofErr w:type="spellStart"/>
+      <w:r>
+        <w:t>Augšjoslas</w:t>
+      </w:r>
+      <w:proofErr w:type="spellEnd"/>
+      <w:r>
+        <w:t xml:space="preserve"> pauzēšanas poga.</w:t>
       </w:r>
     </w:p>
     <w:p>
@@ -4984,8 +5028,13 @@
         <w:t>: Laika rādītājs</w:t>
       </w:r>
       <w:r>
-        <w:t xml:space="preserve"> augšjoslā</w:t>
-      </w:r>
+        <w:t xml:space="preserve"> </w:t>
+      </w:r>
+      <w:proofErr w:type="spellStart"/>
+      <w:r>
+        <w:t>augšjoslā</w:t>
+      </w:r>
+      <w:proofErr w:type="spellEnd"/>
       <w:r>
         <w:t>.</w:t>
       </w:r>
@@ -5044,8 +5093,13 @@
         <w:t xml:space="preserve">: </w:t>
       </w:r>
       <w:r>
-        <w:t>Kārtas skaits augšjoslā</w:t>
-      </w:r>
+        <w:t xml:space="preserve">Kārtas skaits </w:t>
+      </w:r>
+      <w:proofErr w:type="spellStart"/>
+      <w:r>
+        <w:t>augšjoslā</w:t>
+      </w:r>
+      <w:proofErr w:type="spellEnd"/>
       <w:r>
         <w:t xml:space="preserve">. </w:t>
       </w:r>
@@ -7707,7 +7761,15 @@
       </w:r>
       <w:r>
         <w:tab/>
-        <w:t>Datorspēles kompilētā programmai ir jābūt pēc iespējas pieejamai vairākās platformās vai kompilējamam vairākām operētājsistēmām, taču galvenokārt “Windows” un “Linux” videi;</w:t>
+        <w:t>Datorspēles kompilētā programmai ir jābūt pēc iespējas pieejamai vairākās platformās vai kompilējamam vairākām operētājsistēmām, taču galvenokārt “Windows” un “</w:t>
+      </w:r>
+      <w:proofErr w:type="spellStart"/>
+      <w:r>
+        <w:t>Linux</w:t>
+      </w:r>
+      <w:proofErr w:type="spellEnd"/>
+      <w:r>
+        <w:t>” videi;</w:t>
       </w:r>
     </w:p>
     <w:p>
@@ -7724,8 +7786,13 @@
         <w:pStyle w:val="Virsraksts3"/>
       </w:pPr>
       <w:r>
-        <w:t>Lietotāja saskarne</w:t>
-      </w:r>
+        <w:t xml:space="preserve">Lietotāja </w:t>
+      </w:r>
+      <w:proofErr w:type="spellStart"/>
+      <w:r>
+        <w:t>saskarne</w:t>
+      </w:r>
+      <w:proofErr w:type="spellEnd"/>
     </w:p>
     <w:p>
       <w:r>
@@ -7742,7 +7809,15 @@
       </w:r>
       <w:r>
         <w:tab/>
-        <w:t>Datorspēles grafikai un lietotāja saskarnei jābūt minimālai, taču viegli pārskatāmai;</w:t>
+        <w:t xml:space="preserve">Datorspēles grafikai un lietotāja </w:t>
+      </w:r>
+      <w:proofErr w:type="spellStart"/>
+      <w:r>
+        <w:t>saskarnei</w:t>
+      </w:r>
+      <w:proofErr w:type="spellEnd"/>
+      <w:r>
+        <w:t xml:space="preserve"> jābūt minimālai, taču viegli pārskatāmai;</w:t>
       </w:r>
     </w:p>
     <w:p>
@@ -7754,7 +7829,15 @@
       </w:r>
       <w:r>
         <w:tab/>
-        <w:t>Lietotāja saskarnei ir jābūt pielāgojamai dažādos ekrānu izmēros vai izšķirtspējās;</w:t>
+        <w:t xml:space="preserve">Lietotāja </w:t>
+      </w:r>
+      <w:proofErr w:type="spellStart"/>
+      <w:r>
+        <w:t>saskarnei</w:t>
+      </w:r>
+      <w:proofErr w:type="spellEnd"/>
+      <w:r>
+        <w:t xml:space="preserve"> ir jābūt pielāgojamai dažādos ekrānu izmēros vai izšķirtspējās;</w:t>
       </w:r>
     </w:p>
     <w:p>
@@ -7766,7 +7849,15 @@
       </w:r>
       <w:r>
         <w:tab/>
-        <w:t>Datorspēles saskarnes valodai jābūt angļu valodai;</w:t>
+        <w:t xml:space="preserve">Datorspēles </w:t>
+      </w:r>
+      <w:proofErr w:type="spellStart"/>
+      <w:r>
+        <w:t>saskarnes</w:t>
+      </w:r>
+      <w:proofErr w:type="spellEnd"/>
+      <w:r>
+        <w:t xml:space="preserve"> valodai jābūt angļu valodai;</w:t>
       </w:r>
     </w:p>
     <w:p>
@@ -7871,7 +7962,15 @@
     </w:p>
     <w:p>
       <w:r>
-        <w:t>Šī sadaļa noskaidros, kādi ir pieejami līdzekļi un rīki, lietojuma pamatojumi un tās iespējamās alternatīvās projekta īstenošanai. Rīki tiks atlasīti pēc licencēšanas, kurai ir jābūt pēc iespējas brīvai un atvērtai, starpplatformu pieejamības, pieejamās dimensiju vides, kuras jāiekļauj un jābūt optimizēta div</w:t>
+        <w:t xml:space="preserve">Šī sadaļa noskaidros, kādi ir pieejami līdzekļi un rīki, lietojuma pamatojumi un tās iespējamās alternatīvās projekta īstenošanai. Rīki tiks atlasīti pēc licencēšanas, kurai ir jābūt pēc iespējas brīvai un atvērtai, </w:t>
+      </w:r>
+      <w:proofErr w:type="spellStart"/>
+      <w:r>
+        <w:t>starpplatformu</w:t>
+      </w:r>
+      <w:proofErr w:type="spellEnd"/>
+      <w:r>
+        <w:t xml:space="preserve"> pieejamības, pieejamās dimensiju vides, kuras jāiekļauj un jābūt optimizēta div</w:t>
       </w:r>
       <w:r>
         <w:t xml:space="preserve">u </w:t>
@@ -7905,13 +8004,37 @@
     </w:p>
     <w:p>
       <w:r>
-        <w:t>Spēļu un grafikas ietvars “Godot” ir izcelta starp pārējiem tāda veida ietvariem, jo liels skaits neliela mēra projektu kā pašizstrādātās vai mazo komandu izstrādātās spēles. Ne tikai pēc popularitātes dēļ, taču licencēšana norāda šo ietvaru par brīvu un atvērtu, kurai nav nepieciešama ne papildizmaksas, nedz reģistrācijas, kā arī ir salīdzinoši ar citiem ietvariem ātri un viegli apgūstama. Šis dzinis arī ir pieejams vairākās platformās, it īpaši starp operētājsistēmām. Funkcionāli tā ir optimizēta div</w:t>
+        <w:t>Spēļu un grafikas ietvars “</w:t>
+      </w:r>
+      <w:proofErr w:type="spellStart"/>
+      <w:r>
+        <w:t>Godot</w:t>
+      </w:r>
+      <w:proofErr w:type="spellEnd"/>
+      <w:r>
+        <w:t xml:space="preserve">” ir izcelta starp pārējiem tāda veida ietvariem, jo liels skaits neliela mēra projektu kā </w:t>
+      </w:r>
+      <w:proofErr w:type="spellStart"/>
+      <w:r>
+        <w:t>pašizstrādātās</w:t>
+      </w:r>
+      <w:proofErr w:type="spellEnd"/>
+      <w:r>
+        <w:t xml:space="preserve"> vai mazo komandu izstrādātās spēles. Ne tikai pēc popularitātes dēļ, taču licencēšana norāda šo ietvaru par brīvu un atvērtu, kurai nav nepieciešama ne papildizmaksas, nedz reģistrācijas, kā arī ir salīdzinoši ar citiem ietvariem ātri un viegli apgūstama. Šis dzinis arī ir pieejams vairākās platformās, it īpaši starp operētājsistēmām. Funkcionāli tā ir optimizēta div</w:t>
       </w:r>
       <w:r>
         <w:t xml:space="preserve">u </w:t>
       </w:r>
       <w:r>
-        <w:t xml:space="preserve">dimensiju videi pēc noteiktiem kritērijiem, taču arī ir iespējams izmantot trīsdimensiju vidi, kura arī ir īpaši optimizēta un pielāgota. </w:t>
+        <w:t xml:space="preserve">dimensiju videi pēc noteiktiem kritērijiem, taču arī ir iespējams izmantot </w:t>
+      </w:r>
+      <w:proofErr w:type="spellStart"/>
+      <w:r>
+        <w:t>trīsdimensiju</w:t>
+      </w:r>
+      <w:proofErr w:type="spellEnd"/>
+      <w:r>
+        <w:t xml:space="preserve"> vidi, kura arī ir īpaši optimizēta un pielāgota. </w:t>
       </w:r>
     </w:p>
     <w:p>
@@ -7926,7 +8049,55 @@
     </w:p>
     <w:p>
       <w:r>
-        <w:t>Ietvars “Godot” oficiāli piedāvā izmantot abas programmēšanas valodas – “Godot” iebūvētā “GDScript” un “.NET” ietvara valoda “C#”, kura tiks izvēlēta šī projekta izstrādei. “GDScript” ir interpretētā valoda, kura tiek tikai apstrādāta palaišanas laikā un pēc avotkoda izmaiņām nav nepieciešama papildus darbības kā kompilēšanu, taču ar nepilnību, kura mazina datorspēles darbības veiktspēju. “C#” valoda tiks izmantota tam dēļ, ka veiktspēja datorspēles darbībai ir uzlabota ar nosacījumu, ka pēc jebkuras izmaiņas projektu ir nepieciešams kompilēt. “GDScript” arī nav pilnīgi pielāgota objektorientētai izmantošanai, kamēr “C#” pēc dizaina ir objektorientētā valoda.</w:t>
+        <w:t>Ietvars “</w:t>
+      </w:r>
+      <w:proofErr w:type="spellStart"/>
+      <w:r>
+        <w:t>Godot</w:t>
+      </w:r>
+      <w:proofErr w:type="spellEnd"/>
+      <w:r>
+        <w:t>” oficiāli piedāvā izmantot abas programmēšanas valodas – “</w:t>
+      </w:r>
+      <w:proofErr w:type="spellStart"/>
+      <w:r>
+        <w:t>Godot</w:t>
+      </w:r>
+      <w:proofErr w:type="spellEnd"/>
+      <w:r>
+        <w:t>” iebūvētā “</w:t>
+      </w:r>
+      <w:proofErr w:type="spellStart"/>
+      <w:r>
+        <w:t>GDScript</w:t>
+      </w:r>
+      <w:proofErr w:type="spellEnd"/>
+      <w:r>
+        <w:t>” un “.NET” ietvara valoda “C#”, kura tiks izvēlēta šī projekta izstrādei. “</w:t>
+      </w:r>
+      <w:proofErr w:type="spellStart"/>
+      <w:r>
+        <w:t>GDScript</w:t>
+      </w:r>
+      <w:proofErr w:type="spellEnd"/>
+      <w:r>
+        <w:t xml:space="preserve">” ir interpretētā valoda, kura tiek tikai apstrādāta palaišanas laikā un pēc </w:t>
+      </w:r>
+      <w:proofErr w:type="spellStart"/>
+      <w:r>
+        <w:t>avotkoda</w:t>
+      </w:r>
+      <w:proofErr w:type="spellEnd"/>
+      <w:r>
+        <w:t xml:space="preserve"> izmaiņām nav nepieciešama papildus darbības kā kompilēšanu, taču ar nepilnību, kura mazina datorspēles darbības veiktspēju. “C#” valoda tiks izmantota tam dēļ, ka veiktspēja datorspēles darbībai ir uzlabota ar nosacījumu, ka pēc jebkuras izmaiņas projektu ir nepieciešams kompilēt. “</w:t>
+      </w:r>
+      <w:proofErr w:type="spellStart"/>
+      <w:r>
+        <w:t>GDScript</w:t>
+      </w:r>
+      <w:proofErr w:type="spellEnd"/>
+      <w:r>
+        <w:t>” arī nav pilnīgi pielāgota objektorientētai izmantošanai, kamēr “C#” pēc dizaina ir objektorientētā valoda.</w:t>
       </w:r>
     </w:p>
     <w:p>
@@ -7941,7 +8112,23 @@
     </w:p>
     <w:p>
       <w:r>
-        <w:t>“Godot” ietvaram ir jau savs projekta redaktors, kurā iekļauj koda redaktoru. Šis koda redaktors ir vairāk pielāgots ar “GDScript” valodu, taču pieejams atbalsts “C#” valodai. Pašā izstrādes vidē var viegli pārslēgties uz vizuālo redaktoru, kodu redaktoru un atkļūdošanas sadaļu</w:t>
+        <w:t>“</w:t>
+      </w:r>
+      <w:proofErr w:type="spellStart"/>
+      <w:r>
+        <w:t>Godot</w:t>
+      </w:r>
+      <w:proofErr w:type="spellEnd"/>
+      <w:r>
+        <w:t>” ietvaram ir jau savs projekta redaktors, kurā iekļauj koda redaktoru. Šis koda redaktors ir vairāk pielāgots ar “</w:t>
+      </w:r>
+      <w:proofErr w:type="spellStart"/>
+      <w:r>
+        <w:t>GDScript</w:t>
+      </w:r>
+      <w:proofErr w:type="spellEnd"/>
+      <w:r>
+        <w:t>” valodu, taču pieejams atbalsts “C#” valodai. Pašā izstrādes vidē var viegli pārslēgties uz vizuālo redaktoru, kodu redaktoru un atkļūdošanas sadaļu</w:t>
       </w:r>
       <w:r>
         <w:t xml:space="preserve"> un nenošķir kodu rakstīšanu ar vizuālo rediģēšanu</w:t>
@@ -7957,19 +8144,48 @@
       <w:bookmarkStart w:id="22" w:name="_Toc225723247"/>
       <w:r>
         <w:lastRenderedPageBreak/>
-        <w:t>Versiju kontrole un repozitorijas mitināšana</w:t>
+        <w:t xml:space="preserve">Versiju kontrole un </w:t>
+      </w:r>
+      <w:proofErr w:type="spellStart"/>
+      <w:r>
+        <w:t>repozitorijas</w:t>
+      </w:r>
+      <w:proofErr w:type="spellEnd"/>
+      <w:r>
+        <w:t xml:space="preserve"> mitināšana</w:t>
       </w:r>
       <w:bookmarkEnd w:id="22"/>
     </w:p>
     <w:p>
       <w:r>
-        <w:t>“Git” tiks izmantots versiju kontrolei un tīmeklī tiks izmantots ”</w:t>
+        <w:t>“</w:t>
+      </w:r>
+      <w:proofErr w:type="spellStart"/>
+      <w:r>
+        <w:t>Git</w:t>
+      </w:r>
+      <w:proofErr w:type="spellEnd"/>
+      <w:r>
+        <w:t>” tiks izmantots versiju kontrolei un tīmeklī tiks izmantots ”</w:t>
       </w:r>
       <w:r>
         <w:t xml:space="preserve"> </w:t>
       </w:r>
-      <w:r>
-        <w:t>GitHub”, lai mitinātu šo projekta avotkodu.</w:t>
+      <w:proofErr w:type="spellStart"/>
+      <w:r>
+        <w:t>GitHub</w:t>
+      </w:r>
+      <w:proofErr w:type="spellEnd"/>
+      <w:r>
+        <w:t xml:space="preserve">”, lai mitinātu šo projekta </w:t>
+      </w:r>
+      <w:proofErr w:type="spellStart"/>
+      <w:r>
+        <w:t>avotkodu</w:t>
+      </w:r>
+      <w:proofErr w:type="spellEnd"/>
+      <w:r>
+        <w:t>.</w:t>
       </w:r>
     </w:p>
     <w:p>
@@ -7999,7 +8215,103 @@
     </w:p>
     <w:p>
       <w:r>
-        <w:t>Populārākos ietvarus datorspēļu un citu mediju izstrādē iekļauj “Unity”, “Unreal Engine”,  “CryEngine”. Ietvari “Unreal Engine” un “CryEngine” nav pielāgoti divdimensiju datorspēļu izveidei ietvara ierobežojumu dēļ, kura no tās izslēdz izmantošanu, ja ne arī neprasa veiktspējīgu datorsistēmu, kura ir pretrunā ar projekta mērķiem, taču “Unity” ietvars neprasa salīdzinoši veiktspējīgu datorsistēmu un ir pielāgojama divdimensiju videi, taču licencēšana nav brīva un prasa lietotāja reģistrāciju un papildizmaksas, ja šis projekts paplašināties komercdarbības nolūkiem.</w:t>
+        <w:t>Populārākos ietvarus datorspēļu un citu mediju izstrādē iekļauj “</w:t>
+      </w:r>
+      <w:proofErr w:type="spellStart"/>
+      <w:r>
+        <w:t>Unity</w:t>
+      </w:r>
+      <w:proofErr w:type="spellEnd"/>
+      <w:r>
+        <w:t>”, “</w:t>
+      </w:r>
+      <w:proofErr w:type="spellStart"/>
+      <w:r>
+        <w:t>Unreal</w:t>
+      </w:r>
+      <w:proofErr w:type="spellEnd"/>
+      <w:r>
+        <w:t xml:space="preserve"> </w:t>
+      </w:r>
+      <w:proofErr w:type="spellStart"/>
+      <w:r>
+        <w:t>Engine</w:t>
+      </w:r>
+      <w:proofErr w:type="spellEnd"/>
+      <w:r>
+        <w:t>”,  “</w:t>
+      </w:r>
+      <w:proofErr w:type="spellStart"/>
+      <w:r>
+        <w:t>CryEngine</w:t>
+      </w:r>
+      <w:proofErr w:type="spellEnd"/>
+      <w:r>
+        <w:t>”. Ietvari “</w:t>
+      </w:r>
+      <w:proofErr w:type="spellStart"/>
+      <w:r>
+        <w:t>Unreal</w:t>
+      </w:r>
+      <w:proofErr w:type="spellEnd"/>
+      <w:r>
+        <w:t xml:space="preserve"> </w:t>
+      </w:r>
+      <w:proofErr w:type="spellStart"/>
+      <w:r>
+        <w:t>Engine</w:t>
+      </w:r>
+      <w:proofErr w:type="spellEnd"/>
+      <w:r>
+        <w:t>” un “</w:t>
+      </w:r>
+      <w:proofErr w:type="spellStart"/>
+      <w:r>
+        <w:t>CryEngine</w:t>
+      </w:r>
+      <w:proofErr w:type="spellEnd"/>
+      <w:r>
+        <w:t xml:space="preserve">” nav pielāgoti </w:t>
+      </w:r>
+      <w:proofErr w:type="spellStart"/>
+      <w:r>
+        <w:t>divdimensiju</w:t>
+      </w:r>
+      <w:proofErr w:type="spellEnd"/>
+      <w:r>
+        <w:t xml:space="preserve"> datorspēļu izveidei ietvara ierobežojumu dēļ, kura no tās izslēdz izmantošanu, ja ne arī neprasa </w:t>
+      </w:r>
+      <w:proofErr w:type="spellStart"/>
+      <w:r>
+        <w:t>veiktspējīgu</w:t>
+      </w:r>
+      <w:proofErr w:type="spellEnd"/>
+      <w:r>
+        <w:t xml:space="preserve"> datorsistēmu, kura ir pretrunā ar projekta mērķiem, taču “</w:t>
+      </w:r>
+      <w:proofErr w:type="spellStart"/>
+      <w:r>
+        <w:t>Unity</w:t>
+      </w:r>
+      <w:proofErr w:type="spellEnd"/>
+      <w:r>
+        <w:t xml:space="preserve">” ietvars neprasa salīdzinoši </w:t>
+      </w:r>
+      <w:proofErr w:type="spellStart"/>
+      <w:r>
+        <w:t>veiktspējīgu</w:t>
+      </w:r>
+      <w:proofErr w:type="spellEnd"/>
+      <w:r>
+        <w:t xml:space="preserve"> datorsistēmu un ir pielāgojama </w:t>
+      </w:r>
+      <w:proofErr w:type="spellStart"/>
+      <w:r>
+        <w:t>divdimensiju</w:t>
+      </w:r>
+      <w:proofErr w:type="spellEnd"/>
+      <w:r>
+        <w:t xml:space="preserve"> videi, taču licencēšana nav brīva un prasa lietotāja reģistrāciju un papildizmaksas, ja šis projekts paplašināties komercdarbības nolūkiem.</w:t>
       </w:r>
     </w:p>
     <w:p>
@@ -8014,7 +8326,63 @@
     </w:p>
     <w:p>
       <w:r>
-        <w:t>Ietvari “CryEngine” un “Unreal Engine” izmanto valodu “C++”, kurā iekļauj klases un objektorientētā funkcionalitāte kā C#, taču neatlasot šos ietvarus valoda “C++” netiks izmantota. “C++” lietojuma stili ir plašāki, taču valodas funkcionalitāti un īpatnības apgūt ir sarežģītāk nekā ar “C#”, kura izstrādātājam liek lietot objektorientētā stilā, kurā visi elementi valodā ir objekti, kā arī vairums funkcionalitātes ir aizklātas ar metodēm, kura mazina izstrādes laiku salīdzinot ar “C++”, kura vairākas kompleksas funkcionalitātes nav aizklātas ar metodēm, kura var palēlināt izstrādes laiku. Izvēlētā ietvarā “Godot” ir pieejama skriptēšanas valoda “GDScript”, taču pēc nosacītiem iemesliem izvēlētai valodai šī valoda netiks izmantota.</w:t>
+        <w:t>Ietvari “</w:t>
+      </w:r>
+      <w:proofErr w:type="spellStart"/>
+      <w:r>
+        <w:t>CryEngine</w:t>
+      </w:r>
+      <w:proofErr w:type="spellEnd"/>
+      <w:r>
+        <w:t>” un “</w:t>
+      </w:r>
+      <w:proofErr w:type="spellStart"/>
+      <w:r>
+        <w:t>Unreal</w:t>
+      </w:r>
+      <w:proofErr w:type="spellEnd"/>
+      <w:r>
+        <w:t xml:space="preserve"> </w:t>
+      </w:r>
+      <w:proofErr w:type="spellStart"/>
+      <w:r>
+        <w:t>Engine</w:t>
+      </w:r>
+      <w:proofErr w:type="spellEnd"/>
+      <w:r>
+        <w:t xml:space="preserve">” izmanto valodu “C++”, kurā iekļauj klases un objektorientētā funkcionalitāte kā C#, taču neatlasot šos ietvarus valoda “C++” netiks izmantota. “C++” lietojuma stili ir plašāki, taču valodas funkcionalitāti un īpatnības apgūt ir sarežģītāk nekā ar “C#”, kura izstrādātājam liek lietot objektorientētā stilā, kurā visi elementi valodā ir objekti, kā arī vairums funkcionalitātes ir aizklātas ar metodēm, kura mazina izstrādes laiku salīdzinot ar “C++”, kura vairākas kompleksas funkcionalitātes nav aizklātas ar metodēm, kura var </w:t>
+      </w:r>
+      <w:proofErr w:type="spellStart"/>
+      <w:r>
+        <w:t>palēlināt</w:t>
+      </w:r>
+      <w:proofErr w:type="spellEnd"/>
+      <w:r>
+        <w:t xml:space="preserve"> izstrādes laiku. Izvēlētā ietvarā “</w:t>
+      </w:r>
+      <w:proofErr w:type="spellStart"/>
+      <w:r>
+        <w:t>Godot</w:t>
+      </w:r>
+      <w:proofErr w:type="spellEnd"/>
+      <w:r>
+        <w:t xml:space="preserve">” ir pieejama </w:t>
+      </w:r>
+      <w:proofErr w:type="spellStart"/>
+      <w:r>
+        <w:t>skriptēšanas</w:t>
+      </w:r>
+      <w:proofErr w:type="spellEnd"/>
+      <w:r>
+        <w:t xml:space="preserve"> valoda “</w:t>
+      </w:r>
+      <w:proofErr w:type="spellStart"/>
+      <w:r>
+        <w:t>GDScript</w:t>
+      </w:r>
+      <w:proofErr w:type="spellEnd"/>
+      <w:r>
+        <w:t>”, taču pēc nosacītiem iemesliem izvēlētai valodai šī valoda netiks izmantota.</w:t>
       </w:r>
     </w:p>
     <w:p>
@@ -8041,17 +8409,169 @@
     </w:p>
     <w:p>
       <w:r>
-        <w:t>Tā kā valoda “C#” tiks izmantota, kura ir daļa no ietvara “.NET”, tiks izmantoti attiecīgas izstrādes programmatūras ar uzsvaru uz noteikto ietvaru un tās ekosistēmas. Populārākā izstrādes  vide tam ir “Visual Studio”, kura līdzīgi ar izvēlēto izstrādes vidi “JetBrains Rider” iekļauj detalizētu atķļūdošanu, kodu analīze, automātiskā aizpilde, u.t.t., taču netiks izmantota, jo šī programmatūra nav starpplatformu, ierobežojoties uz “Windows” platformu, kuru autors neizmanto, tātad nepieejama programmatūra autoram.</w:t>
-      </w:r>
-    </w:p>
-    <w:p>
-      <w:r>
-        <w:t>Ja ietvars kā “Unreal Engine” tiktu izmantota, kurā galvenā valoda ir “C++”, tiktu izmantotas izstrādes vides attiecīgi valodai kā “Qt Creator”, kura ir pielāgota ietvara “Qt” programmatūras izstrādei, taču iespējams izveidot projektus, kuras neizmanto minēto ietvaru, ņemot vērā to, ka funkcionalitāte un tās iespējas mazinās vai ne tik advancētas citiem projektiem,  vai “JetBrains CLion”, kurai ir līdzīga funkcionalitāte ar atlasīto izstrādes vidi “”JetBrains Rider” no “JetBrains” programmatūru klāsta.</w:t>
-      </w:r>
-    </w:p>
-    <w:p>
-      <w:r>
-        <w:t>Arī iespējams ir izmantot teksta redaktoru “Visual Studio Code”, kura ar paplašinājumiem var izmantot kā izstrādes vidi, taču noklusētā funkcionalitāte ir ierobežota salīdzinot ar iepriekšējām izstrādes programmatūrām un nepieciešama papildus iestatīšana šai programmatūrai, kura nebūtu nepieciešama pārējām izstrādes vidēm atverot sākotnēji.</w:t>
+        <w:t>Tā kā valoda “C#” tiks izmantota, kura ir daļa no ietvara “.NET”, tiks izmantoti attiecīgas izstrādes programmatūras ar uzsvaru uz noteikto ietvaru un tās ekosistēmas. Populārākā izstrādes  vide tam ir “</w:t>
+      </w:r>
+      <w:proofErr w:type="spellStart"/>
+      <w:r>
+        <w:t>Visual</w:t>
+      </w:r>
+      <w:proofErr w:type="spellEnd"/>
+      <w:r>
+        <w:t xml:space="preserve"> </w:t>
+      </w:r>
+      <w:proofErr w:type="spellStart"/>
+      <w:r>
+        <w:t>Studio</w:t>
+      </w:r>
+      <w:proofErr w:type="spellEnd"/>
+      <w:r>
+        <w:t>”, kura līdzīgi ar izvēlēto izstrādes vidi “</w:t>
+      </w:r>
+      <w:proofErr w:type="spellStart"/>
+      <w:r>
+        <w:t>JetBrains</w:t>
+      </w:r>
+      <w:proofErr w:type="spellEnd"/>
+      <w:r>
+        <w:t xml:space="preserve"> </w:t>
+      </w:r>
+      <w:proofErr w:type="spellStart"/>
+      <w:r>
+        <w:t>Rider</w:t>
+      </w:r>
+      <w:proofErr w:type="spellEnd"/>
+      <w:r>
+        <w:t xml:space="preserve">” iekļauj detalizētu </w:t>
+      </w:r>
+      <w:proofErr w:type="spellStart"/>
+      <w:r>
+        <w:t>atķļūdošanu</w:t>
+      </w:r>
+      <w:proofErr w:type="spellEnd"/>
+      <w:r>
+        <w:t xml:space="preserve">, kodu analīze, automātiskā aizpilde, u.t.t., taču netiks izmantota, jo šī programmatūra nav </w:t>
+      </w:r>
+      <w:proofErr w:type="spellStart"/>
+      <w:r>
+        <w:t>starpplatformu</w:t>
+      </w:r>
+      <w:proofErr w:type="spellEnd"/>
+      <w:r>
+        <w:t>, ierobežojoties uz “Windows” platformu, kuru autors neizmanto, tātad nepieejama programmatūra autoram.</w:t>
+      </w:r>
+    </w:p>
+    <w:p>
+      <w:r>
+        <w:t>Ja ietvars kā “</w:t>
+      </w:r>
+      <w:proofErr w:type="spellStart"/>
+      <w:r>
+        <w:t>Unreal</w:t>
+      </w:r>
+      <w:proofErr w:type="spellEnd"/>
+      <w:r>
+        <w:t xml:space="preserve"> </w:t>
+      </w:r>
+      <w:proofErr w:type="spellStart"/>
+      <w:r>
+        <w:t>Engine</w:t>
+      </w:r>
+      <w:proofErr w:type="spellEnd"/>
+      <w:r>
+        <w:t>” tiktu izmantota, kurā galvenā valoda ir “C++”, tiktu izmantotas izstrādes vides attiecīgi valodai kā “</w:t>
+      </w:r>
+      <w:proofErr w:type="spellStart"/>
+      <w:r>
+        <w:t>Qt</w:t>
+      </w:r>
+      <w:proofErr w:type="spellEnd"/>
+      <w:r>
+        <w:t xml:space="preserve"> </w:t>
+      </w:r>
+      <w:proofErr w:type="spellStart"/>
+      <w:r>
+        <w:t>Creator</w:t>
+      </w:r>
+      <w:proofErr w:type="spellEnd"/>
+      <w:r>
+        <w:t>”, kura ir pielāgota ietvara “</w:t>
+      </w:r>
+      <w:proofErr w:type="spellStart"/>
+      <w:r>
+        <w:t>Qt</w:t>
+      </w:r>
+      <w:proofErr w:type="spellEnd"/>
+      <w:r>
+        <w:t xml:space="preserve">” programmatūras izstrādei, taču iespējams izveidot projektus, kuras neizmanto minēto ietvaru, ņemot vērā to, ka funkcionalitāte un tās iespējas mazinās vai ne tik </w:t>
+      </w:r>
+      <w:proofErr w:type="spellStart"/>
+      <w:r>
+        <w:t>advancētas</w:t>
+      </w:r>
+      <w:proofErr w:type="spellEnd"/>
+      <w:r>
+        <w:t xml:space="preserve"> citiem projektiem,  vai “</w:t>
+      </w:r>
+      <w:proofErr w:type="spellStart"/>
+      <w:r>
+        <w:t>JetBrains</w:t>
+      </w:r>
+      <w:proofErr w:type="spellEnd"/>
+      <w:r>
+        <w:t xml:space="preserve"> </w:t>
+      </w:r>
+      <w:proofErr w:type="spellStart"/>
+      <w:r>
+        <w:t>CLion</w:t>
+      </w:r>
+      <w:proofErr w:type="spellEnd"/>
+      <w:r>
+        <w:t>”, kurai ir līdzīga funkcionalitāte ar atlasīto izstrādes vidi “”</w:t>
+      </w:r>
+      <w:proofErr w:type="spellStart"/>
+      <w:r>
+        <w:t>JetBrains</w:t>
+      </w:r>
+      <w:proofErr w:type="spellEnd"/>
+      <w:r>
+        <w:t xml:space="preserve"> </w:t>
+      </w:r>
+      <w:proofErr w:type="spellStart"/>
+      <w:r>
+        <w:t>Rider</w:t>
+      </w:r>
+      <w:proofErr w:type="spellEnd"/>
+      <w:r>
+        <w:t>” no “</w:t>
+      </w:r>
+      <w:proofErr w:type="spellStart"/>
+      <w:r>
+        <w:t>JetBrains</w:t>
+      </w:r>
+      <w:proofErr w:type="spellEnd"/>
+      <w:r>
+        <w:t>” programmatūru klāsta.</w:t>
+      </w:r>
+    </w:p>
+    <w:p>
+      <w:r>
+        <w:t>Arī iespējams ir izmantot teksta redaktoru “</w:t>
+      </w:r>
+      <w:proofErr w:type="spellStart"/>
+      <w:r>
+        <w:t>Visual</w:t>
+      </w:r>
+      <w:proofErr w:type="spellEnd"/>
+      <w:r>
+        <w:t xml:space="preserve"> </w:t>
+      </w:r>
+      <w:proofErr w:type="spellStart"/>
+      <w:r>
+        <w:t>Studio</w:t>
+      </w:r>
+      <w:proofErr w:type="spellEnd"/>
+      <w:r>
+        <w:t xml:space="preserve"> Code”, kura ar paplašinājumiem var izmantot kā izstrādes vidi, taču noklusētā funkcionalitāte ir ierobežota salīdzinot ar iepriekšējām izstrādes programmatūrām un nepieciešama papildus iestatīšana šai programmatūrai, kura nebūtu nepieciešama pārējām izstrādes vidēm atverot sākotnēji.</w:t>
       </w:r>
     </w:p>
     <w:p>
@@ -8066,12 +8586,84 @@
     </w:p>
     <w:p>
       <w:r>
-        <w:t>Mazāk populāri pakalpojumi, kuri mitina avotkodu repozotorijus, izmantojot “Git” versiju kontroli, arī ir pieejami rīki, kura var automatizēt projekta kompilēšanu un pārbaudi, šādi rīki ir “GitLab”, “Gitea” un “Bitbucket”, kuri ir īpaši pielāgota CI/CD izstrādes videi, taču prasa papildizmaksas, ja šādi rīki tiek palaisti šo pakalpojumu serveros vietā pašam lietotājam mitināt šos rīkus.</w:t>
-      </w:r>
-    </w:p>
-    <w:p>
-      <w:r>
-        <w:t>Taču arī ir pieejami pakalpojumi un rīki, kuri nav atkarīga no “Git” versiju kontroles, bet kā pieejamu versiju kontroles programmatūru starp pārējām. Viens no šiem rīkiem ir “Azure Pipelines”, kuras funkcionalitāte ir plašāka salīdzinot ar iepriekš minētiem rīkiem, taču tās plaša funkcionalitātes klāsts ir radīts lielākiem projektiem, kuri iespējams nebūs lielāko daļu paredzēts izmantošanai šī projekta nolūkiem tās apjoma dēļ un lielākas izmaksas, salīdzinot ar iepriekš minētiem rīkiem.</w:t>
+        <w:t xml:space="preserve">Mazāk populāri pakalpojumi, kuri mitina </w:t>
+      </w:r>
+      <w:proofErr w:type="spellStart"/>
+      <w:r>
+        <w:t>avotkodu</w:t>
+      </w:r>
+      <w:proofErr w:type="spellEnd"/>
+      <w:r>
+        <w:t xml:space="preserve"> </w:t>
+      </w:r>
+      <w:proofErr w:type="spellStart"/>
+      <w:r>
+        <w:t>repozotorijus</w:t>
+      </w:r>
+      <w:proofErr w:type="spellEnd"/>
+      <w:r>
+        <w:t>, izmantojot “</w:t>
+      </w:r>
+      <w:proofErr w:type="spellStart"/>
+      <w:r>
+        <w:t>Git</w:t>
+      </w:r>
+      <w:proofErr w:type="spellEnd"/>
+      <w:r>
+        <w:t>” versiju kontroli, arī ir pieejami rīki, kura var automatizēt projekta kompilēšanu un pārbaudi, šādi rīki ir “</w:t>
+      </w:r>
+      <w:proofErr w:type="spellStart"/>
+      <w:r>
+        <w:t>GitLab</w:t>
+      </w:r>
+      <w:proofErr w:type="spellEnd"/>
+      <w:r>
+        <w:t>”, “</w:t>
+      </w:r>
+      <w:proofErr w:type="spellStart"/>
+      <w:r>
+        <w:t>Gitea</w:t>
+      </w:r>
+      <w:proofErr w:type="spellEnd"/>
+      <w:r>
+        <w:t>” un “</w:t>
+      </w:r>
+      <w:proofErr w:type="spellStart"/>
+      <w:r>
+        <w:t>Bitbucket</w:t>
+      </w:r>
+      <w:proofErr w:type="spellEnd"/>
+      <w:r>
+        <w:t>”, kuri ir īpaši pielāgota CI/CD izstrādes videi, taču prasa papildizmaksas, ja šādi rīki tiek palaisti šo pakalpojumu serveros vietā pašam lietotājam mitināt šos rīkus.</w:t>
+      </w:r>
+    </w:p>
+    <w:p>
+      <w:r>
+        <w:t>Taču arī ir pieejami pakalpojumi un rīki, kuri nav atkarīga no “</w:t>
+      </w:r>
+      <w:proofErr w:type="spellStart"/>
+      <w:r>
+        <w:t>Git</w:t>
+      </w:r>
+      <w:proofErr w:type="spellEnd"/>
+      <w:r>
+        <w:t>” versiju kontroles, bet kā pieejamu versiju kontroles programmatūru starp pārējām. Viens no šiem rīkiem ir “</w:t>
+      </w:r>
+      <w:proofErr w:type="spellStart"/>
+      <w:r>
+        <w:t>Azure</w:t>
+      </w:r>
+      <w:proofErr w:type="spellEnd"/>
+      <w:r>
+        <w:t xml:space="preserve"> </w:t>
+      </w:r>
+      <w:proofErr w:type="spellStart"/>
+      <w:r>
+        <w:t>Pipelines</w:t>
+      </w:r>
+      <w:proofErr w:type="spellEnd"/>
+      <w:r>
+        <w:t>”, kuras funkcionalitāte ir plašāka salīdzinot ar iepriekš minētiem rīkiem, taču tās plaša funkcionalitātes klāsts ir radīts lielākiem projektiem, kuri iespējams nebūs lielāko daļu paredzēts izmantošanai šī projekta nolūkiem tās apjoma dēļ un lielākas izmaksas, salīdzinot ar iepriekš minētiem rīkiem.</w:t>
       </w:r>
     </w:p>
     <w:p>
@@ -8200,10 +8792,66 @@
     </w:p>
     <w:p>
       <w:r>
-        <w:t>“SceneManager” komponente pārvalda ainas un tās pārslēgšanu uz citām ainām un tā ir viena no komponentēm ar vizuālu izvadi, kā arī “SettingsWindow” un “ExitDialog” komponentes, kuras izvade ir tikai logi ar saviem attiecīgiem uzdevumiem, taču “ToastManager” tikai izvada īslaicīgus paziņojumus, kuras pēc noteikta laika izzūd. “AudioManager” pārvalda datorspēles galveno, mūzikas un skaņu efektu skaļumu, kā arī iestata fona mūzika katrai ainai.</w:t>
-      </w:r>
-      <w:r>
-        <w:t xml:space="preserve"> Datu, progresu un iestatījumu glabāšanu nodrošina “SaveManager”, kura glabā progresa datus, un “SettingsManager”, kura glabā un iestata iestatījumus visā spēlē, piemēram, skaļumu.</w:t>
+        <w:t>“</w:t>
+      </w:r>
+      <w:proofErr w:type="spellStart"/>
+      <w:r>
+        <w:t>SceneManager</w:t>
+      </w:r>
+      <w:proofErr w:type="spellEnd"/>
+      <w:r>
+        <w:t>” komponente pārvalda ainas un tās pārslēgšanu uz citām ainām un tā ir viena no komponentēm ar vizuālu izvadi, kā arī “</w:t>
+      </w:r>
+      <w:proofErr w:type="spellStart"/>
+      <w:r>
+        <w:t>SettingsWindow</w:t>
+      </w:r>
+      <w:proofErr w:type="spellEnd"/>
+      <w:r>
+        <w:t>” un “</w:t>
+      </w:r>
+      <w:proofErr w:type="spellStart"/>
+      <w:r>
+        <w:t>ExitDialog</w:t>
+      </w:r>
+      <w:proofErr w:type="spellEnd"/>
+      <w:r>
+        <w:t>” komponentes, kuras izvade ir tikai logi ar saviem attiecīgiem uzdevumiem, taču “</w:t>
+      </w:r>
+      <w:proofErr w:type="spellStart"/>
+      <w:r>
+        <w:t>ToastManager</w:t>
+      </w:r>
+      <w:proofErr w:type="spellEnd"/>
+      <w:r>
+        <w:t>” tikai izvada īslaicīgus paziņojumus, kuras pēc noteikta laika izzūd. “</w:t>
+      </w:r>
+      <w:proofErr w:type="spellStart"/>
+      <w:r>
+        <w:t>AudioManager</w:t>
+      </w:r>
+      <w:proofErr w:type="spellEnd"/>
+      <w:r>
+        <w:t>” pārvalda datorspēles galveno, mūzikas un skaņu efektu skaļumu, kā arī iestata fona mūzika katrai ainai.</w:t>
+      </w:r>
+      <w:r>
+        <w:t xml:space="preserve"> Datu, progresu un iestatījumu glabāšanu nodrošina “</w:t>
+      </w:r>
+      <w:proofErr w:type="spellStart"/>
+      <w:r>
+        <w:t>SaveManager</w:t>
+      </w:r>
+      <w:proofErr w:type="spellEnd"/>
+      <w:r>
+        <w:t>”, kura glabā progresa datus, un “</w:t>
+      </w:r>
+      <w:proofErr w:type="spellStart"/>
+      <w:r>
+        <w:t>SettingsManager</w:t>
+      </w:r>
+      <w:proofErr w:type="spellEnd"/>
+      <w:r>
+        <w:t>”, kura glabā un iestata iestatījumus visā spēlē, piemēram, skaļumu.</w:t>
       </w:r>
     </w:p>
     <w:p>
@@ -8340,7 +8988,15 @@
     </w:p>
     <w:p>
       <w:r>
-        <w:t xml:space="preserve">“SceneManager” komponente pārvalda </w:t>
+        <w:t>“</w:t>
+      </w:r>
+      <w:proofErr w:type="spellStart"/>
+      <w:r>
+        <w:t>SceneManager</w:t>
+      </w:r>
+      <w:proofErr w:type="spellEnd"/>
+      <w:r>
+        <w:t xml:space="preserve">” komponente pārvalda </w:t>
       </w:r>
       <w:r>
         <w:t>norādīto (skat. 2. attēl</w:t>
@@ -8364,7 +9020,23 @@
         <w:t>)</w:t>
       </w:r>
       <w:r>
-        <w:t xml:space="preserve"> aina ir sākuma izvēlne, kurā spēlētājs var pārslēgt uz līmeņu atlases ainu “LevelSelection”, lasīt šī projekta anotāciju, mainīt iestatījumus vai iziet no datorspēles. “LevelSelection” </w:t>
+        <w:t xml:space="preserve"> aina ir sākuma izvēlne, kurā spēlētājs var pārslēgt uz līmeņu atlases ainu “</w:t>
+      </w:r>
+      <w:proofErr w:type="spellStart"/>
+      <w:r>
+        <w:t>LevelSelection</w:t>
+      </w:r>
+      <w:proofErr w:type="spellEnd"/>
+      <w:r>
+        <w:t>”, lasīt šī projekta anotāciju, mainīt iestatījumus vai iziet no datorspēles. “</w:t>
+      </w:r>
+      <w:proofErr w:type="spellStart"/>
+      <w:r>
+        <w:t>LevelSelection</w:t>
+      </w:r>
+      <w:proofErr w:type="spellEnd"/>
+      <w:r>
+        <w:t xml:space="preserve">” </w:t>
       </w:r>
       <w:r>
         <w:t>(</w:t>
@@ -8379,7 +9051,23 @@
         <w:t>aina norāda līmeņus</w:t>
       </w:r>
       <w:r>
-        <w:t>, kuri ir izvietoti kartē ar paveidiem un pieejamības stāvolkim. “Battle” (Spēles laukums) ain</w:t>
+        <w:t xml:space="preserve">, kuri ir izvietoti kartē ar paveidiem un pieejamības </w:t>
+      </w:r>
+      <w:proofErr w:type="spellStart"/>
+      <w:r>
+        <w:t>stāvolkim</w:t>
+      </w:r>
+      <w:proofErr w:type="spellEnd"/>
+      <w:r>
+        <w:t>. “</w:t>
+      </w:r>
+      <w:proofErr w:type="spellStart"/>
+      <w:r>
+        <w:t>Battle</w:t>
+      </w:r>
+      <w:proofErr w:type="spellEnd"/>
+      <w:r>
+        <w:t>” (Spēles laukums) ain</w:t>
       </w:r>
       <w:r>
         <w:t>ā ir spēle ar līmeņa nosacījumiem, objekti kartes laukumā un norādīti uzdevumi uzvarai</w:t>
@@ -8496,21 +9184,135 @@
       </w:r>
     </w:p>
     <w:p>
+      <w:r>
+        <w:t>“</w:t>
+      </w:r>
+      <w:proofErr w:type="spellStart"/>
+      <w:r>
+        <w:t>Map</w:t>
+      </w:r>
+      <w:proofErr w:type="spellEnd"/>
+      <w:r>
+        <w:t xml:space="preserve">” (Karte) komponente </w:t>
+      </w:r>
+      <w:r>
+        <w:t xml:space="preserve">(skat. 3. attēlu) </w:t>
+      </w:r>
+      <w:r>
+        <w:t xml:space="preserve">ir šī projekta galvenā komponente un projekta mērķa pamats. Šajā komponentē ir slāņi, kurā atrodas topogrāfijas dati, objektu dati un dekorācijas, un šie slāņi paši par sevi neveic darbības izņemot uzdotās darbības atkarīgas no ainas. Kartes komponentē arī atrodas </w:t>
+      </w:r>
+      <w:r>
+        <w:t>pārējās komponentes, kuras izmanto slāņus darbību veikšanai, piemēram, “</w:t>
+      </w:r>
+      <w:proofErr w:type="spellStart"/>
+      <w:r>
+        <w:t>Selector</w:t>
+      </w:r>
+      <w:proofErr w:type="spellEnd"/>
+      <w:r>
+        <w:t>” (atlasītājs) komponente atlasa slāņu komponentes slāņu datus pēc norādītā punkta, “</w:t>
+      </w:r>
+      <w:proofErr w:type="spellStart"/>
+      <w:r>
+        <w:t>Camera</w:t>
+      </w:r>
+      <w:proofErr w:type="spellEnd"/>
+      <w:r>
+        <w:t>” (Kamera) komponente rāda slāņu fragmentus, kurus spēlētājs var mainīt kameras novietojumu, lai redzētu kartes citu fragmentu un “</w:t>
+      </w:r>
+      <w:proofErr w:type="spellStart"/>
+      <w:r>
+        <w:t>Projectiles</w:t>
+      </w:r>
+      <w:proofErr w:type="spellEnd"/>
+      <w:r>
+        <w:t>” (Lādiņi) komponente, kura simulē lādiņu kustību kartē un iegūst datus no slāņu komponentes pēc novietojuma no uguņošanas līdz nolaišanas, kuras aptver objektus un veic tām izmaiņas, piemēram, iznīcināšanu.</w:t>
+      </w:r>
+    </w:p>
+    <w:p>
+      <w:r>
+        <w:t>Slāņu komponentē atrodas slāņi, kuras izkārtojumi ir rūtiņu ailes. “</w:t>
+      </w:r>
+      <w:proofErr w:type="spellStart"/>
+      <w:r>
+        <w:t>Ground</w:t>
+      </w:r>
+      <w:proofErr w:type="spellEnd"/>
+      <w:r>
+        <w:t>” (Zeme) slāni</w:t>
+      </w:r>
+      <w:r>
+        <w:t>s</w:t>
+      </w:r>
+      <w:r>
+        <w:t xml:space="preserve"> satur topogrāfisko informāciju kā augstumu</w:t>
+      </w:r>
+      <w:r>
+        <w:t xml:space="preserve"> laukuma punktā un </w:t>
+      </w:r>
+      <w:proofErr w:type="spellStart"/>
+      <w:r>
+        <w:t>pamataugstumu</w:t>
+      </w:r>
+      <w:proofErr w:type="spellEnd"/>
+      <w:r>
+        <w:t>, “</w:t>
+      </w:r>
+      <w:proofErr w:type="spellStart"/>
+      <w:r>
+        <w:t>Decoration</w:t>
+      </w:r>
+      <w:proofErr w:type="spellEnd"/>
+      <w:r>
+        <w:t>” (Dekorācija) slānis ievieto virs “</w:t>
+      </w:r>
+      <w:proofErr w:type="spellStart"/>
+      <w:r>
+        <w:t>Ground</w:t>
+      </w:r>
+      <w:proofErr w:type="spellEnd"/>
+      <w:r>
+        <w:t>” slāņa simbolus un dekoratīvos elementus, “</w:t>
+      </w:r>
+      <w:proofErr w:type="spellStart"/>
+      <w:r>
+        <w:t>Entites</w:t>
+      </w:r>
+      <w:proofErr w:type="spellEnd"/>
+      <w:r>
+        <w:t>” (Objekti) slānis satur objektus kā ierīces, mūrus un struktūras, kuras glabā īpašības, piemēram, azimuta leņķis, piederība spēlētājam vai pretiniekam un izturības punkti pirms sabrukšanas (skat. 4. attēlu) un “</w:t>
+      </w:r>
+      <w:proofErr w:type="spellStart"/>
+      <w:r>
+        <w:t>Overlays</w:t>
+      </w:r>
+      <w:proofErr w:type="spellEnd"/>
+      <w:r>
+        <w:t xml:space="preserve">” (Uznirstošie) slānis, kurās izvieto indikatorus un </w:t>
+      </w:r>
+      <w:proofErr w:type="spellStart"/>
+      <w:r>
+        <w:t>aizsegumus</w:t>
+      </w:r>
+      <w:proofErr w:type="spellEnd"/>
+      <w:r>
+        <w:t xml:space="preserve"> kartē. </w:t>
+      </w:r>
+    </w:p>
+    <w:p>
       <w:pPr>
         <w:keepNext/>
-        <w:jc w:val="center"/>
-      </w:pPr>
-      <w:r>
-        <w:br/>
-      </w:r>
+        <w:ind w:firstLine="709"/>
+        <w:jc w:val="left"/>
+      </w:pPr>
       <w:r>
         <w:rPr>
           <w:noProof/>
         </w:rPr>
         <w:drawing>
-          <wp:inline distT="0" distB="0" distL="0" distR="0" wp14:anchorId="4B2842EF" wp14:editId="629CB36C">
-            <wp:extent cx="1276032" cy="3819048"/>
-            <wp:effectExtent l="0" t="0" r="635" b="0"/>
+          <wp:inline distT="0" distB="0" distL="0" distR="0" wp14:anchorId="4B2842EF" wp14:editId="51F9B493">
+            <wp:extent cx="5401800" cy="2362200"/>
+            <wp:effectExtent l="0" t="0" r="8890" b="0"/>
             <wp:docPr id="452690860" name="Picture 7"/>
             <wp:cNvGraphicFramePr>
               <a:graphicFrameLocks xmlns:a="http://schemas.openxmlformats.org/drawingml/2006/main" noChangeAspect="1"/>
@@ -8537,7 +9339,7 @@
                   <pic:spPr>
                     <a:xfrm>
                       <a:off x="0" y="0"/>
-                      <a:ext cx="1276032" cy="3819048"/>
+                      <a:ext cx="5425396" cy="2372519"/>
                     </a:xfrm>
                     <a:prstGeom prst="rect">
                       <a:avLst/>
@@ -8553,6 +9355,38 @@
     <w:p>
       <w:pPr>
         <w:pStyle w:val="Parakstszemobjekta"/>
+      </w:pPr>
+      <w:r>
+        <w:fldChar w:fldCharType="begin"/>
+      </w:r>
+      <w:r>
+        <w:instrText xml:space="preserve"> SEQ attēls \* ARABIC </w:instrText>
+      </w:r>
+      <w:r>
+        <w:fldChar w:fldCharType="separate"/>
+      </w:r>
+      <w:r>
+        <w:rPr>
+          <w:noProof/>
+        </w:rPr>
+        <w:t>3</w:t>
+      </w:r>
+      <w:r>
+        <w:rPr>
+          <w:noProof/>
+        </w:rPr>
+        <w:fldChar w:fldCharType="end"/>
+      </w:r>
+      <w:r>
+        <w:t>. attēls. Kartes komponente</w:t>
+      </w:r>
+      <w:r>
+        <w:t>s</w:t>
+      </w:r>
+    </w:p>
+    <w:p>
+      <w:pPr>
+        <w:ind w:firstLine="0"/>
         <w:sectPr>
           <w:pgSz w:w="12240" w:h="15840"/>
           <w:pgMar w:top="1134" w:right="1134" w:bottom="1134" w:left="1418" w:header="709" w:footer="709" w:gutter="0"/>
@@ -8560,33 +9394,6 @@
           <w:docGrid w:linePitch="360"/>
         </w:sectPr>
       </w:pPr>
-      <w:r>
-        <w:fldChar w:fldCharType="begin"/>
-      </w:r>
-      <w:r>
-        <w:instrText xml:space="preserve"> SEQ attēls \* ARABIC </w:instrText>
-      </w:r>
-      <w:r>
-        <w:fldChar w:fldCharType="separate"/>
-      </w:r>
-      <w:r>
-        <w:rPr>
-          <w:noProof/>
-        </w:rPr>
-        <w:t>3</w:t>
-      </w:r>
-      <w:r>
-        <w:rPr>
-          <w:noProof/>
-        </w:rPr>
-        <w:fldChar w:fldCharType="end"/>
-      </w:r>
-      <w:r>
-        <w:t>. attēls. Kartes komponente</w:t>
-      </w:r>
-      <w:r>
-        <w:t>s</w:t>
-      </w:r>
     </w:p>
     <w:p>
       <w:pPr>
@@ -8993,9 +9800,11 @@
       <w:pPr>
         <w:pStyle w:val="Virsraksts3"/>
       </w:pPr>
+      <w:proofErr w:type="spellStart"/>
       <w:r>
         <w:t>Enumerācijas</w:t>
       </w:r>
+      <w:proofErr w:type="spellEnd"/>
     </w:p>
     <w:p>
       <w:pPr>
@@ -9076,8 +9885,13 @@
         <w:fldChar w:fldCharType="end"/>
       </w:r>
       <w:r>
-        <w:t>. attēls. Saknes mezgla enumerācijas</w:t>
-      </w:r>
+        <w:t xml:space="preserve">. attēls. Saknes mezgla </w:t>
+      </w:r>
+      <w:proofErr w:type="spellStart"/>
+      <w:r>
+        <w:t>enumerācijas</w:t>
+      </w:r>
+      <w:proofErr w:type="spellEnd"/>
     </w:p>
     <w:p>
       <w:pPr>
@@ -9164,8 +9978,13 @@
         <w:fldChar w:fldCharType="end"/>
       </w:r>
       <w:r>
-        <w:t>. attēls. Kartes laukuma enumerācijas</w:t>
-      </w:r>
+        <w:t xml:space="preserve">. attēls. Kartes laukuma </w:t>
+      </w:r>
+      <w:proofErr w:type="spellStart"/>
+      <w:r>
+        <w:t>enumerācijas</w:t>
+      </w:r>
+      <w:proofErr w:type="spellEnd"/>
     </w:p>
     <w:p>
       <w:pPr>
@@ -9213,13 +10032,37 @@
     </w:p>
     <w:p>
       <w:r>
-        <w:t>Izstrādes laikā projektu jātestē un jāpārbauda funkcionalitātes pēc nepilnībām. Testēšana tiks veikta manuāli ar melnās un baltās kastes metodoloģijām, taču atsevišķas funkcionalitātes vai tās daļas testēšanu var veikt automātiski ar vienībtestēšanu.</w:t>
+        <w:t xml:space="preserve">Izstrādes laikā projektu jātestē un jāpārbauda funkcionalitātes pēc nepilnībām. Testēšana tiks veikta manuāli ar melnās un baltās kastes metodoloģijām, taču atsevišķas funkcionalitātes vai tās daļas testēšanu var veikt automātiski ar </w:t>
+      </w:r>
+      <w:proofErr w:type="spellStart"/>
+      <w:r>
+        <w:t>vienībtestēšanu</w:t>
+      </w:r>
+      <w:proofErr w:type="spellEnd"/>
+      <w:r>
+        <w:t>.</w:t>
       </w:r>
       <w:r>
         <w:t xml:space="preserve"> </w:t>
       </w:r>
       <w:r>
-        <w:t>Melnās kastes testēšana ietver pārbaudi no lietotāja skatupunkta, neredzot avotkodu vai atkļūdošanas informāciju, kamēr baltās kastes testēšana pārbauda avotkodu.</w:t>
+        <w:t xml:space="preserve">Melnās kastes testēšana ietver pārbaudi no lietotāja skatupunkta, neredzot </w:t>
+      </w:r>
+      <w:proofErr w:type="spellStart"/>
+      <w:r>
+        <w:t>avotkodu</w:t>
+      </w:r>
+      <w:proofErr w:type="spellEnd"/>
+      <w:r>
+        <w:t xml:space="preserve"> vai atkļūdošanas informāciju, kamēr baltās kastes testēšana pārbauda </w:t>
+      </w:r>
+      <w:proofErr w:type="spellStart"/>
+      <w:r>
+        <w:t>avotkodu</w:t>
+      </w:r>
+      <w:proofErr w:type="spellEnd"/>
+      <w:r>
+        <w:t>.</w:t>
       </w:r>
     </w:p>
     <w:p>
@@ -10383,8 +11226,13 @@
               <w:pStyle w:val="talbecontent"/>
             </w:pPr>
             <w:r>
-              <w:t>Lietotājs gaida līdz ielādei</w:t>
-            </w:r>
+              <w:t xml:space="preserve">Lietotājs gaida līdz </w:t>
+            </w:r>
+            <w:proofErr w:type="spellStart"/>
+            <w:r>
+              <w:t>ielādei</w:t>
+            </w:r>
+            <w:proofErr w:type="spellEnd"/>
           </w:p>
         </w:tc>
         <w:tc>

</xml_diff>

<commit_message>
i think am done with classes
</commit_message>
<xml_diff>
--- a/Documentation/Dokumentācija.docx
+++ b/Documentation/Dokumentācija.docx
@@ -7046,13 +7046,7 @@
         <w:t>Mērķis</w:t>
       </w:r>
       <w:r>
-        <w:t xml:space="preserve">: </w:t>
-      </w:r>
-      <w:r>
-        <w:t>Mainīt galveno skaļumu</w:t>
-      </w:r>
-      <w:r>
-        <w:t>.</w:t>
+        <w:t>: Mainīt galveno skaļumu.</w:t>
       </w:r>
     </w:p>
     <w:p>
@@ -7063,13 +7057,7 @@
         <w:t>Ievaddati</w:t>
       </w:r>
       <w:r>
-        <w:t xml:space="preserve">: </w:t>
-      </w:r>
-      <w:r>
-        <w:t>Galvenā skaļuma slīdnis</w:t>
-      </w:r>
-      <w:r>
-        <w:t>.</w:t>
+        <w:t>: Galvenā skaļuma slīdnis.</w:t>
       </w:r>
     </w:p>
     <w:p>
@@ -7080,13 +7068,7 @@
         <w:t>Apstrāde</w:t>
       </w:r>
       <w:r>
-        <w:t xml:space="preserve">: </w:t>
-      </w:r>
-      <w:r>
-        <w:t>Lietotājam turot slīdni, galvenā skaļuma vērtība palielinās vai mazinās pēc slīdņa virziena</w:t>
-      </w:r>
-      <w:r>
-        <w:t>.</w:t>
+        <w:t>: Lietotājam turot slīdni, galvenā skaļuma vērtība palielinās vai mazinās pēc slīdņa virziena.</w:t>
       </w:r>
     </w:p>
     <w:p>
@@ -7097,13 +7079,7 @@
         <w:t>Izvaddati</w:t>
       </w:r>
       <w:r>
-        <w:t>:</w:t>
-      </w:r>
-      <w:r>
-        <w:t xml:space="preserve"> Galvenā skaļuma lieluma vērtība</w:t>
-      </w:r>
-      <w:r>
-        <w:t>.</w:t>
+        <w:t>: Galvenā skaļuma lieluma vērtība.</w:t>
       </w:r>
     </w:p>
     <w:p/>
@@ -7126,14 +7102,7 @@
           <w:b/>
           <w:bCs/>
         </w:rPr>
-        <w:t>Mūzikas</w:t>
-      </w:r>
-      <w:r>
-        <w:rPr>
-          <w:b/>
-          <w:bCs/>
-        </w:rPr>
-        <w:t xml:space="preserve"> skaļuma maiņa</w:t>
+        <w:t>Mūzikas skaļuma maiņa</w:t>
       </w:r>
     </w:p>
     <w:p>
@@ -7144,13 +7113,7 @@
         <w:t>Mērķis</w:t>
       </w:r>
       <w:r>
-        <w:t xml:space="preserve">: Mainīt </w:t>
-      </w:r>
-      <w:r>
-        <w:t xml:space="preserve">fona mūzikas </w:t>
-      </w:r>
-      <w:r>
-        <w:t>skaļumu.</w:t>
+        <w:t>: Mainīt fona mūzikas skaļumu.</w:t>
       </w:r>
     </w:p>
     <w:p>
@@ -7161,13 +7124,7 @@
         <w:t>Ievaddati</w:t>
       </w:r>
       <w:r>
-        <w:t xml:space="preserve">: </w:t>
-      </w:r>
-      <w:r>
-        <w:t xml:space="preserve">Mūzikas </w:t>
-      </w:r>
-      <w:r>
-        <w:t>skaļuma slīdnis.</w:t>
+        <w:t>: Mūzikas skaļuma slīdnis.</w:t>
       </w:r>
     </w:p>
     <w:p>
@@ -7178,13 +7135,7 @@
         <w:t>Apstrāde</w:t>
       </w:r>
       <w:r>
-        <w:t>: Lietotājam turot slīdni,</w:t>
-      </w:r>
-      <w:r>
-        <w:t xml:space="preserve"> mūzikas</w:t>
-      </w:r>
-      <w:r>
-        <w:t xml:space="preserve"> skaļuma vērtība palielinās vai mazinās pēc slīdņa virziena.</w:t>
+        <w:t>: Lietotājam turot slīdni, mūzikas skaļuma vērtība palielinās vai mazinās pēc slīdņa virziena.</w:t>
       </w:r>
     </w:p>
     <w:p>
@@ -7195,19 +7146,7 @@
         <w:t>Izvaddati</w:t>
       </w:r>
       <w:r>
-        <w:t xml:space="preserve">: </w:t>
-      </w:r>
-      <w:r>
-        <w:t>Mūzikas s</w:t>
-      </w:r>
-      <w:r>
-        <w:t>kaļuma lielum</w:t>
-      </w:r>
-      <w:r>
-        <w:t>a vērtība</w:t>
-      </w:r>
-      <w:r>
-        <w:t>.</w:t>
+        <w:t>: Mūzikas skaļuma lieluma vērtība.</w:t>
       </w:r>
     </w:p>
     <w:p>
@@ -7283,10 +7222,7 @@
         <w:t xml:space="preserve">: Lietotājam turot slīdni, </w:t>
       </w:r>
       <w:r>
-        <w:t>s</w:t>
-      </w:r>
-      <w:r>
-        <w:t xml:space="preserve">kaņas efektu </w:t>
+        <w:t xml:space="preserve">skaņas efektu </w:t>
       </w:r>
       <w:r>
         <w:t>skaļuma vērtība palielinās vai mazinās pēc slīdņa virziena.</w:t>
@@ -7303,10 +7239,7 @@
         <w:t xml:space="preserve">: </w:t>
       </w:r>
       <w:r>
-        <w:t xml:space="preserve">Skaņas efektu </w:t>
-      </w:r>
-      <w:r>
-        <w:t>s</w:t>
+        <w:t>Skaņas efektu s</w:t>
       </w:r>
       <w:r>
         <w:t>kaļuma lielum</w:t>
@@ -7347,13 +7280,7 @@
         <w:t>Mērķis</w:t>
       </w:r>
       <w:r>
-        <w:t xml:space="preserve">: </w:t>
-      </w:r>
-      <w:r>
-        <w:t>Aizvērt iestatījuma logu</w:t>
-      </w:r>
-      <w:r>
-        <w:t>.</w:t>
+        <w:t>: Aizvērt iestatījuma logu.</w:t>
       </w:r>
     </w:p>
     <w:p>
@@ -7364,13 +7291,7 @@
         <w:t>Ievaddati</w:t>
       </w:r>
       <w:r>
-        <w:t xml:space="preserve">: </w:t>
-      </w:r>
-      <w:r>
-        <w:t>Aizvēršanas poga</w:t>
-      </w:r>
-      <w:r>
-        <w:t>.</w:t>
+        <w:t>: Aizvēršanas poga.</w:t>
       </w:r>
     </w:p>
     <w:p>
@@ -7381,13 +7302,7 @@
         <w:t>Apstrāde</w:t>
       </w:r>
       <w:r>
-        <w:t xml:space="preserve">: </w:t>
-      </w:r>
-      <w:r>
-        <w:t>Iestatījumi tiek saglabāti un logs tiek paslēpts</w:t>
-      </w:r>
-      <w:r>
-        <w:t>.</w:t>
+        <w:t>: Iestatījumi tiek saglabāti un logs tiek paslēpts.</w:t>
       </w:r>
     </w:p>
     <w:p>
@@ -7398,13 +7313,7 @@
         <w:t>Izvaddati</w:t>
       </w:r>
       <w:r>
-        <w:t xml:space="preserve">: </w:t>
-      </w:r>
-      <w:r>
-        <w:t>Slēpts logs</w:t>
-      </w:r>
-      <w:r>
-        <w:t>.</w:t>
+        <w:t>: Slēpts logs.</w:t>
       </w:r>
     </w:p>
     <w:p>
@@ -7425,27 +7334,20 @@
           <w:b/>
           <w:bCs/>
         </w:rPr>
-        <w:t>Izejas</w:t>
+        <w:t xml:space="preserve">Izejas </w:t>
       </w:r>
       <w:r>
         <w:rPr>
           <w:b/>
           <w:bCs/>
         </w:rPr>
-        <w:t xml:space="preserve"> </w:t>
+        <w:t>dialog</w:t>
       </w:r>
       <w:r>
         <w:rPr>
           <w:b/>
           <w:bCs/>
         </w:rPr>
-        <w:t>dialog</w:t>
-      </w:r>
-      <w:r>
-        <w:rPr>
-          <w:b/>
-          <w:bCs/>
-        </w:rPr>
         <w:t>logs</w:t>
       </w:r>
     </w:p>
@@ -7457,13 +7359,7 @@
         <w:t>Mērķis</w:t>
       </w:r>
       <w:r>
-        <w:t xml:space="preserve">: </w:t>
-      </w:r>
-      <w:r>
-        <w:t>Rādīt datorspēles iziešanas vaicājumu</w:t>
-      </w:r>
-      <w:r>
-        <w:t>.</w:t>
+        <w:t>: Rādīt datorspēles iziešanas vaicājumu.</w:t>
       </w:r>
     </w:p>
     <w:p>
@@ -7474,13 +7370,7 @@
         <w:t>Ievaddati</w:t>
       </w:r>
       <w:r>
-        <w:t xml:space="preserve">: </w:t>
-      </w:r>
-      <w:r>
-        <w:t>Aizvēršanas poga loga stūrī</w:t>
-      </w:r>
-      <w:r>
-        <w:t>.</w:t>
+        <w:t>: Aizvēršanas poga loga stūrī.</w:t>
       </w:r>
     </w:p>
     <w:p>
@@ -7491,13 +7381,7 @@
         <w:t>Izvaddati</w:t>
       </w:r>
       <w:r>
-        <w:t xml:space="preserve">: </w:t>
-      </w:r>
-      <w:r>
-        <w:t>Vaicājuma logs ar iespējām iziet vai atlikt</w:t>
-      </w:r>
-      <w:r>
-        <w:t>.</w:t>
+        <w:t>: Vaicājuma logs ar iespējām iziet vai atlikt.</w:t>
       </w:r>
     </w:p>
     <w:p>
@@ -7529,13 +7413,27 @@
         <w:t>Mērķis</w:t>
       </w:r>
       <w:r>
+        <w:t xml:space="preserve">: Apturēt spēles darbību </w:t>
+      </w:r>
+      <w:r>
+        <w:t>glabājot datus</w:t>
+      </w:r>
+      <w:r>
+        <w:t>.</w:t>
+      </w:r>
+    </w:p>
+    <w:p>
+      <w:r>
+        <w:rPr>
+          <w:u w:val="single"/>
+        </w:rPr>
+        <w:t>Ievaddati</w:t>
+      </w:r>
+      <w:r>
         <w:t xml:space="preserve">: </w:t>
       </w:r>
       <w:r>
-        <w:t xml:space="preserve">Apturēt spēles darbību </w:t>
-      </w:r>
-      <w:r>
-        <w:t>glabājot datus</w:t>
+        <w:t>Izejas dialogloga apstiprinājuma poga</w:t>
       </w:r>
       <w:r>
         <w:t>.</w:t>
@@ -7546,33 +7444,10 @@
         <w:rPr>
           <w:u w:val="single"/>
         </w:rPr>
-        <w:t>Ievaddati</w:t>
-      </w:r>
-      <w:r>
-        <w:t xml:space="preserve">: </w:t>
-      </w:r>
-      <w:r>
-        <w:t>Izejas dialogloga apstiprinājuma poga</w:t>
-      </w:r>
-      <w:r>
-        <w:t>.</w:t>
-      </w:r>
-    </w:p>
-    <w:p>
-      <w:r>
-        <w:rPr>
-          <w:u w:val="single"/>
-        </w:rPr>
         <w:t>Apstrāde</w:t>
       </w:r>
       <w:r>
-        <w:t xml:space="preserve">: </w:t>
-      </w:r>
-      <w:r>
-        <w:t>Iestatījumi un progresa dati tiek saglabāti, tad ietvars tiek izsaukts aizvēršanai</w:t>
-      </w:r>
-      <w:r>
-        <w:t>.</w:t>
+        <w:t>: Iestatījumi un progresa dati tiek saglabāti, tad ietvars tiek izsaukts aizvēršanai.</w:t>
       </w:r>
     </w:p>
     <w:p>
@@ -7610,14 +7485,7 @@
           <w:b/>
           <w:bCs/>
         </w:rPr>
-        <w:t>Spēles aizvēršana</w:t>
-      </w:r>
-      <w:r>
-        <w:rPr>
-          <w:b/>
-          <w:bCs/>
-        </w:rPr>
-        <w:t>s atlikšana</w:t>
+        <w:t>Spēles aizvēršanas atlikšana</w:t>
       </w:r>
     </w:p>
     <w:p>
@@ -7628,13 +7496,7 @@
         <w:t>Mērķis</w:t>
       </w:r>
       <w:r>
-        <w:t xml:space="preserve">: </w:t>
-      </w:r>
-      <w:r>
-        <w:t>Atlikt spēles aizvēršanu</w:t>
-      </w:r>
-      <w:r>
-        <w:t>.</w:t>
+        <w:t>: Atlikt spēles aizvēršanu.</w:t>
       </w:r>
     </w:p>
     <w:p>
@@ -7645,13 +7507,7 @@
         <w:t>Ievaddati</w:t>
       </w:r>
       <w:r>
-        <w:t xml:space="preserve">: Izejas dialogloga </w:t>
-      </w:r>
-      <w:r>
-        <w:t xml:space="preserve">atlikšanas </w:t>
-      </w:r>
-      <w:r>
-        <w:t>poga.</w:t>
+        <w:t>: Izejas dialogloga atlikšanas poga.</w:t>
       </w:r>
     </w:p>
     <w:p>
@@ -7662,13 +7518,7 @@
         <w:t>Izvaddati</w:t>
       </w:r>
       <w:r>
-        <w:t xml:space="preserve">: </w:t>
-      </w:r>
-      <w:r>
-        <w:t>Paslēpta izejas dialoglogs</w:t>
-      </w:r>
-      <w:r>
-        <w:t>.</w:t>
+        <w:t>: Paslēpta izejas dialoglogs.</w:t>
       </w:r>
     </w:p>
     <w:p>
@@ -8332,10 +8182,7 @@
       </w:pPr>
       <w:r>
         <w:lastRenderedPageBreak/>
-        <w:t>Ainu</w:t>
-      </w:r>
-      <w:r>
-        <w:t xml:space="preserve"> komponenšu struktūra</w:t>
+        <w:t>Ainu komponenšu struktūra</w:t>
       </w:r>
     </w:p>
     <w:p>
@@ -8451,27 +8298,14 @@
       <w:pPr>
         <w:pStyle w:val="Parakstszemobjekta"/>
       </w:pPr>
-      <w:r>
-        <w:fldChar w:fldCharType="begin"/>
-      </w:r>
-      <w:r>
-        <w:instrText xml:space="preserve"> SEQ attēls \* ARABIC </w:instrText>
-      </w:r>
-      <w:r>
-        <w:fldChar w:fldCharType="separate"/>
-      </w:r>
-      <w:r>
-        <w:rPr>
-          <w:noProof/>
-        </w:rPr>
-        <w:t>2</w:t>
-      </w:r>
-      <w:r>
-        <w:rPr>
-          <w:noProof/>
-        </w:rPr>
-        <w:fldChar w:fldCharType="end"/>
-      </w:r>
+      <w:fldSimple w:instr=" SEQ attēls \* ARABIC ">
+        <w:r>
+          <w:rPr>
+            <w:noProof/>
+          </w:rPr>
+          <w:t>2</w:t>
+        </w:r>
+      </w:fldSimple>
       <w:r>
         <w:t>. attēls. Ainu komponentes</w:t>
       </w:r>
@@ -8523,7 +8357,7 @@
         <w:t xml:space="preserve"> laukuma punktā un pamataugstumu, “Decoration” (Dekorācija) slānis ievieto virs “Ground” slāņa simbolus un dekoratīvos elementus, “Entites” (Objekti) slānis satur objektus kā ierīces, mūrus un struktūras, kuras glabā īpašības, piemēram, azimuta leņķis, piederība spēlētājam vai pretiniekam un izturības punkti pirms sabrukšanas (skat. </w:t>
       </w:r>
       <w:r>
-        <w:t>x</w:t>
+        <w:t>7</w:t>
       </w:r>
       <w:r>
         <w:t xml:space="preserve">. attēlu) un “Overlays” (Uznirstošie) slānis, kurās izvieto indikatorus un aizsegumus kartē. </w:t>
@@ -8586,32 +8420,16 @@
       <w:pPr>
         <w:pStyle w:val="Parakstszemobjekta"/>
       </w:pPr>
-      <w:r>
-        <w:fldChar w:fldCharType="begin"/>
-      </w:r>
-      <w:r>
-        <w:instrText xml:space="preserve"> SEQ attēls \* ARABIC </w:instrText>
-      </w:r>
-      <w:r>
-        <w:fldChar w:fldCharType="separate"/>
-      </w:r>
-      <w:r>
-        <w:rPr>
-          <w:noProof/>
-        </w:rPr>
-        <w:t>3</w:t>
-      </w:r>
-      <w:r>
-        <w:rPr>
-          <w:noProof/>
-        </w:rPr>
-        <w:fldChar w:fldCharType="end"/>
-      </w:r>
-      <w:r>
-        <w:t>. attēls. Kartes komponente</w:t>
-      </w:r>
-      <w:r>
-        <w:t>s</w:t>
+      <w:fldSimple w:instr=" SEQ attēls \* ARABIC ">
+        <w:r>
+          <w:rPr>
+            <w:noProof/>
+          </w:rPr>
+          <w:t>3</w:t>
+        </w:r>
+      </w:fldSimple>
+      <w:r>
+        <w:t>. attēls. Kartes komponentes</w:t>
       </w:r>
     </w:p>
     <w:p>
@@ -8631,10 +8449,7 @@
       </w:pPr>
       <w:r>
         <w:lastRenderedPageBreak/>
-        <w:t xml:space="preserve">Sistēmas pārvaldnieku </w:t>
-      </w:r>
-      <w:r>
-        <w:t>klases</w:t>
+        <w:t>Sistēmas pārvaldnieku klases</w:t>
       </w:r>
     </w:p>
     <w:p>
@@ -8705,27 +8520,14 @@
       <w:pPr>
         <w:pStyle w:val="Parakstszemobjekta"/>
       </w:pPr>
-      <w:r>
-        <w:fldChar w:fldCharType="begin"/>
-      </w:r>
-      <w:r>
-        <w:instrText xml:space="preserve"> SEQ attēls \* ARABIC </w:instrText>
-      </w:r>
-      <w:r>
-        <w:fldChar w:fldCharType="separate"/>
-      </w:r>
-      <w:r>
-        <w:rPr>
-          <w:noProof/>
-        </w:rPr>
-        <w:t>4</w:t>
-      </w:r>
-      <w:r>
-        <w:rPr>
-          <w:noProof/>
-        </w:rPr>
-        <w:fldChar w:fldCharType="end"/>
-      </w:r>
+      <w:fldSimple w:instr=" SEQ attēls \* ARABIC ">
+        <w:r>
+          <w:rPr>
+            <w:noProof/>
+          </w:rPr>
+          <w:t>4</w:t>
+        </w:r>
+      </w:fldSimple>
       <w:r>
         <w:t>. attēls. Mezglu saknes komponenšu klases</w:t>
       </w:r>
@@ -8825,97 +8627,276 @@
       <w:pPr>
         <w:pStyle w:val="Parakstszemobjekta"/>
       </w:pPr>
-      <w:r>
-        <w:fldChar w:fldCharType="begin"/>
-      </w:r>
-      <w:r>
-        <w:instrText xml:space="preserve"> SEQ attēls \* ARABIC </w:instrText>
-      </w:r>
-      <w:r>
-        <w:fldChar w:fldCharType="separate"/>
-      </w:r>
+      <w:fldSimple w:instr=" SEQ attēls \* ARABIC ">
+        <w:r>
+          <w:rPr>
+            <w:noProof/>
+          </w:rPr>
+          <w:t>5</w:t>
+        </w:r>
+      </w:fldSimple>
+      <w:r>
+        <w:t>. attēls</w:t>
+      </w:r>
+      <w:r>
+        <w:t>. Ainu klases</w:t>
+      </w:r>
+    </w:p>
+    <w:p>
+      <w:pPr>
+        <w:ind w:firstLine="0"/>
+      </w:pPr>
+    </w:p>
+    <w:p>
+      <w:pPr>
+        <w:ind w:firstLine="0"/>
+      </w:pPr>
+    </w:p>
+    <w:p>
+      <w:pPr>
+        <w:ind w:firstLine="0"/>
+      </w:pPr>
+    </w:p>
+    <w:p>
+      <w:pPr>
+        <w:ind w:firstLine="0"/>
+      </w:pPr>
+    </w:p>
+    <w:p>
+      <w:pPr>
+        <w:ind w:firstLine="0"/>
+      </w:pPr>
+    </w:p>
+    <w:p>
+      <w:pPr>
+        <w:ind w:firstLine="0"/>
+      </w:pPr>
+    </w:p>
+    <w:p>
+      <w:pPr>
+        <w:ind w:firstLine="0"/>
+      </w:pPr>
+    </w:p>
+    <w:p>
+      <w:pPr>
+        <w:ind w:firstLine="0"/>
+      </w:pPr>
+    </w:p>
+    <w:p>
+      <w:pPr>
+        <w:pStyle w:val="Virsraksts3"/>
+      </w:pPr>
+      <w:r>
+        <w:lastRenderedPageBreak/>
+        <w:t>Kartes klase</w:t>
+      </w:r>
+    </w:p>
+    <w:p>
+      <w:r>
+        <w:t>Kartes komponente arī ir klase, kura iekļauj apakškomponentes ar savām metodēm un mainīgajiem. Kartes klases darbības iekļauj ailes datu iegūšanu pēc pozīcijas un laukumu ielādi un eksportēšanu. Slāņu komponentes arī iekļauj minētās metodes noteiktam slānim, taču arī slāņa ailēm ir savas metodes un īpašības, piemēram, “Ground” slāņa ailei augstums un “Entity” slāņa ailes piederība. Pārējām komponentēm savas attiecīgas darbības, kuras ir atkarīgas no slāņu komponentēm</w:t>
+      </w:r>
+      <w:r>
+        <w:t>.</w:t>
+      </w:r>
+      <w:r>
+        <w:t xml:space="preserve"> (skat. 6. attēlu)</w:t>
+      </w:r>
+    </w:p>
+    <w:p/>
+    <w:p>
+      <w:pPr>
+        <w:keepNext/>
+        <w:ind w:firstLine="0"/>
+      </w:pPr>
       <w:r>
         <w:rPr>
           <w:noProof/>
         </w:rPr>
-        <w:t>5</w:t>
-      </w:r>
+        <w:drawing>
+          <wp:inline distT="0" distB="0" distL="0" distR="0" wp14:anchorId="0CD51D51" wp14:editId="4112FC81">
+            <wp:extent cx="6286500" cy="5324194"/>
+            <wp:effectExtent l="0" t="0" r="0" b="0"/>
+            <wp:docPr id="1214231642" name="Picture 1"/>
+            <wp:cNvGraphicFramePr>
+              <a:graphicFrameLocks xmlns:a="http://schemas.openxmlformats.org/drawingml/2006/main" noChangeAspect="1"/>
+            </wp:cNvGraphicFramePr>
+            <a:graphic xmlns:a="http://schemas.openxmlformats.org/drawingml/2006/main">
+              <a:graphicData uri="http://schemas.openxmlformats.org/drawingml/2006/picture">
+                <pic:pic xmlns:pic="http://schemas.openxmlformats.org/drawingml/2006/picture">
+                  <pic:nvPicPr>
+                    <pic:cNvPr id="1214231642" name="Picture 1"/>
+                    <pic:cNvPicPr/>
+                  </pic:nvPicPr>
+                  <pic:blipFill>
+                    <a:blip r:embed="rId15">
+                      <a:extLst>
+                        <a:ext uri="{28A0092B-C50C-407E-A947-70E740481C1C}">
+                          <a14:useLocalDpi xmlns:a14="http://schemas.microsoft.com/office/drawing/2010/main" val="0"/>
+                        </a:ext>
+                      </a:extLst>
+                    </a:blip>
+                    <a:stretch>
+                      <a:fillRect/>
+                    </a:stretch>
+                  </pic:blipFill>
+                  <pic:spPr>
+                    <a:xfrm>
+                      <a:off x="0" y="0"/>
+                      <a:ext cx="6300881" cy="5336374"/>
+                    </a:xfrm>
+                    <a:prstGeom prst="rect">
+                      <a:avLst/>
+                    </a:prstGeom>
+                  </pic:spPr>
+                </pic:pic>
+              </a:graphicData>
+            </a:graphic>
+          </wp:inline>
+        </w:drawing>
+      </w:r>
+    </w:p>
+    <w:p>
+      <w:pPr>
+        <w:pStyle w:val="Parakstszemobjekta"/>
+      </w:pPr>
+      <w:r>
+        <w:t>6</w:t>
+      </w:r>
+      <w:r>
+        <w:t xml:space="preserve">. attēls. </w:t>
+      </w:r>
+      <w:r>
+        <w:t>Kartes klase</w:t>
+      </w:r>
+    </w:p>
+    <w:p/>
+    <w:p>
+      <w:pPr>
+        <w:ind w:firstLine="0"/>
+      </w:pPr>
+    </w:p>
+    <w:p>
+      <w:pPr>
+        <w:pStyle w:val="Virsraksts3"/>
+      </w:pPr>
+      <w:r>
+        <w:lastRenderedPageBreak/>
+        <w:t>Objektu</w:t>
+      </w:r>
+      <w:r>
+        <w:t xml:space="preserve"> klase</w:t>
+      </w:r>
+    </w:p>
+    <w:p>
+      <w:pPr>
+        <w:ind w:firstLine="0"/>
+      </w:pPr>
+      <w:r>
+        <w:tab/>
+        <w:t>“Entity” (</w:t>
+      </w:r>
+      <w:r>
+        <w:t>Objekts</w:t>
+      </w:r>
+      <w:r>
+        <w:t>) klase norāda kartē objektu, kuri var tikt pagriezti, iznīcināti, iestatīt garumus un vairāk īpašību. Šo klasi manto “Device” (artilērijas ierīces), “Wall” (siena) un “Structure” (struktūra) klases ar savām īpašībām, it īpaši “Device” klase, jo tā norāda munīciju skaitu, traversu, augstuma leņķi u.t.t.</w:t>
+      </w:r>
+      <w:r>
+        <w:t xml:space="preserve"> (skat. 7. attēlu)</w:t>
+      </w:r>
+      <w:r>
+        <w:t>.</w:t>
+      </w:r>
+    </w:p>
+    <w:p>
+      <w:pPr>
+        <w:ind w:firstLine="0"/>
+      </w:pPr>
+      <w:r>
+        <w:tab/>
+      </w:r>
+      <w:r>
+        <w:t>Tās klases pamatīpašības ir azimuts, izturība (“integrity”), spēlētāja piederošs, mērķis,  un iznīcināts, kā arī tai klasei un mantotājiem īpašību klase, kura norāda uz resursu, kura norāda tās objekta nemaināmās īpašības, piemēram, ierīcēm kalibrs, struktūrām izturības stadiju gariņi un visām klasēm izturības skala (“toughness”), kura mazina objekta izturības mazināšanas faktoru</w:t>
+      </w:r>
+      <w:r>
+        <w:t>.</w:t>
+      </w:r>
+    </w:p>
+    <w:p>
+      <w:pPr>
+        <w:ind w:firstLine="0"/>
+      </w:pPr>
+    </w:p>
+    <w:p>
+      <w:pPr>
+        <w:keepNext/>
+        <w:ind w:firstLine="0"/>
+        <w:jc w:val="center"/>
+      </w:pPr>
       <w:r>
         <w:rPr>
           <w:noProof/>
         </w:rPr>
-        <w:fldChar w:fldCharType="end"/>
-      </w:r>
-      <w:r>
-        <w:t>. attēls</w:t>
-      </w:r>
-      <w:r>
-        <w:t xml:space="preserve">. </w:t>
-      </w:r>
-      <w:r>
-        <w:t>Ainu</w:t>
-      </w:r>
-      <w:r>
-        <w:t xml:space="preserve"> klase</w:t>
-      </w:r>
-      <w:r>
-        <w:t>s</w:t>
+        <w:drawing>
+          <wp:inline distT="0" distB="0" distL="0" distR="0" wp14:anchorId="3868E2F1" wp14:editId="51D7AF6D">
+            <wp:extent cx="3667125" cy="3241071"/>
+            <wp:effectExtent l="0" t="0" r="0" b="0"/>
+            <wp:docPr id="1760885753" name="Picture 1"/>
+            <wp:cNvGraphicFramePr>
+              <a:graphicFrameLocks xmlns:a="http://schemas.openxmlformats.org/drawingml/2006/main" noChangeAspect="1"/>
+            </wp:cNvGraphicFramePr>
+            <a:graphic xmlns:a="http://schemas.openxmlformats.org/drawingml/2006/main">
+              <a:graphicData uri="http://schemas.openxmlformats.org/drawingml/2006/picture">
+                <pic:pic xmlns:pic="http://schemas.openxmlformats.org/drawingml/2006/picture">
+                  <pic:nvPicPr>
+                    <pic:cNvPr id="1760885753" name="Picture 1"/>
+                    <pic:cNvPicPr/>
+                  </pic:nvPicPr>
+                  <pic:blipFill>
+                    <a:blip r:embed="rId16">
+                      <a:extLst>
+                        <a:ext uri="{28A0092B-C50C-407E-A947-70E740481C1C}">
+                          <a14:useLocalDpi xmlns:a14="http://schemas.microsoft.com/office/drawing/2010/main" val="0"/>
+                        </a:ext>
+                      </a:extLst>
+                    </a:blip>
+                    <a:stretch>
+                      <a:fillRect/>
+                    </a:stretch>
+                  </pic:blipFill>
+                  <pic:spPr>
+                    <a:xfrm>
+                      <a:off x="0" y="0"/>
+                      <a:ext cx="3680232" cy="3252655"/>
+                    </a:xfrm>
+                    <a:prstGeom prst="rect">
+                      <a:avLst/>
+                    </a:prstGeom>
+                  </pic:spPr>
+                </pic:pic>
+              </a:graphicData>
+            </a:graphic>
+          </wp:inline>
+        </w:drawing>
+      </w:r>
+    </w:p>
+    <w:p>
+      <w:pPr>
+        <w:pStyle w:val="Parakstszemobjekta"/>
+      </w:pPr>
+      <w:r>
+        <w:t>7</w:t>
+      </w:r>
+      <w:r>
+        <w:t xml:space="preserve">. attēls. </w:t>
+      </w:r>
+      <w:r>
+        <w:t>Objektu klase un tās mantotāji</w:t>
       </w:r>
     </w:p>
     <w:p>
       <w:pPr>
         <w:ind w:firstLine="0"/>
-      </w:pPr>
-    </w:p>
-    <w:p>
-      <w:pPr>
-        <w:ind w:firstLine="0"/>
-      </w:pPr>
-    </w:p>
-    <w:p>
-      <w:pPr>
-        <w:ind w:firstLine="0"/>
-      </w:pPr>
-    </w:p>
-    <w:p>
-      <w:pPr>
-        <w:ind w:firstLine="0"/>
-      </w:pPr>
-    </w:p>
-    <w:p>
-      <w:pPr>
-        <w:ind w:firstLine="0"/>
-      </w:pPr>
-    </w:p>
-    <w:p>
-      <w:pPr>
-        <w:ind w:firstLine="0"/>
-      </w:pPr>
-    </w:p>
-    <w:p>
-      <w:pPr>
-        <w:ind w:firstLine="0"/>
-      </w:pPr>
-    </w:p>
-    <w:p>
-      <w:pPr>
-        <w:ind w:firstLine="0"/>
-      </w:pPr>
-    </w:p>
-    <w:p>
-      <w:pPr>
-        <w:pStyle w:val="Virsraksts3"/>
-      </w:pPr>
-      <w:r>
-        <w:lastRenderedPageBreak/>
-        <w:t>Kartes</w:t>
-      </w:r>
-      <w:r>
-        <w:t xml:space="preserve"> klase</w:t>
-      </w:r>
-    </w:p>
-    <w:p>
-      <w:pPr>
         <w:sectPr>
           <w:pgSz w:w="12240" w:h="15840"/>
           <w:pgMar w:top="1134" w:right="1134" w:bottom="1134" w:left="1418" w:header="709" w:footer="709" w:gutter="0"/>
@@ -8923,12 +8904,6 @@
           <w:docGrid w:linePitch="360"/>
         </w:sectPr>
       </w:pPr>
-      <w:r>
-        <w:t>Kartes komponente arī ir klase, kura iekļauj apakškomponentes ar savām metodēm un mainīgajiem. Kartes klases darbības iekļauj ailes datu iegūšanu pēc pozīcijas un laukumu ielādi un eksportēšanu. Slāņu komponentes arī iekļauj minētās metodes noteiktam slānim, taču arī slāņa ailēm ir savas metodes un īpašības, piemēram, “Ground” slāņa ailei augstums un “Entity” slāņa ailes piederība. Pārējām komponentēm savas attiecīgas darbības, kuras ir atkarīgas no slāņu komponentēm</w:t>
-      </w:r>
-      <w:r>
-        <w:t>.</w:t>
-      </w:r>
     </w:p>
     <w:p>
       <w:pPr>
@@ -8966,7 +8941,7 @@
                     <pic:cNvPicPr/>
                   </pic:nvPicPr>
                   <pic:blipFill>
-                    <a:blip r:embed="rId15">
+                    <a:blip r:embed="rId17">
                       <a:extLst>
                         <a:ext uri="{28A0092B-C50C-407E-A947-70E740481C1C}">
                           <a14:useLocalDpi xmlns:a14="http://schemas.microsoft.com/office/drawing/2010/main" val="0"/>
@@ -8998,25 +8973,7 @@
         <w:pStyle w:val="Parakstszemobjekta"/>
       </w:pPr>
       <w:r>
-        <w:fldChar w:fldCharType="begin"/>
-      </w:r>
-      <w:r>
-        <w:instrText xml:space="preserve"> SEQ attēls \* ARABIC </w:instrText>
-      </w:r>
-      <w:r>
-        <w:fldChar w:fldCharType="separate"/>
-      </w:r>
-      <w:r>
-        <w:rPr>
-          <w:noProof/>
-        </w:rPr>
-        <w:t>6</w:t>
-      </w:r>
-      <w:r>
-        <w:rPr>
-          <w:noProof/>
-        </w:rPr>
-        <w:fldChar w:fldCharType="end"/>
+        <w:t>7</w:t>
       </w:r>
       <w:r>
         <w:t>. attēls. Ainas stadiju gaita</w:t>
@@ -9049,7 +9006,7 @@
                     <pic:cNvPicPr/>
                   </pic:nvPicPr>
                   <pic:blipFill>
-                    <a:blip r:embed="rId16">
+                    <a:blip r:embed="rId18">
                       <a:extLst>
                         <a:ext uri="{28A0092B-C50C-407E-A947-70E740481C1C}">
                           <a14:useLocalDpi xmlns:a14="http://schemas.microsoft.com/office/drawing/2010/main" val="0"/>
@@ -9081,25 +9038,7 @@
         <w:pStyle w:val="Parakstszemobjekta"/>
       </w:pPr>
       <w:r>
-        <w:fldChar w:fldCharType="begin"/>
-      </w:r>
-      <w:r>
-        <w:instrText xml:space="preserve"> SEQ attēls \* ARABIC </w:instrText>
-      </w:r>
-      <w:r>
-        <w:fldChar w:fldCharType="separate"/>
-      </w:r>
-      <w:r>
-        <w:rPr>
-          <w:noProof/>
-        </w:rPr>
-        <w:t>7</w:t>
-      </w:r>
-      <w:r>
-        <w:rPr>
-          <w:noProof/>
-        </w:rPr>
-        <w:fldChar w:fldCharType="end"/>
+        <w:t>8</w:t>
       </w:r>
       <w:r>
         <w:t>. attēls. Spēles laukuma stadijas</w:t>
@@ -9161,7 +9100,7 @@
                     <pic:cNvPicPr/>
                   </pic:nvPicPr>
                   <pic:blipFill>
-                    <a:blip r:embed="rId17">
+                    <a:blip r:embed="rId19">
                       <a:extLst>
                         <a:ext uri="{28A0092B-C50C-407E-A947-70E740481C1C}">
                           <a14:useLocalDpi xmlns:a14="http://schemas.microsoft.com/office/drawing/2010/main" val="0"/>
@@ -9192,27 +9131,14 @@
       <w:pPr>
         <w:pStyle w:val="Parakstszemobjekta"/>
       </w:pPr>
-      <w:r>
-        <w:fldChar w:fldCharType="begin"/>
-      </w:r>
-      <w:r>
-        <w:instrText xml:space="preserve"> SEQ attēls \* ARABIC </w:instrText>
-      </w:r>
-      <w:r>
-        <w:fldChar w:fldCharType="separate"/>
-      </w:r>
-      <w:r>
-        <w:rPr>
-          <w:noProof/>
-        </w:rPr>
-        <w:t>8</w:t>
-      </w:r>
-      <w:r>
-        <w:rPr>
-          <w:noProof/>
-        </w:rPr>
-        <w:fldChar w:fldCharType="end"/>
-      </w:r>
+      <w:fldSimple w:instr=" SEQ attēls \* ARABIC ">
+        <w:r>
+          <w:rPr>
+            <w:noProof/>
+          </w:rPr>
+          <w:t>8</w:t>
+        </w:r>
+      </w:fldSimple>
       <w:r>
         <w:t>. attēls. Saknes mezgla enumerācijas</w:t>
       </w:r>
@@ -9243,7 +9169,7 @@
                     <pic:cNvPicPr/>
                   </pic:nvPicPr>
                   <pic:blipFill>
-                    <a:blip r:embed="rId18">
+                    <a:blip r:embed="rId20">
                       <a:extLst>
                         <a:ext uri="{28A0092B-C50C-407E-A947-70E740481C1C}">
                           <a14:useLocalDpi xmlns:a14="http://schemas.microsoft.com/office/drawing/2010/main" val="0"/>
@@ -9280,27 +9206,14 @@
           <w:docGrid w:linePitch="360"/>
         </w:sectPr>
       </w:pPr>
-      <w:r>
-        <w:fldChar w:fldCharType="begin"/>
-      </w:r>
-      <w:r>
-        <w:instrText xml:space="preserve"> SEQ attēls \* ARABIC </w:instrText>
-      </w:r>
-      <w:r>
-        <w:fldChar w:fldCharType="separate"/>
-      </w:r>
-      <w:r>
-        <w:rPr>
-          <w:noProof/>
-        </w:rPr>
-        <w:t>9</w:t>
-      </w:r>
-      <w:r>
-        <w:rPr>
-          <w:noProof/>
-        </w:rPr>
-        <w:fldChar w:fldCharType="end"/>
-      </w:r>
+      <w:fldSimple w:instr=" SEQ attēls \* ARABIC ">
+        <w:r>
+          <w:rPr>
+            <w:noProof/>
+          </w:rPr>
+          <w:t>9</w:t>
+        </w:r>
+      </w:fldSimple>
       <w:r>
         <w:t>. attēls. Kartes laukuma enumerācijas</w:t>
       </w:r>
@@ -9375,6 +9288,9 @@
       <w:r>
         <w:t xml:space="preserve"> ar baltās un melnās kastes metodēm.</w:t>
       </w:r>
+      <w:r>
+        <w:t xml:space="preserve"> 1. tabulā</w:t>
+      </w:r>
     </w:p>
     <w:p>
       <w:pPr>
@@ -9385,27 +9301,14 @@
       <w:pPr>
         <w:pStyle w:val="tablecaption"/>
       </w:pPr>
-      <w:r>
-        <w:fldChar w:fldCharType="begin"/>
-      </w:r>
-      <w:r>
-        <w:instrText xml:space="preserve"> SEQ tabula \* ARABIC </w:instrText>
-      </w:r>
-      <w:r>
-        <w:fldChar w:fldCharType="separate"/>
-      </w:r>
-      <w:r>
-        <w:rPr>
-          <w:noProof/>
-        </w:rPr>
-        <w:t>1</w:t>
-      </w:r>
-      <w:r>
-        <w:rPr>
-          <w:noProof/>
-        </w:rPr>
-        <w:fldChar w:fldCharType="end"/>
-      </w:r>
+      <w:fldSimple w:instr=" SEQ tabula \* ARABIC ">
+        <w:r>
+          <w:rPr>
+            <w:noProof/>
+          </w:rPr>
+          <w:t>1</w:t>
+        </w:r>
+      </w:fldSimple>
       <w:r>
         <w:t>. tabula</w:t>
       </w:r>
@@ -9746,6 +9649,50 @@
           </w:p>
         </w:tc>
       </w:tr>
+      <w:tr>
+        <w:tc>
+          <w:tcPr>
+            <w:tcW w:w="4839" w:type="dxa"/>
+          </w:tcPr>
+          <w:p>
+            <w:pPr>
+              <w:ind w:firstLine="0"/>
+              <w:rPr>
+                <w:sz w:val="20"/>
+                <w:szCs w:val="20"/>
+              </w:rPr>
+            </w:pPr>
+            <w:r>
+              <w:rPr>
+                <w:sz w:val="20"/>
+                <w:szCs w:val="20"/>
+              </w:rPr>
+              <w:t>VS</w:t>
+            </w:r>
+          </w:p>
+        </w:tc>
+        <w:tc>
+          <w:tcPr>
+            <w:tcW w:w="4839" w:type="dxa"/>
+          </w:tcPr>
+          <w:p>
+            <w:pPr>
+              <w:ind w:firstLine="0"/>
+              <w:rPr>
+                <w:sz w:val="20"/>
+                <w:szCs w:val="20"/>
+              </w:rPr>
+            </w:pPr>
+            <w:r>
+              <w:rPr>
+                <w:sz w:val="20"/>
+                <w:szCs w:val="20"/>
+              </w:rPr>
+              <w:t>Vispārīgie</w:t>
+            </w:r>
+          </w:p>
+        </w:tc>
+      </w:tr>
     </w:tbl>
     <w:p/>
     <w:p>
@@ -9765,28 +9712,14 @@
         <w:ind w:left="1440"/>
         <w:jc w:val="right"/>
       </w:pPr>
-      <w:r>
-        <w:lastRenderedPageBreak/>
-        <w:fldChar w:fldCharType="begin"/>
-      </w:r>
-      <w:r>
-        <w:instrText xml:space="preserve"> SEQ tabula \* ARABIC </w:instrText>
-      </w:r>
-      <w:r>
-        <w:fldChar w:fldCharType="separate"/>
-      </w:r>
-      <w:r>
-        <w:rPr>
-          <w:noProof/>
-        </w:rPr>
-        <w:t>2</w:t>
-      </w:r>
-      <w:r>
-        <w:rPr>
-          <w:noProof/>
-        </w:rPr>
-        <w:fldChar w:fldCharType="end"/>
-      </w:r>
+      <w:fldSimple w:instr=" SEQ tabula \* ARABIC ">
+        <w:r>
+          <w:rPr>
+            <w:noProof/>
+          </w:rPr>
+          <w:t>2</w:t>
+        </w:r>
+      </w:fldSimple>
       <w:r>
         <w:t>. tabula</w:t>
       </w:r>

</xml_diff>

<commit_message>
YAY DONE WITH DIAGRAMS FOR NOW
</commit_message>
<xml_diff>
--- a/Documentation/Dokumentācija.docx
+++ b/Documentation/Dokumentācija.docx
@@ -228,7 +228,7 @@
           <w:r>
             <w:fldChar w:fldCharType="separate"/>
           </w:r>
-          <w:hyperlink w:anchor="_Toc225723225" w:history="1">
+          <w:hyperlink w:anchor="_Toc230230060" w:history="1">
             <w:r>
               <w:rPr>
                 <w:rStyle w:val="Hipersaite"/>
@@ -255,7 +255,7 @@
                 <w:noProof/>
                 <w:webHidden/>
               </w:rPr>
-              <w:instrText xml:space="preserve"> PAGEREF _Toc225723225 \h </w:instrText>
+              <w:instrText xml:space="preserve"> PAGEREF _Toc230230060 \h </w:instrText>
             </w:r>
             <w:r>
               <w:rPr>
@@ -275,7 +275,7 @@
                 <w:noProof/>
                 <w:webHidden/>
               </w:rPr>
-              <w:t>4</w:t>
+              <w:t>5</w:t>
             </w:r>
             <w:r>
               <w:rPr>
@@ -296,7 +296,7 @@
               <w:lang w:eastAsia="lv-LV"/>
             </w:rPr>
           </w:pPr>
-          <w:hyperlink w:anchor="_Toc225723226" w:history="1">
+          <w:hyperlink w:anchor="_Toc230230061" w:history="1">
             <w:r>
               <w:rPr>
                 <w:rStyle w:val="Hipersaite"/>
@@ -339,7 +339,7 @@
                 <w:noProof/>
                 <w:webHidden/>
               </w:rPr>
-              <w:instrText xml:space="preserve"> PAGEREF _Toc225723226 \h </w:instrText>
+              <w:instrText xml:space="preserve"> PAGEREF _Toc230230061 \h </w:instrText>
             </w:r>
             <w:r>
               <w:rPr>
@@ -359,7 +359,7 @@
                 <w:noProof/>
                 <w:webHidden/>
               </w:rPr>
-              <w:t>5</w:t>
+              <w:t>6</w:t>
             </w:r>
             <w:r>
               <w:rPr>
@@ -380,7 +380,7 @@
               <w:lang w:eastAsia="lv-LV"/>
             </w:rPr>
           </w:pPr>
-          <w:hyperlink w:anchor="_Toc225723227" w:history="1">
+          <w:hyperlink w:anchor="_Toc230230062" w:history="1">
             <w:r>
               <w:rPr>
                 <w:rStyle w:val="Hipersaite"/>
@@ -423,7 +423,7 @@
                 <w:noProof/>
                 <w:webHidden/>
               </w:rPr>
-              <w:instrText xml:space="preserve"> PAGEREF _Toc225723227 \h </w:instrText>
+              <w:instrText xml:space="preserve"> PAGEREF _Toc230230062 \h </w:instrText>
             </w:r>
             <w:r>
               <w:rPr>
@@ -443,7 +443,7 @@
                 <w:noProof/>
                 <w:webHidden/>
               </w:rPr>
-              <w:t>5</w:t>
+              <w:t>6</w:t>
             </w:r>
             <w:r>
               <w:rPr>
@@ -464,7 +464,7 @@
               <w:lang w:eastAsia="lv-LV"/>
             </w:rPr>
           </w:pPr>
-          <w:hyperlink w:anchor="_Toc225723228" w:history="1">
+          <w:hyperlink w:anchor="_Toc230230063" w:history="1">
             <w:r>
               <w:rPr>
                 <w:rStyle w:val="Hipersaite"/>
@@ -507,7 +507,7 @@
                 <w:noProof/>
                 <w:webHidden/>
               </w:rPr>
-              <w:instrText xml:space="preserve"> PAGEREF _Toc225723228 \h </w:instrText>
+              <w:instrText xml:space="preserve"> PAGEREF _Toc230230063 \h </w:instrText>
             </w:r>
             <w:r>
               <w:rPr>
@@ -527,7 +527,7 @@
                 <w:noProof/>
                 <w:webHidden/>
               </w:rPr>
-              <w:t>5</w:t>
+              <w:t>6</w:t>
             </w:r>
             <w:r>
               <w:rPr>
@@ -548,7 +548,7 @@
               <w:lang w:eastAsia="lv-LV"/>
             </w:rPr>
           </w:pPr>
-          <w:hyperlink w:anchor="_Toc225723229" w:history="1">
+          <w:hyperlink w:anchor="_Toc230230064" w:history="1">
             <w:r>
               <w:rPr>
                 <w:rStyle w:val="Hipersaite"/>
@@ -591,7 +591,7 @@
                 <w:noProof/>
                 <w:webHidden/>
               </w:rPr>
-              <w:instrText xml:space="preserve"> PAGEREF _Toc225723229 \h </w:instrText>
+              <w:instrText xml:space="preserve"> PAGEREF _Toc230230064 \h </w:instrText>
             </w:r>
             <w:r>
               <w:rPr>
@@ -611,7 +611,7 @@
                 <w:noProof/>
                 <w:webHidden/>
               </w:rPr>
-              <w:t>5</w:t>
+              <w:t>6</w:t>
             </w:r>
             <w:r>
               <w:rPr>
@@ -632,7 +632,7 @@
               <w:lang w:eastAsia="lv-LV"/>
             </w:rPr>
           </w:pPr>
-          <w:hyperlink w:anchor="_Toc225723230" w:history="1">
+          <w:hyperlink w:anchor="_Toc230230065" w:history="1">
             <w:r>
               <w:rPr>
                 <w:rStyle w:val="Hipersaite"/>
@@ -675,7 +675,7 @@
                 <w:noProof/>
                 <w:webHidden/>
               </w:rPr>
-              <w:instrText xml:space="preserve"> PAGEREF _Toc225723230 \h </w:instrText>
+              <w:instrText xml:space="preserve"> PAGEREF _Toc230230065 \h </w:instrText>
             </w:r>
             <w:r>
               <w:rPr>
@@ -695,7 +695,7 @@
                 <w:noProof/>
                 <w:webHidden/>
               </w:rPr>
-              <w:t>6</w:t>
+              <w:t>7</w:t>
             </w:r>
             <w:r>
               <w:rPr>
@@ -716,7 +716,7 @@
               <w:lang w:eastAsia="lv-LV"/>
             </w:rPr>
           </w:pPr>
-          <w:hyperlink w:anchor="_Toc225723231" w:history="1">
+          <w:hyperlink w:anchor="_Toc230230066" w:history="1">
             <w:r>
               <w:rPr>
                 <w:rStyle w:val="Hipersaite"/>
@@ -759,7 +759,7 @@
                 <w:noProof/>
                 <w:webHidden/>
               </w:rPr>
-              <w:instrText xml:space="preserve"> PAGEREF _Toc225723231 \h </w:instrText>
+              <w:instrText xml:space="preserve"> PAGEREF _Toc230230066 \h </w:instrText>
             </w:r>
             <w:r>
               <w:rPr>
@@ -779,7 +779,7 @@
                 <w:noProof/>
                 <w:webHidden/>
               </w:rPr>
-              <w:t>7</w:t>
+              <w:t>8</w:t>
             </w:r>
             <w:r>
               <w:rPr>
@@ -800,7 +800,7 @@
               <w:lang w:eastAsia="lv-LV"/>
             </w:rPr>
           </w:pPr>
-          <w:hyperlink w:anchor="_Toc225723232" w:history="1">
+          <w:hyperlink w:anchor="_Toc230230067" w:history="1">
             <w:r>
               <w:rPr>
                 <w:rStyle w:val="Hipersaite"/>
@@ -843,7 +843,7 @@
                 <w:noProof/>
                 <w:webHidden/>
               </w:rPr>
-              <w:instrText xml:space="preserve"> PAGEREF _Toc225723232 \h </w:instrText>
+              <w:instrText xml:space="preserve"> PAGEREF _Toc230230067 \h </w:instrText>
             </w:r>
             <w:r>
               <w:rPr>
@@ -863,7 +863,7 @@
                 <w:noProof/>
                 <w:webHidden/>
               </w:rPr>
-              <w:t>7</w:t>
+              <w:t>8</w:t>
             </w:r>
             <w:r>
               <w:rPr>
@@ -884,7 +884,7 @@
               <w:lang w:eastAsia="lv-LV"/>
             </w:rPr>
           </w:pPr>
-          <w:hyperlink w:anchor="_Toc225723233" w:history="1">
+          <w:hyperlink w:anchor="_Toc230230068" w:history="1">
             <w:r>
               <w:rPr>
                 <w:rStyle w:val="Hipersaite"/>
@@ -927,7 +927,7 @@
                 <w:noProof/>
                 <w:webHidden/>
               </w:rPr>
-              <w:instrText xml:space="preserve"> PAGEREF _Toc225723233 \h </w:instrText>
+              <w:instrText xml:space="preserve"> PAGEREF _Toc230230068 \h </w:instrText>
             </w:r>
             <w:r>
               <w:rPr>
@@ -947,7 +947,7 @@
                 <w:noProof/>
                 <w:webHidden/>
               </w:rPr>
-              <w:t>7</w:t>
+              <w:t>8</w:t>
             </w:r>
             <w:r>
               <w:rPr>
@@ -968,7 +968,7 @@
               <w:lang w:eastAsia="lv-LV"/>
             </w:rPr>
           </w:pPr>
-          <w:hyperlink w:anchor="_Toc225723234" w:history="1">
+          <w:hyperlink w:anchor="_Toc230230069" w:history="1">
             <w:r>
               <w:rPr>
                 <w:rStyle w:val="Hipersaite"/>
@@ -1011,7 +1011,7 @@
                 <w:noProof/>
                 <w:webHidden/>
               </w:rPr>
-              <w:instrText xml:space="preserve"> PAGEREF _Toc225723234 \h </w:instrText>
+              <w:instrText xml:space="preserve"> PAGEREF _Toc230230069 \h </w:instrText>
             </w:r>
             <w:r>
               <w:rPr>
@@ -1031,7 +1031,7 @@
                 <w:noProof/>
                 <w:webHidden/>
               </w:rPr>
-              <w:t>7</w:t>
+              <w:t>8</w:t>
             </w:r>
             <w:r>
               <w:rPr>
@@ -1052,7 +1052,7 @@
               <w:lang w:eastAsia="lv-LV"/>
             </w:rPr>
           </w:pPr>
-          <w:hyperlink w:anchor="_Toc225723235" w:history="1">
+          <w:hyperlink w:anchor="_Toc230230070" w:history="1">
             <w:r>
               <w:rPr>
                 <w:rStyle w:val="Hipersaite"/>
@@ -1095,7 +1095,7 @@
                 <w:noProof/>
                 <w:webHidden/>
               </w:rPr>
-              <w:instrText xml:space="preserve"> PAGEREF _Toc225723235 \h </w:instrText>
+              <w:instrText xml:space="preserve"> PAGEREF _Toc230230070 \h </w:instrText>
             </w:r>
             <w:r>
               <w:rPr>
@@ -1115,7 +1115,7 @@
                 <w:noProof/>
                 <w:webHidden/>
               </w:rPr>
-              <w:t>8</w:t>
+              <w:t>9</w:t>
             </w:r>
             <w:r>
               <w:rPr>
@@ -1136,7 +1136,7 @@
               <w:lang w:eastAsia="lv-LV"/>
             </w:rPr>
           </w:pPr>
-          <w:hyperlink w:anchor="_Toc225723236" w:history="1">
+          <w:hyperlink w:anchor="_Toc230230071" w:history="1">
             <w:r>
               <w:rPr>
                 <w:rStyle w:val="Hipersaite"/>
@@ -1179,7 +1179,7 @@
                 <w:noProof/>
                 <w:webHidden/>
               </w:rPr>
-              <w:instrText xml:space="preserve"> PAGEREF _Toc225723236 \h </w:instrText>
+              <w:instrText xml:space="preserve"> PAGEREF _Toc230230071 \h </w:instrText>
             </w:r>
             <w:r>
               <w:rPr>
@@ -1199,7 +1199,7 @@
                 <w:noProof/>
                 <w:webHidden/>
               </w:rPr>
-              <w:t>9</w:t>
+              <w:t>11</w:t>
             </w:r>
             <w:r>
               <w:rPr>
@@ -1220,7 +1220,7 @@
               <w:lang w:eastAsia="lv-LV"/>
             </w:rPr>
           </w:pPr>
-          <w:hyperlink w:anchor="_Toc225723237" w:history="1">
+          <w:hyperlink w:anchor="_Toc230230072" w:history="1">
             <w:r>
               <w:rPr>
                 <w:rStyle w:val="Hipersaite"/>
@@ -1263,7 +1263,7 @@
                 <w:noProof/>
                 <w:webHidden/>
               </w:rPr>
-              <w:instrText xml:space="preserve"> PAGEREF _Toc225723237 \h </w:instrText>
+              <w:instrText xml:space="preserve"> PAGEREF _Toc230230072 \h </w:instrText>
             </w:r>
             <w:r>
               <w:rPr>
@@ -1283,7 +1283,7 @@
                 <w:noProof/>
                 <w:webHidden/>
               </w:rPr>
-              <w:t>13</w:t>
+              <w:t>18</w:t>
             </w:r>
             <w:r>
               <w:rPr>
@@ -1304,7 +1304,7 @@
               <w:lang w:eastAsia="lv-LV"/>
             </w:rPr>
           </w:pPr>
-          <w:hyperlink w:anchor="_Toc225723238" w:history="1">
+          <w:hyperlink w:anchor="_Toc230230073" w:history="1">
             <w:r>
               <w:rPr>
                 <w:rStyle w:val="Hipersaite"/>
@@ -1347,7 +1347,7 @@
                 <w:noProof/>
                 <w:webHidden/>
               </w:rPr>
-              <w:instrText xml:space="preserve"> PAGEREF _Toc225723238 \h </w:instrText>
+              <w:instrText xml:space="preserve"> PAGEREF _Toc230230073 \h </w:instrText>
             </w:r>
             <w:r>
               <w:rPr>
@@ -1367,7 +1367,7 @@
                 <w:noProof/>
                 <w:webHidden/>
               </w:rPr>
-              <w:t>13</w:t>
+              <w:t>18</w:t>
             </w:r>
             <w:r>
               <w:rPr>
@@ -1388,7 +1388,7 @@
               <w:lang w:eastAsia="lv-LV"/>
             </w:rPr>
           </w:pPr>
-          <w:hyperlink w:anchor="_Toc225723239" w:history="1">
+          <w:hyperlink w:anchor="_Toc230230074" w:history="1">
             <w:r>
               <w:rPr>
                 <w:rStyle w:val="Hipersaite"/>
@@ -1410,7 +1410,7 @@
                 <w:rStyle w:val="Hipersaite"/>
                 <w:noProof/>
               </w:rPr>
-              <w:t>Saskarsne</w:t>
+              <w:t>Lietotāja saskarne</w:t>
             </w:r>
             <w:r>
               <w:rPr>
@@ -1431,7 +1431,7 @@
                 <w:noProof/>
                 <w:webHidden/>
               </w:rPr>
-              <w:instrText xml:space="preserve"> PAGEREF _Toc225723239 \h </w:instrText>
+              <w:instrText xml:space="preserve"> PAGEREF _Toc230230074 \h </w:instrText>
             </w:r>
             <w:r>
               <w:rPr>
@@ -1451,7 +1451,7 @@
                 <w:noProof/>
                 <w:webHidden/>
               </w:rPr>
-              <w:t>13</w:t>
+              <w:t>18</w:t>
             </w:r>
             <w:r>
               <w:rPr>
@@ -1472,7 +1472,7 @@
               <w:lang w:eastAsia="lv-LV"/>
             </w:rPr>
           </w:pPr>
-          <w:hyperlink w:anchor="_Toc225723240" w:history="1">
+          <w:hyperlink w:anchor="_Toc230230075" w:history="1">
             <w:r>
               <w:rPr>
                 <w:rStyle w:val="Hipersaite"/>
@@ -1515,7 +1515,7 @@
                 <w:noProof/>
                 <w:webHidden/>
               </w:rPr>
-              <w:instrText xml:space="preserve"> PAGEREF _Toc225723240 \h </w:instrText>
+              <w:instrText xml:space="preserve"> PAGEREF _Toc230230075 \h </w:instrText>
             </w:r>
             <w:r>
               <w:rPr>
@@ -1535,7 +1535,7 @@
                 <w:noProof/>
                 <w:webHidden/>
               </w:rPr>
-              <w:t>13</w:t>
+              <w:t>18</w:t>
             </w:r>
             <w:r>
               <w:rPr>
@@ -1556,7 +1556,7 @@
               <w:lang w:eastAsia="lv-LV"/>
             </w:rPr>
           </w:pPr>
-          <w:hyperlink w:anchor="_Toc225723241" w:history="1">
+          <w:hyperlink w:anchor="_Toc230230076" w:history="1">
             <w:r>
               <w:rPr>
                 <w:rStyle w:val="Hipersaite"/>
@@ -1599,7 +1599,7 @@
                 <w:noProof/>
                 <w:webHidden/>
               </w:rPr>
-              <w:instrText xml:space="preserve"> PAGEREF _Toc225723241 \h </w:instrText>
+              <w:instrText xml:space="preserve"> PAGEREF _Toc230230076 \h </w:instrText>
             </w:r>
             <w:r>
               <w:rPr>
@@ -1619,7 +1619,7 @@
                 <w:noProof/>
                 <w:webHidden/>
               </w:rPr>
-              <w:t>14</w:t>
+              <w:t>18</w:t>
             </w:r>
             <w:r>
               <w:rPr>
@@ -1640,7 +1640,7 @@
               <w:lang w:eastAsia="lv-LV"/>
             </w:rPr>
           </w:pPr>
-          <w:hyperlink w:anchor="_Toc225723242" w:history="1">
+          <w:hyperlink w:anchor="_Toc230230077" w:history="1">
             <w:r>
               <w:rPr>
                 <w:rStyle w:val="Hipersaite"/>
@@ -1683,7 +1683,7 @@
                 <w:noProof/>
                 <w:webHidden/>
               </w:rPr>
-              <w:instrText xml:space="preserve"> PAGEREF _Toc225723242 \h </w:instrText>
+              <w:instrText xml:space="preserve"> PAGEREF _Toc230230077 \h </w:instrText>
             </w:r>
             <w:r>
               <w:rPr>
@@ -1703,7 +1703,7 @@
                 <w:noProof/>
                 <w:webHidden/>
               </w:rPr>
-              <w:t>15</w:t>
+              <w:t>20</w:t>
             </w:r>
             <w:r>
               <w:rPr>
@@ -1724,7 +1724,7 @@
               <w:lang w:eastAsia="lv-LV"/>
             </w:rPr>
           </w:pPr>
-          <w:hyperlink w:anchor="_Toc225723243" w:history="1">
+          <w:hyperlink w:anchor="_Toc230230078" w:history="1">
             <w:r>
               <w:rPr>
                 <w:rStyle w:val="Hipersaite"/>
@@ -1767,7 +1767,7 @@
                 <w:noProof/>
                 <w:webHidden/>
               </w:rPr>
-              <w:instrText xml:space="preserve"> PAGEREF _Toc225723243 \h </w:instrText>
+              <w:instrText xml:space="preserve"> PAGEREF _Toc230230078 \h </w:instrText>
             </w:r>
             <w:r>
               <w:rPr>
@@ -1787,7 +1787,7 @@
                 <w:noProof/>
                 <w:webHidden/>
               </w:rPr>
-              <w:t>15</w:t>
+              <w:t>20</w:t>
             </w:r>
             <w:r>
               <w:rPr>
@@ -1808,7 +1808,7 @@
               <w:lang w:eastAsia="lv-LV"/>
             </w:rPr>
           </w:pPr>
-          <w:hyperlink w:anchor="_Toc225723244" w:history="1">
+          <w:hyperlink w:anchor="_Toc230230079" w:history="1">
             <w:r>
               <w:rPr>
                 <w:rStyle w:val="Hipersaite"/>
@@ -1851,7 +1851,7 @@
                 <w:noProof/>
                 <w:webHidden/>
               </w:rPr>
-              <w:instrText xml:space="preserve"> PAGEREF _Toc225723244 \h </w:instrText>
+              <w:instrText xml:space="preserve"> PAGEREF _Toc230230079 \h </w:instrText>
             </w:r>
             <w:r>
               <w:rPr>
@@ -1871,7 +1871,7 @@
                 <w:noProof/>
                 <w:webHidden/>
               </w:rPr>
-              <w:t>15</w:t>
+              <w:t>20</w:t>
             </w:r>
             <w:r>
               <w:rPr>
@@ -1892,7 +1892,7 @@
               <w:lang w:eastAsia="lv-LV"/>
             </w:rPr>
           </w:pPr>
-          <w:hyperlink w:anchor="_Toc225723245" w:history="1">
+          <w:hyperlink w:anchor="_Toc230230080" w:history="1">
             <w:r>
               <w:rPr>
                 <w:rStyle w:val="Hipersaite"/>
@@ -1935,7 +1935,7 @@
                 <w:noProof/>
                 <w:webHidden/>
               </w:rPr>
-              <w:instrText xml:space="preserve"> PAGEREF _Toc225723245 \h </w:instrText>
+              <w:instrText xml:space="preserve"> PAGEREF _Toc230230080 \h </w:instrText>
             </w:r>
             <w:r>
               <w:rPr>
@@ -1955,7 +1955,7 @@
                 <w:noProof/>
                 <w:webHidden/>
               </w:rPr>
-              <w:t>15</w:t>
+              <w:t>20</w:t>
             </w:r>
             <w:r>
               <w:rPr>
@@ -1976,7 +1976,7 @@
               <w:lang w:eastAsia="lv-LV"/>
             </w:rPr>
           </w:pPr>
-          <w:hyperlink w:anchor="_Toc225723246" w:history="1">
+          <w:hyperlink w:anchor="_Toc230230081" w:history="1">
             <w:r>
               <w:rPr>
                 <w:rStyle w:val="Hipersaite"/>
@@ -2019,7 +2019,7 @@
                 <w:noProof/>
                 <w:webHidden/>
               </w:rPr>
-              <w:instrText xml:space="preserve"> PAGEREF _Toc225723246 \h </w:instrText>
+              <w:instrText xml:space="preserve"> PAGEREF _Toc230230081 \h </w:instrText>
             </w:r>
             <w:r>
               <w:rPr>
@@ -2039,7 +2039,7 @@
                 <w:noProof/>
                 <w:webHidden/>
               </w:rPr>
-              <w:t>15</w:t>
+              <w:t>20</w:t>
             </w:r>
             <w:r>
               <w:rPr>
@@ -2060,7 +2060,7 @@
               <w:lang w:eastAsia="lv-LV"/>
             </w:rPr>
           </w:pPr>
-          <w:hyperlink w:anchor="_Toc225723247" w:history="1">
+          <w:hyperlink w:anchor="_Toc230230082" w:history="1">
             <w:r>
               <w:rPr>
                 <w:rStyle w:val="Hipersaite"/>
@@ -2103,7 +2103,7 @@
                 <w:noProof/>
                 <w:webHidden/>
               </w:rPr>
-              <w:instrText xml:space="preserve"> PAGEREF _Toc225723247 \h </w:instrText>
+              <w:instrText xml:space="preserve"> PAGEREF _Toc230230082 \h </w:instrText>
             </w:r>
             <w:r>
               <w:rPr>
@@ -2123,7 +2123,7 @@
                 <w:noProof/>
                 <w:webHidden/>
               </w:rPr>
-              <w:t>16</w:t>
+              <w:t>21</w:t>
             </w:r>
             <w:r>
               <w:rPr>
@@ -2144,7 +2144,7 @@
               <w:lang w:eastAsia="lv-LV"/>
             </w:rPr>
           </w:pPr>
-          <w:hyperlink w:anchor="_Toc225723248" w:history="1">
+          <w:hyperlink w:anchor="_Toc230230083" w:history="1">
             <w:r>
               <w:rPr>
                 <w:rStyle w:val="Hipersaite"/>
@@ -2187,7 +2187,7 @@
                 <w:noProof/>
                 <w:webHidden/>
               </w:rPr>
-              <w:instrText xml:space="preserve"> PAGEREF _Toc225723248 \h </w:instrText>
+              <w:instrText xml:space="preserve"> PAGEREF _Toc230230083 \h </w:instrText>
             </w:r>
             <w:r>
               <w:rPr>
@@ -2207,7 +2207,7 @@
                 <w:noProof/>
                 <w:webHidden/>
               </w:rPr>
-              <w:t>16</w:t>
+              <w:t>21</w:t>
             </w:r>
             <w:r>
               <w:rPr>
@@ -2228,7 +2228,7 @@
               <w:lang w:eastAsia="lv-LV"/>
             </w:rPr>
           </w:pPr>
-          <w:hyperlink w:anchor="_Toc225723249" w:history="1">
+          <w:hyperlink w:anchor="_Toc230230084" w:history="1">
             <w:r>
               <w:rPr>
                 <w:rStyle w:val="Hipersaite"/>
@@ -2271,7 +2271,7 @@
                 <w:noProof/>
                 <w:webHidden/>
               </w:rPr>
-              <w:instrText xml:space="preserve"> PAGEREF _Toc225723249 \h </w:instrText>
+              <w:instrText xml:space="preserve"> PAGEREF _Toc230230084 \h </w:instrText>
             </w:r>
             <w:r>
               <w:rPr>
@@ -2291,7 +2291,7 @@
                 <w:noProof/>
                 <w:webHidden/>
               </w:rPr>
-              <w:t>16</w:t>
+              <w:t>21</w:t>
             </w:r>
             <w:r>
               <w:rPr>
@@ -2312,7 +2312,7 @@
               <w:lang w:eastAsia="lv-LV"/>
             </w:rPr>
           </w:pPr>
-          <w:hyperlink w:anchor="_Toc225723250" w:history="1">
+          <w:hyperlink w:anchor="_Toc230230085" w:history="1">
             <w:r>
               <w:rPr>
                 <w:rStyle w:val="Hipersaite"/>
@@ -2355,7 +2355,7 @@
                 <w:noProof/>
                 <w:webHidden/>
               </w:rPr>
-              <w:instrText xml:space="preserve"> PAGEREF _Toc225723250 \h </w:instrText>
+              <w:instrText xml:space="preserve"> PAGEREF _Toc230230085 \h </w:instrText>
             </w:r>
             <w:r>
               <w:rPr>
@@ -2375,7 +2375,7 @@
                 <w:noProof/>
                 <w:webHidden/>
               </w:rPr>
-              <w:t>16</w:t>
+              <w:t>21</w:t>
             </w:r>
             <w:r>
               <w:rPr>
@@ -2396,7 +2396,7 @@
               <w:lang w:eastAsia="lv-LV"/>
             </w:rPr>
           </w:pPr>
-          <w:hyperlink w:anchor="_Toc225723251" w:history="1">
+          <w:hyperlink w:anchor="_Toc230230086" w:history="1">
             <w:r>
               <w:rPr>
                 <w:rStyle w:val="Hipersaite"/>
@@ -2439,7 +2439,7 @@
                 <w:noProof/>
                 <w:webHidden/>
               </w:rPr>
-              <w:instrText xml:space="preserve"> PAGEREF _Toc225723251 \h </w:instrText>
+              <w:instrText xml:space="preserve"> PAGEREF _Toc230230086 \h </w:instrText>
             </w:r>
             <w:r>
               <w:rPr>
@@ -2459,7 +2459,7 @@
                 <w:noProof/>
                 <w:webHidden/>
               </w:rPr>
-              <w:t>17</w:t>
+              <w:t>22</w:t>
             </w:r>
             <w:r>
               <w:rPr>
@@ -2480,7 +2480,7 @@
               <w:lang w:eastAsia="lv-LV"/>
             </w:rPr>
           </w:pPr>
-          <w:hyperlink w:anchor="_Toc225723252" w:history="1">
+          <w:hyperlink w:anchor="_Toc230230087" w:history="1">
             <w:r>
               <w:rPr>
                 <w:rStyle w:val="Hipersaite"/>
@@ -2523,7 +2523,7 @@
                 <w:noProof/>
                 <w:webHidden/>
               </w:rPr>
-              <w:instrText xml:space="preserve"> PAGEREF _Toc225723252 \h </w:instrText>
+              <w:instrText xml:space="preserve"> PAGEREF _Toc230230087 \h </w:instrText>
             </w:r>
             <w:r>
               <w:rPr>
@@ -2543,7 +2543,7 @@
                 <w:noProof/>
                 <w:webHidden/>
               </w:rPr>
-              <w:t>17</w:t>
+              <w:t>22</w:t>
             </w:r>
             <w:r>
               <w:rPr>
@@ -2564,7 +2564,7 @@
               <w:lang w:eastAsia="lv-LV"/>
             </w:rPr>
           </w:pPr>
-          <w:hyperlink w:anchor="_Toc225723253" w:history="1">
+          <w:hyperlink w:anchor="_Toc230230088" w:history="1">
             <w:r>
               <w:rPr>
                 <w:rStyle w:val="Hipersaite"/>
@@ -2607,7 +2607,7 @@
                 <w:noProof/>
                 <w:webHidden/>
               </w:rPr>
-              <w:instrText xml:space="preserve"> PAGEREF _Toc225723253 \h </w:instrText>
+              <w:instrText xml:space="preserve"> PAGEREF _Toc230230088 \h </w:instrText>
             </w:r>
             <w:r>
               <w:rPr>
@@ -2627,7 +2627,7 @@
                 <w:noProof/>
                 <w:webHidden/>
               </w:rPr>
-              <w:t>18</w:t>
+              <w:t>23</w:t>
             </w:r>
             <w:r>
               <w:rPr>
@@ -2648,7 +2648,7 @@
               <w:lang w:eastAsia="lv-LV"/>
             </w:rPr>
           </w:pPr>
-          <w:hyperlink w:anchor="_Toc225723254" w:history="1">
+          <w:hyperlink w:anchor="_Toc230230089" w:history="1">
             <w:r>
               <w:rPr>
                 <w:rStyle w:val="Hipersaite"/>
@@ -2670,7 +2670,7 @@
                 <w:rStyle w:val="Hipersaite"/>
                 <w:noProof/>
               </w:rPr>
-              <w:t>Sistēmas struktūras modelis</w:t>
+              <w:t>Sistēmas struktūras modeļi</w:t>
             </w:r>
             <w:r>
               <w:rPr>
@@ -2691,7 +2691,7 @@
                 <w:noProof/>
                 <w:webHidden/>
               </w:rPr>
-              <w:instrText xml:space="preserve"> PAGEREF _Toc225723254 \h </w:instrText>
+              <w:instrText xml:space="preserve"> PAGEREF _Toc230230089 \h </w:instrText>
             </w:r>
             <w:r>
               <w:rPr>
@@ -2711,7 +2711,7 @@
                 <w:noProof/>
                 <w:webHidden/>
               </w:rPr>
-              <w:t>18</w:t>
+              <w:t>23</w:t>
             </w:r>
             <w:r>
               <w:rPr>
@@ -2732,7 +2732,7 @@
               <w:lang w:eastAsia="lv-LV"/>
             </w:rPr>
           </w:pPr>
-          <w:hyperlink w:anchor="_Toc225723255" w:history="1">
+          <w:hyperlink w:anchor="_Toc230230090" w:history="1">
             <w:r>
               <w:rPr>
                 <w:rStyle w:val="Hipersaite"/>
@@ -2754,7 +2754,7 @@
                 <w:rStyle w:val="Hipersaite"/>
                 <w:noProof/>
               </w:rPr>
-              <w:t>Sistēmas struktūra</w:t>
+              <w:t>Sistēmas pārvaldnieku komponenšu struktūra</w:t>
             </w:r>
             <w:r>
               <w:rPr>
@@ -2775,7 +2775,7 @@
                 <w:noProof/>
                 <w:webHidden/>
               </w:rPr>
-              <w:instrText xml:space="preserve"> PAGEREF _Toc225723255 \h </w:instrText>
+              <w:instrText xml:space="preserve"> PAGEREF _Toc230230090 \h </w:instrText>
             </w:r>
             <w:r>
               <w:rPr>
@@ -2795,7 +2795,7 @@
                 <w:noProof/>
                 <w:webHidden/>
               </w:rPr>
-              <w:t>18</w:t>
+              <w:t>23</w:t>
             </w:r>
             <w:r>
               <w:rPr>
@@ -2816,7 +2816,7 @@
               <w:lang w:eastAsia="lv-LV"/>
             </w:rPr>
           </w:pPr>
-          <w:hyperlink w:anchor="_Toc225723256" w:history="1">
+          <w:hyperlink w:anchor="_Toc230230091" w:history="1">
             <w:r>
               <w:rPr>
                 <w:rStyle w:val="Hipersaite"/>
@@ -2838,7 +2838,7 @@
                 <w:rStyle w:val="Hipersaite"/>
                 <w:noProof/>
               </w:rPr>
-              <w:t>Klašu modeļi</w:t>
+              <w:t>Ainu komponenšu struktūra</w:t>
             </w:r>
             <w:r>
               <w:rPr>
@@ -2859,7 +2859,7 @@
                 <w:noProof/>
                 <w:webHidden/>
               </w:rPr>
-              <w:instrText xml:space="preserve"> PAGEREF _Toc225723256 \h </w:instrText>
+              <w:instrText xml:space="preserve"> PAGEREF _Toc230230091 \h </w:instrText>
             </w:r>
             <w:r>
               <w:rPr>
@@ -2879,7 +2879,511 @@
                 <w:noProof/>
                 <w:webHidden/>
               </w:rPr>
-              <w:t>19</w:t>
+              <w:t>24</w:t>
+            </w:r>
+            <w:r>
+              <w:rPr>
+                <w:noProof/>
+                <w:webHidden/>
+              </w:rPr>
+              <w:fldChar w:fldCharType="end"/>
+            </w:r>
+          </w:hyperlink>
+        </w:p>
+        <w:p>
+          <w:pPr>
+            <w:pStyle w:val="Saturs3"/>
+            <w:rPr>
+              <w:rFonts w:asciiTheme="minorHAnsi" w:eastAsiaTheme="minorEastAsia" w:hAnsiTheme="minorHAnsi" w:cstheme="minorBidi"/>
+              <w:noProof/>
+              <w:kern w:val="2"/>
+              <w:lang w:eastAsia="lv-LV"/>
+            </w:rPr>
+          </w:pPr>
+          <w:hyperlink w:anchor="_Toc230230092" w:history="1">
+            <w:r>
+              <w:rPr>
+                <w:rStyle w:val="Hipersaite"/>
+                <w:noProof/>
+              </w:rPr>
+              <w:t>4.1.3.</w:t>
+            </w:r>
+            <w:r>
+              <w:rPr>
+                <w:rFonts w:asciiTheme="minorHAnsi" w:eastAsiaTheme="minorEastAsia" w:hAnsiTheme="minorHAnsi" w:cstheme="minorBidi"/>
+                <w:noProof/>
+                <w:kern w:val="2"/>
+                <w:lang w:eastAsia="lv-LV"/>
+              </w:rPr>
+              <w:tab/>
+            </w:r>
+            <w:r>
+              <w:rPr>
+                <w:rStyle w:val="Hipersaite"/>
+                <w:noProof/>
+              </w:rPr>
+              <w:t>Kartes komponenšu struktūra</w:t>
+            </w:r>
+            <w:r>
+              <w:rPr>
+                <w:noProof/>
+                <w:webHidden/>
+              </w:rPr>
+              <w:tab/>
+            </w:r>
+            <w:r>
+              <w:rPr>
+                <w:noProof/>
+                <w:webHidden/>
+              </w:rPr>
+              <w:fldChar w:fldCharType="begin"/>
+            </w:r>
+            <w:r>
+              <w:rPr>
+                <w:noProof/>
+                <w:webHidden/>
+              </w:rPr>
+              <w:instrText xml:space="preserve"> PAGEREF _Toc230230092 \h </w:instrText>
+            </w:r>
+            <w:r>
+              <w:rPr>
+                <w:noProof/>
+                <w:webHidden/>
+              </w:rPr>
+            </w:r>
+            <w:r>
+              <w:rPr>
+                <w:noProof/>
+                <w:webHidden/>
+              </w:rPr>
+              <w:fldChar w:fldCharType="separate"/>
+            </w:r>
+            <w:r>
+              <w:rPr>
+                <w:noProof/>
+                <w:webHidden/>
+              </w:rPr>
+              <w:t>25</w:t>
+            </w:r>
+            <w:r>
+              <w:rPr>
+                <w:noProof/>
+                <w:webHidden/>
+              </w:rPr>
+              <w:fldChar w:fldCharType="end"/>
+            </w:r>
+          </w:hyperlink>
+        </w:p>
+        <w:p>
+          <w:pPr>
+            <w:pStyle w:val="Saturs3"/>
+            <w:rPr>
+              <w:rFonts w:asciiTheme="minorHAnsi" w:eastAsiaTheme="minorEastAsia" w:hAnsiTheme="minorHAnsi" w:cstheme="minorBidi"/>
+              <w:noProof/>
+              <w:kern w:val="2"/>
+              <w:lang w:eastAsia="lv-LV"/>
+            </w:rPr>
+          </w:pPr>
+          <w:hyperlink w:anchor="_Toc230230093" w:history="1">
+            <w:r>
+              <w:rPr>
+                <w:rStyle w:val="Hipersaite"/>
+                <w:noProof/>
+              </w:rPr>
+              <w:t>4.1.4.</w:t>
+            </w:r>
+            <w:r>
+              <w:rPr>
+                <w:rFonts w:asciiTheme="minorHAnsi" w:eastAsiaTheme="minorEastAsia" w:hAnsiTheme="minorHAnsi" w:cstheme="minorBidi"/>
+                <w:noProof/>
+                <w:kern w:val="2"/>
+                <w:lang w:eastAsia="lv-LV"/>
+              </w:rPr>
+              <w:tab/>
+            </w:r>
+            <w:r>
+              <w:rPr>
+                <w:rStyle w:val="Hipersaite"/>
+                <w:noProof/>
+              </w:rPr>
+              <w:t>Sistēmas pārvaldnieku klases</w:t>
+            </w:r>
+            <w:r>
+              <w:rPr>
+                <w:noProof/>
+                <w:webHidden/>
+              </w:rPr>
+              <w:tab/>
+            </w:r>
+            <w:r>
+              <w:rPr>
+                <w:noProof/>
+                <w:webHidden/>
+              </w:rPr>
+              <w:fldChar w:fldCharType="begin"/>
+            </w:r>
+            <w:r>
+              <w:rPr>
+                <w:noProof/>
+                <w:webHidden/>
+              </w:rPr>
+              <w:instrText xml:space="preserve"> PAGEREF _Toc230230093 \h </w:instrText>
+            </w:r>
+            <w:r>
+              <w:rPr>
+                <w:noProof/>
+                <w:webHidden/>
+              </w:rPr>
+            </w:r>
+            <w:r>
+              <w:rPr>
+                <w:noProof/>
+                <w:webHidden/>
+              </w:rPr>
+              <w:fldChar w:fldCharType="separate"/>
+            </w:r>
+            <w:r>
+              <w:rPr>
+                <w:noProof/>
+                <w:webHidden/>
+              </w:rPr>
+              <w:t>26</w:t>
+            </w:r>
+            <w:r>
+              <w:rPr>
+                <w:noProof/>
+                <w:webHidden/>
+              </w:rPr>
+              <w:fldChar w:fldCharType="end"/>
+            </w:r>
+          </w:hyperlink>
+        </w:p>
+        <w:p>
+          <w:pPr>
+            <w:pStyle w:val="Saturs3"/>
+            <w:rPr>
+              <w:rFonts w:asciiTheme="minorHAnsi" w:eastAsiaTheme="minorEastAsia" w:hAnsiTheme="minorHAnsi" w:cstheme="minorBidi"/>
+              <w:noProof/>
+              <w:kern w:val="2"/>
+              <w:lang w:eastAsia="lv-LV"/>
+            </w:rPr>
+          </w:pPr>
+          <w:hyperlink w:anchor="_Toc230230094" w:history="1">
+            <w:r>
+              <w:rPr>
+                <w:rStyle w:val="Hipersaite"/>
+                <w:noProof/>
+              </w:rPr>
+              <w:t>4.1.5.</w:t>
+            </w:r>
+            <w:r>
+              <w:rPr>
+                <w:rFonts w:asciiTheme="minorHAnsi" w:eastAsiaTheme="minorEastAsia" w:hAnsiTheme="minorHAnsi" w:cstheme="minorBidi"/>
+                <w:noProof/>
+                <w:kern w:val="2"/>
+                <w:lang w:eastAsia="lv-LV"/>
+              </w:rPr>
+              <w:tab/>
+            </w:r>
+            <w:r>
+              <w:rPr>
+                <w:rStyle w:val="Hipersaite"/>
+                <w:noProof/>
+              </w:rPr>
+              <w:t>Ainu klases</w:t>
+            </w:r>
+            <w:r>
+              <w:rPr>
+                <w:noProof/>
+                <w:webHidden/>
+              </w:rPr>
+              <w:tab/>
+            </w:r>
+            <w:r>
+              <w:rPr>
+                <w:noProof/>
+                <w:webHidden/>
+              </w:rPr>
+              <w:fldChar w:fldCharType="begin"/>
+            </w:r>
+            <w:r>
+              <w:rPr>
+                <w:noProof/>
+                <w:webHidden/>
+              </w:rPr>
+              <w:instrText xml:space="preserve"> PAGEREF _Toc230230094 \h </w:instrText>
+            </w:r>
+            <w:r>
+              <w:rPr>
+                <w:noProof/>
+                <w:webHidden/>
+              </w:rPr>
+            </w:r>
+            <w:r>
+              <w:rPr>
+                <w:noProof/>
+                <w:webHidden/>
+              </w:rPr>
+              <w:fldChar w:fldCharType="separate"/>
+            </w:r>
+            <w:r>
+              <w:rPr>
+                <w:noProof/>
+                <w:webHidden/>
+              </w:rPr>
+              <w:t>27</w:t>
+            </w:r>
+            <w:r>
+              <w:rPr>
+                <w:noProof/>
+                <w:webHidden/>
+              </w:rPr>
+              <w:fldChar w:fldCharType="end"/>
+            </w:r>
+          </w:hyperlink>
+        </w:p>
+        <w:p>
+          <w:pPr>
+            <w:pStyle w:val="Saturs3"/>
+            <w:rPr>
+              <w:rFonts w:asciiTheme="minorHAnsi" w:eastAsiaTheme="minorEastAsia" w:hAnsiTheme="minorHAnsi" w:cstheme="minorBidi"/>
+              <w:noProof/>
+              <w:kern w:val="2"/>
+              <w:lang w:eastAsia="lv-LV"/>
+            </w:rPr>
+          </w:pPr>
+          <w:hyperlink w:anchor="_Toc230230095" w:history="1">
+            <w:r>
+              <w:rPr>
+                <w:rStyle w:val="Hipersaite"/>
+                <w:noProof/>
+              </w:rPr>
+              <w:t>4.1.6.</w:t>
+            </w:r>
+            <w:r>
+              <w:rPr>
+                <w:rFonts w:asciiTheme="minorHAnsi" w:eastAsiaTheme="minorEastAsia" w:hAnsiTheme="minorHAnsi" w:cstheme="minorBidi"/>
+                <w:noProof/>
+                <w:kern w:val="2"/>
+                <w:lang w:eastAsia="lv-LV"/>
+              </w:rPr>
+              <w:tab/>
+            </w:r>
+            <w:r>
+              <w:rPr>
+                <w:rStyle w:val="Hipersaite"/>
+                <w:noProof/>
+              </w:rPr>
+              <w:t>Kartes klase</w:t>
+            </w:r>
+            <w:r>
+              <w:rPr>
+                <w:noProof/>
+                <w:webHidden/>
+              </w:rPr>
+              <w:tab/>
+            </w:r>
+            <w:r>
+              <w:rPr>
+                <w:noProof/>
+                <w:webHidden/>
+              </w:rPr>
+              <w:fldChar w:fldCharType="begin"/>
+            </w:r>
+            <w:r>
+              <w:rPr>
+                <w:noProof/>
+                <w:webHidden/>
+              </w:rPr>
+              <w:instrText xml:space="preserve"> PAGEREF _Toc230230095 \h </w:instrText>
+            </w:r>
+            <w:r>
+              <w:rPr>
+                <w:noProof/>
+                <w:webHidden/>
+              </w:rPr>
+            </w:r>
+            <w:r>
+              <w:rPr>
+                <w:noProof/>
+                <w:webHidden/>
+              </w:rPr>
+              <w:fldChar w:fldCharType="separate"/>
+            </w:r>
+            <w:r>
+              <w:rPr>
+                <w:noProof/>
+                <w:webHidden/>
+              </w:rPr>
+              <w:t>28</w:t>
+            </w:r>
+            <w:r>
+              <w:rPr>
+                <w:noProof/>
+                <w:webHidden/>
+              </w:rPr>
+              <w:fldChar w:fldCharType="end"/>
+            </w:r>
+          </w:hyperlink>
+        </w:p>
+        <w:p>
+          <w:pPr>
+            <w:pStyle w:val="Saturs3"/>
+            <w:rPr>
+              <w:rFonts w:asciiTheme="minorHAnsi" w:eastAsiaTheme="minorEastAsia" w:hAnsiTheme="minorHAnsi" w:cstheme="minorBidi"/>
+              <w:noProof/>
+              <w:kern w:val="2"/>
+              <w:lang w:eastAsia="lv-LV"/>
+            </w:rPr>
+          </w:pPr>
+          <w:hyperlink w:anchor="_Toc230230096" w:history="1">
+            <w:r>
+              <w:rPr>
+                <w:rStyle w:val="Hipersaite"/>
+                <w:noProof/>
+              </w:rPr>
+              <w:t>4.1.7.</w:t>
+            </w:r>
+            <w:r>
+              <w:rPr>
+                <w:rFonts w:asciiTheme="minorHAnsi" w:eastAsiaTheme="minorEastAsia" w:hAnsiTheme="minorHAnsi" w:cstheme="minorBidi"/>
+                <w:noProof/>
+                <w:kern w:val="2"/>
+                <w:lang w:eastAsia="lv-LV"/>
+              </w:rPr>
+              <w:tab/>
+            </w:r>
+            <w:r>
+              <w:rPr>
+                <w:rStyle w:val="Hipersaite"/>
+                <w:noProof/>
+              </w:rPr>
+              <w:t>Objektu klase</w:t>
+            </w:r>
+            <w:r>
+              <w:rPr>
+                <w:noProof/>
+                <w:webHidden/>
+              </w:rPr>
+              <w:tab/>
+            </w:r>
+            <w:r>
+              <w:rPr>
+                <w:noProof/>
+                <w:webHidden/>
+              </w:rPr>
+              <w:fldChar w:fldCharType="begin"/>
+            </w:r>
+            <w:r>
+              <w:rPr>
+                <w:noProof/>
+                <w:webHidden/>
+              </w:rPr>
+              <w:instrText xml:space="preserve"> PAGEREF _Toc230230096 \h </w:instrText>
+            </w:r>
+            <w:r>
+              <w:rPr>
+                <w:noProof/>
+                <w:webHidden/>
+              </w:rPr>
+            </w:r>
+            <w:r>
+              <w:rPr>
+                <w:noProof/>
+                <w:webHidden/>
+              </w:rPr>
+              <w:fldChar w:fldCharType="separate"/>
+            </w:r>
+            <w:r>
+              <w:rPr>
+                <w:noProof/>
+                <w:webHidden/>
+              </w:rPr>
+              <w:t>29</w:t>
+            </w:r>
+            <w:r>
+              <w:rPr>
+                <w:noProof/>
+                <w:webHidden/>
+              </w:rPr>
+              <w:fldChar w:fldCharType="end"/>
+            </w:r>
+          </w:hyperlink>
+        </w:p>
+        <w:p>
+          <w:pPr>
+            <w:pStyle w:val="Saturs3"/>
+            <w:rPr>
+              <w:rFonts w:asciiTheme="minorHAnsi" w:eastAsiaTheme="minorEastAsia" w:hAnsiTheme="minorHAnsi" w:cstheme="minorBidi"/>
+              <w:noProof/>
+              <w:kern w:val="2"/>
+              <w:lang w:eastAsia="lv-LV"/>
+            </w:rPr>
+          </w:pPr>
+          <w:hyperlink w:anchor="_Toc230230097" w:history="1">
+            <w:r>
+              <w:rPr>
+                <w:rStyle w:val="Hipersaite"/>
+                <w:noProof/>
+              </w:rPr>
+              <w:t>4.1.8.</w:t>
+            </w:r>
+            <w:r>
+              <w:rPr>
+                <w:rFonts w:asciiTheme="minorHAnsi" w:eastAsiaTheme="minorEastAsia" w:hAnsiTheme="minorHAnsi" w:cstheme="minorBidi"/>
+                <w:noProof/>
+                <w:kern w:val="2"/>
+                <w:lang w:eastAsia="lv-LV"/>
+              </w:rPr>
+              <w:tab/>
+            </w:r>
+            <w:r>
+              <w:rPr>
+                <w:rStyle w:val="Hipersaite"/>
+                <w:noProof/>
+              </w:rPr>
+              <w:t>Lādiņš</w:t>
+            </w:r>
+            <w:r>
+              <w:rPr>
+                <w:noProof/>
+                <w:webHidden/>
+              </w:rPr>
+              <w:tab/>
+            </w:r>
+            <w:r>
+              <w:rPr>
+                <w:noProof/>
+                <w:webHidden/>
+              </w:rPr>
+              <w:fldChar w:fldCharType="begin"/>
+            </w:r>
+            <w:r>
+              <w:rPr>
+                <w:noProof/>
+                <w:webHidden/>
+              </w:rPr>
+              <w:instrText xml:space="preserve"> PAGEREF _Toc230230097 \h </w:instrText>
+            </w:r>
+            <w:r>
+              <w:rPr>
+                <w:noProof/>
+                <w:webHidden/>
+              </w:rPr>
+            </w:r>
+            <w:r>
+              <w:rPr>
+                <w:noProof/>
+                <w:webHidden/>
+              </w:rPr>
+              <w:fldChar w:fldCharType="separate"/>
+            </w:r>
+            <w:r>
+              <w:rPr>
+                <w:noProof/>
+                <w:webHidden/>
+              </w:rPr>
+              <w:t>30</w:t>
             </w:r>
             <w:r>
               <w:rPr>
@@ -2900,7 +3404,7 @@
               <w:lang w:eastAsia="lv-LV"/>
             </w:rPr>
           </w:pPr>
-          <w:hyperlink w:anchor="_Toc225723257" w:history="1">
+          <w:hyperlink w:anchor="_Toc230230098" w:history="1">
             <w:r>
               <w:rPr>
                 <w:rStyle w:val="Hipersaite"/>
@@ -2943,7 +3447,7 @@
                 <w:noProof/>
                 <w:webHidden/>
               </w:rPr>
-              <w:instrText xml:space="preserve"> PAGEREF _Toc225723257 \h </w:instrText>
+              <w:instrText xml:space="preserve"> PAGEREF _Toc230230098 \h </w:instrText>
             </w:r>
             <w:r>
               <w:rPr>
@@ -2963,7 +3467,175 @@
                 <w:noProof/>
                 <w:webHidden/>
               </w:rPr>
-              <w:t>21</w:t>
+              <w:t>31</w:t>
+            </w:r>
+            <w:r>
+              <w:rPr>
+                <w:noProof/>
+                <w:webHidden/>
+              </w:rPr>
+              <w:fldChar w:fldCharType="end"/>
+            </w:r>
+          </w:hyperlink>
+        </w:p>
+        <w:p>
+          <w:pPr>
+            <w:pStyle w:val="Saturs3"/>
+            <w:rPr>
+              <w:rFonts w:asciiTheme="minorHAnsi" w:eastAsiaTheme="minorEastAsia" w:hAnsiTheme="minorHAnsi" w:cstheme="minorBidi"/>
+              <w:noProof/>
+              <w:kern w:val="2"/>
+              <w:lang w:eastAsia="lv-LV"/>
+            </w:rPr>
+          </w:pPr>
+          <w:hyperlink w:anchor="_Toc230230099" w:history="1">
+            <w:r>
+              <w:rPr>
+                <w:rStyle w:val="Hipersaite"/>
+                <w:noProof/>
+              </w:rPr>
+              <w:t>4.2.1.</w:t>
+            </w:r>
+            <w:r>
+              <w:rPr>
+                <w:rFonts w:asciiTheme="minorHAnsi" w:eastAsiaTheme="minorEastAsia" w:hAnsiTheme="minorHAnsi" w:cstheme="minorBidi"/>
+                <w:noProof/>
+                <w:kern w:val="2"/>
+                <w:lang w:eastAsia="lv-LV"/>
+              </w:rPr>
+              <w:tab/>
+            </w:r>
+            <w:r>
+              <w:rPr>
+                <w:rStyle w:val="Hipersaite"/>
+                <w:noProof/>
+              </w:rPr>
+              <w:t>Ainu stadiju gaita</w:t>
+            </w:r>
+            <w:r>
+              <w:rPr>
+                <w:noProof/>
+                <w:webHidden/>
+              </w:rPr>
+              <w:tab/>
+            </w:r>
+            <w:r>
+              <w:rPr>
+                <w:noProof/>
+                <w:webHidden/>
+              </w:rPr>
+              <w:fldChar w:fldCharType="begin"/>
+            </w:r>
+            <w:r>
+              <w:rPr>
+                <w:noProof/>
+                <w:webHidden/>
+              </w:rPr>
+              <w:instrText xml:space="preserve"> PAGEREF _Toc230230099 \h </w:instrText>
+            </w:r>
+            <w:r>
+              <w:rPr>
+                <w:noProof/>
+                <w:webHidden/>
+              </w:rPr>
+            </w:r>
+            <w:r>
+              <w:rPr>
+                <w:noProof/>
+                <w:webHidden/>
+              </w:rPr>
+              <w:fldChar w:fldCharType="separate"/>
+            </w:r>
+            <w:r>
+              <w:rPr>
+                <w:noProof/>
+                <w:webHidden/>
+              </w:rPr>
+              <w:t>31</w:t>
+            </w:r>
+            <w:r>
+              <w:rPr>
+                <w:noProof/>
+                <w:webHidden/>
+              </w:rPr>
+              <w:fldChar w:fldCharType="end"/>
+            </w:r>
+          </w:hyperlink>
+        </w:p>
+        <w:p>
+          <w:pPr>
+            <w:pStyle w:val="Saturs3"/>
+            <w:rPr>
+              <w:rFonts w:asciiTheme="minorHAnsi" w:eastAsiaTheme="minorEastAsia" w:hAnsiTheme="minorHAnsi" w:cstheme="minorBidi"/>
+              <w:noProof/>
+              <w:kern w:val="2"/>
+              <w:lang w:eastAsia="lv-LV"/>
+            </w:rPr>
+          </w:pPr>
+          <w:hyperlink w:anchor="_Toc230230100" w:history="1">
+            <w:r>
+              <w:rPr>
+                <w:rStyle w:val="Hipersaite"/>
+                <w:noProof/>
+              </w:rPr>
+              <w:t>4.2.2.</w:t>
+            </w:r>
+            <w:r>
+              <w:rPr>
+                <w:rFonts w:asciiTheme="minorHAnsi" w:eastAsiaTheme="minorEastAsia" w:hAnsiTheme="minorHAnsi" w:cstheme="minorBidi"/>
+                <w:noProof/>
+                <w:kern w:val="2"/>
+                <w:lang w:eastAsia="lv-LV"/>
+              </w:rPr>
+              <w:tab/>
+            </w:r>
+            <w:r>
+              <w:rPr>
+                <w:rStyle w:val="Hipersaite"/>
+                <w:noProof/>
+              </w:rPr>
+              <w:t>Spēles laukuma stadijas</w:t>
+            </w:r>
+            <w:r>
+              <w:rPr>
+                <w:noProof/>
+                <w:webHidden/>
+              </w:rPr>
+              <w:tab/>
+            </w:r>
+            <w:r>
+              <w:rPr>
+                <w:noProof/>
+                <w:webHidden/>
+              </w:rPr>
+              <w:fldChar w:fldCharType="begin"/>
+            </w:r>
+            <w:r>
+              <w:rPr>
+                <w:noProof/>
+                <w:webHidden/>
+              </w:rPr>
+              <w:instrText xml:space="preserve"> PAGEREF _Toc230230100 \h </w:instrText>
+            </w:r>
+            <w:r>
+              <w:rPr>
+                <w:noProof/>
+                <w:webHidden/>
+              </w:rPr>
+            </w:r>
+            <w:r>
+              <w:rPr>
+                <w:noProof/>
+                <w:webHidden/>
+              </w:rPr>
+              <w:fldChar w:fldCharType="separate"/>
+            </w:r>
+            <w:r>
+              <w:rPr>
+                <w:noProof/>
+                <w:webHidden/>
+              </w:rPr>
+              <w:t>31</w:t>
             </w:r>
             <w:r>
               <w:rPr>
@@ -2984,7 +3656,7 @@
               <w:lang w:eastAsia="lv-LV"/>
             </w:rPr>
           </w:pPr>
-          <w:hyperlink w:anchor="_Toc225723258" w:history="1">
+          <w:hyperlink w:anchor="_Toc230230101" w:history="1">
             <w:r>
               <w:rPr>
                 <w:rStyle w:val="Hipersaite"/>
@@ -3027,7 +3699,7 @@
                 <w:noProof/>
                 <w:webHidden/>
               </w:rPr>
-              <w:instrText xml:space="preserve"> PAGEREF _Toc225723258 \h </w:instrText>
+              <w:instrText xml:space="preserve"> PAGEREF _Toc230230101 \h </w:instrText>
             </w:r>
             <w:r>
               <w:rPr>
@@ -3047,7 +3719,343 @@
                 <w:noProof/>
                 <w:webHidden/>
               </w:rPr>
-              <w:t>21</w:t>
+              <w:t>32</w:t>
+            </w:r>
+            <w:r>
+              <w:rPr>
+                <w:noProof/>
+                <w:webHidden/>
+              </w:rPr>
+              <w:fldChar w:fldCharType="end"/>
+            </w:r>
+          </w:hyperlink>
+        </w:p>
+        <w:p>
+          <w:pPr>
+            <w:pStyle w:val="Saturs3"/>
+            <w:rPr>
+              <w:rFonts w:asciiTheme="minorHAnsi" w:eastAsiaTheme="minorEastAsia" w:hAnsiTheme="minorHAnsi" w:cstheme="minorBidi"/>
+              <w:noProof/>
+              <w:kern w:val="2"/>
+              <w:lang w:eastAsia="lv-LV"/>
+            </w:rPr>
+          </w:pPr>
+          <w:hyperlink w:anchor="_Toc230230102" w:history="1">
+            <w:r>
+              <w:rPr>
+                <w:rStyle w:val="Hipersaite"/>
+                <w:noProof/>
+              </w:rPr>
+              <w:t>4.3.1.</w:t>
+            </w:r>
+            <w:r>
+              <w:rPr>
+                <w:rFonts w:asciiTheme="minorHAnsi" w:eastAsiaTheme="minorEastAsia" w:hAnsiTheme="minorHAnsi" w:cstheme="minorBidi"/>
+                <w:noProof/>
+                <w:kern w:val="2"/>
+                <w:lang w:eastAsia="lv-LV"/>
+              </w:rPr>
+              <w:tab/>
+            </w:r>
+            <w:r>
+              <w:rPr>
+                <w:rStyle w:val="Hipersaite"/>
+                <w:noProof/>
+              </w:rPr>
+              <w:t>Līmeņu kopa un līmeņa īpašības</w:t>
+            </w:r>
+            <w:r>
+              <w:rPr>
+                <w:noProof/>
+                <w:webHidden/>
+              </w:rPr>
+              <w:tab/>
+            </w:r>
+            <w:r>
+              <w:rPr>
+                <w:noProof/>
+                <w:webHidden/>
+              </w:rPr>
+              <w:fldChar w:fldCharType="begin"/>
+            </w:r>
+            <w:r>
+              <w:rPr>
+                <w:noProof/>
+                <w:webHidden/>
+              </w:rPr>
+              <w:instrText xml:space="preserve"> PAGEREF _Toc230230102 \h </w:instrText>
+            </w:r>
+            <w:r>
+              <w:rPr>
+                <w:noProof/>
+                <w:webHidden/>
+              </w:rPr>
+            </w:r>
+            <w:r>
+              <w:rPr>
+                <w:noProof/>
+                <w:webHidden/>
+              </w:rPr>
+              <w:fldChar w:fldCharType="separate"/>
+            </w:r>
+            <w:r>
+              <w:rPr>
+                <w:noProof/>
+                <w:webHidden/>
+              </w:rPr>
+              <w:t>32</w:t>
+            </w:r>
+            <w:r>
+              <w:rPr>
+                <w:noProof/>
+                <w:webHidden/>
+              </w:rPr>
+              <w:fldChar w:fldCharType="end"/>
+            </w:r>
+          </w:hyperlink>
+        </w:p>
+        <w:p>
+          <w:pPr>
+            <w:pStyle w:val="Saturs3"/>
+            <w:rPr>
+              <w:rFonts w:asciiTheme="minorHAnsi" w:eastAsiaTheme="minorEastAsia" w:hAnsiTheme="minorHAnsi" w:cstheme="minorBidi"/>
+              <w:noProof/>
+              <w:kern w:val="2"/>
+              <w:lang w:eastAsia="lv-LV"/>
+            </w:rPr>
+          </w:pPr>
+          <w:hyperlink w:anchor="_Toc230230103" w:history="1">
+            <w:r>
+              <w:rPr>
+                <w:rStyle w:val="Hipersaite"/>
+                <w:noProof/>
+              </w:rPr>
+              <w:t>4.3.2.</w:t>
+            </w:r>
+            <w:r>
+              <w:rPr>
+                <w:rFonts w:asciiTheme="minorHAnsi" w:eastAsiaTheme="minorEastAsia" w:hAnsiTheme="minorHAnsi" w:cstheme="minorBidi"/>
+                <w:noProof/>
+                <w:kern w:val="2"/>
+                <w:lang w:eastAsia="lv-LV"/>
+              </w:rPr>
+              <w:tab/>
+            </w:r>
+            <w:r>
+              <w:rPr>
+                <w:rStyle w:val="Hipersaite"/>
+                <w:noProof/>
+              </w:rPr>
+              <w:t>Līmeņa punkti</w:t>
+            </w:r>
+            <w:r>
+              <w:rPr>
+                <w:noProof/>
+                <w:webHidden/>
+              </w:rPr>
+              <w:tab/>
+            </w:r>
+            <w:r>
+              <w:rPr>
+                <w:noProof/>
+                <w:webHidden/>
+              </w:rPr>
+              <w:fldChar w:fldCharType="begin"/>
+            </w:r>
+            <w:r>
+              <w:rPr>
+                <w:noProof/>
+                <w:webHidden/>
+              </w:rPr>
+              <w:instrText xml:space="preserve"> PAGEREF _Toc230230103 \h </w:instrText>
+            </w:r>
+            <w:r>
+              <w:rPr>
+                <w:noProof/>
+                <w:webHidden/>
+              </w:rPr>
+            </w:r>
+            <w:r>
+              <w:rPr>
+                <w:noProof/>
+                <w:webHidden/>
+              </w:rPr>
+              <w:fldChar w:fldCharType="separate"/>
+            </w:r>
+            <w:r>
+              <w:rPr>
+                <w:noProof/>
+                <w:webHidden/>
+              </w:rPr>
+              <w:t>32</w:t>
+            </w:r>
+            <w:r>
+              <w:rPr>
+                <w:noProof/>
+                <w:webHidden/>
+              </w:rPr>
+              <w:fldChar w:fldCharType="end"/>
+            </w:r>
+          </w:hyperlink>
+        </w:p>
+        <w:p>
+          <w:pPr>
+            <w:pStyle w:val="Saturs3"/>
+            <w:rPr>
+              <w:rFonts w:asciiTheme="minorHAnsi" w:eastAsiaTheme="minorEastAsia" w:hAnsiTheme="minorHAnsi" w:cstheme="minorBidi"/>
+              <w:noProof/>
+              <w:kern w:val="2"/>
+              <w:lang w:eastAsia="lv-LV"/>
+            </w:rPr>
+          </w:pPr>
+          <w:hyperlink w:anchor="_Toc230230104" w:history="1">
+            <w:r>
+              <w:rPr>
+                <w:rStyle w:val="Hipersaite"/>
+                <w:noProof/>
+              </w:rPr>
+              <w:t>4.3.3.</w:t>
+            </w:r>
+            <w:r>
+              <w:rPr>
+                <w:rFonts w:asciiTheme="minorHAnsi" w:eastAsiaTheme="minorEastAsia" w:hAnsiTheme="minorHAnsi" w:cstheme="minorBidi"/>
+                <w:noProof/>
+                <w:kern w:val="2"/>
+                <w:lang w:eastAsia="lv-LV"/>
+              </w:rPr>
+              <w:tab/>
+            </w:r>
+            <w:r>
+              <w:rPr>
+                <w:rStyle w:val="Hipersaite"/>
+                <w:noProof/>
+              </w:rPr>
+              <w:t>Kartes un tās apakškomponenšu dati</w:t>
+            </w:r>
+            <w:r>
+              <w:rPr>
+                <w:noProof/>
+                <w:webHidden/>
+              </w:rPr>
+              <w:tab/>
+            </w:r>
+            <w:r>
+              <w:rPr>
+                <w:noProof/>
+                <w:webHidden/>
+              </w:rPr>
+              <w:fldChar w:fldCharType="begin"/>
+            </w:r>
+            <w:r>
+              <w:rPr>
+                <w:noProof/>
+                <w:webHidden/>
+              </w:rPr>
+              <w:instrText xml:space="preserve"> PAGEREF _Toc230230104 \h </w:instrText>
+            </w:r>
+            <w:r>
+              <w:rPr>
+                <w:noProof/>
+                <w:webHidden/>
+              </w:rPr>
+            </w:r>
+            <w:r>
+              <w:rPr>
+                <w:noProof/>
+                <w:webHidden/>
+              </w:rPr>
+              <w:fldChar w:fldCharType="separate"/>
+            </w:r>
+            <w:r>
+              <w:rPr>
+                <w:noProof/>
+                <w:webHidden/>
+              </w:rPr>
+              <w:t>33</w:t>
+            </w:r>
+            <w:r>
+              <w:rPr>
+                <w:noProof/>
+                <w:webHidden/>
+              </w:rPr>
+              <w:fldChar w:fldCharType="end"/>
+            </w:r>
+          </w:hyperlink>
+        </w:p>
+        <w:p>
+          <w:pPr>
+            <w:pStyle w:val="Saturs3"/>
+            <w:rPr>
+              <w:rFonts w:asciiTheme="minorHAnsi" w:eastAsiaTheme="minorEastAsia" w:hAnsiTheme="minorHAnsi" w:cstheme="minorBidi"/>
+              <w:noProof/>
+              <w:kern w:val="2"/>
+              <w:lang w:eastAsia="lv-LV"/>
+            </w:rPr>
+          </w:pPr>
+          <w:hyperlink w:anchor="_Toc230230105" w:history="1">
+            <w:r>
+              <w:rPr>
+                <w:rStyle w:val="Hipersaite"/>
+                <w:noProof/>
+              </w:rPr>
+              <w:t>4.3.4.</w:t>
+            </w:r>
+            <w:r>
+              <w:rPr>
+                <w:rFonts w:asciiTheme="minorHAnsi" w:eastAsiaTheme="minorEastAsia" w:hAnsiTheme="minorHAnsi" w:cstheme="minorBidi"/>
+                <w:noProof/>
+                <w:kern w:val="2"/>
+                <w:lang w:eastAsia="lv-LV"/>
+              </w:rPr>
+              <w:tab/>
+            </w:r>
+            <w:r>
+              <w:rPr>
+                <w:rStyle w:val="Hipersaite"/>
+                <w:noProof/>
+              </w:rPr>
+              <w:t>Kartes objektu un tās mantotāju īpašības</w:t>
+            </w:r>
+            <w:r>
+              <w:rPr>
+                <w:noProof/>
+                <w:webHidden/>
+              </w:rPr>
+              <w:tab/>
+            </w:r>
+            <w:r>
+              <w:rPr>
+                <w:noProof/>
+                <w:webHidden/>
+              </w:rPr>
+              <w:fldChar w:fldCharType="begin"/>
+            </w:r>
+            <w:r>
+              <w:rPr>
+                <w:noProof/>
+                <w:webHidden/>
+              </w:rPr>
+              <w:instrText xml:space="preserve"> PAGEREF _Toc230230105 \h </w:instrText>
+            </w:r>
+            <w:r>
+              <w:rPr>
+                <w:noProof/>
+                <w:webHidden/>
+              </w:rPr>
+            </w:r>
+            <w:r>
+              <w:rPr>
+                <w:noProof/>
+                <w:webHidden/>
+              </w:rPr>
+              <w:fldChar w:fldCharType="separate"/>
+            </w:r>
+            <w:r>
+              <w:rPr>
+                <w:noProof/>
+                <w:webHidden/>
+              </w:rPr>
+              <w:t>33</w:t>
             </w:r>
             <w:r>
               <w:rPr>
@@ -3068,7 +4076,7 @@
               <w:lang w:eastAsia="lv-LV"/>
             </w:rPr>
           </w:pPr>
-          <w:hyperlink w:anchor="_Toc225723259" w:history="1">
+          <w:hyperlink w:anchor="_Toc230230106" w:history="1">
             <w:r>
               <w:rPr>
                 <w:rStyle w:val="Hipersaite"/>
@@ -3111,7 +4119,7 @@
                 <w:noProof/>
                 <w:webHidden/>
               </w:rPr>
-              <w:instrText xml:space="preserve"> PAGEREF _Toc225723259 \h </w:instrText>
+              <w:instrText xml:space="preserve"> PAGEREF _Toc230230106 \h </w:instrText>
             </w:r>
             <w:r>
               <w:rPr>
@@ -3131,7 +4139,7 @@
                 <w:noProof/>
                 <w:webHidden/>
               </w:rPr>
-              <w:t>22</w:t>
+              <w:t>34</w:t>
             </w:r>
             <w:r>
               <w:rPr>
@@ -3152,7 +4160,7 @@
               <w:lang w:eastAsia="lv-LV"/>
             </w:rPr>
           </w:pPr>
-          <w:hyperlink w:anchor="_Toc225723260" w:history="1">
+          <w:hyperlink w:anchor="_Toc230230107" w:history="1">
             <w:r>
               <w:rPr>
                 <w:rStyle w:val="Hipersaite"/>
@@ -3195,7 +4203,7 @@
                 <w:noProof/>
                 <w:webHidden/>
               </w:rPr>
-              <w:instrText xml:space="preserve"> PAGEREF _Toc225723260 \h </w:instrText>
+              <w:instrText xml:space="preserve"> PAGEREF _Toc230230107 \h </w:instrText>
             </w:r>
             <w:r>
               <w:rPr>
@@ -3215,7 +4223,175 @@
                 <w:noProof/>
                 <w:webHidden/>
               </w:rPr>
-              <w:t>23</w:t>
+              <w:t>35</w:t>
+            </w:r>
+            <w:r>
+              <w:rPr>
+                <w:noProof/>
+                <w:webHidden/>
+              </w:rPr>
+              <w:fldChar w:fldCharType="end"/>
+            </w:r>
+          </w:hyperlink>
+        </w:p>
+        <w:p>
+          <w:pPr>
+            <w:pStyle w:val="Saturs2"/>
+            <w:rPr>
+              <w:rFonts w:asciiTheme="minorHAnsi" w:eastAsiaTheme="minorEastAsia" w:hAnsiTheme="minorHAnsi" w:cstheme="minorBidi"/>
+              <w:noProof/>
+              <w:kern w:val="2"/>
+              <w:lang w:eastAsia="lv-LV"/>
+            </w:rPr>
+          </w:pPr>
+          <w:hyperlink w:anchor="_Toc230230108" w:history="1">
+            <w:r>
+              <w:rPr>
+                <w:rStyle w:val="Hipersaite"/>
+                <w:noProof/>
+              </w:rPr>
+              <w:t>6.1.</w:t>
+            </w:r>
+            <w:r>
+              <w:rPr>
+                <w:rFonts w:asciiTheme="minorHAnsi" w:eastAsiaTheme="minorEastAsia" w:hAnsiTheme="minorHAnsi" w:cstheme="minorBidi"/>
+                <w:noProof/>
+                <w:kern w:val="2"/>
+                <w:lang w:eastAsia="lv-LV"/>
+              </w:rPr>
+              <w:tab/>
+            </w:r>
+            <w:r>
+              <w:rPr>
+                <w:rStyle w:val="Hipersaite"/>
+                <w:noProof/>
+              </w:rPr>
+              <w:t>Metodoloģija</w:t>
+            </w:r>
+            <w:r>
+              <w:rPr>
+                <w:noProof/>
+                <w:webHidden/>
+              </w:rPr>
+              <w:tab/>
+            </w:r>
+            <w:r>
+              <w:rPr>
+                <w:noProof/>
+                <w:webHidden/>
+              </w:rPr>
+              <w:fldChar w:fldCharType="begin"/>
+            </w:r>
+            <w:r>
+              <w:rPr>
+                <w:noProof/>
+                <w:webHidden/>
+              </w:rPr>
+              <w:instrText xml:space="preserve"> PAGEREF _Toc230230108 \h </w:instrText>
+            </w:r>
+            <w:r>
+              <w:rPr>
+                <w:noProof/>
+                <w:webHidden/>
+              </w:rPr>
+            </w:r>
+            <w:r>
+              <w:rPr>
+                <w:noProof/>
+                <w:webHidden/>
+              </w:rPr>
+              <w:fldChar w:fldCharType="separate"/>
+            </w:r>
+            <w:r>
+              <w:rPr>
+                <w:noProof/>
+                <w:webHidden/>
+              </w:rPr>
+              <w:t>35</w:t>
+            </w:r>
+            <w:r>
+              <w:rPr>
+                <w:noProof/>
+                <w:webHidden/>
+              </w:rPr>
+              <w:fldChar w:fldCharType="end"/>
+            </w:r>
+          </w:hyperlink>
+        </w:p>
+        <w:p>
+          <w:pPr>
+            <w:pStyle w:val="Saturs2"/>
+            <w:rPr>
+              <w:rFonts w:asciiTheme="minorHAnsi" w:eastAsiaTheme="minorEastAsia" w:hAnsiTheme="minorHAnsi" w:cstheme="minorBidi"/>
+              <w:noProof/>
+              <w:kern w:val="2"/>
+              <w:lang w:eastAsia="lv-LV"/>
+            </w:rPr>
+          </w:pPr>
+          <w:hyperlink w:anchor="_Toc230230109" w:history="1">
+            <w:r>
+              <w:rPr>
+                <w:rStyle w:val="Hipersaite"/>
+                <w:noProof/>
+              </w:rPr>
+              <w:t>6.2.</w:t>
+            </w:r>
+            <w:r>
+              <w:rPr>
+                <w:rFonts w:asciiTheme="minorHAnsi" w:eastAsiaTheme="minorEastAsia" w:hAnsiTheme="minorHAnsi" w:cstheme="minorBidi"/>
+                <w:noProof/>
+                <w:kern w:val="2"/>
+                <w:lang w:eastAsia="lv-LV"/>
+              </w:rPr>
+              <w:tab/>
+            </w:r>
+            <w:r>
+              <w:rPr>
+                <w:rStyle w:val="Hipersaite"/>
+                <w:noProof/>
+              </w:rPr>
+              <w:t>Testpiemēri</w:t>
+            </w:r>
+            <w:r>
+              <w:rPr>
+                <w:noProof/>
+                <w:webHidden/>
+              </w:rPr>
+              <w:tab/>
+            </w:r>
+            <w:r>
+              <w:rPr>
+                <w:noProof/>
+                <w:webHidden/>
+              </w:rPr>
+              <w:fldChar w:fldCharType="begin"/>
+            </w:r>
+            <w:r>
+              <w:rPr>
+                <w:noProof/>
+                <w:webHidden/>
+              </w:rPr>
+              <w:instrText xml:space="preserve"> PAGEREF _Toc230230109 \h </w:instrText>
+            </w:r>
+            <w:r>
+              <w:rPr>
+                <w:noProof/>
+                <w:webHidden/>
+              </w:rPr>
+            </w:r>
+            <w:r>
+              <w:rPr>
+                <w:noProof/>
+                <w:webHidden/>
+              </w:rPr>
+              <w:fldChar w:fldCharType="separate"/>
+            </w:r>
+            <w:r>
+              <w:rPr>
+                <w:noProof/>
+                <w:webHidden/>
+              </w:rPr>
+              <w:t>35</w:t>
             </w:r>
             <w:r>
               <w:rPr>
@@ -3268,7 +4444,7 @@
           <w:numId w:val="0"/>
         </w:numPr>
       </w:pPr>
-      <w:bookmarkStart w:id="0" w:name="_Toc225723225"/>
+      <w:bookmarkStart w:id="0" w:name="_Toc230230060"/>
       <w:r>
         <w:lastRenderedPageBreak/>
         <w:t>Ievads</w:t>
@@ -3394,7 +4570,7 @@
       <w:pPr>
         <w:pStyle w:val="Virsraksts1"/>
       </w:pPr>
-      <w:bookmarkStart w:id="1" w:name="_Toc225723226"/>
+      <w:bookmarkStart w:id="1" w:name="_Toc230230061"/>
       <w:r>
         <w:lastRenderedPageBreak/>
         <w:t>Uzdevuma formulējums</w:t>
@@ -3405,7 +4581,7 @@
       <w:pPr>
         <w:pStyle w:val="Virsraksts2"/>
       </w:pPr>
-      <w:bookmarkStart w:id="2" w:name="_Toc225723227"/>
+      <w:bookmarkStart w:id="2" w:name="_Toc230230062"/>
       <w:r>
         <w:t>Vispārīgais formulējums</w:t>
       </w:r>
@@ -3507,7 +4683,7 @@
       <w:pPr>
         <w:pStyle w:val="Virsraksts2"/>
       </w:pPr>
-      <w:bookmarkStart w:id="3" w:name="_Toc225723228"/>
+      <w:bookmarkStart w:id="3" w:name="_Toc230230063"/>
       <w:r>
         <w:t>Projektēšanas formulējums</w:t>
       </w:r>
@@ -3551,7 +4727,7 @@
       <w:pPr>
         <w:pStyle w:val="Virsraksts2"/>
       </w:pPr>
-      <w:bookmarkStart w:id="4" w:name="_Toc225723229"/>
+      <w:bookmarkStart w:id="4" w:name="_Toc230230064"/>
       <w:r>
         <w:t>Izstrādes formulējums</w:t>
       </w:r>
@@ -3577,7 +4753,7 @@
       <w:pPr>
         <w:pStyle w:val="Virsraksts2"/>
       </w:pPr>
-      <w:bookmarkStart w:id="5" w:name="_Toc225723230"/>
+      <w:bookmarkStart w:id="5" w:name="_Toc230230065"/>
       <w:r>
         <w:lastRenderedPageBreak/>
         <w:t>Testēšanas formulējums</w:t>
@@ -3611,7 +4787,7 @@
       <w:pPr>
         <w:pStyle w:val="Virsraksts1"/>
       </w:pPr>
-      <w:bookmarkStart w:id="6" w:name="_Toc225723231"/>
+      <w:bookmarkStart w:id="6" w:name="_Toc230230066"/>
       <w:r>
         <w:lastRenderedPageBreak/>
         <w:t>Programmatūras prasību specifikācija</w:t>
@@ -3627,7 +4803,7 @@
       <w:pPr>
         <w:pStyle w:val="Virsraksts2"/>
       </w:pPr>
-      <w:bookmarkStart w:id="7" w:name="_Toc225723232"/>
+      <w:bookmarkStart w:id="7" w:name="_Toc230230067"/>
       <w:r>
         <w:t>Projekta perspektīva</w:t>
       </w:r>
@@ -3654,7 +4830,7 @@
       <w:pPr>
         <w:pStyle w:val="Virsraksts2"/>
       </w:pPr>
-      <w:bookmarkStart w:id="8" w:name="_Toc225723233"/>
+      <w:bookmarkStart w:id="8" w:name="_Toc230230068"/>
       <w:r>
         <w:t>Funkcionālās prasības</w:t>
       </w:r>
@@ -3664,7 +4840,7 @@
       <w:pPr>
         <w:pStyle w:val="Virsraksts3"/>
       </w:pPr>
-      <w:bookmarkStart w:id="9" w:name="_Toc225723234"/>
+      <w:bookmarkStart w:id="9" w:name="_Toc230230069"/>
       <w:r>
         <w:t>Galvenā izvēlne</w:t>
       </w:r>
@@ -4155,7 +5331,7 @@
       <w:pPr>
         <w:pStyle w:val="Virsraksts3"/>
       </w:pPr>
-      <w:bookmarkStart w:id="10" w:name="_Toc225723235"/>
+      <w:bookmarkStart w:id="10" w:name="_Toc230230070"/>
       <w:r>
         <w:t>Līmeņu atlases aina</w:t>
       </w:r>
@@ -4630,7 +5806,7 @@
       <w:pPr>
         <w:pStyle w:val="Virsraksts3"/>
       </w:pPr>
-      <w:bookmarkStart w:id="12" w:name="_Toc225723236"/>
+      <w:bookmarkStart w:id="12" w:name="_Toc230230071"/>
       <w:r>
         <w:lastRenderedPageBreak/>
         <w:t>Spēles laukuma aina</w:t>
@@ -7579,7 +8755,7 @@
       <w:pPr>
         <w:pStyle w:val="Virsraksts2"/>
       </w:pPr>
-      <w:bookmarkStart w:id="13" w:name="_Toc225723237"/>
+      <w:bookmarkStart w:id="13" w:name="_Toc230230072"/>
       <w:r>
         <w:lastRenderedPageBreak/>
         <w:t>Nefunkcionālās prasības</w:t>
@@ -7590,7 +8766,7 @@
       <w:pPr>
         <w:pStyle w:val="Virsraksts3"/>
       </w:pPr>
-      <w:bookmarkStart w:id="14" w:name="_Toc225723238"/>
+      <w:bookmarkStart w:id="14" w:name="_Toc230230073"/>
       <w:r>
         <w:t>Palaišana un veiktspēja</w:t>
       </w:r>
@@ -7635,6 +8811,7 @@
       <w:pPr>
         <w:pStyle w:val="Virsraksts3"/>
       </w:pPr>
+      <w:bookmarkStart w:id="15" w:name="_Toc230230074"/>
       <w:r>
         <w:t xml:space="preserve">Lietotāja </w:t>
       </w:r>
@@ -7642,6 +8819,7 @@
       <w:r>
         <w:t>saskarne</w:t>
       </w:r>
+      <w:bookmarkEnd w:id="15"/>
       <w:proofErr w:type="spellEnd"/>
     </w:p>
     <w:p>
@@ -7714,11 +8892,11 @@
       <w:pPr>
         <w:pStyle w:val="Virsraksts3"/>
       </w:pPr>
-      <w:bookmarkStart w:id="15" w:name="_Toc225723240"/>
+      <w:bookmarkStart w:id="16" w:name="_Toc230230075"/>
       <w:r>
         <w:t>Datu drošība</w:t>
       </w:r>
-      <w:bookmarkEnd w:id="15"/>
+      <w:bookmarkEnd w:id="16"/>
     </w:p>
     <w:p>
       <w:r>
@@ -7766,11 +8944,11 @@
       <w:pPr>
         <w:pStyle w:val="Virsraksts2"/>
       </w:pPr>
-      <w:bookmarkStart w:id="16" w:name="_Toc225723241"/>
+      <w:bookmarkStart w:id="17" w:name="_Toc230230076"/>
       <w:r>
         <w:t>Gala lietotāja rakstura iezīmes</w:t>
       </w:r>
-      <w:bookmarkEnd w:id="16"/>
+      <w:bookmarkEnd w:id="17"/>
     </w:p>
     <w:p>
       <w:r>
@@ -7803,12 +8981,12 @@
       <w:pPr>
         <w:pStyle w:val="Virsraksts1"/>
       </w:pPr>
-      <w:bookmarkStart w:id="17" w:name="_Toc225723242"/>
+      <w:bookmarkStart w:id="18" w:name="_Toc230230077"/>
       <w:r>
         <w:lastRenderedPageBreak/>
         <w:t>Izstrādes līdzekļu, rīku apraksts un izvēles pamatojums</w:t>
       </w:r>
-      <w:bookmarkEnd w:id="17"/>
+      <w:bookmarkEnd w:id="18"/>
     </w:p>
     <w:p>
       <w:r>
@@ -7833,24 +9011,24 @@
       <w:pPr>
         <w:pStyle w:val="Virsraksts2"/>
       </w:pPr>
-      <w:bookmarkStart w:id="18" w:name="_Toc225723243"/>
+      <w:bookmarkStart w:id="19" w:name="_Toc230230078"/>
       <w:r>
         <w:t>Izvēlēto risinājuma līdzekļu un valodu aprakst</w:t>
       </w:r>
       <w:r>
         <w:t>s</w:t>
       </w:r>
-      <w:bookmarkEnd w:id="18"/>
+      <w:bookmarkEnd w:id="19"/>
     </w:p>
     <w:p>
       <w:pPr>
         <w:pStyle w:val="Virsraksts3"/>
       </w:pPr>
-      <w:bookmarkStart w:id="19" w:name="_Toc225723244"/>
+      <w:bookmarkStart w:id="20" w:name="_Toc230230079"/>
       <w:r>
         <w:t>Ietvars</w:t>
       </w:r>
-      <w:bookmarkEnd w:id="19"/>
+      <w:bookmarkEnd w:id="20"/>
     </w:p>
     <w:p>
       <w:r>
@@ -7891,11 +9069,11 @@
       <w:pPr>
         <w:pStyle w:val="Virsraksts3"/>
       </w:pPr>
-      <w:bookmarkStart w:id="20" w:name="_Toc225723245"/>
+      <w:bookmarkStart w:id="21" w:name="_Toc230230080"/>
       <w:r>
         <w:t>Valoda</w:t>
       </w:r>
-      <w:bookmarkEnd w:id="20"/>
+      <w:bookmarkEnd w:id="21"/>
     </w:p>
     <w:p>
       <w:r>
@@ -7954,11 +9132,11 @@
       <w:pPr>
         <w:pStyle w:val="Virsraksts3"/>
       </w:pPr>
-      <w:bookmarkStart w:id="21" w:name="_Toc225723246"/>
+      <w:bookmarkStart w:id="22" w:name="_Toc230230081"/>
       <w:r>
         <w:t>Izstrādes vide</w:t>
       </w:r>
-      <w:bookmarkEnd w:id="21"/>
+      <w:bookmarkEnd w:id="22"/>
     </w:p>
     <w:p>
       <w:r>
@@ -7991,7 +9169,7 @@
       <w:pPr>
         <w:pStyle w:val="Virsraksts3"/>
       </w:pPr>
-      <w:bookmarkStart w:id="22" w:name="_Toc225723247"/>
+      <w:bookmarkStart w:id="23" w:name="_Toc230230082"/>
       <w:r>
         <w:lastRenderedPageBreak/>
         <w:t xml:space="preserve">Versiju kontrole un </w:t>
@@ -8004,7 +9182,7 @@
       <w:r>
         <w:t xml:space="preserve"> mitināšana</w:t>
       </w:r>
-      <w:bookmarkEnd w:id="22"/>
+      <w:bookmarkEnd w:id="23"/>
     </w:p>
     <w:p>
       <w:r>
@@ -8042,11 +9220,11 @@
       <w:pPr>
         <w:pStyle w:val="Virsraksts2"/>
       </w:pPr>
-      <w:bookmarkStart w:id="23" w:name="_Toc225723248"/>
+      <w:bookmarkStart w:id="24" w:name="_Toc230230083"/>
       <w:r>
         <w:t>Iespējamo risinājuma līdzekļu un valodu apraksts</w:t>
       </w:r>
-      <w:bookmarkEnd w:id="23"/>
+      <w:bookmarkEnd w:id="24"/>
     </w:p>
     <w:p>
       <w:r>
@@ -8057,11 +9235,11 @@
       <w:pPr>
         <w:pStyle w:val="Virsraksts3"/>
       </w:pPr>
-      <w:bookmarkStart w:id="24" w:name="_Toc225723249"/>
+      <w:bookmarkStart w:id="25" w:name="_Toc230230084"/>
       <w:r>
         <w:t>Ietvari</w:t>
       </w:r>
-      <w:bookmarkEnd w:id="24"/>
+      <w:bookmarkEnd w:id="25"/>
     </w:p>
     <w:p>
       <w:r>
@@ -8168,11 +9346,11 @@
       <w:pPr>
         <w:pStyle w:val="Virsraksts3"/>
       </w:pPr>
-      <w:bookmarkStart w:id="25" w:name="_Toc225723250"/>
+      <w:bookmarkStart w:id="26" w:name="_Toc230230085"/>
       <w:r>
         <w:t>Valodas</w:t>
       </w:r>
-      <w:bookmarkEnd w:id="25"/>
+      <w:bookmarkEnd w:id="26"/>
     </w:p>
     <w:p>
       <w:r>
@@ -8250,12 +9428,12 @@
       <w:pPr>
         <w:pStyle w:val="Virsraksts3"/>
       </w:pPr>
-      <w:bookmarkStart w:id="26" w:name="_Toc225723251"/>
+      <w:bookmarkStart w:id="27" w:name="_Toc230230086"/>
       <w:r>
         <w:lastRenderedPageBreak/>
         <w:t>Izstrādes vides</w:t>
       </w:r>
-      <w:bookmarkEnd w:id="26"/>
+      <w:bookmarkEnd w:id="27"/>
     </w:p>
     <w:p>
       <w:r>
@@ -8428,11 +9606,11 @@
       <w:pPr>
         <w:pStyle w:val="Virsraksts3"/>
       </w:pPr>
-      <w:bookmarkStart w:id="27" w:name="_Toc225723252"/>
+      <w:bookmarkStart w:id="28" w:name="_Toc230230087"/>
       <w:r>
         <w:t>Versiju kontrole</w:t>
       </w:r>
-      <w:bookmarkEnd w:id="27"/>
+      <w:bookmarkEnd w:id="28"/>
     </w:p>
     <w:p>
       <w:r>
@@ -8520,12 +9698,12 @@
       <w:pPr>
         <w:pStyle w:val="Virsraksts1"/>
       </w:pPr>
-      <w:bookmarkStart w:id="28" w:name="_Toc225723253"/>
+      <w:bookmarkStart w:id="29" w:name="_Toc230230088"/>
       <w:r>
         <w:lastRenderedPageBreak/>
         <w:t>Sistēmas modelēšana un projektēšana</w:t>
       </w:r>
-      <w:bookmarkEnd w:id="28"/>
+      <w:bookmarkEnd w:id="29"/>
     </w:p>
     <w:p>
       <w:r>
@@ -8536,14 +9714,14 @@
       <w:pPr>
         <w:pStyle w:val="Virsraksts2"/>
       </w:pPr>
-      <w:bookmarkStart w:id="29" w:name="_Toc225723254"/>
+      <w:bookmarkStart w:id="30" w:name="_Toc230230089"/>
       <w:r>
         <w:t>Sistēmas struktūras mode</w:t>
       </w:r>
-      <w:bookmarkEnd w:id="29"/>
       <w:r>
         <w:t>ļi</w:t>
       </w:r>
+      <w:bookmarkEnd w:id="30"/>
     </w:p>
     <w:p>
       <w:r>
@@ -8563,11 +9741,10 @@
       <w:pPr>
         <w:pStyle w:val="Virsraksts3"/>
       </w:pPr>
-      <w:bookmarkStart w:id="30" w:name="_Toc225723255"/>
+      <w:bookmarkStart w:id="31" w:name="_Toc230230090"/>
       <w:r>
         <w:t xml:space="preserve">Sistēmas </w:t>
       </w:r>
-      <w:bookmarkEnd w:id="30"/>
       <w:r>
         <w:t xml:space="preserve">pārvaldnieku </w:t>
       </w:r>
@@ -8577,6 +9754,7 @@
       <w:r>
         <w:t>struktūra</w:t>
       </w:r>
+      <w:bookmarkEnd w:id="31"/>
     </w:p>
     <w:p>
       <w:r>
@@ -8763,8 +9941,8 @@
         </w:drawing>
       </w:r>
     </w:p>
-    <w:bookmarkStart w:id="31" w:name="_Ref225695254"/>
-    <w:bookmarkStart w:id="32" w:name="_Ref225695245"/>
+    <w:bookmarkStart w:id="32" w:name="_Ref225695254"/>
+    <w:bookmarkStart w:id="33" w:name="_Ref225695245"/>
     <w:p>
       <w:pPr>
         <w:pStyle w:val="Parakstszemobjekta"/>
@@ -8790,11 +9968,11 @@
       <w:r>
         <w:t>. attēls</w:t>
       </w:r>
-      <w:bookmarkEnd w:id="31"/>
+      <w:bookmarkEnd w:id="32"/>
       <w:r>
         <w:t>. Komponenšu modelis</w:t>
       </w:r>
-      <w:bookmarkEnd w:id="32"/>
+      <w:bookmarkEnd w:id="33"/>
       <w:r>
         <w:t xml:space="preserve"> spēles mezglu saknē</w:t>
       </w:r>
@@ -8828,10 +10006,12 @@
       <w:pPr>
         <w:pStyle w:val="Virsraksts3"/>
       </w:pPr>
+      <w:bookmarkStart w:id="34" w:name="_Toc230230091"/>
       <w:r>
         <w:lastRenderedPageBreak/>
         <w:t>Ainu komponenšu struktūra</w:t>
       </w:r>
+      <w:bookmarkEnd w:id="34"/>
     </w:p>
     <w:p>
       <w:r>
@@ -9009,6 +10189,7 @@
       <w:pPr>
         <w:pStyle w:val="Virsraksts3"/>
       </w:pPr>
+      <w:bookmarkStart w:id="35" w:name="_Toc230230092"/>
       <w:r>
         <w:lastRenderedPageBreak/>
         <w:t>Kartes</w:t>
@@ -9016,6 +10197,7 @@
       <w:r>
         <w:t xml:space="preserve"> komponenšu struktūra</w:t>
       </w:r>
+      <w:bookmarkEnd w:id="35"/>
     </w:p>
     <w:p>
       <w:r>
@@ -9223,10 +10405,12 @@
       <w:pPr>
         <w:pStyle w:val="Virsraksts3"/>
       </w:pPr>
+      <w:bookmarkStart w:id="36" w:name="_Toc230230093"/>
       <w:r>
         <w:lastRenderedPageBreak/>
         <w:t>Sistēmas pārvaldnieku klases</w:t>
       </w:r>
+      <w:bookmarkEnd w:id="36"/>
     </w:p>
     <w:p>
       <w:r>
@@ -9320,10 +10504,12 @@
       <w:pPr>
         <w:pStyle w:val="Virsraksts3"/>
       </w:pPr>
+      <w:bookmarkStart w:id="37" w:name="_Toc230230094"/>
       <w:r>
         <w:lastRenderedPageBreak/>
         <w:t>Ainu klases</w:t>
       </w:r>
+      <w:bookmarkEnd w:id="37"/>
     </w:p>
     <w:p>
       <w:r>
@@ -9478,10 +10664,12 @@
       <w:pPr>
         <w:pStyle w:val="Virsraksts3"/>
       </w:pPr>
+      <w:bookmarkStart w:id="38" w:name="_Toc230230095"/>
       <w:r>
         <w:lastRenderedPageBreak/>
         <w:t>Kartes klase</w:t>
       </w:r>
+      <w:bookmarkEnd w:id="38"/>
     </w:p>
     <w:p>
       <w:r>
@@ -9537,8 +10725,8 @@
           <w:noProof/>
         </w:rPr>
         <w:drawing>
-          <wp:inline distT="0" distB="0" distL="0" distR="0" wp14:anchorId="0CD51D51" wp14:editId="4112FC81">
-            <wp:extent cx="6286500" cy="5324194"/>
+          <wp:inline distT="0" distB="0" distL="0" distR="0" wp14:anchorId="0CD51D51" wp14:editId="09529E9C">
+            <wp:extent cx="6211559" cy="5324194"/>
             <wp:effectExtent l="0" t="0" r="0" b="0"/>
             <wp:docPr id="1214231642" name="Picture 1"/>
             <wp:cNvGraphicFramePr>
@@ -9566,7 +10754,7 @@
                   <pic:spPr>
                     <a:xfrm>
                       <a:off x="0" y="0"/>
-                      <a:ext cx="6300881" cy="5336374"/>
+                      <a:ext cx="6211559" cy="5324194"/>
                     </a:xfrm>
                     <a:prstGeom prst="rect">
                       <a:avLst/>
@@ -9584,13 +10772,7 @@
         <w:pStyle w:val="Parakstszemobjekta"/>
       </w:pPr>
       <w:r>
-        <w:t>6</w:t>
-      </w:r>
-      <w:r>
-        <w:t xml:space="preserve">. attēls. </w:t>
-      </w:r>
-      <w:r>
-        <w:t>Kartes klase</w:t>
+        <w:t>6. attēls. Kartes klase</w:t>
       </w:r>
     </w:p>
     <w:p/>
@@ -9603,6 +10785,7 @@
       <w:pPr>
         <w:pStyle w:val="Virsraksts3"/>
       </w:pPr>
+      <w:bookmarkStart w:id="39" w:name="_Toc230230096"/>
       <w:r>
         <w:lastRenderedPageBreak/>
         <w:t>Objektu</w:t>
@@ -9610,6 +10793,7 @@
       <w:r>
         <w:t xml:space="preserve"> klase</w:t>
       </w:r>
+      <w:bookmarkEnd w:id="39"/>
     </w:p>
     <w:p>
       <w:pPr>
@@ -9625,13 +10809,7 @@
       </w:r>
       <w:proofErr w:type="spellEnd"/>
       <w:r>
-        <w:t>” (</w:t>
-      </w:r>
-      <w:r>
-        <w:t>Objekts</w:t>
-      </w:r>
-      <w:r>
-        <w:t>) klase norāda kartē objektu, kuri var tikt pagriezti, iznīcināti, iestatīt garumus un vairāk īpašību. Šo klasi manto “</w:t>
+        <w:t>” (Objekts) klase norāda kartē objektu, kuri var tikt pagriezti, iznīcināti, iestatīt garumus un vairāk īpašību. Šo klasi manto “</w:t>
       </w:r>
       <w:proofErr w:type="spellStart"/>
       <w:r>
@@ -9678,8 +10856,6 @@
       </w:pPr>
       <w:r>
         <w:tab/>
-      </w:r>
-      <w:r>
         <w:t>Tās klases pamatīpašības ir azimuts, izturība (“</w:t>
       </w:r>
       <w:proofErr w:type="spellStart"/>
@@ -9696,10 +10872,7 @@
       </w:r>
       <w:proofErr w:type="spellEnd"/>
       <w:r>
-        <w:t>”), kura mazina objekta izturības mazināšanas faktoru</w:t>
-      </w:r>
-      <w:r>
-        <w:t>.</w:t>
+        <w:t>”), kura mazina objekta izturības mazināšanas faktoru.</w:t>
       </w:r>
     </w:p>
     <w:p>
@@ -9768,15 +10941,132 @@
         <w:t>7</w:t>
       </w:r>
       <w:r>
+        <w:t>. attēls. Objektu klase un tās mantotāji</w:t>
+      </w:r>
+    </w:p>
+    <w:p/>
+    <w:p/>
+    <w:p>
+      <w:r>
+        <w:t xml:space="preserve"> </w:t>
+      </w:r>
+    </w:p>
+    <w:p/>
+    <w:p/>
+    <w:p/>
+    <w:p>
+      <w:pPr>
+        <w:pStyle w:val="Virsraksts3"/>
+      </w:pPr>
+      <w:bookmarkStart w:id="40" w:name="_Toc230230097"/>
+      <w:r>
+        <w:lastRenderedPageBreak/>
+        <w:t>Lādiņš</w:t>
+      </w:r>
+      <w:bookmarkEnd w:id="40"/>
+    </w:p>
+    <w:p>
+      <w:r>
+        <w:t>L</w:t>
+      </w:r>
+      <w:r>
+        <w:t>ādiņu laukumā (“</w:t>
+      </w:r>
+      <w:proofErr w:type="spellStart"/>
+      <w:r>
+        <w:t>Projectiles</w:t>
+      </w:r>
+      <w:proofErr w:type="spellEnd"/>
+      <w:r>
+        <w:t xml:space="preserve">”) </w:t>
+      </w:r>
+      <w:r>
+        <w:t xml:space="preserve">lādiņiem ir savas īpašības un metodes, lai pēc iespējas </w:t>
+      </w:r>
+      <w:proofErr w:type="spellStart"/>
+      <w:r>
+        <w:t>attainotu</w:t>
+      </w:r>
+      <w:proofErr w:type="spellEnd"/>
+      <w:r>
+        <w:t xml:space="preserve"> lādiņu ballistiku gaisā</w:t>
+      </w:r>
+      <w:r>
+        <w:t xml:space="preserve"> un objektu iznīcināšanu un bojāšanu nolaišanas uz zemes</w:t>
+      </w:r>
+      <w:r>
+        <w:t xml:space="preserve"> (skat. 8. attēlu)</w:t>
+      </w:r>
+    </w:p>
+    <w:p>
+      <w:pPr>
+        <w:keepNext/>
+        <w:ind w:firstLine="0"/>
+        <w:jc w:val="center"/>
+      </w:pPr>
+      <w:r>
+        <w:rPr>
+          <w:noProof/>
+        </w:rPr>
+        <w:drawing>
+          <wp:inline distT="0" distB="0" distL="0" distR="0" wp14:anchorId="3FDF6EC6" wp14:editId="27E1ABDD">
+            <wp:extent cx="2590907" cy="3252655"/>
+            <wp:effectExtent l="0" t="0" r="0" b="5080"/>
+            <wp:docPr id="890849665" name="Picture 1"/>
+            <wp:cNvGraphicFramePr>
+              <a:graphicFrameLocks xmlns:a="http://schemas.openxmlformats.org/drawingml/2006/main" noChangeAspect="1"/>
+            </wp:cNvGraphicFramePr>
+            <a:graphic xmlns:a="http://schemas.openxmlformats.org/drawingml/2006/main">
+              <a:graphicData uri="http://schemas.openxmlformats.org/drawingml/2006/picture">
+                <pic:pic xmlns:pic="http://schemas.openxmlformats.org/drawingml/2006/picture">
+                  <pic:nvPicPr>
+                    <pic:cNvPr id="890849665" name="Picture 1"/>
+                    <pic:cNvPicPr/>
+                  </pic:nvPicPr>
+                  <pic:blipFill>
+                    <a:blip r:embed="rId17">
+                      <a:extLst>
+                        <a:ext uri="{28A0092B-C50C-407E-A947-70E740481C1C}">
+                          <a14:useLocalDpi xmlns:a14="http://schemas.microsoft.com/office/drawing/2010/main" val="0"/>
+                        </a:ext>
+                      </a:extLst>
+                    </a:blip>
+                    <a:stretch>
+                      <a:fillRect/>
+                    </a:stretch>
+                  </pic:blipFill>
+                  <pic:spPr>
+                    <a:xfrm>
+                      <a:off x="0" y="0"/>
+                      <a:ext cx="2590907" cy="3252655"/>
+                    </a:xfrm>
+                    <a:prstGeom prst="rect">
+                      <a:avLst/>
+                    </a:prstGeom>
+                  </pic:spPr>
+                </pic:pic>
+              </a:graphicData>
+            </a:graphic>
+          </wp:inline>
+        </w:drawing>
+      </w:r>
+    </w:p>
+    <w:p>
+      <w:pPr>
+        <w:pStyle w:val="Parakstszemobjekta"/>
+      </w:pPr>
+      <w:r>
+        <w:t>8</w:t>
+      </w:r>
+      <w:r>
         <w:t xml:space="preserve">. attēls. </w:t>
       </w:r>
       <w:r>
-        <w:t>Objektu klase un tās mantotāji</w:t>
-      </w:r>
-    </w:p>
-    <w:p>
-      <w:pPr>
-        <w:ind w:firstLine="0"/>
+        <w:t>Lādiņa klases metodes un pamatīpašības</w:t>
+      </w:r>
+    </w:p>
+    <w:p>
+      <w:pPr>
         <w:sectPr>
           <w:pgSz w:w="12240" w:h="15840"/>
           <w:pgMar w:top="1134" w:right="1134" w:bottom="1134" w:left="1418" w:header="709" w:footer="709" w:gutter="0"/>
@@ -9789,12 +11079,12 @@
       <w:pPr>
         <w:pStyle w:val="Virsraksts2"/>
       </w:pPr>
-      <w:bookmarkStart w:id="33" w:name="_Toc225723257"/>
+      <w:bookmarkStart w:id="41" w:name="_Toc230230098"/>
       <w:r>
         <w:lastRenderedPageBreak/>
         <w:t>Funkcionālie un dinamiskie modeļi</w:t>
       </w:r>
-      <w:bookmarkEnd w:id="33"/>
+      <w:bookmarkEnd w:id="41"/>
     </w:p>
     <w:p>
       <w:r>
@@ -9805,19 +11095,18 @@
       <w:pPr>
         <w:pStyle w:val="Virsraksts3"/>
       </w:pPr>
-      <w:r>
-        <w:t>Ai</w:t>
-      </w:r>
-      <w:r>
-        <w:t>nu stadiju gaita</w:t>
-      </w:r>
+      <w:bookmarkStart w:id="42" w:name="_Toc230230099"/>
+      <w:r>
+        <w:t>Ainu stadiju gaita</w:t>
+      </w:r>
+      <w:bookmarkEnd w:id="42"/>
     </w:p>
     <w:p>
       <w:r>
         <w:t xml:space="preserve">Šī gaita precizē, kā ainas tiek pārslēgtas pēc nosacījumiem un kādā secībā (skat. </w:t>
       </w:r>
       <w:r>
-        <w:t>8</w:t>
+        <w:t>9</w:t>
       </w:r>
       <w:r>
         <w:t>. attēlu).</w:t>
@@ -9848,7 +11137,7 @@
                     <pic:cNvPicPr/>
                   </pic:nvPicPr>
                   <pic:blipFill>
-                    <a:blip r:embed="rId17">
+                    <a:blip r:embed="rId18">
                       <a:extLst>
                         <a:ext uri="{28A0092B-C50C-407E-A947-70E740481C1C}">
                           <a14:useLocalDpi xmlns:a14="http://schemas.microsoft.com/office/drawing/2010/main" val="0"/>
@@ -9880,7 +11169,7 @@
         <w:pStyle w:val="Parakstszemobjekta"/>
       </w:pPr>
       <w:r>
-        <w:t>8</w:t>
+        <w:t>9</w:t>
       </w:r>
       <w:r>
         <w:t>. attēls. Ainas stadiju gaita</w:t>
@@ -9890,9 +11179,11 @@
       <w:pPr>
         <w:pStyle w:val="Virsraksts3"/>
       </w:pPr>
+      <w:bookmarkStart w:id="43" w:name="_Toc230230100"/>
       <w:r>
         <w:t>Spēles laukuma stadijas</w:t>
       </w:r>
+      <w:bookmarkEnd w:id="43"/>
     </w:p>
     <w:p>
       <w:r>
@@ -9905,7 +11196,7 @@
         <w:t xml:space="preserve"> (skat. </w:t>
       </w:r>
       <w:r>
-        <w:t>9</w:t>
+        <w:t>10</w:t>
       </w:r>
       <w:r>
         <w:t>. attēlu).</w:t>
@@ -9937,7 +11228,7 @@
                     <pic:cNvPicPr/>
                   </pic:nvPicPr>
                   <pic:blipFill>
-                    <a:blip r:embed="rId18">
+                    <a:blip r:embed="rId19">
                       <a:extLst>
                         <a:ext uri="{28A0092B-C50C-407E-A947-70E740481C1C}">
                           <a14:useLocalDpi xmlns:a14="http://schemas.microsoft.com/office/drawing/2010/main" val="0"/>
@@ -9969,7 +11260,7 @@
         <w:pStyle w:val="Parakstszemobjekta"/>
       </w:pPr>
       <w:r>
-        <w:t>9</w:t>
+        <w:t>10</w:t>
       </w:r>
       <w:r>
         <w:t>. attēls. Spēles laukuma stadijas</w:t>
@@ -9990,27 +11281,47 @@
       <w:pPr>
         <w:pStyle w:val="Virsraksts2"/>
       </w:pPr>
-      <w:bookmarkStart w:id="34" w:name="_Toc225723258"/>
+      <w:bookmarkStart w:id="44" w:name="_Toc230230101"/>
       <w:r>
         <w:lastRenderedPageBreak/>
         <w:t>Datu struktūru apraksts</w:t>
       </w:r>
-      <w:bookmarkEnd w:id="34"/>
+      <w:bookmarkEnd w:id="44"/>
+    </w:p>
+    <w:p>
+      <w:r>
+        <w:t>Šī sadaļa precizēs klašu objektus, kurus izmantoja definētās klases 4.1. sadaļā</w:t>
+      </w:r>
     </w:p>
     <w:p>
       <w:pPr>
         <w:pStyle w:val="Virsraksts3"/>
       </w:pPr>
-      <w:proofErr w:type="spellStart"/>
-      <w:r>
-        <w:t>Enumerācijas</w:t>
-      </w:r>
-      <w:proofErr w:type="spellEnd"/>
-    </w:p>
-    <w:p>
-      <w:pPr>
-        <w:keepNext/>
-        <w:ind w:firstLine="0"/>
+      <w:bookmarkStart w:id="45" w:name="_Toc230230102"/>
+      <w:r>
+        <w:t>Līmeņu kopa un līmeņa īpašības</w:t>
+      </w:r>
+      <w:bookmarkEnd w:id="45"/>
+    </w:p>
+    <w:p>
+      <w:r>
+        <w:t>Karšu dati tiek glabāti līmeņos, kuri nosaka secību līmeņu kopā. Līmeņiem un tās kopām var būt papildus īpašības</w:t>
+      </w:r>
+      <w:r>
+        <w:t xml:space="preserve"> (skat. 1</w:t>
+      </w:r>
+      <w:r>
+        <w:t>1</w:t>
+      </w:r>
+      <w:r>
+        <w:t>. attēlu)</w:t>
+      </w:r>
+      <w:r>
+        <w:t>.</w:t>
+      </w:r>
+    </w:p>
+    <w:p>
+      <w:pPr>
         <w:jc w:val="center"/>
       </w:pPr>
       <w:r>
@@ -10018,10 +11329,10 @@
           <w:noProof/>
         </w:rPr>
         <w:drawing>
-          <wp:inline distT="0" distB="0" distL="0" distR="0" wp14:anchorId="39EE9166" wp14:editId="6D579B4B">
-            <wp:extent cx="3733800" cy="3733800"/>
-            <wp:effectExtent l="0" t="0" r="0" b="0"/>
-            <wp:docPr id="678940417" name="Picture 4"/>
+          <wp:inline distT="0" distB="0" distL="0" distR="0" wp14:anchorId="1890F284" wp14:editId="13B165CC">
+            <wp:extent cx="2867025" cy="944880"/>
+            <wp:effectExtent l="0" t="0" r="9525" b="7620"/>
+            <wp:docPr id="1181671786" name="Picture 5"/>
             <wp:cNvGraphicFramePr>
               <a:graphicFrameLocks xmlns:a="http://schemas.openxmlformats.org/drawingml/2006/main" noChangeAspect="1"/>
             </wp:cNvGraphicFramePr>
@@ -10029,11 +11340,404 @@
               <a:graphicData uri="http://schemas.openxmlformats.org/drawingml/2006/picture">
                 <pic:pic xmlns:pic="http://schemas.openxmlformats.org/drawingml/2006/picture">
                   <pic:nvPicPr>
-                    <pic:cNvPr id="678940417" name="Picture 678940417"/>
+                    <pic:cNvPr id="1181671786" name="Picture 5"/>
+                    <pic:cNvPicPr/>
+                  </pic:nvPicPr>
+                  <pic:blipFill rotWithShape="1">
+                    <a:blip r:embed="rId20">
+                      <a:extLst>
+                        <a:ext uri="{28A0092B-C50C-407E-A947-70E740481C1C}">
+                          <a14:useLocalDpi xmlns:a14="http://schemas.microsoft.com/office/drawing/2010/main" val="0"/>
+                        </a:ext>
+                      </a:extLst>
+                    </a:blip>
+                    <a:srcRect r="33259"/>
+                    <a:stretch>
+                      <a:fillRect/>
+                    </a:stretch>
+                  </pic:blipFill>
+                  <pic:spPr bwMode="auto">
+                    <a:xfrm>
+                      <a:off x="0" y="0"/>
+                      <a:ext cx="2867071" cy="944895"/>
+                    </a:xfrm>
+                    <a:prstGeom prst="rect">
+                      <a:avLst/>
+                    </a:prstGeom>
+                    <a:ln>
+                      <a:noFill/>
+                    </a:ln>
+                    <a:extLst>
+                      <a:ext uri="{53640926-AAD7-44D8-BBD7-CCE9431645EC}">
+                        <a14:shadowObscured xmlns:a14="http://schemas.microsoft.com/office/drawing/2010/main"/>
+                      </a:ext>
+                    </a:extLst>
+                  </pic:spPr>
+                </pic:pic>
+              </a:graphicData>
+            </a:graphic>
+          </wp:inline>
+        </w:drawing>
+      </w:r>
+    </w:p>
+    <w:p>
+      <w:pPr>
+        <w:pStyle w:val="Parakstszemobjekta"/>
+      </w:pPr>
+      <w:r>
+        <w:t>11</w:t>
+      </w:r>
+      <w:r>
+        <w:t xml:space="preserve">. attēls. </w:t>
+      </w:r>
+      <w:r>
+        <w:t>Līmeņu kopa un līmeņu īpašības</w:t>
+      </w:r>
+    </w:p>
+    <w:p>
+      <w:pPr>
+        <w:pStyle w:val="Virsraksts3"/>
+      </w:pPr>
+      <w:bookmarkStart w:id="46" w:name="_Toc230230103"/>
+      <w:r>
+        <w:t>Līmeņa punkti</w:t>
+      </w:r>
+      <w:bookmarkEnd w:id="46"/>
+    </w:p>
+    <w:p>
+      <w:r>
+        <w:t>Pēc uzvaras spēles laukumā punkti tiek glabāti progresa failā, lai sekotu līdzi, kuri līmeņi var tikt atslēgti un būt pieejamiem spēlētājam (skat. 1</w:t>
+      </w:r>
+      <w:r>
+        <w:t>2</w:t>
+      </w:r>
+      <w:r>
+        <w:t>. attēlu).</w:t>
+      </w:r>
+    </w:p>
+    <w:p>
+      <w:pPr>
+        <w:jc w:val="center"/>
+      </w:pPr>
+      <w:r>
+        <w:rPr>
+          <w:noProof/>
+        </w:rPr>
+        <w:drawing>
+          <wp:inline distT="0" distB="0" distL="0" distR="0" wp14:anchorId="7B7B8E55" wp14:editId="191F734E">
+            <wp:extent cx="1457325" cy="447675"/>
+            <wp:effectExtent l="0" t="0" r="0" b="9525"/>
+            <wp:docPr id="2009787560" name="Picture 5"/>
+            <wp:cNvGraphicFramePr>
+              <a:graphicFrameLocks xmlns:a="http://schemas.openxmlformats.org/drawingml/2006/main" noChangeAspect="1"/>
+            </wp:cNvGraphicFramePr>
+            <a:graphic xmlns:a="http://schemas.openxmlformats.org/drawingml/2006/main">
+              <a:graphicData uri="http://schemas.openxmlformats.org/drawingml/2006/picture">
+                <pic:pic xmlns:pic="http://schemas.openxmlformats.org/drawingml/2006/picture">
+                  <pic:nvPicPr>
+                    <pic:cNvPr id="1181671786" name="Picture 5"/>
+                    <pic:cNvPicPr/>
+                  </pic:nvPicPr>
+                  <pic:blipFill rotWithShape="1">
+                    <a:blip r:embed="rId20">
+                      <a:extLst>
+                        <a:ext uri="{28A0092B-C50C-407E-A947-70E740481C1C}">
+                          <a14:useLocalDpi xmlns:a14="http://schemas.microsoft.com/office/drawing/2010/main" val="0"/>
+                        </a:ext>
+                      </a:extLst>
+                    </a:blip>
+                    <a:srcRect l="68736" r="-2660" b="52621"/>
+                    <a:stretch>
+                      <a:fillRect/>
+                    </a:stretch>
+                  </pic:blipFill>
+                  <pic:spPr bwMode="auto">
+                    <a:xfrm>
+                      <a:off x="0" y="0"/>
+                      <a:ext cx="1457349" cy="447682"/>
+                    </a:xfrm>
+                    <a:prstGeom prst="rect">
+                      <a:avLst/>
+                    </a:prstGeom>
+                    <a:ln>
+                      <a:noFill/>
+                    </a:ln>
+                    <a:extLst>
+                      <a:ext uri="{53640926-AAD7-44D8-BBD7-CCE9431645EC}">
+                        <a14:shadowObscured xmlns:a14="http://schemas.microsoft.com/office/drawing/2010/main"/>
+                      </a:ext>
+                    </a:extLst>
+                  </pic:spPr>
+                </pic:pic>
+              </a:graphicData>
+            </a:graphic>
+          </wp:inline>
+        </w:drawing>
+      </w:r>
+    </w:p>
+    <w:p>
+      <w:pPr>
+        <w:pStyle w:val="Parakstszemobjekta"/>
+      </w:pPr>
+      <w:r>
+        <w:t>1</w:t>
+      </w:r>
+      <w:r>
+        <w:t>2</w:t>
+      </w:r>
+      <w:r>
+        <w:t xml:space="preserve">. attēls. Līmeņu </w:t>
+      </w:r>
+      <w:r>
+        <w:t>punkti</w:t>
+      </w:r>
+    </w:p>
+    <w:p>
+      <w:pPr>
+        <w:ind w:firstLine="0"/>
+      </w:pPr>
+    </w:p>
+    <w:p>
+      <w:pPr>
+        <w:ind w:firstLine="0"/>
+      </w:pPr>
+    </w:p>
+    <w:p>
+      <w:pPr>
+        <w:ind w:firstLine="0"/>
+      </w:pPr>
+    </w:p>
+    <w:p>
+      <w:pPr>
+        <w:ind w:firstLine="0"/>
+      </w:pPr>
+    </w:p>
+    <w:p>
+      <w:pPr>
+        <w:ind w:firstLine="0"/>
+      </w:pPr>
+    </w:p>
+    <w:p>
+      <w:pPr>
+        <w:ind w:firstLine="0"/>
+      </w:pPr>
+    </w:p>
+    <w:p>
+      <w:pPr>
+        <w:ind w:firstLine="0"/>
+      </w:pPr>
+    </w:p>
+    <w:p>
+      <w:pPr>
+        <w:ind w:firstLine="0"/>
+      </w:pPr>
+    </w:p>
+    <w:p>
+      <w:pPr>
+        <w:ind w:firstLine="0"/>
+      </w:pPr>
+    </w:p>
+    <w:p>
+      <w:pPr>
+        <w:ind w:firstLine="0"/>
+      </w:pPr>
+    </w:p>
+    <w:p>
+      <w:pPr>
+        <w:ind w:firstLine="0"/>
+      </w:pPr>
+    </w:p>
+    <w:p>
+      <w:pPr>
+        <w:pStyle w:val="Virsraksts3"/>
+      </w:pPr>
+      <w:bookmarkStart w:id="47" w:name="_Toc230230104"/>
+      <w:r>
+        <w:lastRenderedPageBreak/>
+        <w:t xml:space="preserve">Kartes un tās </w:t>
+      </w:r>
+      <w:proofErr w:type="spellStart"/>
+      <w:r>
+        <w:t>apakškomponenšu</w:t>
+      </w:r>
+      <w:proofErr w:type="spellEnd"/>
+      <w:r>
+        <w:t xml:space="preserve"> dati</w:t>
+      </w:r>
+      <w:bookmarkEnd w:id="47"/>
+    </w:p>
+    <w:p>
+      <w:r>
+        <w:t>Kartes glabā pamatinformāciju</w:t>
+      </w:r>
+      <w:r>
+        <w:t>, piemēram, ailes izmēru, augstumu un sarežģīšanas iespējas</w:t>
+      </w:r>
+      <w:r>
+        <w:t xml:space="preserve">, kurus izmantos tās visas tās </w:t>
+      </w:r>
+      <w:proofErr w:type="spellStart"/>
+      <w:r>
+        <w:t>apakškomponentes</w:t>
+      </w:r>
+      <w:proofErr w:type="spellEnd"/>
+      <w:r>
+        <w:t>, kuras no dažam var būt savi dati glabāti kartes datos, it īpaši slāņu komponentēm (skat. 1</w:t>
+      </w:r>
+      <w:r>
+        <w:t>3</w:t>
+      </w:r>
+      <w:r>
+        <w:t>. attēlu).</w:t>
+      </w:r>
+    </w:p>
+    <w:p>
+      <w:pPr>
+        <w:jc w:val="center"/>
+      </w:pPr>
+      <w:r>
+        <w:rPr>
+          <w:noProof/>
+        </w:rPr>
+        <w:drawing>
+          <wp:inline distT="0" distB="0" distL="0" distR="0" wp14:anchorId="2BF9B0AA" wp14:editId="4636703C">
+            <wp:extent cx="4711875" cy="3705225"/>
+            <wp:effectExtent l="0" t="0" r="0" b="0"/>
+            <wp:docPr id="765263167" name="Picture 5"/>
+            <wp:cNvGraphicFramePr>
+              <a:graphicFrameLocks xmlns:a="http://schemas.openxmlformats.org/drawingml/2006/main" noChangeAspect="1"/>
+            </wp:cNvGraphicFramePr>
+            <a:graphic xmlns:a="http://schemas.openxmlformats.org/drawingml/2006/main">
+              <a:graphicData uri="http://schemas.openxmlformats.org/drawingml/2006/picture">
+                <pic:pic xmlns:pic="http://schemas.openxmlformats.org/drawingml/2006/picture">
+                  <pic:nvPicPr>
+                    <pic:cNvPr id="765263167" name="Picture 5"/>
+                    <pic:cNvPicPr/>
+                  </pic:nvPicPr>
+                  <pic:blipFill rotWithShape="1">
+                    <a:blip r:embed="rId21">
+                      <a:extLst>
+                        <a:ext uri="{28A0092B-C50C-407E-A947-70E740481C1C}">
+                          <a14:useLocalDpi xmlns:a14="http://schemas.microsoft.com/office/drawing/2010/main" val="0"/>
+                        </a:ext>
+                      </a:extLst>
+                    </a:blip>
+                    <a:srcRect t="-2796" b="84"/>
+                    <a:stretch>
+                      <a:fillRect/>
+                    </a:stretch>
+                  </pic:blipFill>
+                  <pic:spPr bwMode="auto">
+                    <a:xfrm>
+                      <a:off x="0" y="0"/>
+                      <a:ext cx="4720579" cy="3712069"/>
+                    </a:xfrm>
+                    <a:prstGeom prst="rect">
+                      <a:avLst/>
+                    </a:prstGeom>
+                    <a:ln>
+                      <a:noFill/>
+                    </a:ln>
+                    <a:extLst>
+                      <a:ext uri="{53640926-AAD7-44D8-BBD7-CCE9431645EC}">
+                        <a14:shadowObscured xmlns:a14="http://schemas.microsoft.com/office/drawing/2010/main"/>
+                      </a:ext>
+                    </a:extLst>
+                  </pic:spPr>
+                </pic:pic>
+              </a:graphicData>
+            </a:graphic>
+          </wp:inline>
+        </w:drawing>
+      </w:r>
+    </w:p>
+    <w:p>
+      <w:pPr>
+        <w:pStyle w:val="Parakstszemobjekta"/>
+      </w:pPr>
+      <w:r>
+        <w:t>1</w:t>
+      </w:r>
+      <w:r>
+        <w:t>3</w:t>
+      </w:r>
+      <w:r>
+        <w:t xml:space="preserve">. attēls. </w:t>
+      </w:r>
+      <w:r>
+        <w:t xml:space="preserve">Kartes un </w:t>
+      </w:r>
+      <w:proofErr w:type="spellStart"/>
+      <w:r>
+        <w:t>apakškomponenšu</w:t>
+      </w:r>
+      <w:proofErr w:type="spellEnd"/>
+      <w:r>
+        <w:t xml:space="preserve"> dati</w:t>
+      </w:r>
+    </w:p>
+    <w:p>
+      <w:pPr>
+        <w:pStyle w:val="Virsraksts3"/>
+      </w:pPr>
+      <w:bookmarkStart w:id="48" w:name="_Toc230230105"/>
+      <w:r>
+        <w:t xml:space="preserve">Kartes </w:t>
+      </w:r>
+      <w:r>
+        <w:t>objektu un tās mantotāju īpašības</w:t>
+      </w:r>
+      <w:bookmarkEnd w:id="48"/>
+    </w:p>
+    <w:p>
+      <w:r>
+        <w:t>Slāņa ”</w:t>
+      </w:r>
+      <w:proofErr w:type="spellStart"/>
+      <w:r>
+        <w:t>Entities</w:t>
+      </w:r>
+      <w:proofErr w:type="spellEnd"/>
+      <w:r>
+        <w:t>” objektiem ir kopīgas nemaināmās īpašības, kurus izmanto paši slāņu objekti un citas klases pieejot tiem (skat. 1</w:t>
+      </w:r>
+      <w:r>
+        <w:t>4</w:t>
+      </w:r>
+      <w:r>
+        <w:t>. attēlu).</w:t>
+      </w:r>
+      <w:r>
+        <w:t xml:space="preserve"> </w:t>
+      </w:r>
+    </w:p>
+    <w:p>
+      <w:pPr>
+        <w:keepNext/>
+        <w:ind w:firstLine="0"/>
+        <w:jc w:val="center"/>
+      </w:pPr>
+      <w:r>
+        <w:rPr>
+          <w:noProof/>
+        </w:rPr>
+        <w:drawing>
+          <wp:inline distT="0" distB="0" distL="0" distR="0" wp14:anchorId="3E1479C0" wp14:editId="51FE2EE6">
+            <wp:extent cx="2586288" cy="2200275"/>
+            <wp:effectExtent l="0" t="0" r="5080" b="0"/>
+            <wp:docPr id="539535502" name="Picture 5"/>
+            <wp:cNvGraphicFramePr>
+              <a:graphicFrameLocks xmlns:a="http://schemas.openxmlformats.org/drawingml/2006/main" noChangeAspect="1"/>
+            </wp:cNvGraphicFramePr>
+            <a:graphic xmlns:a="http://schemas.openxmlformats.org/drawingml/2006/main">
+              <a:graphicData uri="http://schemas.openxmlformats.org/drawingml/2006/picture">
+                <pic:pic xmlns:pic="http://schemas.openxmlformats.org/drawingml/2006/picture">
+                  <pic:nvPicPr>
+                    <pic:cNvPr id="539535502" name="Picture 5"/>
                     <pic:cNvPicPr/>
                   </pic:nvPicPr>
                   <pic:blipFill>
-                    <a:blip r:embed="rId19">
+                    <a:blip r:embed="rId22">
                       <a:extLst>
                         <a:ext uri="{28A0092B-C50C-407E-A947-70E740481C1C}">
                           <a14:useLocalDpi xmlns:a14="http://schemas.microsoft.com/office/drawing/2010/main" val="0"/>
@@ -10047,7 +11751,7 @@
                   <pic:spPr>
                     <a:xfrm>
                       <a:off x="0" y="0"/>
-                      <a:ext cx="3733800" cy="3733800"/>
+                      <a:ext cx="2586288" cy="2200275"/>
                     </a:xfrm>
                     <a:prstGeom prst="rect">
                       <a:avLst/>
@@ -10064,146 +11768,47 @@
       <w:pPr>
         <w:pStyle w:val="Parakstszemobjekta"/>
       </w:pPr>
-      <w:fldSimple w:instr=" SEQ attēls \* ARABIC ">
-        <w:r>
-          <w:rPr>
-            <w:noProof/>
-          </w:rPr>
-          <w:t>8</w:t>
-        </w:r>
-      </w:fldSimple>
-      <w:r>
-        <w:t xml:space="preserve">. attēls. Saknes mezgla </w:t>
-      </w:r>
-      <w:proofErr w:type="spellStart"/>
-      <w:r>
-        <w:t>enumerācijas</w:t>
-      </w:r>
-      <w:proofErr w:type="spellEnd"/>
-    </w:p>
-    <w:p>
-      <w:pPr>
-        <w:keepNext/>
-        <w:ind w:firstLine="0"/>
-        <w:jc w:val="center"/>
-      </w:pPr>
-      <w:r>
-        <w:rPr>
-          <w:noProof/>
-        </w:rPr>
-        <w:drawing>
-          <wp:inline distT="0" distB="0" distL="0" distR="0" wp14:anchorId="6868AF71" wp14:editId="47ABCC9F">
-            <wp:extent cx="4295775" cy="2200275"/>
-            <wp:effectExtent l="0" t="0" r="9525" b="9525"/>
-            <wp:docPr id="539535502" name="Picture 5"/>
-            <wp:cNvGraphicFramePr>
-              <a:graphicFrameLocks xmlns:a="http://schemas.openxmlformats.org/drawingml/2006/main" noChangeAspect="1"/>
-            </wp:cNvGraphicFramePr>
-            <a:graphic xmlns:a="http://schemas.openxmlformats.org/drawingml/2006/main">
-              <a:graphicData uri="http://schemas.openxmlformats.org/drawingml/2006/picture">
-                <pic:pic xmlns:pic="http://schemas.openxmlformats.org/drawingml/2006/picture">
-                  <pic:nvPicPr>
-                    <pic:cNvPr id="539535502" name="Picture 539535502"/>
-                    <pic:cNvPicPr/>
-                  </pic:nvPicPr>
-                  <pic:blipFill>
-                    <a:blip r:embed="rId20">
-                      <a:extLst>
-                        <a:ext uri="{28A0092B-C50C-407E-A947-70E740481C1C}">
-                          <a14:useLocalDpi xmlns:a14="http://schemas.microsoft.com/office/drawing/2010/main" val="0"/>
-                        </a:ext>
-                      </a:extLst>
-                    </a:blip>
-                    <a:stretch>
-                      <a:fillRect/>
-                    </a:stretch>
-                  </pic:blipFill>
-                  <pic:spPr>
-                    <a:xfrm>
-                      <a:off x="0" y="0"/>
-                      <a:ext cx="4295775" cy="2200275"/>
-                    </a:xfrm>
-                    <a:prstGeom prst="rect">
-                      <a:avLst/>
-                    </a:prstGeom>
-                  </pic:spPr>
-                </pic:pic>
-              </a:graphicData>
-            </a:graphic>
-          </wp:inline>
-        </w:drawing>
-      </w:r>
-    </w:p>
-    <w:p>
-      <w:pPr>
-        <w:pStyle w:val="Parakstszemobjekta"/>
-        <w:sectPr>
-          <w:pgSz w:w="12240" w:h="15840"/>
-          <w:pgMar w:top="1134" w:right="1134" w:bottom="1134" w:left="1418" w:header="709" w:footer="709" w:gutter="0"/>
-          <w:cols w:space="708"/>
-          <w:docGrid w:linePitch="360"/>
-        </w:sectPr>
-      </w:pPr>
-      <w:fldSimple w:instr=" SEQ attēls \* ARABIC ">
-        <w:r>
-          <w:rPr>
-            <w:noProof/>
-          </w:rPr>
-          <w:t>9</w:t>
-        </w:r>
-      </w:fldSimple>
-      <w:r>
-        <w:t xml:space="preserve">. attēls. Kartes laukuma </w:t>
-      </w:r>
-      <w:proofErr w:type="spellStart"/>
-      <w:r>
-        <w:t>enumerācijas</w:t>
-      </w:r>
-      <w:proofErr w:type="spellEnd"/>
-    </w:p>
-    <w:p>
-      <w:pPr>
-        <w:pStyle w:val="Virsraksts3"/>
-        <w:numPr>
-          <w:ilvl w:val="0"/>
-          <w:numId w:val="0"/>
-        </w:numPr>
-      </w:pPr>
-    </w:p>
-    <w:p>
-      <w:pPr>
-        <w:jc w:val="center"/>
-      </w:pPr>
+      <w:r>
+        <w:t>14</w:t>
+      </w:r>
+      <w:r>
+        <w:t xml:space="preserve">. attēls. </w:t>
+      </w:r>
+      <w:r>
+        <w:t>Kartes objektu īpašības</w:t>
+      </w:r>
     </w:p>
     <w:p>
       <w:pPr>
         <w:pStyle w:val="Virsraksts1"/>
       </w:pPr>
-      <w:bookmarkStart w:id="35" w:name="_Toc225723259"/>
+      <w:bookmarkStart w:id="49" w:name="_Toc230230106"/>
       <w:r>
         <w:lastRenderedPageBreak/>
         <w:t>Lietotāju ceļvedis</w:t>
       </w:r>
-      <w:bookmarkEnd w:id="35"/>
+      <w:bookmarkEnd w:id="49"/>
     </w:p>
     <w:p>
       <w:pPr>
         <w:pStyle w:val="Virsraksts1"/>
       </w:pPr>
-      <w:bookmarkStart w:id="36" w:name="_Toc225723260"/>
+      <w:bookmarkStart w:id="50" w:name="_Toc230230107"/>
       <w:r>
         <w:lastRenderedPageBreak/>
         <w:t>Testēšanas dokumentācija</w:t>
       </w:r>
-      <w:bookmarkEnd w:id="36"/>
+      <w:bookmarkEnd w:id="50"/>
     </w:p>
     <w:p>
       <w:pPr>
         <w:pStyle w:val="Virsraksts2"/>
       </w:pPr>
+      <w:bookmarkStart w:id="51" w:name="_Toc230230108"/>
       <w:r>
         <w:t>Metodoloģija</w:t>
       </w:r>
+      <w:bookmarkEnd w:id="51"/>
     </w:p>
     <w:p>
       <w:r>
@@ -10244,9 +11849,11 @@
       <w:pPr>
         <w:pStyle w:val="Virsraksts2"/>
       </w:pPr>
+      <w:bookmarkStart w:id="52" w:name="_Toc230230109"/>
       <w:r>
         <w:t>Testpiemēri</w:t>
       </w:r>
+      <w:bookmarkEnd w:id="52"/>
     </w:p>
     <w:p>
       <w:r>
@@ -16440,6 +18047,46 @@
       <w:szCs w:val="20"/>
     </w:rPr>
   </w:style>
+  <w:style w:type="paragraph" w:styleId="Vresteksts">
+    <w:name w:val="footnote text"/>
+    <w:basedOn w:val="Parasts"/>
+    <w:link w:val="VrestekstsRakstz"/>
+    <w:uiPriority w:val="99"/>
+    <w:semiHidden/>
+    <w:unhideWhenUsed/>
+    <w:rsid w:val="004E3495"/>
+    <w:pPr>
+      <w:spacing w:line="240" w:lineRule="auto"/>
+    </w:pPr>
+    <w:rPr>
+      <w:sz w:val="20"/>
+      <w:szCs w:val="20"/>
+    </w:rPr>
+  </w:style>
+  <w:style w:type="character" w:customStyle="1" w:styleId="VrestekstsRakstz">
+    <w:name w:val="Vēres teksts Rakstz."/>
+    <w:basedOn w:val="Noklusjumarindkopasfonts"/>
+    <w:link w:val="Vresteksts"/>
+    <w:uiPriority w:val="99"/>
+    <w:semiHidden/>
+    <w:rsid w:val="004E3495"/>
+    <w:rPr>
+      <w:rFonts w:ascii="Times New Roman" w:hAnsi="Times New Roman" w:cs="Times New Roman"/>
+      <w:sz w:val="20"/>
+      <w:szCs w:val="20"/>
+    </w:rPr>
+  </w:style>
+  <w:style w:type="character" w:styleId="Vresatsauce">
+    <w:name w:val="footnote reference"/>
+    <w:basedOn w:val="Noklusjumarindkopasfonts"/>
+    <w:uiPriority w:val="99"/>
+    <w:semiHidden/>
+    <w:unhideWhenUsed/>
+    <w:rsid w:val="004E3495"/>
+    <w:rPr>
+      <w:vertAlign w:val="superscript"/>
+    </w:rPr>
+  </w:style>
 </w:styles>
 </file>
 

</xml_diff>

<commit_message>
centering thing on header 2
</commit_message>
<xml_diff>
--- a/Documentation/Dokumentācija.docx
+++ b/Documentation/Dokumentācija.docx
@@ -112,8 +112,13 @@
       </w:r>
       <w:r>
         <w:br/>
-        <w:t>Skolotājs, Kristaps Rāvalds</w:t>
-      </w:r>
+        <w:t xml:space="preserve">Skolotājs, Kristaps </w:t>
+      </w:r>
+      <w:proofErr w:type="spellStart"/>
+      <w:r>
+        <w:t>Rāvalds</w:t>
+      </w:r>
+      <w:proofErr w:type="spellEnd"/>
     </w:p>
     <w:p>
       <w:pPr>
@@ -5581,7 +5586,15 @@
         <w:t xml:space="preserve">, kā arī </w:t>
       </w:r>
       <w:r>
-        <w:t>kādas datorspēlēs var iekļaut funkcionalitātes, kuras nav nepieciešams vai novērsošas projektam un tās izmantošanai kā pamatzināšanu apmācības materiālam.</w:t>
+        <w:t xml:space="preserve">kādas datorspēlēs var iekļaut funkcionalitātes, kuras nav nepieciešams vai novērsošas projektam un tās izmantošanai kā </w:t>
+      </w:r>
+      <w:proofErr w:type="spellStart"/>
+      <w:r>
+        <w:t>pamatzināšanu</w:t>
+      </w:r>
+      <w:proofErr w:type="spellEnd"/>
+      <w:r>
+        <w:t xml:space="preserve"> apmācības materiālam.</w:t>
       </w:r>
     </w:p>
     <w:p>
@@ -5696,7 +5709,15 @@
         <w:t xml:space="preserve"> </w:t>
       </w:r>
       <w:r>
-        <w:t xml:space="preserve">Pēc izstrādes šis projekts ar tās avotkodu tiek kompilēts datorsistēmas platformās kā </w:t>
+        <w:t xml:space="preserve">Pēc izstrādes šis projekts ar tās </w:t>
+      </w:r>
+      <w:proofErr w:type="spellStart"/>
+      <w:r>
+        <w:t>avotkodu</w:t>
+      </w:r>
+      <w:proofErr w:type="spellEnd"/>
+      <w:r>
+        <w:t xml:space="preserve"> tiek kompilēts datorsistēmas platformās kā </w:t>
       </w:r>
       <w:r>
         <w:rPr>
@@ -5708,6 +5729,7 @@
       <w:r>
         <w:t xml:space="preserve"> un </w:t>
       </w:r>
+      <w:proofErr w:type="spellStart"/>
       <w:r>
         <w:rPr>
           <w:i/>
@@ -5715,6 +5737,7 @@
         </w:rPr>
         <w:t>Linux</w:t>
       </w:r>
+      <w:proofErr w:type="spellEnd"/>
       <w:r>
         <w:t xml:space="preserve"> vidē.</w:t>
       </w:r>
@@ -5791,7 +5814,15 @@
         <w:t xml:space="preserve">Pēc modelēšanas tiek izstrādās projekts, pamatojoties uz iepriekš izveidotiem modeļiem. Izstrādes laikā </w:t>
       </w:r>
       <w:r>
-        <w:t>ir jāveic projektam versionēšanu jeb versiju kontroli, kuras vadīs projekta stadijas punktus. Praksē tā tiks izmantota, piemēram, projekta sazarošanai funkcionalitātes, būtisko izmaiņu ieviešanai, atsevišķu failu izmaiņu punktu atzīmēšanu, sazarojumu apvienošanu un versijas punktu atzīmēšanu.</w:t>
+        <w:t xml:space="preserve">ir jāveic projektam </w:t>
+      </w:r>
+      <w:proofErr w:type="spellStart"/>
+      <w:r>
+        <w:t>versionēšanu</w:t>
+      </w:r>
+      <w:proofErr w:type="spellEnd"/>
+      <w:r>
+        <w:t xml:space="preserve"> jeb versiju kontroli, kuras vadīs projekta stadijas punktus. Praksē tā tiks izmantota, piemēram, projekta sazarošanai funkcionalitātes, būtisko izmaiņu ieviešanai, atsevišķu failu izmaiņu punktu atzīmēšanu, sazarojumu apvienošanu un versijas punktu atzīmēšanu.</w:t>
       </w:r>
     </w:p>
     <w:p>
@@ -6006,7 +6037,15 @@
         <w:t>Izvaddati</w:t>
       </w:r>
       <w:r>
-        <w:t>: Uznirsts anotācijas logs.</w:t>
+        <w:t xml:space="preserve">: </w:t>
+      </w:r>
+      <w:proofErr w:type="spellStart"/>
+      <w:r>
+        <w:t>Uznirsts</w:t>
+      </w:r>
+      <w:proofErr w:type="spellEnd"/>
+      <w:r>
+        <w:t xml:space="preserve"> anotācijas logs.</w:t>
       </w:r>
     </w:p>
     <w:p>
@@ -7027,8 +7066,13 @@
       <w:r>
         <w:t xml:space="preserve">: </w:t>
       </w:r>
-      <w:r>
-        <w:t>Augšjoslas pauzēšanas poga.</w:t>
+      <w:proofErr w:type="spellStart"/>
+      <w:r>
+        <w:t>Augšjoslas</w:t>
+      </w:r>
+      <w:proofErr w:type="spellEnd"/>
+      <w:r>
+        <w:t xml:space="preserve"> pauzēšanas poga.</w:t>
       </w:r>
     </w:p>
     <w:p>
@@ -7236,8 +7280,13 @@
         <w:t>: Laika rādītājs</w:t>
       </w:r>
       <w:r>
-        <w:t xml:space="preserve"> augšjoslā</w:t>
-      </w:r>
+        <w:t xml:space="preserve"> </w:t>
+      </w:r>
+      <w:proofErr w:type="spellStart"/>
+      <w:r>
+        <w:t>augšjoslā</w:t>
+      </w:r>
+      <w:proofErr w:type="spellEnd"/>
       <w:r>
         <w:t>.</w:t>
       </w:r>
@@ -7296,8 +7345,13 @@
         <w:t xml:space="preserve">: </w:t>
       </w:r>
       <w:r>
-        <w:t>Kārtas skaits augšjoslā</w:t>
-      </w:r>
+        <w:t xml:space="preserve">Kārtas skaits </w:t>
+      </w:r>
+      <w:proofErr w:type="spellStart"/>
+      <w:r>
+        <w:t>augšjoslā</w:t>
+      </w:r>
+      <w:proofErr w:type="spellEnd"/>
       <w:r>
         <w:t xml:space="preserve">. </w:t>
       </w:r>
@@ -9816,7 +9870,15 @@
       </w:r>
       <w:r>
         <w:tab/>
-        <w:t>Datorspēles kompilētā programmai ir jābūt pēc iespējas pieejamai vairākās platformās vai kompilējamam vairākām operētājsistēmām, taču galvenokārt “Windows” un “Linux” videi;</w:t>
+        <w:t>Datorspēles kompilētā programmai ir jābūt pēc iespējas pieejamai vairākās platformās vai kompilējamam vairākām operētājsistēmām, taču galvenokārt “Windows” un “</w:t>
+      </w:r>
+      <w:proofErr w:type="spellStart"/>
+      <w:r>
+        <w:t>Linux</w:t>
+      </w:r>
+      <w:proofErr w:type="spellEnd"/>
+      <w:r>
+        <w:t>” videi;</w:t>
       </w:r>
     </w:p>
     <w:p>
@@ -9834,9 +9896,14 @@
       </w:pPr>
       <w:bookmarkStart w:id="15" w:name="_Toc230242293"/>
       <w:r>
-        <w:t>Lietotāja saskarne</w:t>
+        <w:t xml:space="preserve">Lietotāja </w:t>
+      </w:r>
+      <w:proofErr w:type="spellStart"/>
+      <w:r>
+        <w:t>saskarne</w:t>
       </w:r>
       <w:bookmarkEnd w:id="15"/>
+      <w:proofErr w:type="spellEnd"/>
     </w:p>
     <w:p>
       <w:r>
@@ -9853,7 +9920,15 @@
       </w:r>
       <w:r>
         <w:tab/>
-        <w:t>Datorspēles grafikai un lietotāja saskarnei jābūt minimālai, taču viegli pārskatāmai;</w:t>
+        <w:t xml:space="preserve">Datorspēles grafikai un lietotāja </w:t>
+      </w:r>
+      <w:proofErr w:type="spellStart"/>
+      <w:r>
+        <w:t>saskarnei</w:t>
+      </w:r>
+      <w:proofErr w:type="spellEnd"/>
+      <w:r>
+        <w:t xml:space="preserve"> jābūt minimālai, taču viegli pārskatāmai;</w:t>
       </w:r>
     </w:p>
     <w:p>
@@ -9865,7 +9940,15 @@
       </w:r>
       <w:r>
         <w:tab/>
-        <w:t>Lietotāja saskarnei ir jābūt pielāgojamai dažādos ekrānu izmēros vai izšķirtspējās;</w:t>
+        <w:t xml:space="preserve">Lietotāja </w:t>
+      </w:r>
+      <w:proofErr w:type="spellStart"/>
+      <w:r>
+        <w:t>saskarnei</w:t>
+      </w:r>
+      <w:proofErr w:type="spellEnd"/>
+      <w:r>
+        <w:t xml:space="preserve"> ir jābūt pielāgojamai dažādos ekrānu izmēros vai izšķirtspējās;</w:t>
       </w:r>
     </w:p>
     <w:p>
@@ -9877,7 +9960,15 @@
       </w:r>
       <w:r>
         <w:tab/>
-        <w:t>Datorspēles saskarnes valodai jābūt angļu valodai;</w:t>
+        <w:t xml:space="preserve">Datorspēles </w:t>
+      </w:r>
+      <w:proofErr w:type="spellStart"/>
+      <w:r>
+        <w:t>saskarnes</w:t>
+      </w:r>
+      <w:proofErr w:type="spellEnd"/>
+      <w:r>
+        <w:t xml:space="preserve"> valodai jābūt angļu valodai;</w:t>
       </w:r>
     </w:p>
     <w:p>
@@ -9982,7 +10073,15 @@
     </w:p>
     <w:p>
       <w:r>
-        <w:t>Šī sadaļa noskaidros, kādi ir pieejami līdzekļi un rīki, lietojuma pamatojumi un tās iespējamās alternatīvās projekta īstenošanai. Rīki tiks atlasīti pēc licencēšanas, kurai ir jābūt pēc iespējas brīvai un atvērtai, starpplatformu pieejamības, pieejamās dimensiju vides, kuras jāiekļauj un jābūt optimizēta div</w:t>
+        <w:t xml:space="preserve">Šī sadaļa noskaidros, kādi ir pieejami līdzekļi un rīki, lietojuma pamatojumi un tās iespējamās alternatīvās projekta īstenošanai. Rīki tiks atlasīti pēc licencēšanas, kurai ir jābūt pēc iespējas brīvai un atvērtai, </w:t>
+      </w:r>
+      <w:proofErr w:type="spellStart"/>
+      <w:r>
+        <w:t>starpplatformu</w:t>
+      </w:r>
+      <w:proofErr w:type="spellEnd"/>
+      <w:r>
+        <w:t xml:space="preserve"> pieejamības, pieejamās dimensiju vides, kuras jāiekļauj un jābūt optimizēta div</w:t>
       </w:r>
       <w:r>
         <w:t xml:space="preserve">u </w:t>
@@ -10016,13 +10115,37 @@
     </w:p>
     <w:p>
       <w:r>
-        <w:t>Spēļu un grafikas ietvars “Godot” ir izcelta starp pārējiem tāda veida ietvariem, jo liels skaits neliela mēra projektu kā pašizstrādātās vai mazo komandu izstrādātās spēles. Ne tikai pēc popularitātes dēļ, taču licencēšana norāda šo ietvaru par brīvu un atvērtu, kurai nav nepieciešama ne papildizmaksas, nedz reģistrācijas, kā arī ir salīdzinoši ar citiem ietvariem ātri un viegli apgūstama. Šis dzinis arī ir pieejams vairākās platformās, it īpaši starp operētājsistēmām. Funkcionāli tā ir optimizēta div</w:t>
+        <w:t>Spēļu un grafikas ietvars “</w:t>
+      </w:r>
+      <w:proofErr w:type="spellStart"/>
+      <w:r>
+        <w:t>Godot</w:t>
+      </w:r>
+      <w:proofErr w:type="spellEnd"/>
+      <w:r>
+        <w:t xml:space="preserve">” ir izcelta starp pārējiem tāda veida ietvariem, jo liels skaits neliela mēra projektu kā </w:t>
+      </w:r>
+      <w:proofErr w:type="spellStart"/>
+      <w:r>
+        <w:t>pašizstrādātās</w:t>
+      </w:r>
+      <w:proofErr w:type="spellEnd"/>
+      <w:r>
+        <w:t xml:space="preserve"> vai mazo komandu izstrādātās spēles. Ne tikai pēc popularitātes dēļ, taču licencēšana norāda šo ietvaru par brīvu un atvērtu, kurai nav nepieciešama ne papildizmaksas, nedz reģistrācijas, kā arī ir salīdzinoši ar citiem ietvariem ātri un viegli apgūstama. Šis dzinis arī ir pieejams vairākās platformās, it īpaši starp operētājsistēmām. Funkcionāli tā ir optimizēta div</w:t>
       </w:r>
       <w:r>
         <w:t xml:space="preserve">u </w:t>
       </w:r>
       <w:r>
-        <w:t xml:space="preserve">dimensiju videi pēc noteiktiem kritērijiem, taču arī ir iespējams izmantot trīsdimensiju vidi, kura arī ir īpaši optimizēta un pielāgota. </w:t>
+        <w:t xml:space="preserve">dimensiju videi pēc noteiktiem kritērijiem, taču arī ir iespējams izmantot </w:t>
+      </w:r>
+      <w:proofErr w:type="spellStart"/>
+      <w:r>
+        <w:t>trīsdimensiju</w:t>
+      </w:r>
+      <w:proofErr w:type="spellEnd"/>
+      <w:r>
+        <w:t xml:space="preserve"> vidi, kura arī ir īpaši optimizēta un pielāgota. </w:t>
       </w:r>
     </w:p>
     <w:p>
@@ -10037,7 +10160,55 @@
     </w:p>
     <w:p>
       <w:r>
-        <w:t>Ietvars “Godot” oficiāli piedāvā izmantot abas programmēšanas valodas – “Godot” iebūvētā “GDScript” un “.NET” ietvara valoda “C#”, kura tiks izvēlēta šī projekta izstrādei. “GDScript” ir interpretētā valoda, kura tiek tikai apstrādāta palaišanas laikā un pēc avotkoda izmaiņām nav nepieciešama papildus darbības kā kompilēšanu, taču ar nepilnību, kura mazina datorspēles darbības veiktspēju. “C#” valoda tiks izmantota tam dēļ, ka veiktspēja datorspēles darbībai ir uzlabota ar nosacījumu, ka pēc jebkuras izmaiņas projektu ir nepieciešams kompilēt. “GDScript” arī nav pilnīgi pielāgota objektorientētai izmantošanai, kamēr “C#” pēc dizaina ir objektorientētā valoda.</w:t>
+        <w:t>Ietvars “</w:t>
+      </w:r>
+      <w:proofErr w:type="spellStart"/>
+      <w:r>
+        <w:t>Godot</w:t>
+      </w:r>
+      <w:proofErr w:type="spellEnd"/>
+      <w:r>
+        <w:t>” oficiāli piedāvā izmantot abas programmēšanas valodas – “</w:t>
+      </w:r>
+      <w:proofErr w:type="spellStart"/>
+      <w:r>
+        <w:t>Godot</w:t>
+      </w:r>
+      <w:proofErr w:type="spellEnd"/>
+      <w:r>
+        <w:t>” iebūvētā “</w:t>
+      </w:r>
+      <w:proofErr w:type="spellStart"/>
+      <w:r>
+        <w:t>GDScript</w:t>
+      </w:r>
+      <w:proofErr w:type="spellEnd"/>
+      <w:r>
+        <w:t>” un “.NET” ietvara valoda “C#”, kura tiks izvēlēta šī projekta izstrādei. “</w:t>
+      </w:r>
+      <w:proofErr w:type="spellStart"/>
+      <w:r>
+        <w:t>GDScript</w:t>
+      </w:r>
+      <w:proofErr w:type="spellEnd"/>
+      <w:r>
+        <w:t xml:space="preserve">” ir interpretētā valoda, kura tiek tikai apstrādāta palaišanas laikā un pēc </w:t>
+      </w:r>
+      <w:proofErr w:type="spellStart"/>
+      <w:r>
+        <w:t>avotkoda</w:t>
+      </w:r>
+      <w:proofErr w:type="spellEnd"/>
+      <w:r>
+        <w:t xml:space="preserve"> izmaiņām nav nepieciešama papildus darbības kā kompilēšanu, taču ar nepilnību, kura mazina datorspēles darbības veiktspēju. “C#” valoda tiks izmantota tam dēļ, ka veiktspēja datorspēles darbībai ir uzlabota ar nosacījumu, ka pēc jebkuras izmaiņas projektu ir nepieciešams kompilēt. “</w:t>
+      </w:r>
+      <w:proofErr w:type="spellStart"/>
+      <w:r>
+        <w:t>GDScript</w:t>
+      </w:r>
+      <w:proofErr w:type="spellEnd"/>
+      <w:r>
+        <w:t>” arī nav pilnīgi pielāgota objektorientētai izmantošanai, kamēr “C#” pēc dizaina ir objektorientētā valoda.</w:t>
       </w:r>
     </w:p>
     <w:p>
@@ -10052,7 +10223,23 @@
     </w:p>
     <w:p>
       <w:r>
-        <w:t>“Godot” ietvaram ir jau savs projekta redaktors, kurā iekļauj koda redaktoru. Šis koda redaktors ir vairāk pielāgots ar “GDScript” valodu, taču pieejams atbalsts “C#” valodai. Pašā izstrādes vidē var viegli pārslēgties uz vizuālo redaktoru, kodu redaktoru un atkļūdošanas sadaļu</w:t>
+        <w:t>“</w:t>
+      </w:r>
+      <w:proofErr w:type="spellStart"/>
+      <w:r>
+        <w:t>Godot</w:t>
+      </w:r>
+      <w:proofErr w:type="spellEnd"/>
+      <w:r>
+        <w:t>” ietvaram ir jau savs projekta redaktors, kurā iekļauj koda redaktoru. Šis koda redaktors ir vairāk pielāgots ar “</w:t>
+      </w:r>
+      <w:proofErr w:type="spellStart"/>
+      <w:r>
+        <w:t>GDScript</w:t>
+      </w:r>
+      <w:proofErr w:type="spellEnd"/>
+      <w:r>
+        <w:t>” valodu, taču pieejams atbalsts “C#” valodai. Pašā izstrādes vidē var viegli pārslēgties uz vizuālo redaktoru, kodu redaktoru un atkļūdošanas sadaļu</w:t>
       </w:r>
       <w:r>
         <w:t xml:space="preserve"> un nenošķir kodu rakstīšanu ar vizuālo rediģēšanu</w:t>
@@ -10068,19 +10255,48 @@
       <w:bookmarkStart w:id="23" w:name="_Toc230242301"/>
       <w:r>
         <w:lastRenderedPageBreak/>
-        <w:t>Versiju kontrole un repozitorijas mitināšana</w:t>
+        <w:t xml:space="preserve">Versiju kontrole un </w:t>
+      </w:r>
+      <w:proofErr w:type="spellStart"/>
+      <w:r>
+        <w:t>repozitorijas</w:t>
+      </w:r>
+      <w:proofErr w:type="spellEnd"/>
+      <w:r>
+        <w:t xml:space="preserve"> mitināšana</w:t>
       </w:r>
       <w:bookmarkEnd w:id="23"/>
     </w:p>
     <w:p>
       <w:r>
-        <w:t>“Git” tiks izmantots versiju kontrolei un tīmeklī tiks izmantots ”</w:t>
+        <w:t>“</w:t>
+      </w:r>
+      <w:proofErr w:type="spellStart"/>
+      <w:r>
+        <w:t>Git</w:t>
+      </w:r>
+      <w:proofErr w:type="spellEnd"/>
+      <w:r>
+        <w:t>” tiks izmantots versiju kontrolei un tīmeklī tiks izmantots ”</w:t>
       </w:r>
       <w:r>
         <w:t xml:space="preserve"> </w:t>
       </w:r>
-      <w:r>
-        <w:t>GitHub”, lai mitinātu šo projekta avotkodu.</w:t>
+      <w:proofErr w:type="spellStart"/>
+      <w:r>
+        <w:t>GitHub</w:t>
+      </w:r>
+      <w:proofErr w:type="spellEnd"/>
+      <w:r>
+        <w:t xml:space="preserve">”, lai mitinātu šo projekta </w:t>
+      </w:r>
+      <w:proofErr w:type="spellStart"/>
+      <w:r>
+        <w:t>avotkodu</w:t>
+      </w:r>
+      <w:proofErr w:type="spellEnd"/>
+      <w:r>
+        <w:t>.</w:t>
       </w:r>
     </w:p>
     <w:p>
@@ -10110,7 +10326,103 @@
     </w:p>
     <w:p>
       <w:r>
-        <w:t>Populārākos ietvarus datorspēļu un citu mediju izstrādē iekļauj “Unity”, “Unreal Engine”,  “CryEngine”. Ietvari “Unreal Engine” un “CryEngine” nav pielāgoti divdimensiju datorspēļu izveidei ietvara ierobežojumu dēļ, kura no tās izslēdz izmantošanu, ja ne arī neprasa veiktspējīgu datorsistēmu, kura ir pretrunā ar projekta mērķiem, taču “Unity” ietvars neprasa salīdzinoši veiktspējīgu datorsistēmu un ir pielāgojama divdimensiju videi, taču licencēšana nav brīva un prasa lietotāja reģistrāciju un papildizmaksas, ja šis projekts paplašināties komercdarbības nolūkiem.</w:t>
+        <w:t>Populārākos ietvarus datorspēļu un citu mediju izstrādē iekļauj “</w:t>
+      </w:r>
+      <w:proofErr w:type="spellStart"/>
+      <w:r>
+        <w:t>Unity</w:t>
+      </w:r>
+      <w:proofErr w:type="spellEnd"/>
+      <w:r>
+        <w:t>”, “</w:t>
+      </w:r>
+      <w:proofErr w:type="spellStart"/>
+      <w:r>
+        <w:t>Unreal</w:t>
+      </w:r>
+      <w:proofErr w:type="spellEnd"/>
+      <w:r>
+        <w:t xml:space="preserve"> </w:t>
+      </w:r>
+      <w:proofErr w:type="spellStart"/>
+      <w:r>
+        <w:t>Engine</w:t>
+      </w:r>
+      <w:proofErr w:type="spellEnd"/>
+      <w:r>
+        <w:t>”,  “</w:t>
+      </w:r>
+      <w:proofErr w:type="spellStart"/>
+      <w:r>
+        <w:t>CryEngine</w:t>
+      </w:r>
+      <w:proofErr w:type="spellEnd"/>
+      <w:r>
+        <w:t>”. Ietvari “</w:t>
+      </w:r>
+      <w:proofErr w:type="spellStart"/>
+      <w:r>
+        <w:t>Unreal</w:t>
+      </w:r>
+      <w:proofErr w:type="spellEnd"/>
+      <w:r>
+        <w:t xml:space="preserve"> </w:t>
+      </w:r>
+      <w:proofErr w:type="spellStart"/>
+      <w:r>
+        <w:t>Engine</w:t>
+      </w:r>
+      <w:proofErr w:type="spellEnd"/>
+      <w:r>
+        <w:t>” un “</w:t>
+      </w:r>
+      <w:proofErr w:type="spellStart"/>
+      <w:r>
+        <w:t>CryEngine</w:t>
+      </w:r>
+      <w:proofErr w:type="spellEnd"/>
+      <w:r>
+        <w:t xml:space="preserve">” nav pielāgoti </w:t>
+      </w:r>
+      <w:proofErr w:type="spellStart"/>
+      <w:r>
+        <w:t>divdimensiju</w:t>
+      </w:r>
+      <w:proofErr w:type="spellEnd"/>
+      <w:r>
+        <w:t xml:space="preserve"> datorspēļu izveidei ietvara ierobežojumu dēļ, kura no tās izslēdz izmantošanu, ja ne arī neprasa </w:t>
+      </w:r>
+      <w:proofErr w:type="spellStart"/>
+      <w:r>
+        <w:t>veiktspējīgu</w:t>
+      </w:r>
+      <w:proofErr w:type="spellEnd"/>
+      <w:r>
+        <w:t xml:space="preserve"> datorsistēmu, kura ir pretrunā ar projekta mērķiem, taču “</w:t>
+      </w:r>
+      <w:proofErr w:type="spellStart"/>
+      <w:r>
+        <w:t>Unity</w:t>
+      </w:r>
+      <w:proofErr w:type="spellEnd"/>
+      <w:r>
+        <w:t xml:space="preserve">” ietvars neprasa salīdzinoši </w:t>
+      </w:r>
+      <w:proofErr w:type="spellStart"/>
+      <w:r>
+        <w:t>veiktspējīgu</w:t>
+      </w:r>
+      <w:proofErr w:type="spellEnd"/>
+      <w:r>
+        <w:t xml:space="preserve"> datorsistēmu un ir pielāgojama </w:t>
+      </w:r>
+      <w:proofErr w:type="spellStart"/>
+      <w:r>
+        <w:t>divdimensiju</w:t>
+      </w:r>
+      <w:proofErr w:type="spellEnd"/>
+      <w:r>
+        <w:t xml:space="preserve"> videi, taču licencēšana nav brīva un prasa lietotāja reģistrāciju un papildizmaksas, ja šis projekts paplašināties komercdarbības nolūkiem.</w:t>
       </w:r>
     </w:p>
     <w:p>
@@ -10125,7 +10437,63 @@
     </w:p>
     <w:p>
       <w:r>
-        <w:t>Ietvari “CryEngine” un “Unreal Engine” izmanto valodu “C++”, kurā iekļauj klases un objektorientētā funkcionalitāte kā C#, taču neatlasot šos ietvarus valoda “C++” netiks izmantota. “C++” lietojuma stili ir plašāki, taču valodas funkcionalitāti un īpatnības apgūt ir sarežģītāk nekā ar “C#”, kura izstrādātājam liek lietot objektorientētā stilā, kurā visi elementi valodā ir objekti, kā arī vairums funkcionalitātes ir aizklātas ar metodēm, kura mazina izstrādes laiku salīdzinot ar “C++”, kura vairākas kompleksas funkcionalitātes nav aizklātas ar metodēm, kura var palēlināt izstrādes laiku. Izvēlētā ietvarā “Godot” ir pieejama skriptēšanas valoda “GDScript”, taču pēc nosacītiem iemesliem izvēlētai valodai šī valoda netiks izmantota.</w:t>
+        <w:t>Ietvari “</w:t>
+      </w:r>
+      <w:proofErr w:type="spellStart"/>
+      <w:r>
+        <w:t>CryEngine</w:t>
+      </w:r>
+      <w:proofErr w:type="spellEnd"/>
+      <w:r>
+        <w:t>” un “</w:t>
+      </w:r>
+      <w:proofErr w:type="spellStart"/>
+      <w:r>
+        <w:t>Unreal</w:t>
+      </w:r>
+      <w:proofErr w:type="spellEnd"/>
+      <w:r>
+        <w:t xml:space="preserve"> </w:t>
+      </w:r>
+      <w:proofErr w:type="spellStart"/>
+      <w:r>
+        <w:t>Engine</w:t>
+      </w:r>
+      <w:proofErr w:type="spellEnd"/>
+      <w:r>
+        <w:t xml:space="preserve">” izmanto valodu “C++”, kurā iekļauj klases un objektorientētā funkcionalitāte kā C#, taču neatlasot šos ietvarus valoda “C++” netiks izmantota. “C++” lietojuma stili ir plašāki, taču valodas funkcionalitāti un īpatnības apgūt ir sarežģītāk nekā ar “C#”, kura izstrādātājam liek lietot objektorientētā stilā, kurā visi elementi valodā ir objekti, kā arī vairums funkcionalitātes ir aizklātas ar metodēm, kura mazina izstrādes laiku salīdzinot ar “C++”, kura vairākas kompleksas funkcionalitātes nav aizklātas ar metodēm, kura var </w:t>
+      </w:r>
+      <w:proofErr w:type="spellStart"/>
+      <w:r>
+        <w:t>palēlināt</w:t>
+      </w:r>
+      <w:proofErr w:type="spellEnd"/>
+      <w:r>
+        <w:t xml:space="preserve"> izstrādes laiku. Izvēlētā ietvarā “</w:t>
+      </w:r>
+      <w:proofErr w:type="spellStart"/>
+      <w:r>
+        <w:t>Godot</w:t>
+      </w:r>
+      <w:proofErr w:type="spellEnd"/>
+      <w:r>
+        <w:t xml:space="preserve">” ir pieejama </w:t>
+      </w:r>
+      <w:proofErr w:type="spellStart"/>
+      <w:r>
+        <w:t>skriptēšanas</w:t>
+      </w:r>
+      <w:proofErr w:type="spellEnd"/>
+      <w:r>
+        <w:t xml:space="preserve"> valoda “</w:t>
+      </w:r>
+      <w:proofErr w:type="spellStart"/>
+      <w:r>
+        <w:t>GDScript</w:t>
+      </w:r>
+      <w:proofErr w:type="spellEnd"/>
+      <w:r>
+        <w:t>”, taču pēc nosacītiem iemesliem izvēlētai valodai šī valoda netiks izmantota.</w:t>
       </w:r>
     </w:p>
     <w:p>
@@ -10152,17 +10520,169 @@
     </w:p>
     <w:p>
       <w:r>
-        <w:t>Tā kā valoda “C#” tiks izmantota, kura ir daļa no ietvara “.NET”, tiks izmantoti attiecīgas izstrādes programmatūras ar uzsvaru uz noteikto ietvaru un tās ekosistēmas. Populārākā izstrādes  vide tam ir “Visual Studio”, kura līdzīgi ar izvēlēto izstrādes vidi “JetBrains Rider” iekļauj detalizētu atķļūdošanu, kodu analīze, automātiskā aizpilde, u.t.t., taču netiks izmantota, jo šī programmatūra nav starpplatformu, ierobežojoties uz “Windows” platformu, kuru autors neizmanto, tātad nepieejama programmatūra autoram.</w:t>
-      </w:r>
-    </w:p>
-    <w:p>
-      <w:r>
-        <w:t>Ja ietvars kā “Unreal Engine” tiktu izmantota, kurā galvenā valoda ir “C++”, tiktu izmantotas izstrādes vides attiecīgi valodai kā “Qt Creator”, kura ir pielāgota ietvara “Qt” programmatūras izstrādei, taču iespējams izveidot projektus, kuras neizmanto minēto ietvaru, ņemot vērā to, ka funkcionalitāte un tās iespējas mazinās vai ne tik advancētas citiem projektiem,  vai “JetBrains CLion”, kurai ir līdzīga funkcionalitāte ar atlasīto izstrādes vidi “”JetBrains Rider” no “JetBrains” programmatūru klāsta.</w:t>
-      </w:r>
-    </w:p>
-    <w:p>
-      <w:r>
-        <w:t>Arī iespējams ir izmantot teksta redaktoru “Visual Studio Code”, kura ar paplašinājumiem var izmantot kā izstrādes vidi, taču noklusētā funkcionalitāte ir ierobežota salīdzinot ar iepriekšējām izstrādes programmatūrām un nepieciešama papildus iestatīšana šai programmatūrai, kura nebūtu nepieciešama pārējām izstrādes vidēm atverot sākotnēji.</w:t>
+        <w:t>Tā kā valoda “C#” tiks izmantota, kura ir daļa no ietvara “.NET”, tiks izmantoti attiecīgas izstrādes programmatūras ar uzsvaru uz noteikto ietvaru un tās ekosistēmas. Populārākā izstrādes  vide tam ir “</w:t>
+      </w:r>
+      <w:proofErr w:type="spellStart"/>
+      <w:r>
+        <w:t>Visual</w:t>
+      </w:r>
+      <w:proofErr w:type="spellEnd"/>
+      <w:r>
+        <w:t xml:space="preserve"> </w:t>
+      </w:r>
+      <w:proofErr w:type="spellStart"/>
+      <w:r>
+        <w:t>Studio</w:t>
+      </w:r>
+      <w:proofErr w:type="spellEnd"/>
+      <w:r>
+        <w:t>”, kura līdzīgi ar izvēlēto izstrādes vidi “</w:t>
+      </w:r>
+      <w:proofErr w:type="spellStart"/>
+      <w:r>
+        <w:t>JetBrains</w:t>
+      </w:r>
+      <w:proofErr w:type="spellEnd"/>
+      <w:r>
+        <w:t xml:space="preserve"> </w:t>
+      </w:r>
+      <w:proofErr w:type="spellStart"/>
+      <w:r>
+        <w:t>Rider</w:t>
+      </w:r>
+      <w:proofErr w:type="spellEnd"/>
+      <w:r>
+        <w:t xml:space="preserve">” iekļauj detalizētu </w:t>
+      </w:r>
+      <w:proofErr w:type="spellStart"/>
+      <w:r>
+        <w:t>atķļūdošanu</w:t>
+      </w:r>
+      <w:proofErr w:type="spellEnd"/>
+      <w:r>
+        <w:t xml:space="preserve">, kodu analīze, automātiskā aizpilde, u.t.t., taču netiks izmantota, jo šī programmatūra nav </w:t>
+      </w:r>
+      <w:proofErr w:type="spellStart"/>
+      <w:r>
+        <w:t>starpplatformu</w:t>
+      </w:r>
+      <w:proofErr w:type="spellEnd"/>
+      <w:r>
+        <w:t>, ierobežojoties uz “Windows” platformu, kuru autors neizmanto, tātad nepieejama programmatūra autoram.</w:t>
+      </w:r>
+    </w:p>
+    <w:p>
+      <w:r>
+        <w:t>Ja ietvars kā “</w:t>
+      </w:r>
+      <w:proofErr w:type="spellStart"/>
+      <w:r>
+        <w:t>Unreal</w:t>
+      </w:r>
+      <w:proofErr w:type="spellEnd"/>
+      <w:r>
+        <w:t xml:space="preserve"> </w:t>
+      </w:r>
+      <w:proofErr w:type="spellStart"/>
+      <w:r>
+        <w:t>Engine</w:t>
+      </w:r>
+      <w:proofErr w:type="spellEnd"/>
+      <w:r>
+        <w:t>” tiktu izmantota, kurā galvenā valoda ir “C++”, tiktu izmantotas izstrādes vides attiecīgi valodai kā “</w:t>
+      </w:r>
+      <w:proofErr w:type="spellStart"/>
+      <w:r>
+        <w:t>Qt</w:t>
+      </w:r>
+      <w:proofErr w:type="spellEnd"/>
+      <w:r>
+        <w:t xml:space="preserve"> </w:t>
+      </w:r>
+      <w:proofErr w:type="spellStart"/>
+      <w:r>
+        <w:t>Creator</w:t>
+      </w:r>
+      <w:proofErr w:type="spellEnd"/>
+      <w:r>
+        <w:t>”, kura ir pielāgota ietvara “</w:t>
+      </w:r>
+      <w:proofErr w:type="spellStart"/>
+      <w:r>
+        <w:t>Qt</w:t>
+      </w:r>
+      <w:proofErr w:type="spellEnd"/>
+      <w:r>
+        <w:t xml:space="preserve">” programmatūras izstrādei, taču iespējams izveidot projektus, kuras neizmanto minēto ietvaru, ņemot vērā to, ka funkcionalitāte un tās iespējas mazinās vai ne tik </w:t>
+      </w:r>
+      <w:proofErr w:type="spellStart"/>
+      <w:r>
+        <w:t>advancētas</w:t>
+      </w:r>
+      <w:proofErr w:type="spellEnd"/>
+      <w:r>
+        <w:t xml:space="preserve"> citiem projektiem,  vai “</w:t>
+      </w:r>
+      <w:proofErr w:type="spellStart"/>
+      <w:r>
+        <w:t>JetBrains</w:t>
+      </w:r>
+      <w:proofErr w:type="spellEnd"/>
+      <w:r>
+        <w:t xml:space="preserve"> </w:t>
+      </w:r>
+      <w:proofErr w:type="spellStart"/>
+      <w:r>
+        <w:t>CLion</w:t>
+      </w:r>
+      <w:proofErr w:type="spellEnd"/>
+      <w:r>
+        <w:t>”, kurai ir līdzīga funkcionalitāte ar atlasīto izstrādes vidi “”</w:t>
+      </w:r>
+      <w:proofErr w:type="spellStart"/>
+      <w:r>
+        <w:t>JetBrains</w:t>
+      </w:r>
+      <w:proofErr w:type="spellEnd"/>
+      <w:r>
+        <w:t xml:space="preserve"> </w:t>
+      </w:r>
+      <w:proofErr w:type="spellStart"/>
+      <w:r>
+        <w:t>Rider</w:t>
+      </w:r>
+      <w:proofErr w:type="spellEnd"/>
+      <w:r>
+        <w:t>” no “</w:t>
+      </w:r>
+      <w:proofErr w:type="spellStart"/>
+      <w:r>
+        <w:t>JetBrains</w:t>
+      </w:r>
+      <w:proofErr w:type="spellEnd"/>
+      <w:r>
+        <w:t>” programmatūru klāsta.</w:t>
+      </w:r>
+    </w:p>
+    <w:p>
+      <w:r>
+        <w:t>Arī iespējams ir izmantot teksta redaktoru “</w:t>
+      </w:r>
+      <w:proofErr w:type="spellStart"/>
+      <w:r>
+        <w:t>Visual</w:t>
+      </w:r>
+      <w:proofErr w:type="spellEnd"/>
+      <w:r>
+        <w:t xml:space="preserve"> </w:t>
+      </w:r>
+      <w:proofErr w:type="spellStart"/>
+      <w:r>
+        <w:t>Studio</w:t>
+      </w:r>
+      <w:proofErr w:type="spellEnd"/>
+      <w:r>
+        <w:t xml:space="preserve"> Code”, kura ar paplašinājumiem var izmantot kā izstrādes vidi, taču noklusētā funkcionalitāte ir ierobežota salīdzinot ar iepriekšējām izstrādes programmatūrām un nepieciešama papildus iestatīšana šai programmatūrai, kura nebūtu nepieciešama pārējām izstrādes vidēm atverot sākotnēji.</w:t>
       </w:r>
     </w:p>
     <w:p>
@@ -10177,12 +10697,84 @@
     </w:p>
     <w:p>
       <w:r>
-        <w:t>Mazāk populāri pakalpojumi, kuri mitina avotkodu repozotorijus, izmantojot “Git” versiju kontroli, arī ir pieejami rīki, kura var automatizēt projekta kompilēšanu un pārbaudi, šādi rīki ir “GitLab”, “Gitea” un “Bitbucket”, kuri ir īpaši pielāgota CI/CD izstrādes videi, taču prasa papildizmaksas, ja šādi rīki tiek palaisti šo pakalpojumu serveros vietā pašam lietotājam mitināt šos rīkus.</w:t>
-      </w:r>
-    </w:p>
-    <w:p>
-      <w:r>
-        <w:t>Taču arī ir pieejami pakalpojumi un rīki, kuri nav atkarīga no “Git” versiju kontroles, bet kā pieejamu versiju kontroles programmatūru starp pārējām. Viens no šiem rīkiem ir “Azure Pipelines”, kuras funkcionalitāte ir plašāka salīdzinot ar iepriekš minētiem rīkiem, taču tās plaša funkcionalitātes klāsts ir radīts lielākiem projektiem, kuri iespējams nebūs lielāko daļu paredzēts izmantošanai šī projekta nolūkiem tās apjoma dēļ un lielākas izmaksas, salīdzinot ar iepriekš minētiem rīkiem.</w:t>
+        <w:t xml:space="preserve">Mazāk populāri pakalpojumi, kuri mitina </w:t>
+      </w:r>
+      <w:proofErr w:type="spellStart"/>
+      <w:r>
+        <w:t>avotkodu</w:t>
+      </w:r>
+      <w:proofErr w:type="spellEnd"/>
+      <w:r>
+        <w:t xml:space="preserve"> </w:t>
+      </w:r>
+      <w:proofErr w:type="spellStart"/>
+      <w:r>
+        <w:t>repozotorijus</w:t>
+      </w:r>
+      <w:proofErr w:type="spellEnd"/>
+      <w:r>
+        <w:t>, izmantojot “</w:t>
+      </w:r>
+      <w:proofErr w:type="spellStart"/>
+      <w:r>
+        <w:t>Git</w:t>
+      </w:r>
+      <w:proofErr w:type="spellEnd"/>
+      <w:r>
+        <w:t>” versiju kontroli, arī ir pieejami rīki, kura var automatizēt projekta kompilēšanu un pārbaudi, šādi rīki ir “</w:t>
+      </w:r>
+      <w:proofErr w:type="spellStart"/>
+      <w:r>
+        <w:t>GitLab</w:t>
+      </w:r>
+      <w:proofErr w:type="spellEnd"/>
+      <w:r>
+        <w:t>”, “</w:t>
+      </w:r>
+      <w:proofErr w:type="spellStart"/>
+      <w:r>
+        <w:t>Gitea</w:t>
+      </w:r>
+      <w:proofErr w:type="spellEnd"/>
+      <w:r>
+        <w:t>” un “</w:t>
+      </w:r>
+      <w:proofErr w:type="spellStart"/>
+      <w:r>
+        <w:t>Bitbucket</w:t>
+      </w:r>
+      <w:proofErr w:type="spellEnd"/>
+      <w:r>
+        <w:t>”, kuri ir īpaši pielāgota CI/CD izstrādes videi, taču prasa papildizmaksas, ja šādi rīki tiek palaisti šo pakalpojumu serveros vietā pašam lietotājam mitināt šos rīkus.</w:t>
+      </w:r>
+    </w:p>
+    <w:p>
+      <w:r>
+        <w:t>Taču arī ir pieejami pakalpojumi un rīki, kuri nav atkarīga no “</w:t>
+      </w:r>
+      <w:proofErr w:type="spellStart"/>
+      <w:r>
+        <w:t>Git</w:t>
+      </w:r>
+      <w:proofErr w:type="spellEnd"/>
+      <w:r>
+        <w:t>” versiju kontroles, bet kā pieejamu versiju kontroles programmatūru starp pārējām. Viens no šiem rīkiem ir “</w:t>
+      </w:r>
+      <w:proofErr w:type="spellStart"/>
+      <w:r>
+        <w:t>Azure</w:t>
+      </w:r>
+      <w:proofErr w:type="spellEnd"/>
+      <w:r>
+        <w:t xml:space="preserve"> </w:t>
+      </w:r>
+      <w:proofErr w:type="spellStart"/>
+      <w:r>
+        <w:t>Pipelines</w:t>
+      </w:r>
+      <w:proofErr w:type="spellEnd"/>
+      <w:r>
+        <w:t>”, kuras funkcionalitāte ir plašāka salīdzinot ar iepriekš minētiem rīkiem, taču tās plaša funkcionalitātes klāsts ir radīts lielākiem projektiem, kuri iespējams nebūs lielāko daļu paredzēts izmantošanai šī projekta nolūkiem tās apjoma dēļ un lielākas izmaksas, salīdzinot ar iepriekš minētiem rīkiem.</w:t>
       </w:r>
     </w:p>
     <w:p>
@@ -10308,10 +10900,66 @@
     </w:p>
     <w:p>
       <w:r>
-        <w:t>“SceneManager” komponente pārvalda ainas un tās pārslēgšanu uz citām ainām un tā ir viena no komponentēm ar vizuālu izvadi, kā arī “SettingsWindow” un “ExitDialog” komponentes, kuras izvade ir tikai logi ar saviem attiecīgiem uzdevumiem, taču “ToastManager” tikai izvada īslaicīgus paziņojumus, kuras pēc noteikta laika izzūd. “AudioManager” pārvalda datorspēles galveno, mūzikas un skaņu efektu skaļumu, kā arī iestata fona mūzika katrai ainai.</w:t>
-      </w:r>
-      <w:r>
-        <w:t xml:space="preserve"> Datu, progresu un iestatījumu glabāšanu nodrošina “SaveManager”, kura glabā progresa datus, un “SettingsManager”, kura glabā un iestata iestatījumus visā spēlē, piemēram, skaļumu.</w:t>
+        <w:t>“</w:t>
+      </w:r>
+      <w:proofErr w:type="spellStart"/>
+      <w:r>
+        <w:t>SceneManager</w:t>
+      </w:r>
+      <w:proofErr w:type="spellEnd"/>
+      <w:r>
+        <w:t>” komponente pārvalda ainas un tās pārslēgšanu uz citām ainām un tā ir viena no komponentēm ar vizuālu izvadi, kā arī “</w:t>
+      </w:r>
+      <w:proofErr w:type="spellStart"/>
+      <w:r>
+        <w:t>SettingsWindow</w:t>
+      </w:r>
+      <w:proofErr w:type="spellEnd"/>
+      <w:r>
+        <w:t>” un “</w:t>
+      </w:r>
+      <w:proofErr w:type="spellStart"/>
+      <w:r>
+        <w:t>ExitDialog</w:t>
+      </w:r>
+      <w:proofErr w:type="spellEnd"/>
+      <w:r>
+        <w:t>” komponentes, kuras izvade ir tikai logi ar saviem attiecīgiem uzdevumiem, taču “</w:t>
+      </w:r>
+      <w:proofErr w:type="spellStart"/>
+      <w:r>
+        <w:t>ToastManager</w:t>
+      </w:r>
+      <w:proofErr w:type="spellEnd"/>
+      <w:r>
+        <w:t>” tikai izvada īslaicīgus paziņojumus, kuras pēc noteikta laika izzūd. “</w:t>
+      </w:r>
+      <w:proofErr w:type="spellStart"/>
+      <w:r>
+        <w:t>AudioManager</w:t>
+      </w:r>
+      <w:proofErr w:type="spellEnd"/>
+      <w:r>
+        <w:t>” pārvalda datorspēles galveno, mūzikas un skaņu efektu skaļumu, kā arī iestata fona mūzika katrai ainai.</w:t>
+      </w:r>
+      <w:r>
+        <w:t xml:space="preserve"> Datu, progresu un iestatījumu glabāšanu nodrošina “</w:t>
+      </w:r>
+      <w:proofErr w:type="spellStart"/>
+      <w:r>
+        <w:t>SaveManager</w:t>
+      </w:r>
+      <w:proofErr w:type="spellEnd"/>
+      <w:r>
+        <w:t>”, kura glabā progresa datus, un “</w:t>
+      </w:r>
+      <w:proofErr w:type="spellStart"/>
+      <w:r>
+        <w:t>SettingsManager</w:t>
+      </w:r>
+      <w:proofErr w:type="spellEnd"/>
+      <w:r>
+        <w:t>”, kura glabā un iestata iestatījumus visā spēlē, piemēram, skaļumu.</w:t>
       </w:r>
     </w:p>
     <w:p>
@@ -10447,7 +11095,15 @@
     </w:p>
     <w:p>
       <w:r>
-        <w:t xml:space="preserve">“SceneManager” komponente pārvalda </w:t>
+        <w:t>“</w:t>
+      </w:r>
+      <w:proofErr w:type="spellStart"/>
+      <w:r>
+        <w:t>SceneManager</w:t>
+      </w:r>
+      <w:proofErr w:type="spellEnd"/>
+      <w:r>
+        <w:t xml:space="preserve">” komponente pārvalda </w:t>
       </w:r>
       <w:r>
         <w:t>norādīto (skat. 2. attēl</w:t>
@@ -10471,7 +11127,23 @@
         <w:t>)</w:t>
       </w:r>
       <w:r>
-        <w:t xml:space="preserve"> aina ir sākuma izvēlne, kurā spēlētājs var pārslēgt uz līmeņu atlases ainu “LevelSelection”, lasīt šī projekta anotāciju, mainīt iestatījumus vai iziet no datorspēles. “LevelSelection” </w:t>
+        <w:t xml:space="preserve"> aina ir sākuma izvēlne, kurā spēlētājs var pārslēgt uz līmeņu atlases ainu “</w:t>
+      </w:r>
+      <w:proofErr w:type="spellStart"/>
+      <w:r>
+        <w:t>LevelSelection</w:t>
+      </w:r>
+      <w:proofErr w:type="spellEnd"/>
+      <w:r>
+        <w:t>”, lasīt šī projekta anotāciju, mainīt iestatījumus vai iziet no datorspēles. “</w:t>
+      </w:r>
+      <w:proofErr w:type="spellStart"/>
+      <w:r>
+        <w:t>LevelSelection</w:t>
+      </w:r>
+      <w:proofErr w:type="spellEnd"/>
+      <w:r>
+        <w:t xml:space="preserve">” </w:t>
       </w:r>
       <w:r>
         <w:t>(</w:t>
@@ -10486,7 +11158,23 @@
         <w:t>aina norāda līmeņus</w:t>
       </w:r>
       <w:r>
-        <w:t>, kuri ir izvietoti kartē ar paveidiem un pieejamības stāvolkim. “Battle” (Spēles laukums) ain</w:t>
+        <w:t xml:space="preserve">, kuri ir izvietoti kartē ar paveidiem un pieejamības </w:t>
+      </w:r>
+      <w:proofErr w:type="spellStart"/>
+      <w:r>
+        <w:t>stāvolkim</w:t>
+      </w:r>
+      <w:proofErr w:type="spellEnd"/>
+      <w:r>
+        <w:t>. “</w:t>
+      </w:r>
+      <w:proofErr w:type="spellStart"/>
+      <w:r>
+        <w:t>Battle</w:t>
+      </w:r>
+      <w:proofErr w:type="spellEnd"/>
+      <w:r>
+        <w:t>” (Spēles laukums) ain</w:t>
       </w:r>
       <w:r>
         <w:t>ā ir spēle ar līmeņa nosacījumiem, objekti kartes laukumā un norādīti uzdevumi uzvarai</w:t>
@@ -10558,27 +11246,14 @@
       <w:pPr>
         <w:pStyle w:val="Parakstszemobjekta"/>
       </w:pPr>
-      <w:r>
-        <w:fldChar w:fldCharType="begin"/>
-      </w:r>
-      <w:r>
-        <w:instrText xml:space="preserve"> SEQ attēls \* ARABIC </w:instrText>
-      </w:r>
-      <w:r>
-        <w:fldChar w:fldCharType="separate"/>
-      </w:r>
-      <w:r>
-        <w:rPr>
-          <w:noProof/>
-        </w:rPr>
-        <w:t>2</w:t>
-      </w:r>
-      <w:r>
-        <w:rPr>
-          <w:noProof/>
-        </w:rPr>
-        <w:fldChar w:fldCharType="end"/>
-      </w:r>
+      <w:fldSimple w:instr=" SEQ attēls \* ARABIC ">
+        <w:r>
+          <w:rPr>
+            <w:noProof/>
+          </w:rPr>
+          <w:t>2</w:t>
+        </w:r>
+      </w:fldSimple>
       <w:r>
         <w:t>. attēls. Ainu komponentes</w:t>
       </w:r>
@@ -10606,7 +11281,15 @@
     </w:p>
     <w:p>
       <w:r>
-        <w:t xml:space="preserve">“Map” (Karte) komponente </w:t>
+        <w:t>“</w:t>
+      </w:r>
+      <w:proofErr w:type="spellStart"/>
+      <w:r>
+        <w:t>Map</w:t>
+      </w:r>
+      <w:proofErr w:type="spellEnd"/>
+      <w:r>
+        <w:t xml:space="preserve">” (Karte) komponente </w:t>
       </w:r>
       <w:r>
         <w:t xml:space="preserve">(skat. 3. attēlu) </w:t>
@@ -10615,12 +11298,44 @@
         <w:t xml:space="preserve">ir šī projekta galvenā komponente un projekta mērķa pamats. Šajā komponentē ir slāņi, kurā atrodas topogrāfijas dati, objektu dati un dekorācijas, un šie slāņi paši par sevi neveic darbības izņemot uzdotās darbības atkarīgas no ainas. Kartes komponentē arī atrodas </w:t>
       </w:r>
       <w:r>
-        <w:t>pārējās komponentes, kuras izmanto slāņus darbību veikšanai, piemēram, “Selector” (atlasītājs) komponente atlasa slāņu komponentes slāņu datus pēc norādītā punkta, “Camera” (Kamera) komponente rāda slāņu fragmentus, kurus spēlētājs var mainīt kameras novietojumu, lai redzētu kartes citu fragmentu un “Projectiles” (Lādiņi) komponente, kura simulē lādiņu kustību kartē un iegūst datus no slāņu komponentes pēc novietojuma no uguņošanas līdz nolaišanas, kuras aptver objektus un veic tām izmaiņas, piemēram, iznīcināšanu.</w:t>
-      </w:r>
-    </w:p>
-    <w:p>
-      <w:r>
-        <w:t>Slāņu komponentē atrodas slāņi, kuras izkārtojumi ir rūtiņu ailes. “Ground” (Zeme) slāni</w:t>
+        <w:t>pārējās komponentes, kuras izmanto slāņus darbību veikšanai, piemēram, “</w:t>
+      </w:r>
+      <w:proofErr w:type="spellStart"/>
+      <w:r>
+        <w:t>Selector</w:t>
+      </w:r>
+      <w:proofErr w:type="spellEnd"/>
+      <w:r>
+        <w:t>” (atlasītājs) komponente atlasa slāņu komponentes slāņu datus pēc norādītā punkta, “</w:t>
+      </w:r>
+      <w:proofErr w:type="spellStart"/>
+      <w:r>
+        <w:t>Camera</w:t>
+      </w:r>
+      <w:proofErr w:type="spellEnd"/>
+      <w:r>
+        <w:t>” (Kamera) komponente rāda slāņu fragmentus, kurus spēlētājs var mainīt kameras novietojumu, lai redzētu kartes citu fragmentu un “</w:t>
+      </w:r>
+      <w:proofErr w:type="spellStart"/>
+      <w:r>
+        <w:t>Projectiles</w:t>
+      </w:r>
+      <w:proofErr w:type="spellEnd"/>
+      <w:r>
+        <w:t>” (Lādiņi) komponente, kura simulē lādiņu kustību kartē un iegūst datus no slāņu komponentes pēc novietojuma no uguņošanas līdz nolaišanas, kuras aptver objektus un veic tām izmaiņas, piemēram, iznīcināšanu.</w:t>
+      </w:r>
+    </w:p>
+    <w:p>
+      <w:r>
+        <w:t>Slāņu komponentē atrodas slāņi, kuras izkārtojumi ir rūtiņu ailes. “</w:t>
+      </w:r>
+      <w:proofErr w:type="spellStart"/>
+      <w:r>
+        <w:t>Ground</w:t>
+      </w:r>
+      <w:proofErr w:type="spellEnd"/>
+      <w:r>
+        <w:t>” (Zeme) slāni</w:t>
       </w:r>
       <w:r>
         <w:t>s</w:t>
@@ -10629,13 +11344,61 @@
         <w:t xml:space="preserve"> satur topogrāfisko informāciju kā augstumu</w:t>
       </w:r>
       <w:r>
-        <w:t xml:space="preserve"> laukuma punktā un pamataugstumu, “Decoration” (Dekorācija) slānis ievieto virs “Ground” slāņa simbolus un dekoratīvos elementus, “Entites” (Objekti) slānis satur objektus kā ierīces, mūrus un struktūras, kuras glabā īpašības, piemēram, azimuta leņķis, piederība spēlētājam vai pretiniekam un izturības punkti pirms sabrukšanas (skat. </w:t>
+        <w:t xml:space="preserve"> laukuma punktā un </w:t>
+      </w:r>
+      <w:proofErr w:type="spellStart"/>
+      <w:r>
+        <w:t>pamataugstumu</w:t>
+      </w:r>
+      <w:proofErr w:type="spellEnd"/>
+      <w:r>
+        <w:t>, “</w:t>
+      </w:r>
+      <w:proofErr w:type="spellStart"/>
+      <w:r>
+        <w:t>Decoration</w:t>
+      </w:r>
+      <w:proofErr w:type="spellEnd"/>
+      <w:r>
+        <w:t>” (Dekorācija) slānis ievieto virs “</w:t>
+      </w:r>
+      <w:proofErr w:type="spellStart"/>
+      <w:r>
+        <w:t>Ground</w:t>
+      </w:r>
+      <w:proofErr w:type="spellEnd"/>
+      <w:r>
+        <w:t>” slāņa simbolus un dekoratīvos elementus, “</w:t>
+      </w:r>
+      <w:proofErr w:type="spellStart"/>
+      <w:r>
+        <w:t>Entites</w:t>
+      </w:r>
+      <w:proofErr w:type="spellEnd"/>
+      <w:r>
+        <w:t xml:space="preserve">” (Objekti) slānis satur objektus kā ierīces, mūrus un struktūras, kuras glabā īpašības, piemēram, azimuta leņķis, piederība spēlētājam vai pretiniekam un izturības punkti pirms sabrukšanas (skat. </w:t>
       </w:r>
       <w:r>
         <w:t>7</w:t>
       </w:r>
       <w:r>
-        <w:t xml:space="preserve">. attēlu) un “Overlays” (Uznirstošie) slānis, kurās izvieto indikatorus un aizsegumus kartē. </w:t>
+        <w:t>. attēlu) un “</w:t>
+      </w:r>
+      <w:proofErr w:type="spellStart"/>
+      <w:r>
+        <w:t>Overlays</w:t>
+      </w:r>
+      <w:proofErr w:type="spellEnd"/>
+      <w:r>
+        <w:t xml:space="preserve">” (Uznirstošie) slānis, kurās izvieto indikatorus un </w:t>
+      </w:r>
+      <w:proofErr w:type="spellStart"/>
+      <w:r>
+        <w:t>aizsegumus</w:t>
+      </w:r>
+      <w:proofErr w:type="spellEnd"/>
+      <w:r>
+        <w:t xml:space="preserve"> kartē. </w:t>
       </w:r>
     </w:p>
     <w:p>
@@ -10695,27 +11458,14 @@
       <w:pPr>
         <w:pStyle w:val="Parakstszemobjekta"/>
       </w:pPr>
-      <w:r>
-        <w:fldChar w:fldCharType="begin"/>
-      </w:r>
-      <w:r>
-        <w:instrText xml:space="preserve"> SEQ attēls \* ARABIC </w:instrText>
-      </w:r>
-      <w:r>
-        <w:fldChar w:fldCharType="separate"/>
-      </w:r>
-      <w:r>
-        <w:rPr>
-          <w:noProof/>
-        </w:rPr>
-        <w:t>3</w:t>
-      </w:r>
-      <w:r>
-        <w:rPr>
-          <w:noProof/>
-        </w:rPr>
-        <w:fldChar w:fldCharType="end"/>
-      </w:r>
+      <w:fldSimple w:instr=" SEQ attēls \* ARABIC ">
+        <w:r>
+          <w:rPr>
+            <w:noProof/>
+          </w:rPr>
+          <w:t>3</w:t>
+        </w:r>
+      </w:fldSimple>
       <w:r>
         <w:t>. attēls. Kartes komponentes</w:t>
       </w:r>
@@ -10810,27 +11560,14 @@
       <w:pPr>
         <w:pStyle w:val="Parakstszemobjekta"/>
       </w:pPr>
-      <w:r>
-        <w:fldChar w:fldCharType="begin"/>
-      </w:r>
-      <w:r>
-        <w:instrText xml:space="preserve"> SEQ attēls \* ARABIC </w:instrText>
-      </w:r>
-      <w:r>
-        <w:fldChar w:fldCharType="separate"/>
-      </w:r>
-      <w:r>
-        <w:rPr>
-          <w:noProof/>
-        </w:rPr>
-        <w:t>4</w:t>
-      </w:r>
-      <w:r>
-        <w:rPr>
-          <w:noProof/>
-        </w:rPr>
-        <w:fldChar w:fldCharType="end"/>
-      </w:r>
+      <w:fldSimple w:instr=" SEQ attēls \* ARABIC ">
+        <w:r>
+          <w:rPr>
+            <w:noProof/>
+          </w:rPr>
+          <w:t>4</w:t>
+        </w:r>
+      </w:fldSimple>
       <w:r>
         <w:t>. attēls. Mezglu saknes komponenšu klases</w:t>
       </w:r>
@@ -10856,10 +11593,26 @@
     </w:p>
     <w:p>
       <w:r>
-        <w:t>Katra aina, kuru parāda “SceneManager” komponente, ir klase ar saviem mainīgajiem un  metodēm</w:t>
-      </w:r>
-      <w:r>
-        <w:t>. Ainu metodes var izsaukt komponentes metodes, tvert lietotāja ievadi un veikt darbības ar ievadi un komponentēm, piemēram, tvert peles klikšķi un “Map” komponentē iegūt ailes informāciju no peles novietojuma</w:t>
+        <w:t>Katra aina, kuru parāda “</w:t>
+      </w:r>
+      <w:proofErr w:type="spellStart"/>
+      <w:r>
+        <w:t>SceneManager</w:t>
+      </w:r>
+      <w:proofErr w:type="spellEnd"/>
+      <w:r>
+        <w:t>” komponente, ir klase ar saviem mainīgajiem un  metodēm</w:t>
+      </w:r>
+      <w:r>
+        <w:t>. Ainu metodes var izsaukt komponentes metodes, tvert lietotāja ievadi un veikt darbības ar ievadi un komponentēm, piemēram, tvert peles klikšķi un “</w:t>
+      </w:r>
+      <w:proofErr w:type="spellStart"/>
+      <w:r>
+        <w:t>Map</w:t>
+      </w:r>
+      <w:proofErr w:type="spellEnd"/>
+      <w:r>
+        <w:t>” komponentē iegūt ailes informāciju no peles novietojuma</w:t>
       </w:r>
       <w:r>
         <w:t xml:space="preserve"> (skat. </w:t>
@@ -10932,27 +11685,14 @@
       <w:pPr>
         <w:pStyle w:val="Parakstszemobjekta"/>
       </w:pPr>
-      <w:r>
-        <w:fldChar w:fldCharType="begin"/>
-      </w:r>
-      <w:r>
-        <w:instrText xml:space="preserve"> SEQ attēls \* ARABIC </w:instrText>
-      </w:r>
-      <w:r>
-        <w:fldChar w:fldCharType="separate"/>
-      </w:r>
-      <w:r>
-        <w:rPr>
-          <w:noProof/>
-        </w:rPr>
-        <w:t>5</w:t>
-      </w:r>
-      <w:r>
-        <w:rPr>
-          <w:noProof/>
-        </w:rPr>
-        <w:fldChar w:fldCharType="end"/>
-      </w:r>
+      <w:fldSimple w:instr=" SEQ attēls \* ARABIC ">
+        <w:r>
+          <w:rPr>
+            <w:noProof/>
+          </w:rPr>
+          <w:t>5</w:t>
+        </w:r>
+      </w:fldSimple>
       <w:r>
         <w:t>. attēls</w:t>
       </w:r>
@@ -11013,7 +11753,39 @@
     </w:p>
     <w:p>
       <w:r>
-        <w:t>Kartes komponente arī ir klase, kura iekļauj apakškomponentes ar savām metodēm un mainīgajiem. Kartes klases darbības iekļauj ailes datu iegūšanu pēc pozīcijas un laukumu ielādi un eksportēšanu. Slāņu komponentes arī iekļauj minētās metodes noteiktam slānim, taču arī slāņa ailēm ir savas metodes un īpašības, piemēram, “Ground” slāņa ailei augstums un “Entity” slāņa ailes piederība. Pārējām komponentēm savas attiecīgas darbības, kuras ir atkarīgas no slāņu komponentēm</w:t>
+        <w:t xml:space="preserve">Kartes komponente arī ir klase, kura iekļauj </w:t>
+      </w:r>
+      <w:proofErr w:type="spellStart"/>
+      <w:r>
+        <w:t>apakškomponentes</w:t>
+      </w:r>
+      <w:proofErr w:type="spellEnd"/>
+      <w:r>
+        <w:t xml:space="preserve"> ar savām metodēm un mainīgajiem. Kartes klases darbības iekļauj ailes datu iegūšanu pēc pozīcijas un laukumu </w:t>
+      </w:r>
+      <w:proofErr w:type="spellStart"/>
+      <w:r>
+        <w:t>ielādi</w:t>
+      </w:r>
+      <w:proofErr w:type="spellEnd"/>
+      <w:r>
+        <w:t xml:space="preserve"> un eksportēšanu. Slāņu komponentes arī iekļauj minētās metodes noteiktam slānim, taču arī slāņa ailēm ir savas metodes un īpašības, piemēram, “</w:t>
+      </w:r>
+      <w:proofErr w:type="spellStart"/>
+      <w:r>
+        <w:t>Ground</w:t>
+      </w:r>
+      <w:proofErr w:type="spellEnd"/>
+      <w:r>
+        <w:t>” slāņa ailei augstums un “</w:t>
+      </w:r>
+      <w:proofErr w:type="spellStart"/>
+      <w:r>
+        <w:t>Entity</w:t>
+      </w:r>
+      <w:proofErr w:type="spellEnd"/>
+      <w:r>
+        <w:t>” slāņa ailes piederība. Pārējām komponentēm savas attiecīgas darbības, kuras ir atkarīgas no slāņu komponentēm</w:t>
       </w:r>
       <w:r>
         <w:t>.</w:t>
@@ -11109,7 +11881,47 @@
       </w:pPr>
       <w:r>
         <w:tab/>
-        <w:t>“Entity” (Objekts) klase norāda kartē objektu, kuri var tikt pagriezti, iznīcināti, iestatīt garumus un vairāk īpašību. Šo klasi manto “Device” (artilērijas ierīces), “Wall” (siena) un “Structure” (struktūra) klases ar savām īpašībām, it īpaši “Device” klase, jo tā norāda munīciju skaitu, traversu, augstuma leņķi u.t.t.</w:t>
+        <w:t>“</w:t>
+      </w:r>
+      <w:proofErr w:type="spellStart"/>
+      <w:r>
+        <w:t>Entity</w:t>
+      </w:r>
+      <w:proofErr w:type="spellEnd"/>
+      <w:r>
+        <w:t>” (Objekts) klase norāda kartē objektu, kuri var tikt pagriezti, iznīcināti, iestatīt garumus un vairāk īpašību. Šo klasi manto “</w:t>
+      </w:r>
+      <w:proofErr w:type="spellStart"/>
+      <w:r>
+        <w:t>Device</w:t>
+      </w:r>
+      <w:proofErr w:type="spellEnd"/>
+      <w:r>
+        <w:t>” (artilērijas ierīces), “</w:t>
+      </w:r>
+      <w:proofErr w:type="spellStart"/>
+      <w:r>
+        <w:t>Wall</w:t>
+      </w:r>
+      <w:proofErr w:type="spellEnd"/>
+      <w:r>
+        <w:t>” (siena) un “</w:t>
+      </w:r>
+      <w:proofErr w:type="spellStart"/>
+      <w:r>
+        <w:t>Structure</w:t>
+      </w:r>
+      <w:proofErr w:type="spellEnd"/>
+      <w:r>
+        <w:t>” (struktūra) klases ar savām īpašībām, it īpaši “</w:t>
+      </w:r>
+      <w:proofErr w:type="spellStart"/>
+      <w:r>
+        <w:t>Device</w:t>
+      </w:r>
+      <w:proofErr w:type="spellEnd"/>
+      <w:r>
+        <w:t>” klase, jo tā norāda munīciju skaitu, traversu, augstuma leņķi u.t.t.</w:t>
       </w:r>
       <w:r>
         <w:t xml:space="preserve"> (skat. 7. attēlu)</w:t>
@@ -11124,7 +11936,23 @@
       </w:pPr>
       <w:r>
         <w:tab/>
-        <w:t>Tās klases pamatīpašības ir azimuts, izturība (“integrity”), spēlētāja piederošs, mērķis,  un iznīcināts, kā arī tai klasei un mantotājiem īpašību klase, kura norāda uz resursu, kura norāda tās objekta nemaināmās īpašības, piemēram, ierīcēm kalibrs, struktūrām izturības stadiju gariņi un visām klasēm izturības skala (“toughness”), kura mazina objekta izturības mazināšanas faktoru.</w:t>
+        <w:t>Tās klases pamatīpašības ir azimuts, izturība (“</w:t>
+      </w:r>
+      <w:proofErr w:type="spellStart"/>
+      <w:r>
+        <w:t>integrity</w:t>
+      </w:r>
+      <w:proofErr w:type="spellEnd"/>
+      <w:r>
+        <w:t>”), spēlētāja piederošs, mērķis,  un iznīcināts, kā arī tai klasei un mantotājiem īpašību klase, kura norāda uz resursu, kura norāda tās objekta nemaināmās īpašības, piemēram, ierīcēm kalibrs, struktūrām izturības stadiju gariņi un visām klasēm izturības skala (“</w:t>
+      </w:r>
+      <w:proofErr w:type="spellStart"/>
+      <w:r>
+        <w:t>toughness</w:t>
+      </w:r>
+      <w:proofErr w:type="spellEnd"/>
+      <w:r>
+        <w:t>”), kura mazina objekta izturības mazināšanas faktoru.</w:t>
       </w:r>
     </w:p>
     <w:p>
@@ -11222,10 +12050,26 @@
         <w:t>L</w:t>
       </w:r>
       <w:r>
-        <w:t xml:space="preserve">ādiņu laukumā (“Projectiles”) </w:t>
-      </w:r>
-      <w:r>
-        <w:t>lādiņiem ir savas īpašības un metodes, lai pēc iespējas attainotu lādiņu ballistiku gaisā</w:t>
+        <w:t>ādiņu laukumā (“</w:t>
+      </w:r>
+      <w:proofErr w:type="spellStart"/>
+      <w:r>
+        <w:t>Projectiles</w:t>
+      </w:r>
+      <w:proofErr w:type="spellEnd"/>
+      <w:r>
+        <w:t xml:space="preserve">”) </w:t>
+      </w:r>
+      <w:r>
+        <w:t xml:space="preserve">lādiņiem ir savas īpašības un metodes, lai pēc iespējas </w:t>
+      </w:r>
+      <w:proofErr w:type="spellStart"/>
+      <w:r>
+        <w:t>attainotu</w:t>
+      </w:r>
+      <w:proofErr w:type="spellEnd"/>
+      <w:r>
+        <w:t xml:space="preserve"> lādiņu ballistiku gaisā</w:t>
       </w:r>
       <w:r>
         <w:t xml:space="preserve"> un objektu iznīcināšanu un bojāšanu nolaišanas uz zemes</w:t>
@@ -11292,13 +12136,7 @@
         <w:pStyle w:val="Parakstszemobjekta"/>
       </w:pPr>
       <w:r>
-        <w:t>8</w:t>
-      </w:r>
-      <w:r>
-        <w:t xml:space="preserve">. attēls. </w:t>
-      </w:r>
-      <w:r>
-        <w:t>Lādiņa klases metodes un pamatīpašības</w:t>
+        <w:t>8. attēls. Lādiņa klases metodes un pamatīpašības</w:t>
       </w:r>
     </w:p>
     <w:p>
@@ -11621,13 +12459,7 @@
         <w:pStyle w:val="Parakstszemobjekta"/>
       </w:pPr>
       <w:r>
-        <w:t>11</w:t>
-      </w:r>
-      <w:r>
-        <w:t xml:space="preserve">. attēls. </w:t>
-      </w:r>
-      <w:r>
-        <w:t>Līmeņu kopa un līmeņu īpašības</w:t>
+        <w:t>11. attēls. Līmeņu kopa un līmeņu īpašības</w:t>
       </w:r>
     </w:p>
     <w:p>
@@ -11716,16 +12548,7 @@
         <w:pStyle w:val="Parakstszemobjekta"/>
       </w:pPr>
       <w:r>
-        <w:t>1</w:t>
-      </w:r>
-      <w:r>
-        <w:t>2</w:t>
-      </w:r>
-      <w:r>
-        <w:t xml:space="preserve">. attēls. Līmeņu </w:t>
-      </w:r>
-      <w:r>
-        <w:t>punkti</w:t>
+        <w:t>12. attēls. Līmeņu punkti</w:t>
       </w:r>
     </w:p>
     <w:p>
@@ -11790,7 +12613,15 @@
       <w:bookmarkStart w:id="47" w:name="_Toc230242323"/>
       <w:r>
         <w:lastRenderedPageBreak/>
-        <w:t>Kartes un tās apakškomponenšu dati</w:t>
+        <w:t xml:space="preserve">Kartes un tās </w:t>
+      </w:r>
+      <w:proofErr w:type="spellStart"/>
+      <w:r>
+        <w:t>apakškomponenšu</w:t>
+      </w:r>
+      <w:proofErr w:type="spellEnd"/>
+      <w:r>
+        <w:t xml:space="preserve"> dati</w:t>
       </w:r>
       <w:bookmarkEnd w:id="47"/>
     </w:p>
@@ -11802,7 +12633,15 @@
         <w:t>, piemēram, ailes izmēru, augstumu un sarežģīšanas iespējas</w:t>
       </w:r>
       <w:r>
-        <w:t>, kurus izmantos tās visas tās apakškomponentes, kuras no dažam var būt savi dati glabāti kartes datos, it īpaši slāņu komponentēm (skat. 1</w:t>
+        <w:t xml:space="preserve">, kurus izmantos tās visas tās </w:t>
+      </w:r>
+      <w:proofErr w:type="spellStart"/>
+      <w:r>
+        <w:t>apakškomponentes</w:t>
+      </w:r>
+      <w:proofErr w:type="spellEnd"/>
+      <w:r>
+        <w:t>, kuras no dažam var būt savi dati glabāti kartes datos, it īpaši slāņu komponentēm (skat. 1</w:t>
       </w:r>
       <w:r>
         <w:t>3</w:t>
@@ -11876,16 +12715,15 @@
         <w:pStyle w:val="Parakstszemobjekta"/>
       </w:pPr>
       <w:r>
-        <w:t>1</w:t>
-      </w:r>
-      <w:r>
-        <w:t>3</w:t>
-      </w:r>
-      <w:r>
-        <w:t xml:space="preserve">. attēls. </w:t>
-      </w:r>
-      <w:r>
-        <w:t>Kartes un apakškomponenšu dati</w:t>
+        <w:t xml:space="preserve">13. attēls. Kartes un </w:t>
+      </w:r>
+      <w:proofErr w:type="spellStart"/>
+      <w:r>
+        <w:t>apakškomponenšu</w:t>
+      </w:r>
+      <w:proofErr w:type="spellEnd"/>
+      <w:r>
+        <w:t xml:space="preserve"> dati</w:t>
       </w:r>
     </w:p>
     <w:p>
@@ -11903,7 +12741,15 @@
     </w:p>
     <w:p>
       <w:r>
-        <w:t>Slāņa ”Entities” objektiem ir kopīgas nemaināmās īpašības, kurus izmanto paši slāņu objekti un citas klases pieejot tiem (skat. 1</w:t>
+        <w:t>Slāņa ”</w:t>
+      </w:r>
+      <w:proofErr w:type="spellStart"/>
+      <w:r>
+        <w:t>Entities</w:t>
+      </w:r>
+      <w:proofErr w:type="spellEnd"/>
+      <w:r>
+        <w:t>” objektiem ir kopīgas nemaināmās īpašības, kurus izmanto paši slāņu objekti un citas klases pieejot tiem (skat. 1</w:t>
       </w:r>
       <w:r>
         <w:t>4</w:t>
@@ -11973,13 +12819,7 @@
         <w:pStyle w:val="Parakstszemobjekta"/>
       </w:pPr>
       <w:r>
-        <w:t>14</w:t>
-      </w:r>
-      <w:r>
-        <w:t xml:space="preserve">. attēls. </w:t>
-      </w:r>
-      <w:r>
-        <w:t>Kartes objektu īpašības</w:t>
+        <w:t>14. attēls. Kartes objektu īpašības</w:t>
       </w:r>
     </w:p>
     <w:p>
@@ -11995,7 +12835,15 @@
     </w:p>
     <w:p>
       <w:r>
-        <w:t>Šajā sadaļā lietotājam skaidros šīs datorspēles lietojumu un tās saskarnes elementus ar ekrānuzņēmumiem un skaidrojošiem rādītājiem.</w:t>
+        <w:t xml:space="preserve">Šajā sadaļā lietotājam skaidros šīs datorspēles lietojumu un tās </w:t>
+      </w:r>
+      <w:proofErr w:type="spellStart"/>
+      <w:r>
+        <w:t>saskarnes</w:t>
+      </w:r>
+      <w:proofErr w:type="spellEnd"/>
+      <w:r>
+        <w:t xml:space="preserve"> elementus ar ekrānuzņēmumiem un skaidrojošiem rādītājiem.</w:t>
       </w:r>
     </w:p>
     <w:p>
@@ -12079,7 +12927,7 @@
           <w:noProof/>
         </w:rPr>
         <w:drawing>
-          <wp:inline distT="0" distB="0" distL="0" distR="0" wp14:anchorId="184F5E21" wp14:editId="09ACF2E5">
+          <wp:inline distT="0" distB="0" distL="0" distR="0" wp14:anchorId="184F5E21" wp14:editId="37FF348F">
             <wp:extent cx="4635610" cy="2846070"/>
             <wp:effectExtent l="0" t="0" r="0" b="0"/>
             <wp:docPr id="97138795" name="Picture 5"/>
@@ -12159,10 +13007,7 @@
       <w:bookmarkStart w:id="51" w:name="_Toc230242327"/>
       <w:r>
         <w:lastRenderedPageBreak/>
-        <w:t xml:space="preserve">Līmeņu atlases </w:t>
-      </w:r>
-      <w:r>
-        <w:t>aina</w:t>
+        <w:t>Līmeņu atlases aina</w:t>
       </w:r>
       <w:bookmarkEnd w:id="51"/>
     </w:p>
@@ -12171,16 +13016,7 @@
         <w:t>Līmeņu atlases ainā atrodas karte, kurā ir novietoti punkti</w:t>
       </w:r>
       <w:r>
-        <w:t xml:space="preserve"> </w:t>
-      </w:r>
-      <w:r>
-        <w:t>(</w:t>
-      </w:r>
-      <w:r>
-        <w:t>2</w:t>
-      </w:r>
-      <w:r>
-        <w:t>)</w:t>
+        <w:t xml:space="preserve"> (2)</w:t>
       </w:r>
       <w:r>
         <w:t>, kuri norāda līmeņus</w:t>
@@ -12198,37 +13034,24 @@
         <w:t xml:space="preserve"> Katrs punkts norāda līmeņa stāvokli (slēgts ar sarkano karog</w:t>
       </w:r>
       <w:r>
-        <w:t xml:space="preserve">u </w:t>
-      </w:r>
-      <w:r>
-        <w:t>(</w:t>
-      </w:r>
-      <w:r>
-        <w:t>3</w:t>
-      </w:r>
-      <w:r>
-        <w:t>)</w:t>
-      </w:r>
-      <w:r>
-        <w:t xml:space="preserve"> </w:t>
+        <w:t xml:space="preserve">u (3) </w:t>
       </w:r>
       <w:r>
         <w:t>vai pieejams ar zilo karogu</w:t>
       </w:r>
       <w:r>
-        <w:t xml:space="preserve"> </w:t>
-      </w:r>
-      <w:r>
-        <w:t>(</w:t>
-      </w:r>
-      <w:r>
-        <w:t>4</w:t>
-      </w:r>
-      <w:r>
-        <w:t>)</w:t>
-      </w:r>
-      <w:r>
-        <w:t>), kā arī zem apraksta iespējo vai atspējo pogu.</w:t>
+        <w:t xml:space="preserve"> (4)</w:t>
+      </w:r>
+      <w:r>
+        <w:t xml:space="preserve">), kā arī zem apraksta </w:t>
+      </w:r>
+      <w:proofErr w:type="spellStart"/>
+      <w:r>
+        <w:t>iespējo</w:t>
+      </w:r>
+      <w:proofErr w:type="spellEnd"/>
+      <w:r>
+        <w:t xml:space="preserve"> vai atspējo pogu.</w:t>
       </w:r>
     </w:p>
     <w:p>
@@ -12241,7 +13064,7 @@
           <w:noProof/>
         </w:rPr>
         <w:drawing>
-          <wp:inline distT="0" distB="0" distL="0" distR="0" wp14:anchorId="5289E669" wp14:editId="028F1469">
+          <wp:inline distT="0" distB="0" distL="0" distR="0" wp14:anchorId="5289E669" wp14:editId="6DA0418A">
             <wp:extent cx="5197221" cy="3190875"/>
             <wp:effectExtent l="0" t="0" r="3810" b="0"/>
             <wp:docPr id="1801011733" name="Picture 5"/>
@@ -12303,7 +13126,7 @@
           <w:noProof/>
         </w:rPr>
         <w:drawing>
-          <wp:inline distT="0" distB="0" distL="0" distR="0" wp14:anchorId="6AF8B356" wp14:editId="2F9858B0">
+          <wp:inline distT="0" distB="0" distL="0" distR="0" wp14:anchorId="6AF8B356" wp14:editId="7FDA1D3A">
             <wp:extent cx="5253990" cy="3225729"/>
             <wp:effectExtent l="0" t="0" r="3810" b="0"/>
             <wp:docPr id="1892648572" name="Picture 5"/>
@@ -12359,19 +13182,7 @@
         <w:pStyle w:val="Parakstszemobjekta"/>
       </w:pPr>
       <w:r>
-        <w:t>1</w:t>
-      </w:r>
-      <w:r>
-        <w:t>6</w:t>
-      </w:r>
-      <w:r>
-        <w:t xml:space="preserve">. attēls. </w:t>
-      </w:r>
-      <w:r>
-        <w:t xml:space="preserve">Līmeņu atlases aina </w:t>
-      </w:r>
-      <w:r>
-        <w:t>un atvērumi</w:t>
+        <w:t>16. attēls. Līmeņu atlases aina un atvērumi</w:t>
       </w:r>
     </w:p>
     <w:p/>
@@ -12382,10 +13193,7 @@
       <w:bookmarkStart w:id="52" w:name="_Toc230242328"/>
       <w:r>
         <w:lastRenderedPageBreak/>
-        <w:t>Spēles laukuma</w:t>
-      </w:r>
-      <w:r>
-        <w:t xml:space="preserve"> aina</w:t>
+        <w:t>Spēles laukuma aina</w:t>
       </w:r>
       <w:bookmarkEnd w:id="52"/>
     </w:p>
@@ -12394,7 +13202,15 @@
         <w:t xml:space="preserve">Spēles laukuma ainā atrodas </w:t>
       </w:r>
       <w:r>
-        <w:t xml:space="preserve">vairākas saskarnes kontroles, gan visā ainā, gan atsevišķās stadijās. </w:t>
+        <w:t xml:space="preserve">vairākas </w:t>
+      </w:r>
+      <w:proofErr w:type="spellStart"/>
+      <w:r>
+        <w:t>saskarnes</w:t>
+      </w:r>
+      <w:proofErr w:type="spellEnd"/>
+      <w:r>
+        <w:t xml:space="preserve"> kontroles, gan visā ainā, gan atsevišķās stadijās. </w:t>
       </w:r>
     </w:p>
     <w:p>
@@ -12402,14 +13218,21 @@
         <w:pStyle w:val="Virsraksts3"/>
       </w:pPr>
       <w:bookmarkStart w:id="53" w:name="_Toc230242329"/>
+      <w:proofErr w:type="spellStart"/>
       <w:r>
         <w:t>Virsjosla</w:t>
       </w:r>
       <w:bookmarkEnd w:id="53"/>
-    </w:p>
-    <w:p>
-      <w:r>
-        <w:t xml:space="preserve">Virsjoslā </w:t>
+      <w:proofErr w:type="spellEnd"/>
+    </w:p>
+    <w:p>
+      <w:proofErr w:type="spellStart"/>
+      <w:r>
+        <w:t>Virsjoslā</w:t>
+      </w:r>
+      <w:proofErr w:type="spellEnd"/>
+      <w:r>
+        <w:t xml:space="preserve"> </w:t>
       </w:r>
       <w:r>
         <w:t xml:space="preserve">(skat. 16. attēlu) </w:t>
@@ -12424,16 +13247,7 @@
         <w:t>, stadijas nosaukums</w:t>
       </w:r>
       <w:r>
-        <w:t xml:space="preserve"> </w:t>
-      </w:r>
-      <w:r>
-        <w:t>(</w:t>
-      </w:r>
-      <w:r>
-        <w:t>2</w:t>
-      </w:r>
-      <w:r>
-        <w:t>)</w:t>
+        <w:t xml:space="preserve"> (2)</w:t>
       </w:r>
       <w:r>
         <w:t xml:space="preserve"> un skaitītāj</w:t>
@@ -12445,103 +13259,48 @@
         <w:t>kā peles pozīcija</w:t>
       </w:r>
       <w:r>
-        <w:t xml:space="preserve"> </w:t>
-      </w:r>
-      <w:r>
-        <w:t>(</w:t>
-      </w:r>
-      <w:r>
-        <w:t>3</w:t>
-      </w:r>
-      <w:r>
-        <w:t>)</w:t>
+        <w:t xml:space="preserve"> (3)</w:t>
       </w:r>
       <w:r>
         <w:t>, mērogs</w:t>
       </w:r>
       <w:r>
-        <w:t xml:space="preserve"> </w:t>
-      </w:r>
-      <w:r>
-        <w:t>(</w:t>
-      </w:r>
-      <w:r>
-        <w:t>4</w:t>
-      </w:r>
-      <w:r>
-        <w:t>)</w:t>
-      </w:r>
-      <w:r>
-        <w:t>, pamataugstums</w:t>
-      </w:r>
-      <w:r>
-        <w:t xml:space="preserve"> </w:t>
-      </w:r>
-      <w:r>
-        <w:t>(</w:t>
-      </w:r>
-      <w:r>
-        <w:t>5)</w:t>
+        <w:t xml:space="preserve"> (4)</w:t>
+      </w:r>
+      <w:r>
+        <w:t xml:space="preserve">, </w:t>
+      </w:r>
+      <w:proofErr w:type="spellStart"/>
+      <w:r>
+        <w:t>pamataugstums</w:t>
+      </w:r>
+      <w:proofErr w:type="spellEnd"/>
+      <w:r>
+        <w:t xml:space="preserve"> (5)</w:t>
       </w:r>
       <w:r>
         <w:t>, spēlētāja ierīču skaits</w:t>
       </w:r>
       <w:r>
-        <w:t xml:space="preserve"> </w:t>
-      </w:r>
-      <w:r>
-        <w:t>(</w:t>
-      </w:r>
-      <w:r>
-        <w:t>6</w:t>
-      </w:r>
-      <w:r>
-        <w:t>)</w:t>
+        <w:t xml:space="preserve"> (6)</w:t>
       </w:r>
       <w:r>
         <w:t>, mērķu skaits</w:t>
       </w:r>
       <w:r>
-        <w:t xml:space="preserve"> </w:t>
-      </w:r>
-      <w:r>
-        <w:t>(</w:t>
-      </w:r>
-      <w:r>
-        <w:t>7</w:t>
-      </w:r>
-      <w:r>
-        <w:t>)</w:t>
+        <w:t xml:space="preserve"> (7)</w:t>
       </w:r>
       <w:r>
         <w:t xml:space="preserve">, kārtas skaits </w:t>
       </w:r>
       <w:r>
-        <w:t>(</w:t>
-      </w:r>
-      <w:r>
-        <w:t>8</w:t>
-      </w:r>
-      <w:r>
-        <w:t>)</w:t>
-      </w:r>
-      <w:r>
-        <w:t xml:space="preserve"> </w:t>
+        <w:t xml:space="preserve">(8) </w:t>
       </w:r>
       <w:r>
         <w:t>un atlikušais laiks</w:t>
       </w:r>
       <w:r>
-        <w:t xml:space="preserve"> </w:t>
-      </w:r>
-      <w:r>
-        <w:t>(</w:t>
-      </w:r>
-      <w:r>
-        <w:t>9</w:t>
-      </w:r>
-      <w:r>
-        <w:t>)</w:t>
+        <w:t xml:space="preserve"> (9)</w:t>
       </w:r>
       <w:r>
         <w:t>.</w:t>
@@ -12560,7 +13319,7 @@
           <w:noProof/>
         </w:rPr>
         <w:drawing>
-          <wp:inline distT="0" distB="0" distL="0" distR="0" wp14:anchorId="7D3C05DD" wp14:editId="416831C9">
+          <wp:inline distT="0" distB="0" distL="0" distR="0" wp14:anchorId="7D3C05DD" wp14:editId="1E42B302">
             <wp:extent cx="6151880" cy="820420"/>
             <wp:effectExtent l="0" t="0" r="0" b="0"/>
             <wp:docPr id="1192359658" name="Attēls 1"/>
@@ -12613,7 +13372,7 @@
           <w:noProof/>
         </w:rPr>
         <w:drawing>
-          <wp:inline distT="0" distB="0" distL="0" distR="0" wp14:anchorId="6CFFB280" wp14:editId="67DF660D">
+          <wp:inline distT="0" distB="0" distL="0" distR="0" wp14:anchorId="6CFFB280" wp14:editId="65F25F66">
             <wp:extent cx="6123214" cy="1428750"/>
             <wp:effectExtent l="0" t="0" r="0" b="0"/>
             <wp:docPr id="1604049363" name="Attēls 1"/>
@@ -12777,7 +13536,7 @@
           <w:noProof/>
         </w:rPr>
         <w:drawing>
-          <wp:inline distT="0" distB="0" distL="0" distR="0" wp14:anchorId="0CB2110C" wp14:editId="3119087F">
+          <wp:inline distT="0" distB="0" distL="0" distR="0" wp14:anchorId="0CB2110C" wp14:editId="142B8DFA">
             <wp:extent cx="5202313" cy="3194002"/>
             <wp:effectExtent l="0" t="0" r="0" b="6985"/>
             <wp:docPr id="78287740" name="Picture 5"/>
@@ -12833,13 +13592,7 @@
         <w:pStyle w:val="Parakstszemobjekta"/>
       </w:pPr>
       <w:r>
-        <w:t>1</w:t>
-      </w:r>
-      <w:r>
-        <w:t>7</w:t>
-      </w:r>
-      <w:r>
-        <w:t>. attēls. Līmeņu atlases aina un atvērumi</w:t>
+        <w:t>17. attēls. Līmeņu atlases aina un atvērumi</w:t>
       </w:r>
     </w:p>
     <w:p>
@@ -12899,10 +13652,7 @@
       <w:bookmarkStart w:id="55" w:name="_Toc230242331"/>
       <w:r>
         <w:lastRenderedPageBreak/>
-        <w:t xml:space="preserve">Ierīču </w:t>
-      </w:r>
-      <w:r>
-        <w:t>koriģēšana</w:t>
+        <w:t>Ierīču koriģēšana</w:t>
       </w:r>
       <w:bookmarkEnd w:id="55"/>
     </w:p>
@@ -12914,10 +13664,7 @@
         <w:t xml:space="preserve"> Lai koriģētu, spēlētājs atlasa savu ierīci </w:t>
       </w:r>
       <w:r>
-        <w:t>(1)</w:t>
-      </w:r>
-      <w:r>
-        <w:t xml:space="preserve"> </w:t>
+        <w:t xml:space="preserve">(1) </w:t>
       </w:r>
       <w:r>
         <w:t>laukumā</w:t>
@@ -12998,16 +13745,7 @@
         <w:pStyle w:val="Parakstszemobjekta"/>
       </w:pPr>
       <w:r>
-        <w:t>1</w:t>
-      </w:r>
-      <w:r>
-        <w:t>8</w:t>
-      </w:r>
-      <w:r>
-        <w:t xml:space="preserve">. attēls. </w:t>
-      </w:r>
-      <w:r>
-        <w:t>Ierīču koriģēšanas stadija pirms un pēc atlases</w:t>
+        <w:t>18. attēls. Ierīču koriģēšanas stadija pirms un pēc atlases</w:t>
       </w:r>
     </w:p>
     <w:p/>
@@ -13035,49 +13773,21 @@
     </w:p>
     <w:p>
       <w:r>
-        <w:t xml:space="preserve">Sākotnējā koriģēšanā atlasītai ierīcei (1) koriģēšanas logā (2) izmaina azimutu </w:t>
-      </w:r>
-      <w:r>
-        <w:t>(</w:t>
-      </w:r>
-      <w:r>
-        <w:t>3</w:t>
-      </w:r>
-      <w:r>
-        <w:t>)</w:t>
-      </w:r>
-      <w:r>
-        <w:t xml:space="preserve">, augstuma leņķi </w:t>
-      </w:r>
-      <w:r>
-        <w:t>(</w:t>
-      </w:r>
-      <w:r>
-        <w:t>4</w:t>
-      </w:r>
-      <w:r>
-        <w:t>)</w:t>
-      </w:r>
-      <w:r>
-        <w:t xml:space="preserve"> un šāvienu skaits vienā kārtā </w:t>
-      </w:r>
-      <w:r>
-        <w:t>(</w:t>
-      </w:r>
-      <w:r>
-        <w:t>5</w:t>
-      </w:r>
-      <w:r>
-        <w:t>)</w:t>
-      </w:r>
-      <w:r>
-        <w:t xml:space="preserve"> (skat. 19. attēlu).</w:t>
+        <w:t>Sākotnējā koriģēšanā atlasītai ierīcei (1) koriģēšanas logā (2) izmaina azimutu (3), augstuma leņķi (4) un šāvienu skaits vienā kārtā (5) (skat. 19. attēlu).</w:t>
       </w:r>
       <w:r>
         <w:t xml:space="preserve"> Koriģēšanas logā arī norāda atlikušo lādiņu skaitu </w:t>
       </w:r>
       <w:r>
-        <w:t>vai atlikušās kārtas pirms pārlādes.</w:t>
+        <w:t xml:space="preserve">vai atlikušās kārtas pirms </w:t>
+      </w:r>
+      <w:proofErr w:type="spellStart"/>
+      <w:r>
+        <w:t>pārlādes</w:t>
+      </w:r>
+      <w:proofErr w:type="spellEnd"/>
+      <w:r>
+        <w:t>.</w:t>
       </w:r>
     </w:p>
     <w:p>
@@ -13144,16 +13854,7 @@
         <w:pStyle w:val="Parakstszemobjekta"/>
       </w:pPr>
       <w:r>
-        <w:t>1</w:t>
-      </w:r>
-      <w:r>
-        <w:t>9</w:t>
-      </w:r>
-      <w:r>
-        <w:t xml:space="preserve">. attēls. </w:t>
-      </w:r>
-      <w:r>
-        <w:t>Sākotnējās koriģēšanas logs</w:t>
+        <w:t>19. attēls. Sākotnējās koriģēšanas logs</w:t>
       </w:r>
     </w:p>
     <w:p>
@@ -13165,10 +13866,7 @@
         <w:ind w:left="851" w:hanging="851"/>
       </w:pPr>
       <w:r>
-        <w:t>Turpmākā</w:t>
-      </w:r>
-      <w:r>
-        <w:t xml:space="preserve"> koriģēšana</w:t>
+        <w:t>Turpmākā koriģēšana</w:t>
       </w:r>
     </w:p>
     <w:p>
@@ -13252,22 +13950,7 @@
         <w:pStyle w:val="Parakstszemobjekta"/>
       </w:pPr>
       <w:r>
-        <w:t>20</w:t>
-      </w:r>
-      <w:r>
-        <w:t>. attēls</w:t>
-      </w:r>
-      <w:r>
-        <w:t>.</w:t>
-      </w:r>
-      <w:r>
-        <w:t xml:space="preserve"> </w:t>
-      </w:r>
-      <w:r>
-        <w:t>K</w:t>
-      </w:r>
-      <w:r>
-        <w:t>oriģēšanas logs</w:t>
+        <w:t>20. attēls. Koriģēšanas logs</w:t>
       </w:r>
     </w:p>
     <w:p>
@@ -13313,16 +13996,7 @@
         <w:t xml:space="preserve"> vai izlaist uz uguņošanas stadiju</w:t>
       </w:r>
       <w:r>
-        <w:t xml:space="preserve"> </w:t>
-      </w:r>
-      <w:r>
-        <w:t>(</w:t>
-      </w:r>
-      <w:r>
-        <w:t>3</w:t>
-      </w:r>
-      <w:r>
-        <w:t>)</w:t>
+        <w:t xml:space="preserve"> (3)</w:t>
       </w:r>
       <w:r>
         <w:t xml:space="preserve"> (skat. 21. attēlu)</w:t>
@@ -13351,7 +14025,7 @@
           <w:noProof/>
         </w:rPr>
         <w:drawing>
-          <wp:inline distT="0" distB="0" distL="0" distR="0" wp14:anchorId="183636F5" wp14:editId="17E0AF1C">
+          <wp:inline distT="0" distB="0" distL="0" distR="0" wp14:anchorId="183636F5" wp14:editId="74F272D0">
             <wp:extent cx="6143625" cy="3486150"/>
             <wp:effectExtent l="0" t="0" r="0" b="0"/>
             <wp:docPr id="428480901" name="Attēls 5"/>
@@ -13405,16 +14079,7 @@
         <w:pStyle w:val="Parakstszemobjekta"/>
       </w:pPr>
       <w:r>
-        <w:t>2</w:t>
-      </w:r>
-      <w:r>
-        <w:t>1</w:t>
-      </w:r>
-      <w:r>
-        <w:t xml:space="preserve">. attēls. </w:t>
-      </w:r>
-      <w:r>
-        <w:t>Izlūku izsaukšana</w:t>
+        <w:t>21. attēls. Izlūku izsaukšana</w:t>
       </w:r>
     </w:p>
     <w:p/>
@@ -13614,14 +14279,7 @@
                 <w:sz w:val="20"/>
                 <w:szCs w:val="20"/>
               </w:rPr>
-              <w:t>P</w:t>
-            </w:r>
-            <w:r>
-              <w:rPr>
-                <w:sz w:val="20"/>
-                <w:szCs w:val="20"/>
-              </w:rPr>
-              <w:t>ārvirze uz ierīču koriģēšanas stadiju</w:t>
+              <w:t>Pārvirze uz ierīču koriģēšanas stadiju</w:t>
             </w:r>
           </w:p>
         </w:tc>
@@ -13671,14 +14329,7 @@
                 <w:sz w:val="20"/>
                 <w:szCs w:val="20"/>
               </w:rPr>
-              <w:t>Atsegšana</w:t>
-            </w:r>
-            <w:r>
-              <w:rPr>
-                <w:sz w:val="20"/>
-                <w:szCs w:val="20"/>
-              </w:rPr>
-              <w:t xml:space="preserve"> un pārvirze uz uguņošanas stadiju, pretinieka ierīces uguņo pirmās.</w:t>
+              <w:t>Atsegšana un pārvirze uz uguņošanas stadiju, pretinieka ierīces uguņo pirmās.</w:t>
             </w:r>
           </w:p>
         </w:tc>
@@ -13754,14 +14405,7 @@
                 <w:sz w:val="20"/>
                 <w:szCs w:val="20"/>
               </w:rPr>
-              <w:t>Atsegšana</w:t>
-            </w:r>
-            <w:r>
-              <w:rPr>
-                <w:sz w:val="20"/>
-                <w:szCs w:val="20"/>
-              </w:rPr>
-              <w:t xml:space="preserve"> un pārvirze uz uguņošanas stadiju, spēlētāja ierīces uguņo pirmās</w:t>
+              <w:t>Atsegšana un pārvirze uz uguņošanas stadiju, spēlētāja ierīces uguņo pirmās</w:t>
             </w:r>
           </w:p>
         </w:tc>
@@ -13932,7 +14576,7 @@
           <w:noProof/>
         </w:rPr>
         <w:drawing>
-          <wp:inline distT="0" distB="0" distL="0" distR="0" wp14:anchorId="5756904A" wp14:editId="543D7E13">
+          <wp:inline distT="0" distB="0" distL="0" distR="0" wp14:anchorId="5756904A" wp14:editId="6F56EDEC">
             <wp:extent cx="6143066" cy="3147695"/>
             <wp:effectExtent l="0" t="0" r="0" b="0"/>
             <wp:docPr id="772840116" name="Attēls 5"/>
@@ -13991,16 +14635,7 @@
         <w:pStyle w:val="Parakstszemobjekta"/>
       </w:pPr>
       <w:r>
-        <w:t>2</w:t>
-      </w:r>
-      <w:r>
-        <w:t>2</w:t>
-      </w:r>
-      <w:r>
-        <w:t xml:space="preserve">. attēls. </w:t>
-      </w:r>
-      <w:r>
-        <w:t>Uguņošana</w:t>
+        <w:t>22. attēls. Uguņošana</w:t>
       </w:r>
     </w:p>
     <w:p>
@@ -14156,13 +14791,7 @@
         <w:pStyle w:val="Parakstszemobjekta"/>
       </w:pPr>
       <w:r>
-        <w:t>2</w:t>
-      </w:r>
-      <w:r>
-        <w:t>3</w:t>
-      </w:r>
-      <w:r>
-        <w:t xml:space="preserve">. attēls. </w:t>
+        <w:t xml:space="preserve">23. attēls. </w:t>
       </w:r>
       <w:r>
         <w:t>Lādiņu šaušana un nolaišanās</w:t>
@@ -14262,31 +14891,7 @@
         <w:t>.</w:t>
       </w:r>
       <w:r>
-        <w:t xml:space="preserve"> Neatkarīgi no rezultātiem, spēlētājs var atsākt spēli (2), iziet no tās </w:t>
-      </w:r>
-      <w:r>
-        <w:t>(</w:t>
-      </w:r>
-      <w:r>
-        <w:t>3</w:t>
-      </w:r>
-      <w:r>
-        <w:t>)</w:t>
-      </w:r>
-      <w:r>
-        <w:t xml:space="preserve"> vai samazināt logu </w:t>
-      </w:r>
-      <w:r>
-        <w:t>(</w:t>
-      </w:r>
-      <w:r>
-        <w:t>4</w:t>
-      </w:r>
-      <w:r>
-        <w:t>)</w:t>
-      </w:r>
-      <w:r>
-        <w:t>, lai aplūkotu karti.</w:t>
+        <w:t xml:space="preserve"> Neatkarīgi no rezultātiem, spēlētājs var atsākt spēli (2), iziet no tās (3) vai samazināt logu (4), lai aplūkotu karti.</w:t>
       </w:r>
       <w:r>
         <w:t xml:space="preserve"> (skat. 24. attēlu)</w:t>
@@ -14305,7 +14910,7 @@
           <w:noProof/>
         </w:rPr>
         <w:drawing>
-          <wp:inline distT="0" distB="0" distL="0" distR="0" wp14:anchorId="2800BEDB" wp14:editId="5A9B03D7">
+          <wp:inline distT="0" distB="0" distL="0" distR="0" wp14:anchorId="2800BEDB" wp14:editId="526B0977">
             <wp:extent cx="6143625" cy="3486150"/>
             <wp:effectExtent l="0" t="0" r="9525" b="0"/>
             <wp:docPr id="7237126" name="Attēls 7"/>
@@ -14394,13 +14999,37 @@
     </w:p>
     <w:p>
       <w:r>
-        <w:t>Izstrādes laikā projektu jātestē un jāpārbauda funkcionalitātes pēc nepilnībām. Testēšana tiks veikta manuāli ar melnās un baltās kastes metodoloģijām, taču atsevišķas funkcionalitātes vai tās daļas testēšanu var veikt automātiski ar vienībtestēšanu.</w:t>
+        <w:t xml:space="preserve">Izstrādes laikā projektu jātestē un jāpārbauda funkcionalitātes pēc nepilnībām. Testēšana tiks veikta manuāli ar melnās un baltās kastes metodoloģijām, taču atsevišķas funkcionalitātes vai tās daļas testēšanu var veikt automātiski ar </w:t>
+      </w:r>
+      <w:proofErr w:type="spellStart"/>
+      <w:r>
+        <w:t>vienībtestēšanu</w:t>
+      </w:r>
+      <w:proofErr w:type="spellEnd"/>
+      <w:r>
+        <w:t>.</w:t>
       </w:r>
       <w:r>
         <w:t xml:space="preserve"> </w:t>
       </w:r>
       <w:r>
-        <w:t>Melnās kastes testēšana ietver pārbaudi no lietotāja skatupunkta, neredzot avotkodu vai atkļūdošanas informāciju, kamēr baltās kastes testēšana pārbauda avotkodu.</w:t>
+        <w:t xml:space="preserve">Melnās kastes testēšana ietver pārbaudi no lietotāja skatupunkta, neredzot </w:t>
+      </w:r>
+      <w:proofErr w:type="spellStart"/>
+      <w:r>
+        <w:t>avotkodu</w:t>
+      </w:r>
+      <w:proofErr w:type="spellEnd"/>
+      <w:r>
+        <w:t xml:space="preserve"> vai atkļūdošanas informāciju, kamēr baltās kastes testēšana pārbauda </w:t>
+      </w:r>
+      <w:proofErr w:type="spellStart"/>
+      <w:r>
+        <w:t>avotkodu</w:t>
+      </w:r>
+      <w:proofErr w:type="spellEnd"/>
+      <w:r>
+        <w:t>.</w:t>
       </w:r>
     </w:p>
     <w:p>
@@ -15107,10 +15736,7 @@
               <w:pStyle w:val="talbecontent"/>
             </w:pPr>
             <w:r>
-              <w:t>PR</w:t>
-            </w:r>
-            <w:r>
-              <w:t>.SK.1</w:t>
+              <w:t>PR.SK.1</w:t>
             </w:r>
           </w:p>
         </w:tc>
@@ -15203,10 +15829,7 @@
               <w:pStyle w:val="talbecontent"/>
             </w:pPr>
             <w:r>
-              <w:t>PR.SK.</w:t>
-            </w:r>
-            <w:r>
-              <w:t>2</w:t>
+              <w:t>PR.SK.2</w:t>
             </w:r>
           </w:p>
         </w:tc>
@@ -15299,10 +15922,7 @@
               <w:pStyle w:val="talbecontent"/>
             </w:pPr>
             <w:r>
-              <w:t>PR.SK.</w:t>
-            </w:r>
-            <w:r>
-              <w:t>3</w:t>
+              <w:t>PR.SK.3</w:t>
             </w:r>
           </w:p>
         </w:tc>
@@ -15330,10 +15950,7 @@
               <w:pStyle w:val="talbecontent"/>
             </w:pPr>
             <w:r>
-              <w:t>Iestatījuma</w:t>
-            </w:r>
-            <w:r>
-              <w:t xml:space="preserve"> logs tiek atvērts</w:t>
+              <w:t>Iestatījuma logs tiek atvērts</w:t>
             </w:r>
           </w:p>
         </w:tc>
@@ -15359,13 +15976,7 @@
               <w:pStyle w:val="talbecontent"/>
             </w:pPr>
             <w:r>
-              <w:t xml:space="preserve">Lietotājs nospiež </w:t>
-            </w:r>
-            <w:r>
-              <w:t>iestatījuma</w:t>
-            </w:r>
-            <w:r>
-              <w:t xml:space="preserve"> pogu</w:t>
+              <w:t>Lietotājs nospiež iestatījuma pogu</w:t>
             </w:r>
           </w:p>
         </w:tc>
@@ -15391,10 +16002,7 @@
               <w:pStyle w:val="talbecontent"/>
             </w:pPr>
             <w:r>
-              <w:t xml:space="preserve">Iestatījuma logs ir redzams lietotājam, </w:t>
-            </w:r>
-            <w:r>
-              <w:t>ar vadībām, lai izmainītu spēles iestatījumus.</w:t>
+              <w:t>Iestatījuma logs ir redzams lietotājam, ar vadībām, lai izmainītu spēles iestatījumus.</w:t>
             </w:r>
           </w:p>
         </w:tc>
@@ -15407,10 +16015,7 @@
               <w:pStyle w:val="talbecontent"/>
             </w:pPr>
             <w:r>
-              <w:t>PR.SK.</w:t>
-            </w:r>
-            <w:r>
-              <w:t>4</w:t>
+              <w:t>PR.SK.4</w:t>
             </w:r>
           </w:p>
         </w:tc>
@@ -15438,10 +16043,7 @@
               <w:pStyle w:val="talbecontent"/>
             </w:pPr>
             <w:r>
-              <w:t xml:space="preserve">Iestatījuma logs tiek </w:t>
-            </w:r>
-            <w:r>
-              <w:t>aizvērts</w:t>
+              <w:t>Iestatījuma logs tiek aizvērts</w:t>
             </w:r>
           </w:p>
         </w:tc>
@@ -15506,10 +16108,7 @@
               <w:pStyle w:val="talbecontent"/>
             </w:pPr>
             <w:r>
-              <w:t>PR.SK.</w:t>
-            </w:r>
-            <w:r>
-              <w:t>5</w:t>
+              <w:t>PR.SK.5</w:t>
             </w:r>
           </w:p>
         </w:tc>
@@ -15602,10 +16201,7 @@
               <w:pStyle w:val="talbecontent"/>
             </w:pPr>
             <w:r>
-              <w:t>PR.SK.</w:t>
-            </w:r>
-            <w:r>
-              <w:t>6</w:t>
+              <w:t>PR.SK.6</w:t>
             </w:r>
           </w:p>
         </w:tc>
@@ -15753,8 +16349,13 @@
               <w:pStyle w:val="talbecontent"/>
             </w:pPr>
             <w:r>
-              <w:t>Lietotājs gaida līdz ielādei</w:t>
-            </w:r>
+              <w:t xml:space="preserve">Lietotājs gaida līdz </w:t>
+            </w:r>
+            <w:proofErr w:type="spellStart"/>
+            <w:r>
+              <w:t>ielādei</w:t>
+            </w:r>
+            <w:proofErr w:type="spellEnd"/>
           </w:p>
         </w:tc>
         <w:tc>
@@ -15792,10 +16393,7 @@
               <w:pStyle w:val="talbecontent"/>
             </w:pPr>
             <w:r>
-              <w:t>PR.</w:t>
-            </w:r>
-            <w:r>
-              <w:t>LA.8</w:t>
+              <w:t>PR.LA.8</w:t>
             </w:r>
           </w:p>
         </w:tc>
@@ -15888,10 +16486,7 @@
               <w:pStyle w:val="talbecontent"/>
             </w:pPr>
             <w:r>
-              <w:t>PR.LA.</w:t>
-            </w:r>
-            <w:r>
-              <w:t>9</w:t>
+              <w:t>PR.LA.9</w:t>
             </w:r>
           </w:p>
         </w:tc>
@@ -15984,10 +16579,7 @@
               <w:pStyle w:val="talbecontent"/>
             </w:pPr>
             <w:r>
-              <w:t>PR.LA.</w:t>
-            </w:r>
-            <w:r>
-              <w:t>10</w:t>
+              <w:t>PR.LA.10</w:t>
             </w:r>
           </w:p>
         </w:tc>
@@ -16080,10 +16672,7 @@
               <w:pStyle w:val="talbecontent"/>
             </w:pPr>
             <w:r>
-              <w:t>PR.LA.</w:t>
-            </w:r>
-            <w:r>
-              <w:t>11</w:t>
+              <w:t>PR.LA.11</w:t>
             </w:r>
           </w:p>
         </w:tc>
@@ -16176,10 +16765,7 @@
               <w:pStyle w:val="talbecontent"/>
             </w:pPr>
             <w:r>
-              <w:t>PR.LA.</w:t>
-            </w:r>
-            <w:r>
-              <w:t>12</w:t>
+              <w:t>PR.LA.12</w:t>
             </w:r>
           </w:p>
         </w:tc>
@@ -16257,16 +16843,7 @@
               <w:pStyle w:val="talbecontent"/>
             </w:pPr>
             <w:r>
-              <w:t>PR.</w:t>
-            </w:r>
-            <w:r>
-              <w:t>SL</w:t>
-            </w:r>
-            <w:r>
-              <w:t>.</w:t>
-            </w:r>
-            <w:r>
-              <w:t>13</w:t>
+              <w:t>PR.SL.13</w:t>
             </w:r>
           </w:p>
         </w:tc>
@@ -16344,10 +16921,7 @@
               <w:pStyle w:val="talbecontent"/>
             </w:pPr>
             <w:r>
-              <w:t>PR.SL.1</w:t>
-            </w:r>
-            <w:r>
-              <w:t>4</w:t>
+              <w:t>PR.SL.14</w:t>
             </w:r>
           </w:p>
         </w:tc>
@@ -16425,10 +16999,7 @@
               <w:pStyle w:val="talbecontent"/>
             </w:pPr>
             <w:r>
-              <w:t>PR.SL.1</w:t>
-            </w:r>
-            <w:r>
-              <w:t>5</w:t>
+              <w:t>PR.SL.15</w:t>
             </w:r>
           </w:p>
         </w:tc>
@@ -16506,10 +17077,7 @@
               <w:pStyle w:val="talbecontent"/>
             </w:pPr>
             <w:r>
-              <w:t>PR.SL.1</w:t>
-            </w:r>
-            <w:r>
-              <w:t>6</w:t>
+              <w:t>PR.SL.16</w:t>
             </w:r>
           </w:p>
         </w:tc>
@@ -16587,10 +17155,7 @@
               <w:pStyle w:val="talbecontent"/>
             </w:pPr>
             <w:r>
-              <w:t>PR.SL.1</w:t>
-            </w:r>
-            <w:r>
-              <w:t>7</w:t>
+              <w:t>PR.SL.17</w:t>
             </w:r>
           </w:p>
         </w:tc>
@@ -16669,10 +17234,7 @@
               <w:pStyle w:val="talbecontent"/>
             </w:pPr>
             <w:r>
-              <w:t>PR.SL.1</w:t>
-            </w:r>
-            <w:r>
-              <w:t>8</w:t>
+              <w:t>PR.SL.18</w:t>
             </w:r>
           </w:p>
         </w:tc>
@@ -16700,13 +17262,7 @@
               <w:pStyle w:val="talbecontent"/>
             </w:pPr>
             <w:r>
-              <w:t xml:space="preserve">Pārvirze uz </w:t>
-            </w:r>
-            <w:r>
-              <w:t>līmeņa atlases</w:t>
-            </w:r>
-            <w:r>
-              <w:t xml:space="preserve"> ainu.</w:t>
+              <w:t>Pārvirze uz līmeņa atlases ainu.</w:t>
             </w:r>
           </w:p>
         </w:tc>
@@ -16719,13 +17275,7 @@
               <w:pStyle w:val="talbecontent"/>
             </w:pPr>
             <w:r>
-              <w:t>Pārvirze uz līmeņa atlases</w:t>
-            </w:r>
-            <w:r>
-              <w:t xml:space="preserve"> </w:t>
-            </w:r>
-            <w:r>
-              <w:t>ainu</w:t>
+              <w:t>Pārvirze uz līmeņa atlases ainu</w:t>
             </w:r>
           </w:p>
         </w:tc>
@@ -16764,13 +17314,7 @@
               <w:pStyle w:val="talbecontent"/>
             </w:pPr>
             <w:r>
-              <w:t>Lietotājs tiek pārvirzīts uz līmeņa atlases</w:t>
-            </w:r>
-            <w:r>
-              <w:t xml:space="preserve"> </w:t>
-            </w:r>
-            <w:r>
-              <w:t>ainu</w:t>
+              <w:t>Lietotājs tiek pārvirzīts uz līmeņa atlases ainu</w:t>
             </w:r>
           </w:p>
         </w:tc>
@@ -16783,10 +17327,7 @@
               <w:pStyle w:val="talbecontent"/>
             </w:pPr>
             <w:r>
-              <w:t>PR.SL.1</w:t>
-            </w:r>
-            <w:r>
-              <w:t>9</w:t>
+              <w:t>PR.SL.19</w:t>
             </w:r>
           </w:p>
         </w:tc>
@@ -16864,10 +17405,7 @@
               <w:pStyle w:val="talbecontent"/>
             </w:pPr>
             <w:r>
-              <w:t>PR.SL.</w:t>
-            </w:r>
-            <w:r>
-              <w:t>20</w:t>
+              <w:t>PR.SL.20</w:t>
             </w:r>
           </w:p>
         </w:tc>
@@ -16945,10 +17483,7 @@
               <w:pStyle w:val="talbecontent"/>
             </w:pPr>
             <w:r>
-              <w:t>PR.SL.2</w:t>
-            </w:r>
-            <w:r>
-              <w:t>1</w:t>
+              <w:t>PR.SL.21</w:t>
             </w:r>
           </w:p>
         </w:tc>
@@ -17026,10 +17561,7 @@
               <w:pStyle w:val="talbecontent"/>
             </w:pPr>
             <w:r>
-              <w:t>PR.SL.2</w:t>
-            </w:r>
-            <w:r>
-              <w:t>2</w:t>
+              <w:t>PR.SL.22</w:t>
             </w:r>
           </w:p>
         </w:tc>
@@ -17107,10 +17639,7 @@
               <w:pStyle w:val="talbecontent"/>
             </w:pPr>
             <w:r>
-              <w:t>PR.SL.2</w:t>
-            </w:r>
-            <w:r>
-              <w:t>3</w:t>
+              <w:t>PR.SL.23</w:t>
             </w:r>
           </w:p>
         </w:tc>
@@ -17188,10 +17717,7 @@
               <w:pStyle w:val="talbecontent"/>
             </w:pPr>
             <w:r>
-              <w:t>PR.SL.2</w:t>
-            </w:r>
-            <w:r>
-              <w:t>4</w:t>
+              <w:t>PR.SL.24</w:t>
             </w:r>
           </w:p>
         </w:tc>
@@ -17269,10 +17795,7 @@
               <w:pStyle w:val="talbecontent"/>
             </w:pPr>
             <w:r>
-              <w:t>PR.SL.2</w:t>
-            </w:r>
-            <w:r>
-              <w:t>5</w:t>
+              <w:t>PR.SL.25</w:t>
             </w:r>
           </w:p>
         </w:tc>
@@ -17350,10 +17873,7 @@
               <w:pStyle w:val="talbecontent"/>
             </w:pPr>
             <w:r>
-              <w:t>PR.SL.2</w:t>
-            </w:r>
-            <w:r>
-              <w:t>6</w:t>
+              <w:t>PR.SL.26</w:t>
             </w:r>
           </w:p>
         </w:tc>
@@ -17431,10 +17951,7 @@
               <w:pStyle w:val="talbecontent"/>
             </w:pPr>
             <w:r>
-              <w:t>PR.SL.2</w:t>
-            </w:r>
-            <w:r>
-              <w:t>7</w:t>
+              <w:t>PR.SL.27</w:t>
             </w:r>
           </w:p>
         </w:tc>
@@ -17512,10 +18029,7 @@
               <w:pStyle w:val="talbecontent"/>
             </w:pPr>
             <w:r>
-              <w:t>PR.SL.2</w:t>
-            </w:r>
-            <w:r>
-              <w:t>8</w:t>
+              <w:t>PR.SL.28</w:t>
             </w:r>
           </w:p>
         </w:tc>
@@ -17593,10 +18107,7 @@
               <w:pStyle w:val="talbecontent"/>
             </w:pPr>
             <w:r>
-              <w:t>PR.SL.2</w:t>
-            </w:r>
-            <w:r>
-              <w:t>9</w:t>
+              <w:t>PR.SL.29</w:t>
             </w:r>
           </w:p>
         </w:tc>
@@ -17674,10 +18185,7 @@
               <w:pStyle w:val="talbecontent"/>
             </w:pPr>
             <w:r>
-              <w:t>PR.SL.</w:t>
-            </w:r>
-            <w:r>
-              <w:t>30</w:t>
+              <w:t>PR.SL.30</w:t>
             </w:r>
           </w:p>
         </w:tc>
@@ -17755,10 +18263,7 @@
               <w:pStyle w:val="talbecontent"/>
             </w:pPr>
             <w:r>
-              <w:t>PR.SL.3</w:t>
-            </w:r>
-            <w:r>
-              <w:t>1</w:t>
+              <w:t>PR.SL.31</w:t>
             </w:r>
           </w:p>
         </w:tc>
@@ -17836,10 +18341,7 @@
               <w:pStyle w:val="talbecontent"/>
             </w:pPr>
             <w:r>
-              <w:t>PR.SL.3</w:t>
-            </w:r>
-            <w:r>
-              <w:t>2</w:t>
+              <w:t>PR.SL.32</w:t>
             </w:r>
           </w:p>
         </w:tc>
@@ -17917,10 +18419,7 @@
               <w:pStyle w:val="talbecontent"/>
             </w:pPr>
             <w:r>
-              <w:t>PR.SL.3</w:t>
-            </w:r>
-            <w:r>
-              <w:t>3</w:t>
+              <w:t>PR.SL.33</w:t>
             </w:r>
           </w:p>
         </w:tc>
@@ -17998,10 +18497,7 @@
               <w:pStyle w:val="talbecontent"/>
             </w:pPr>
             <w:r>
-              <w:t>PR.SL.3</w:t>
-            </w:r>
-            <w:r>
-              <w:t>4</w:t>
+              <w:t>PR.SL.34</w:t>
             </w:r>
           </w:p>
         </w:tc>
@@ -18079,10 +18575,7 @@
               <w:pStyle w:val="talbecontent"/>
             </w:pPr>
             <w:r>
-              <w:t>PR.SL.3</w:t>
-            </w:r>
-            <w:r>
-              <w:t>5</w:t>
+              <w:t>PR.SL.35</w:t>
             </w:r>
           </w:p>
         </w:tc>
@@ -18160,10 +18653,7 @@
               <w:pStyle w:val="talbecontent"/>
             </w:pPr>
             <w:r>
-              <w:t>PR.SL.3</w:t>
-            </w:r>
-            <w:r>
-              <w:t>6</w:t>
+              <w:t>PR.SL.36</w:t>
             </w:r>
           </w:p>
         </w:tc>
@@ -18241,16 +18731,7 @@
               <w:pStyle w:val="talbecontent"/>
             </w:pPr>
             <w:r>
-              <w:t>PR.</w:t>
-            </w:r>
-            <w:r>
-              <w:t xml:space="preserve"> </w:t>
-            </w:r>
-            <w:r>
-              <w:t>SL.3</w:t>
-            </w:r>
-            <w:r>
-              <w:t>7</w:t>
+              <w:t>PR. SL.37</w:t>
             </w:r>
           </w:p>
         </w:tc>
@@ -18328,16 +18809,7 @@
               <w:pStyle w:val="talbecontent"/>
             </w:pPr>
             <w:r>
-              <w:t>PR.</w:t>
-            </w:r>
-            <w:r>
-              <w:t xml:space="preserve"> </w:t>
-            </w:r>
-            <w:r>
-              <w:t>SL.3</w:t>
-            </w:r>
-            <w:r>
-              <w:t>8</w:t>
+              <w:t>PR. SL.38</w:t>
             </w:r>
           </w:p>
         </w:tc>
@@ -18415,16 +18887,7 @@
               <w:pStyle w:val="talbecontent"/>
             </w:pPr>
             <w:r>
-              <w:t>PR.</w:t>
-            </w:r>
-            <w:r>
-              <w:t xml:space="preserve"> </w:t>
-            </w:r>
-            <w:r>
-              <w:t>SL.3</w:t>
-            </w:r>
-            <w:r>
-              <w:t>9</w:t>
+              <w:t>PR. SL.39</w:t>
             </w:r>
           </w:p>
         </w:tc>
@@ -18502,16 +18965,7 @@
               <w:pStyle w:val="talbecontent"/>
             </w:pPr>
             <w:r>
-              <w:t>PR.S</w:t>
-            </w:r>
-            <w:r>
-              <w:t>L</w:t>
-            </w:r>
-            <w:r>
-              <w:t>.</w:t>
-            </w:r>
-            <w:r>
-              <w:t>40</w:t>
+              <w:t>PR.SL.40</w:t>
             </w:r>
           </w:p>
         </w:tc>
@@ -18589,10 +19043,7 @@
               <w:pStyle w:val="talbecontent"/>
             </w:pPr>
             <w:r>
-              <w:t>PR.VS.4</w:t>
-            </w:r>
-            <w:r>
-              <w:t>1</w:t>
+              <w:t>PR.VS.41</w:t>
             </w:r>
           </w:p>
         </w:tc>
@@ -18671,10 +19122,7 @@
               <w:pStyle w:val="talbecontent"/>
             </w:pPr>
             <w:r>
-              <w:t>PR.VS.4</w:t>
-            </w:r>
-            <w:r>
-              <w:t>2</w:t>
+              <w:t>PR.VS.42</w:t>
             </w:r>
           </w:p>
         </w:tc>
@@ -18752,10 +19200,7 @@
               <w:pStyle w:val="talbecontent"/>
             </w:pPr>
             <w:r>
-              <w:t>PR.VS.4</w:t>
-            </w:r>
-            <w:r>
-              <w:t>3</w:t>
+              <w:t>PR.VS.43</w:t>
             </w:r>
           </w:p>
         </w:tc>
@@ -18833,10 +19278,7 @@
               <w:pStyle w:val="talbecontent"/>
             </w:pPr>
             <w:r>
-              <w:t>PR.VS.4</w:t>
-            </w:r>
-            <w:r>
-              <w:t>4</w:t>
+              <w:t>PR.VS.44</w:t>
             </w:r>
           </w:p>
         </w:tc>
@@ -18914,10 +19356,7 @@
               <w:pStyle w:val="talbecontent"/>
             </w:pPr>
             <w:r>
-              <w:t>PR.VS.4</w:t>
-            </w:r>
-            <w:r>
-              <w:t>5</w:t>
+              <w:t>PR.VS.45</w:t>
             </w:r>
           </w:p>
         </w:tc>
@@ -18995,10 +19434,7 @@
               <w:pStyle w:val="talbecontent"/>
             </w:pPr>
             <w:r>
-              <w:t>PR.VS.4</w:t>
-            </w:r>
-            <w:r>
-              <w:t>6</w:t>
+              <w:t>PR.VS.46</w:t>
             </w:r>
           </w:p>
         </w:tc>
@@ -19076,10 +19512,7 @@
               <w:pStyle w:val="talbecontent"/>
             </w:pPr>
             <w:r>
-              <w:t>PR.VS.4</w:t>
-            </w:r>
-            <w:r>
-              <w:t>7</w:t>
+              <w:t>PR.VS.47</w:t>
             </w:r>
           </w:p>
         </w:tc>
@@ -19175,10 +19608,7 @@
               <w:pStyle w:val="talbecontent"/>
             </w:pPr>
             <w:r>
-              <w:t>PR.VS.4</w:t>
-            </w:r>
-            <w:r>
-              <w:t>8</w:t>
+              <w:t>PR.VS.48</w:t>
             </w:r>
           </w:p>
         </w:tc>
@@ -19219,16 +19649,7 @@
               <w:pStyle w:val="talbecontent"/>
             </w:pPr>
             <w:r>
-              <w:t>Datorspēles aizvēršana</w:t>
-            </w:r>
-            <w:r>
-              <w:t xml:space="preserve">s </w:t>
-            </w:r>
-            <w:r>
-              <w:t>atlik</w:t>
-            </w:r>
-            <w:r>
-              <w:t>šana</w:t>
+              <w:t>Datorspēles aizvēršanas atlikšana</w:t>
             </w:r>
           </w:p>
         </w:tc>
@@ -19241,13 +19662,7 @@
               <w:pStyle w:val="talbecontent"/>
             </w:pPr>
             <w:r>
-              <w:t xml:space="preserve">Lietotājs nospiež aizvēršanas pogu logā, tad </w:t>
-            </w:r>
-            <w:r>
-              <w:t>atlikšanas</w:t>
-            </w:r>
-            <w:r>
-              <w:t xml:space="preserve"> pogu</w:t>
+              <w:t>Lietotājs nospiež aizvēršanas pogu logā, tad atlikšanas pogu</w:t>
             </w:r>
           </w:p>
         </w:tc>
@@ -19260,10 +19675,7 @@
               <w:pStyle w:val="talbecontent"/>
             </w:pPr>
             <w:r>
-              <w:t>Atlikšanas</w:t>
-            </w:r>
-            <w:r>
-              <w:t xml:space="preserve"> poga dialoglogā</w:t>
+              <w:t>Atlikšanas poga dialoglogā</w:t>
             </w:r>
           </w:p>
         </w:tc>
@@ -19286,10 +19698,7 @@
               <w:pStyle w:val="talbecontent"/>
             </w:pPr>
             <w:r>
-              <w:t>PR.VS.4</w:t>
-            </w:r>
-            <w:r>
-              <w:t>9</w:t>
+              <w:t>PR.VS.49</w:t>
             </w:r>
           </w:p>
         </w:tc>
@@ -19328,7 +19737,23 @@
         <w:t>Projekta ideja bija sākotnēji un šķietami vienkārši izstr</w:t>
       </w:r>
       <w:r>
-        <w:t>ādājama, ņemot vērā iepriekšējo pieredzi ar “Godot” dzini, neskatoties, ka iepriekšējā pieredzē tikai biju veidojis projekta fragmentu un ar atsevišķu valodu “GDScript”;</w:t>
+        <w:t>ādājama, ņemot vērā iepriekšējo pieredzi ar “</w:t>
+      </w:r>
+      <w:proofErr w:type="spellStart"/>
+      <w:r>
+        <w:t>Godot</w:t>
+      </w:r>
+      <w:proofErr w:type="spellEnd"/>
+      <w:r>
+        <w:t>” dzini, neskatoties, ka iepriekšējā pieredzē tikai biju veidojis projekta fragmentu un ar atsevišķu valodu “</w:t>
+      </w:r>
+      <w:proofErr w:type="spellStart"/>
+      <w:r>
+        <w:t>GDScript</w:t>
+      </w:r>
+      <w:proofErr w:type="spellEnd"/>
+      <w:r>
+        <w:t>”;</w:t>
       </w:r>
     </w:p>
     <w:p>
@@ -19385,7 +19810,15 @@
         </w:numPr>
       </w:pPr>
       <w:r>
-        <w:t>Izstrāde palika sarežģītāka kamēr vienlaicīgi mācījos izstrādāt ar “Godot” ietvaru un “C#” programmēšanas valodu, taču arī uzzināju daudz jaunu iespēju izmantojot šo dzini un valodu;</w:t>
+        <w:t>Izstrāde palika sarežģītāka kamēr vienlaicīgi mācījos izstrādāt ar “</w:t>
+      </w:r>
+      <w:proofErr w:type="spellStart"/>
+      <w:r>
+        <w:t>Godot</w:t>
+      </w:r>
+      <w:proofErr w:type="spellEnd"/>
+      <w:r>
+        <w:t>” ietvaru un “C#” programmēšanas valodu, taču arī uzzināju daudz jaunu iespēju izmantojot šo dzini un valodu;</w:t>
       </w:r>
     </w:p>
     <w:p>
@@ -19397,7 +19830,15 @@
         </w:numPr>
       </w:pPr>
       <w:r>
-        <w:t>Šī projekta izstrāde bija personīgi īstens objektorientētā programmēšanas pārbaudījums, jo izstrādes laikā vairākās reizes mēģināju ieviest advancētākus funkcionalitātes un īpatnības objektorientētās programmēšanas valodās un “C#” valodā pirms beigās izmantoju vienkāršākus risinājumus;</w:t>
+        <w:t xml:space="preserve">Šī projekta izstrāde bija personīgi īstens objektorientētā programmēšanas pārbaudījums, jo izstrādes laikā vairākās reizes mēģināju ieviest </w:t>
+      </w:r>
+      <w:proofErr w:type="spellStart"/>
+      <w:r>
+        <w:t>advancētākus</w:t>
+      </w:r>
+      <w:proofErr w:type="spellEnd"/>
+      <w:r>
+        <w:t xml:space="preserve"> funkcionalitātes un īpatnības objektorientētās programmēšanas valodās un “C#” valodā pirms beigās izmantoju vienkāršākus risinājumus;</w:t>
       </w:r>
     </w:p>
     <w:p>
@@ -19409,7 +19850,15 @@
         </w:numPr>
       </w:pPr>
       <w:r>
-        <w:t>Kad uzzināju jaunu funkcionalitāti “C#” valodā vai “Godot” ietvarā, personīgi bija konflikti ar pašreizējo dizainu kodā un uzzināto iespēju, kuras var vienkāršot darbības gaitu izstrādē;</w:t>
+        <w:t>Kad uzzināju jaunu funkcionalitāti “C#” valodā vai “</w:t>
+      </w:r>
+      <w:proofErr w:type="spellStart"/>
+      <w:r>
+        <w:t>Godot</w:t>
+      </w:r>
+      <w:proofErr w:type="spellEnd"/>
+      <w:r>
+        <w:t>” ietvarā, personīgi bija konflikti ar pašreizējo dizainu kodā un uzzināto iespēju, kuras var vienkāršot darbības gaitu izstrādē;</w:t>
       </w:r>
     </w:p>
     <w:p>
@@ -19907,7 +20356,15 @@
         <w:ind w:left="1134" w:hanging="283"/>
       </w:pPr>
       <w:r>
-        <w:t>“Godot ”</w:t>
+        <w:t>“</w:t>
+      </w:r>
+      <w:proofErr w:type="spellStart"/>
+      <w:r>
+        <w:t>Godot</w:t>
+      </w:r>
+      <w:proofErr w:type="spellEnd"/>
+      <w:r>
+        <w:t xml:space="preserve"> ”</w:t>
       </w:r>
     </w:p>
     <w:p>
@@ -20124,22 +20581,45 @@
         <w:pStyle w:val="Parakstszemobjekta"/>
       </w:pPr>
       <w:r>
-        <w:t>2</w:t>
-      </w:r>
-      <w:r>
-        <w:t>5</w:t>
-      </w:r>
-      <w:r>
-        <w:t xml:space="preserve">. attēls. </w:t>
-      </w:r>
-      <w:r>
-        <w:t>Kameras kalibrācija pēc kartes laukuma un repozicionēšana ar peles vilkšanas loģika</w:t>
+        <w:t xml:space="preserve">25. attēls. Kameras </w:t>
+      </w:r>
+      <w:proofErr w:type="spellStart"/>
+      <w:r>
+        <w:t>kalibrācija</w:t>
+      </w:r>
+      <w:proofErr w:type="spellEnd"/>
+      <w:r>
+        <w:t xml:space="preserve"> pēc kartes laukuma un </w:t>
+      </w:r>
+      <w:proofErr w:type="spellStart"/>
+      <w:r>
+        <w:t>repozicionēšana</w:t>
+      </w:r>
+      <w:proofErr w:type="spellEnd"/>
+      <w:r>
+        <w:t xml:space="preserve"> ar peles vilkšanas loģika</w:t>
       </w:r>
       <w:r>
         <w:t>.</w:t>
       </w:r>
       <w:r>
-        <w:t xml:space="preserve"> Kalibrācija arī ņem vērā augšpaneļa augstumu, kuru iestata ainas ar šo paneli.</w:t>
+        <w:t xml:space="preserve"> </w:t>
+      </w:r>
+      <w:proofErr w:type="spellStart"/>
+      <w:r>
+        <w:t>Kalibrācija</w:t>
+      </w:r>
+      <w:proofErr w:type="spellEnd"/>
+      <w:r>
+        <w:t xml:space="preserve"> arī ņem vērā </w:t>
+      </w:r>
+      <w:proofErr w:type="spellStart"/>
+      <w:r>
+        <w:t>augšpaneļa</w:t>
+      </w:r>
+      <w:proofErr w:type="spellEnd"/>
+      <w:r>
+        <w:t xml:space="preserve"> augstumu, kuru iestata ainas ar šo paneli.</w:t>
       </w:r>
       <w:r>
         <w:t xml:space="preserve"> </w:t>
@@ -20218,16 +20698,15 @@
         <w:pStyle w:val="Parakstszemobjekta"/>
       </w:pPr>
       <w:r>
-        <w:t>2</w:t>
-      </w:r>
-      <w:r>
-        <w:t>6</w:t>
-      </w:r>
-      <w:r>
-        <w:t>. attēls.</w:t>
-      </w:r>
-      <w:r>
-        <w:t xml:space="preserve"> Ierīces īpašības spēles laukumā. Tajā iekļauj ierīces tekstūras kā ķermeni un galvu (piemēram, pašpropelējošas artilērijas ierīces) vai tikai galvu (piemēram, mortīras), kā arī tās ierīces īpašībās kā augstuma leņķu ierobežojumi, traversa ierobežojumi un lodes ātrums. </w:t>
+        <w:t xml:space="preserve">26. attēls. Ierīces īpašības spēles laukumā. Tajā iekļauj ierīces tekstūras kā ķermeni un galvu (piemēram, </w:t>
+      </w:r>
+      <w:proofErr w:type="spellStart"/>
+      <w:r>
+        <w:t>pašpropelējošas</w:t>
+      </w:r>
+      <w:proofErr w:type="spellEnd"/>
+      <w:r>
+        <w:t xml:space="preserve"> artilērijas ierīces) vai tikai galvu (piemēram, mortīras), kā arī tās ierīces īpašībās kā augstuma leņķu ierobežojumi, traversa ierobežojumi un lodes ātrums. </w:t>
       </w:r>
       <w:r>
         <w:t>Iekļautas arī lādiņu īpašības.</w:t>
@@ -20364,16 +20843,15 @@
         <w:pStyle w:val="Parakstszemobjekta"/>
       </w:pPr>
       <w:r>
-        <w:t>2</w:t>
-      </w:r>
-      <w:r>
-        <w:t>7</w:t>
-      </w:r>
-      <w:r>
-        <w:t>. attēls.</w:t>
-      </w:r>
-      <w:r>
-        <w:t xml:space="preserve"> Uguņošanas stadijas fragments. Tiek sekota līdzi ierīces, kurus uguņo vai pārlādē pirms nākamām kārtām. Sekošanai līdzi, ashinhronu metožu dēļ, tiek izveidoti sekošanas mainīgie.</w:t>
+        <w:t xml:space="preserve">27. attēls. Uguņošanas stadijas fragments. Tiek sekota līdzi ierīces, kurus uguņo vai pārlādē pirms nākamām kārtām. Sekošanai līdzi, </w:t>
+      </w:r>
+      <w:proofErr w:type="spellStart"/>
+      <w:r>
+        <w:t>ashinhronu</w:t>
+      </w:r>
+      <w:proofErr w:type="spellEnd"/>
+      <w:r>
+        <w:t xml:space="preserve"> metožu dēļ, tiek izveidoti sekošanas mainīgie.</w:t>
       </w:r>
     </w:p>
     <w:p>
@@ -20510,13 +20988,7 @@
         <w:pStyle w:val="Parakstszemobjekta"/>
       </w:pPr>
       <w:r>
-        <w:t>2</w:t>
-      </w:r>
-      <w:r>
-        <w:t>8</w:t>
-      </w:r>
-      <w:r>
-        <w:t xml:space="preserve">. attēls. </w:t>
+        <w:t xml:space="preserve">28. attēls. </w:t>
       </w:r>
       <w:r>
         <w:t>Lādiņu izšaušanas, ballistikas un detonācijas fragmenti</w:t>
@@ -20612,13 +21084,7 @@
         <w:pStyle w:val="Parakstszemobjekta"/>
       </w:pPr>
       <w:r>
-        <w:t>2</w:t>
-      </w:r>
-      <w:r>
-        <w:t>9</w:t>
-      </w:r>
-      <w:r>
-        <w:t xml:space="preserve">. attēls. </w:t>
+        <w:t xml:space="preserve">29. attēls. </w:t>
       </w:r>
       <w:r>
         <w:t>Kartes datu ielādēšanas fragments</w:t>
@@ -23063,7 +23529,7 @@
   <w:abstractNum w:abstractNumId="25" w15:restartNumberingAfterBreak="0">
     <w:nsid w:val="664A78A8"/>
     <w:multiLevelType w:val="multilevel"/>
-    <w:tmpl w:val="2964561E"/>
+    <w:tmpl w:val="623C2658"/>
     <w:lvl w:ilvl="0">
       <w:start w:val="1"/>
       <w:numFmt w:val="decimal"/>
@@ -24707,7 +25173,7 @@
     <w:uiPriority w:val="9"/>
     <w:unhideWhenUsed/>
     <w:qFormat/>
-    <w:rsid w:val="00A20276"/>
+    <w:rsid w:val="00AB6963"/>
     <w:pPr>
       <w:keepNext/>
       <w:keepLines/>
@@ -24716,6 +25182,7 @@
         <w:numId w:val="34"/>
       </w:numPr>
       <w:spacing w:before="240" w:after="240"/>
+      <w:ind w:left="426" w:hanging="426"/>
       <w:jc w:val="center"/>
       <w:outlineLvl w:val="1"/>
     </w:pPr>
@@ -24924,7 +25391,7 @@
     <w:basedOn w:val="Noklusjumarindkopasfonts"/>
     <w:link w:val="Virsraksts2"/>
     <w:uiPriority w:val="9"/>
-    <w:rsid w:val="00A20276"/>
+    <w:rsid w:val="00AB6963"/>
     <w:rPr>
       <w:rFonts w:ascii="Times New Roman" w:eastAsiaTheme="majorEastAsia" w:hAnsi="Times New Roman" w:cs="Times New Roman"/>
       <w:b/>

</xml_diff>

<commit_message>
test example table fill first cols
</commit_message>
<xml_diff>
--- a/Documentation/Dokumentācija.docx
+++ b/Documentation/Dokumentācija.docx
@@ -112,13 +112,8 @@
       </w:r>
       <w:r>
         <w:br/>
-        <w:t xml:space="preserve">Skolotājs, Kristaps </w:t>
-      </w:r>
-      <w:proofErr w:type="spellStart"/>
-      <w:r>
-        <w:t>Rāvalds</w:t>
-      </w:r>
-      <w:proofErr w:type="spellEnd"/>
+        <w:t>Skolotājs, Kristaps Rāvalds</w:t>
+      </w:r>
     </w:p>
     <w:p>
       <w:pPr>
@@ -5586,15 +5581,7 @@
         <w:t xml:space="preserve">, kā arī </w:t>
       </w:r>
       <w:r>
-        <w:t xml:space="preserve">kādas datorspēlēs var iekļaut funkcionalitātes, kuras nav nepieciešams vai novērsošas projektam un tās izmantošanai kā </w:t>
-      </w:r>
-      <w:proofErr w:type="spellStart"/>
-      <w:r>
-        <w:t>pamatzināšanu</w:t>
-      </w:r>
-      <w:proofErr w:type="spellEnd"/>
-      <w:r>
-        <w:t xml:space="preserve"> apmācības materiālam.</w:t>
+        <w:t>kādas datorspēlēs var iekļaut funkcionalitātes, kuras nav nepieciešams vai novērsošas projektam un tās izmantošanai kā pamatzināšanu apmācības materiālam.</w:t>
       </w:r>
     </w:p>
     <w:p>
@@ -5709,15 +5696,7 @@
         <w:t xml:space="preserve"> </w:t>
       </w:r>
       <w:r>
-        <w:t xml:space="preserve">Pēc izstrādes šis projekts ar tās </w:t>
-      </w:r>
-      <w:proofErr w:type="spellStart"/>
-      <w:r>
-        <w:t>avotkodu</w:t>
-      </w:r>
-      <w:proofErr w:type="spellEnd"/>
-      <w:r>
-        <w:t xml:space="preserve"> tiek kompilēts datorsistēmas platformās kā </w:t>
+        <w:t xml:space="preserve">Pēc izstrādes šis projekts ar tās avotkodu tiek kompilēts datorsistēmas platformās kā </w:t>
       </w:r>
       <w:r>
         <w:rPr>
@@ -5729,7 +5708,6 @@
       <w:r>
         <w:t xml:space="preserve"> un </w:t>
       </w:r>
-      <w:proofErr w:type="spellStart"/>
       <w:r>
         <w:rPr>
           <w:i/>
@@ -5737,7 +5715,6 @@
         </w:rPr>
         <w:t>Linux</w:t>
       </w:r>
-      <w:proofErr w:type="spellEnd"/>
       <w:r>
         <w:t xml:space="preserve"> vidē.</w:t>
       </w:r>
@@ -5814,15 +5791,7 @@
         <w:t xml:space="preserve">Pēc modelēšanas tiek izstrādās projekts, pamatojoties uz iepriekš izveidotiem modeļiem. Izstrādes laikā </w:t>
       </w:r>
       <w:r>
-        <w:t xml:space="preserve">ir jāveic projektam </w:t>
-      </w:r>
-      <w:proofErr w:type="spellStart"/>
-      <w:r>
-        <w:t>versionēšanu</w:t>
-      </w:r>
-      <w:proofErr w:type="spellEnd"/>
-      <w:r>
-        <w:t xml:space="preserve"> jeb versiju kontroli, kuras vadīs projekta stadijas punktus. Praksē tā tiks izmantota, piemēram, projekta sazarošanai funkcionalitātes, būtisko izmaiņu ieviešanai, atsevišķu failu izmaiņu punktu atzīmēšanu, sazarojumu apvienošanu un versijas punktu atzīmēšanu.</w:t>
+        <w:t>ir jāveic projektam versionēšanu jeb versiju kontroli, kuras vadīs projekta stadijas punktus. Praksē tā tiks izmantota, piemēram, projekta sazarošanai funkcionalitātes, būtisko izmaiņu ieviešanai, atsevišķu failu izmaiņu punktu atzīmēšanu, sazarojumu apvienošanu un versijas punktu atzīmēšanu.</w:t>
       </w:r>
     </w:p>
     <w:p>
@@ -6037,15 +6006,7 @@
         <w:t>Izvaddati</w:t>
       </w:r>
       <w:r>
-        <w:t xml:space="preserve">: </w:t>
-      </w:r>
-      <w:proofErr w:type="spellStart"/>
-      <w:r>
-        <w:t>Uznirsts</w:t>
-      </w:r>
-      <w:proofErr w:type="spellEnd"/>
-      <w:r>
-        <w:t xml:space="preserve"> anotācijas logs.</w:t>
+        <w:t>: Uznirsts anotācijas logs.</w:t>
       </w:r>
     </w:p>
     <w:p>
@@ -7066,13 +7027,8 @@
       <w:r>
         <w:t xml:space="preserve">: </w:t>
       </w:r>
-      <w:proofErr w:type="spellStart"/>
-      <w:r>
-        <w:t>Augšjoslas</w:t>
-      </w:r>
-      <w:proofErr w:type="spellEnd"/>
-      <w:r>
-        <w:t xml:space="preserve"> pauzēšanas poga.</w:t>
+      <w:r>
+        <w:t>Augšjoslas pauzēšanas poga.</w:t>
       </w:r>
     </w:p>
     <w:p>
@@ -7280,13 +7236,8 @@
         <w:t>: Laika rādītājs</w:t>
       </w:r>
       <w:r>
-        <w:t xml:space="preserve"> </w:t>
-      </w:r>
-      <w:proofErr w:type="spellStart"/>
-      <w:r>
-        <w:t>augšjoslā</w:t>
-      </w:r>
-      <w:proofErr w:type="spellEnd"/>
+        <w:t xml:space="preserve"> augšjoslā</w:t>
+      </w:r>
       <w:r>
         <w:t>.</w:t>
       </w:r>
@@ -7345,13 +7296,8 @@
         <w:t xml:space="preserve">: </w:t>
       </w:r>
       <w:r>
-        <w:t xml:space="preserve">Kārtas skaits </w:t>
-      </w:r>
-      <w:proofErr w:type="spellStart"/>
-      <w:r>
-        <w:t>augšjoslā</w:t>
-      </w:r>
-      <w:proofErr w:type="spellEnd"/>
+        <w:t>Kārtas skaits augšjoslā</w:t>
+      </w:r>
       <w:r>
         <w:t xml:space="preserve">. </w:t>
       </w:r>
@@ -9870,15 +9816,7 @@
       </w:r>
       <w:r>
         <w:tab/>
-        <w:t>Datorspēles kompilētā programmai ir jābūt pēc iespējas pieejamai vairākās platformās vai kompilējamam vairākām operētājsistēmām, taču galvenokārt “Windows” un “</w:t>
-      </w:r>
-      <w:proofErr w:type="spellStart"/>
-      <w:r>
-        <w:t>Linux</w:t>
-      </w:r>
-      <w:proofErr w:type="spellEnd"/>
-      <w:r>
-        <w:t>” videi;</w:t>
+        <w:t>Datorspēles kompilētā programmai ir jābūt pēc iespējas pieejamai vairākās platformās vai kompilējamam vairākām operētājsistēmām, taču galvenokārt “Windows” un “Linux” videi;</w:t>
       </w:r>
     </w:p>
     <w:p>
@@ -9896,14 +9834,9 @@
       </w:pPr>
       <w:bookmarkStart w:id="15" w:name="_Toc230242293"/>
       <w:r>
-        <w:t xml:space="preserve">Lietotāja </w:t>
-      </w:r>
-      <w:proofErr w:type="spellStart"/>
-      <w:r>
-        <w:t>saskarne</w:t>
+        <w:t>Lietotāja saskarne</w:t>
       </w:r>
       <w:bookmarkEnd w:id="15"/>
-      <w:proofErr w:type="spellEnd"/>
     </w:p>
     <w:p>
       <w:r>
@@ -9920,15 +9853,7 @@
       </w:r>
       <w:r>
         <w:tab/>
-        <w:t xml:space="preserve">Datorspēles grafikai un lietotāja </w:t>
-      </w:r>
-      <w:proofErr w:type="spellStart"/>
-      <w:r>
-        <w:t>saskarnei</w:t>
-      </w:r>
-      <w:proofErr w:type="spellEnd"/>
-      <w:r>
-        <w:t xml:space="preserve"> jābūt minimālai, taču viegli pārskatāmai;</w:t>
+        <w:t>Datorspēles grafikai un lietotāja saskarnei jābūt minimālai, taču viegli pārskatāmai;</w:t>
       </w:r>
     </w:p>
     <w:p>
@@ -9940,15 +9865,7 @@
       </w:r>
       <w:r>
         <w:tab/>
-        <w:t xml:space="preserve">Lietotāja </w:t>
-      </w:r>
-      <w:proofErr w:type="spellStart"/>
-      <w:r>
-        <w:t>saskarnei</w:t>
-      </w:r>
-      <w:proofErr w:type="spellEnd"/>
-      <w:r>
-        <w:t xml:space="preserve"> ir jābūt pielāgojamai dažādos ekrānu izmēros vai izšķirtspējās;</w:t>
+        <w:t>Lietotāja saskarnei ir jābūt pielāgojamai dažādos ekrānu izmēros vai izšķirtspējās;</w:t>
       </w:r>
     </w:p>
     <w:p>
@@ -9960,15 +9877,7 @@
       </w:r>
       <w:r>
         <w:tab/>
-        <w:t xml:space="preserve">Datorspēles </w:t>
-      </w:r>
-      <w:proofErr w:type="spellStart"/>
-      <w:r>
-        <w:t>saskarnes</w:t>
-      </w:r>
-      <w:proofErr w:type="spellEnd"/>
-      <w:r>
-        <w:t xml:space="preserve"> valodai jābūt angļu valodai;</w:t>
+        <w:t>Datorspēles saskarnes valodai jābūt angļu valodai;</w:t>
       </w:r>
     </w:p>
     <w:p>
@@ -10073,15 +9982,7 @@
     </w:p>
     <w:p>
       <w:r>
-        <w:t xml:space="preserve">Šī sadaļa noskaidros, kādi ir pieejami līdzekļi un rīki, lietojuma pamatojumi un tās iespējamās alternatīvās projekta īstenošanai. Rīki tiks atlasīti pēc licencēšanas, kurai ir jābūt pēc iespējas brīvai un atvērtai, </w:t>
-      </w:r>
-      <w:proofErr w:type="spellStart"/>
-      <w:r>
-        <w:t>starpplatformu</w:t>
-      </w:r>
-      <w:proofErr w:type="spellEnd"/>
-      <w:r>
-        <w:t xml:space="preserve"> pieejamības, pieejamās dimensiju vides, kuras jāiekļauj un jābūt optimizēta div</w:t>
+        <w:t>Šī sadaļa noskaidros, kādi ir pieejami līdzekļi un rīki, lietojuma pamatojumi un tās iespējamās alternatīvās projekta īstenošanai. Rīki tiks atlasīti pēc licencēšanas, kurai ir jābūt pēc iespējas brīvai un atvērtai, starpplatformu pieejamības, pieejamās dimensiju vides, kuras jāiekļauj un jābūt optimizēta div</w:t>
       </w:r>
       <w:r>
         <w:t xml:space="preserve">u </w:t>
@@ -10115,37 +10016,13 @@
     </w:p>
     <w:p>
       <w:r>
-        <w:t>Spēļu un grafikas ietvars “</w:t>
-      </w:r>
-      <w:proofErr w:type="spellStart"/>
-      <w:r>
-        <w:t>Godot</w:t>
-      </w:r>
-      <w:proofErr w:type="spellEnd"/>
-      <w:r>
-        <w:t xml:space="preserve">” ir izcelta starp pārējiem tāda veida ietvariem, jo liels skaits neliela mēra projektu kā </w:t>
-      </w:r>
-      <w:proofErr w:type="spellStart"/>
-      <w:r>
-        <w:t>pašizstrādātās</w:t>
-      </w:r>
-      <w:proofErr w:type="spellEnd"/>
-      <w:r>
-        <w:t xml:space="preserve"> vai mazo komandu izstrādātās spēles. Ne tikai pēc popularitātes dēļ, taču licencēšana norāda šo ietvaru par brīvu un atvērtu, kurai nav nepieciešama ne papildizmaksas, nedz reģistrācijas, kā arī ir salīdzinoši ar citiem ietvariem ātri un viegli apgūstama. Šis dzinis arī ir pieejams vairākās platformās, it īpaši starp operētājsistēmām. Funkcionāli tā ir optimizēta div</w:t>
+        <w:t>Spēļu un grafikas ietvars “Godot” ir izcelta starp pārējiem tāda veida ietvariem, jo liels skaits neliela mēra projektu kā pašizstrādātās vai mazo komandu izstrādātās spēles. Ne tikai pēc popularitātes dēļ, taču licencēšana norāda šo ietvaru par brīvu un atvērtu, kurai nav nepieciešama ne papildizmaksas, nedz reģistrācijas, kā arī ir salīdzinoši ar citiem ietvariem ātri un viegli apgūstama. Šis dzinis arī ir pieejams vairākās platformās, it īpaši starp operētājsistēmām. Funkcionāli tā ir optimizēta div</w:t>
       </w:r>
       <w:r>
         <w:t xml:space="preserve">u </w:t>
       </w:r>
       <w:r>
-        <w:t xml:space="preserve">dimensiju videi pēc noteiktiem kritērijiem, taču arī ir iespējams izmantot </w:t>
-      </w:r>
-      <w:proofErr w:type="spellStart"/>
-      <w:r>
-        <w:t>trīsdimensiju</w:t>
-      </w:r>
-      <w:proofErr w:type="spellEnd"/>
-      <w:r>
-        <w:t xml:space="preserve"> vidi, kura arī ir īpaši optimizēta un pielāgota. </w:t>
+        <w:t xml:space="preserve">dimensiju videi pēc noteiktiem kritērijiem, taču arī ir iespējams izmantot trīsdimensiju vidi, kura arī ir īpaši optimizēta un pielāgota. </w:t>
       </w:r>
     </w:p>
     <w:p>
@@ -10160,55 +10037,7 @@
     </w:p>
     <w:p>
       <w:r>
-        <w:t>Ietvars “</w:t>
-      </w:r>
-      <w:proofErr w:type="spellStart"/>
-      <w:r>
-        <w:t>Godot</w:t>
-      </w:r>
-      <w:proofErr w:type="spellEnd"/>
-      <w:r>
-        <w:t>” oficiāli piedāvā izmantot abas programmēšanas valodas – “</w:t>
-      </w:r>
-      <w:proofErr w:type="spellStart"/>
-      <w:r>
-        <w:t>Godot</w:t>
-      </w:r>
-      <w:proofErr w:type="spellEnd"/>
-      <w:r>
-        <w:t>” iebūvētā “</w:t>
-      </w:r>
-      <w:proofErr w:type="spellStart"/>
-      <w:r>
-        <w:t>GDScript</w:t>
-      </w:r>
-      <w:proofErr w:type="spellEnd"/>
-      <w:r>
-        <w:t>” un “.NET” ietvara valoda “C#”, kura tiks izvēlēta šī projekta izstrādei. “</w:t>
-      </w:r>
-      <w:proofErr w:type="spellStart"/>
-      <w:r>
-        <w:t>GDScript</w:t>
-      </w:r>
-      <w:proofErr w:type="spellEnd"/>
-      <w:r>
-        <w:t xml:space="preserve">” ir interpretētā valoda, kura tiek tikai apstrādāta palaišanas laikā un pēc </w:t>
-      </w:r>
-      <w:proofErr w:type="spellStart"/>
-      <w:r>
-        <w:t>avotkoda</w:t>
-      </w:r>
-      <w:proofErr w:type="spellEnd"/>
-      <w:r>
-        <w:t xml:space="preserve"> izmaiņām nav nepieciešama papildus darbības kā kompilēšanu, taču ar nepilnību, kura mazina datorspēles darbības veiktspēju. “C#” valoda tiks izmantota tam dēļ, ka veiktspēja datorspēles darbībai ir uzlabota ar nosacījumu, ka pēc jebkuras izmaiņas projektu ir nepieciešams kompilēt. “</w:t>
-      </w:r>
-      <w:proofErr w:type="spellStart"/>
-      <w:r>
-        <w:t>GDScript</w:t>
-      </w:r>
-      <w:proofErr w:type="spellEnd"/>
-      <w:r>
-        <w:t>” arī nav pilnīgi pielāgota objektorientētai izmantošanai, kamēr “C#” pēc dizaina ir objektorientētā valoda.</w:t>
+        <w:t>Ietvars “Godot” oficiāli piedāvā izmantot abas programmēšanas valodas – “Godot” iebūvētā “GDScript” un “.NET” ietvara valoda “C#”, kura tiks izvēlēta šī projekta izstrādei. “GDScript” ir interpretētā valoda, kura tiek tikai apstrādāta palaišanas laikā un pēc avotkoda izmaiņām nav nepieciešama papildus darbības kā kompilēšanu, taču ar nepilnību, kura mazina datorspēles darbības veiktspēju. “C#” valoda tiks izmantota tam dēļ, ka veiktspēja datorspēles darbībai ir uzlabota ar nosacījumu, ka pēc jebkuras izmaiņas projektu ir nepieciešams kompilēt. “GDScript” arī nav pilnīgi pielāgota objektorientētai izmantošanai, kamēr “C#” pēc dizaina ir objektorientētā valoda.</w:t>
       </w:r>
     </w:p>
     <w:p>
@@ -10223,23 +10052,7 @@
     </w:p>
     <w:p>
       <w:r>
-        <w:t>“</w:t>
-      </w:r>
-      <w:proofErr w:type="spellStart"/>
-      <w:r>
-        <w:t>Godot</w:t>
-      </w:r>
-      <w:proofErr w:type="spellEnd"/>
-      <w:r>
-        <w:t>” ietvaram ir jau savs projekta redaktors, kurā iekļauj koda redaktoru. Šis koda redaktors ir vairāk pielāgots ar “</w:t>
-      </w:r>
-      <w:proofErr w:type="spellStart"/>
-      <w:r>
-        <w:t>GDScript</w:t>
-      </w:r>
-      <w:proofErr w:type="spellEnd"/>
-      <w:r>
-        <w:t>” valodu, taču pieejams atbalsts “C#” valodai. Pašā izstrādes vidē var viegli pārslēgties uz vizuālo redaktoru, kodu redaktoru un atkļūdošanas sadaļu</w:t>
+        <w:t>“Godot” ietvaram ir jau savs projekta redaktors, kurā iekļauj koda redaktoru. Šis koda redaktors ir vairāk pielāgots ar “GDScript” valodu, taču pieejams atbalsts “C#” valodai. Pašā izstrādes vidē var viegli pārslēgties uz vizuālo redaktoru, kodu redaktoru un atkļūdošanas sadaļu</w:t>
       </w:r>
       <w:r>
         <w:t xml:space="preserve"> un nenošķir kodu rakstīšanu ar vizuālo rediģēšanu</w:t>
@@ -10255,48 +10068,19 @@
       <w:bookmarkStart w:id="23" w:name="_Toc230242301"/>
       <w:r>
         <w:lastRenderedPageBreak/>
-        <w:t xml:space="preserve">Versiju kontrole un </w:t>
-      </w:r>
-      <w:proofErr w:type="spellStart"/>
-      <w:r>
-        <w:t>repozitorijas</w:t>
-      </w:r>
-      <w:proofErr w:type="spellEnd"/>
-      <w:r>
-        <w:t xml:space="preserve"> mitināšana</w:t>
+        <w:t>Versiju kontrole un repozitorijas mitināšana</w:t>
       </w:r>
       <w:bookmarkEnd w:id="23"/>
     </w:p>
     <w:p>
       <w:r>
-        <w:t>“</w:t>
-      </w:r>
-      <w:proofErr w:type="spellStart"/>
-      <w:r>
-        <w:t>Git</w:t>
-      </w:r>
-      <w:proofErr w:type="spellEnd"/>
-      <w:r>
-        <w:t>” tiks izmantots versiju kontrolei un tīmeklī tiks izmantots ”</w:t>
+        <w:t>“Git” tiks izmantots versiju kontrolei un tīmeklī tiks izmantots ”</w:t>
       </w:r>
       <w:r>
         <w:t xml:space="preserve"> </w:t>
       </w:r>
-      <w:proofErr w:type="spellStart"/>
-      <w:r>
-        <w:t>GitHub</w:t>
-      </w:r>
-      <w:proofErr w:type="spellEnd"/>
-      <w:r>
-        <w:t xml:space="preserve">”, lai mitinātu šo projekta </w:t>
-      </w:r>
-      <w:proofErr w:type="spellStart"/>
-      <w:r>
-        <w:t>avotkodu</w:t>
-      </w:r>
-      <w:proofErr w:type="spellEnd"/>
-      <w:r>
-        <w:t>.</w:t>
+      <w:r>
+        <w:t>GitHub”, lai mitinātu šo projekta avotkodu.</w:t>
       </w:r>
     </w:p>
     <w:p>
@@ -10326,103 +10110,7 @@
     </w:p>
     <w:p>
       <w:r>
-        <w:t>Populārākos ietvarus datorspēļu un citu mediju izstrādē iekļauj “</w:t>
-      </w:r>
-      <w:proofErr w:type="spellStart"/>
-      <w:r>
-        <w:t>Unity</w:t>
-      </w:r>
-      <w:proofErr w:type="spellEnd"/>
-      <w:r>
-        <w:t>”, “</w:t>
-      </w:r>
-      <w:proofErr w:type="spellStart"/>
-      <w:r>
-        <w:t>Unreal</w:t>
-      </w:r>
-      <w:proofErr w:type="spellEnd"/>
-      <w:r>
-        <w:t xml:space="preserve"> </w:t>
-      </w:r>
-      <w:proofErr w:type="spellStart"/>
-      <w:r>
-        <w:t>Engine</w:t>
-      </w:r>
-      <w:proofErr w:type="spellEnd"/>
-      <w:r>
-        <w:t>”,  “</w:t>
-      </w:r>
-      <w:proofErr w:type="spellStart"/>
-      <w:r>
-        <w:t>CryEngine</w:t>
-      </w:r>
-      <w:proofErr w:type="spellEnd"/>
-      <w:r>
-        <w:t>”. Ietvari “</w:t>
-      </w:r>
-      <w:proofErr w:type="spellStart"/>
-      <w:r>
-        <w:t>Unreal</w:t>
-      </w:r>
-      <w:proofErr w:type="spellEnd"/>
-      <w:r>
-        <w:t xml:space="preserve"> </w:t>
-      </w:r>
-      <w:proofErr w:type="spellStart"/>
-      <w:r>
-        <w:t>Engine</w:t>
-      </w:r>
-      <w:proofErr w:type="spellEnd"/>
-      <w:r>
-        <w:t>” un “</w:t>
-      </w:r>
-      <w:proofErr w:type="spellStart"/>
-      <w:r>
-        <w:t>CryEngine</w:t>
-      </w:r>
-      <w:proofErr w:type="spellEnd"/>
-      <w:r>
-        <w:t xml:space="preserve">” nav pielāgoti </w:t>
-      </w:r>
-      <w:proofErr w:type="spellStart"/>
-      <w:r>
-        <w:t>divdimensiju</w:t>
-      </w:r>
-      <w:proofErr w:type="spellEnd"/>
-      <w:r>
-        <w:t xml:space="preserve"> datorspēļu izveidei ietvara ierobežojumu dēļ, kura no tās izslēdz izmantošanu, ja ne arī neprasa </w:t>
-      </w:r>
-      <w:proofErr w:type="spellStart"/>
-      <w:r>
-        <w:t>veiktspējīgu</w:t>
-      </w:r>
-      <w:proofErr w:type="spellEnd"/>
-      <w:r>
-        <w:t xml:space="preserve"> datorsistēmu, kura ir pretrunā ar projekta mērķiem, taču “</w:t>
-      </w:r>
-      <w:proofErr w:type="spellStart"/>
-      <w:r>
-        <w:t>Unity</w:t>
-      </w:r>
-      <w:proofErr w:type="spellEnd"/>
-      <w:r>
-        <w:t xml:space="preserve">” ietvars neprasa salīdzinoši </w:t>
-      </w:r>
-      <w:proofErr w:type="spellStart"/>
-      <w:r>
-        <w:t>veiktspējīgu</w:t>
-      </w:r>
-      <w:proofErr w:type="spellEnd"/>
-      <w:r>
-        <w:t xml:space="preserve"> datorsistēmu un ir pielāgojama </w:t>
-      </w:r>
-      <w:proofErr w:type="spellStart"/>
-      <w:r>
-        <w:t>divdimensiju</w:t>
-      </w:r>
-      <w:proofErr w:type="spellEnd"/>
-      <w:r>
-        <w:t xml:space="preserve"> videi, taču licencēšana nav brīva un prasa lietotāja reģistrāciju un papildizmaksas, ja šis projekts paplašināties komercdarbības nolūkiem.</w:t>
+        <w:t>Populārākos ietvarus datorspēļu un citu mediju izstrādē iekļauj “Unity”, “Unreal Engine”,  “CryEngine”. Ietvari “Unreal Engine” un “CryEngine” nav pielāgoti divdimensiju datorspēļu izveidei ietvara ierobežojumu dēļ, kura no tās izslēdz izmantošanu, ja ne arī neprasa veiktspējīgu datorsistēmu, kura ir pretrunā ar projekta mērķiem, taču “Unity” ietvars neprasa salīdzinoši veiktspējīgu datorsistēmu un ir pielāgojama divdimensiju videi, taču licencēšana nav brīva un prasa lietotāja reģistrāciju un papildizmaksas, ja šis projekts paplašināties komercdarbības nolūkiem.</w:t>
       </w:r>
     </w:p>
     <w:p>
@@ -10437,63 +10125,7 @@
     </w:p>
     <w:p>
       <w:r>
-        <w:t>Ietvari “</w:t>
-      </w:r>
-      <w:proofErr w:type="spellStart"/>
-      <w:r>
-        <w:t>CryEngine</w:t>
-      </w:r>
-      <w:proofErr w:type="spellEnd"/>
-      <w:r>
-        <w:t>” un “</w:t>
-      </w:r>
-      <w:proofErr w:type="spellStart"/>
-      <w:r>
-        <w:t>Unreal</w:t>
-      </w:r>
-      <w:proofErr w:type="spellEnd"/>
-      <w:r>
-        <w:t xml:space="preserve"> </w:t>
-      </w:r>
-      <w:proofErr w:type="spellStart"/>
-      <w:r>
-        <w:t>Engine</w:t>
-      </w:r>
-      <w:proofErr w:type="spellEnd"/>
-      <w:r>
-        <w:t xml:space="preserve">” izmanto valodu “C++”, kurā iekļauj klases un objektorientētā funkcionalitāte kā C#, taču neatlasot šos ietvarus valoda “C++” netiks izmantota. “C++” lietojuma stili ir plašāki, taču valodas funkcionalitāti un īpatnības apgūt ir sarežģītāk nekā ar “C#”, kura izstrādātājam liek lietot objektorientētā stilā, kurā visi elementi valodā ir objekti, kā arī vairums funkcionalitātes ir aizklātas ar metodēm, kura mazina izstrādes laiku salīdzinot ar “C++”, kura vairākas kompleksas funkcionalitātes nav aizklātas ar metodēm, kura var </w:t>
-      </w:r>
-      <w:proofErr w:type="spellStart"/>
-      <w:r>
-        <w:t>palēlināt</w:t>
-      </w:r>
-      <w:proofErr w:type="spellEnd"/>
-      <w:r>
-        <w:t xml:space="preserve"> izstrādes laiku. Izvēlētā ietvarā “</w:t>
-      </w:r>
-      <w:proofErr w:type="spellStart"/>
-      <w:r>
-        <w:t>Godot</w:t>
-      </w:r>
-      <w:proofErr w:type="spellEnd"/>
-      <w:r>
-        <w:t xml:space="preserve">” ir pieejama </w:t>
-      </w:r>
-      <w:proofErr w:type="spellStart"/>
-      <w:r>
-        <w:t>skriptēšanas</w:t>
-      </w:r>
-      <w:proofErr w:type="spellEnd"/>
-      <w:r>
-        <w:t xml:space="preserve"> valoda “</w:t>
-      </w:r>
-      <w:proofErr w:type="spellStart"/>
-      <w:r>
-        <w:t>GDScript</w:t>
-      </w:r>
-      <w:proofErr w:type="spellEnd"/>
-      <w:r>
-        <w:t>”, taču pēc nosacītiem iemesliem izvēlētai valodai šī valoda netiks izmantota.</w:t>
+        <w:t>Ietvari “CryEngine” un “Unreal Engine” izmanto valodu “C++”, kurā iekļauj klases un objektorientētā funkcionalitāte kā C#, taču neatlasot šos ietvarus valoda “C++” netiks izmantota. “C++” lietojuma stili ir plašāki, taču valodas funkcionalitāti un īpatnības apgūt ir sarežģītāk nekā ar “C#”, kura izstrādātājam liek lietot objektorientētā stilā, kurā visi elementi valodā ir objekti, kā arī vairums funkcionalitātes ir aizklātas ar metodēm, kura mazina izstrādes laiku salīdzinot ar “C++”, kura vairākas kompleksas funkcionalitātes nav aizklātas ar metodēm, kura var palēlināt izstrādes laiku. Izvēlētā ietvarā “Godot” ir pieejama skriptēšanas valoda “GDScript”, taču pēc nosacītiem iemesliem izvēlētai valodai šī valoda netiks izmantota.</w:t>
       </w:r>
     </w:p>
     <w:p>
@@ -10520,169 +10152,17 @@
     </w:p>
     <w:p>
       <w:r>
-        <w:t>Tā kā valoda “C#” tiks izmantota, kura ir daļa no ietvara “.NET”, tiks izmantoti attiecīgas izstrādes programmatūras ar uzsvaru uz noteikto ietvaru un tās ekosistēmas. Populārākā izstrādes  vide tam ir “</w:t>
-      </w:r>
-      <w:proofErr w:type="spellStart"/>
-      <w:r>
-        <w:t>Visual</w:t>
-      </w:r>
-      <w:proofErr w:type="spellEnd"/>
-      <w:r>
-        <w:t xml:space="preserve"> </w:t>
-      </w:r>
-      <w:proofErr w:type="spellStart"/>
-      <w:r>
-        <w:t>Studio</w:t>
-      </w:r>
-      <w:proofErr w:type="spellEnd"/>
-      <w:r>
-        <w:t>”, kura līdzīgi ar izvēlēto izstrādes vidi “</w:t>
-      </w:r>
-      <w:proofErr w:type="spellStart"/>
-      <w:r>
-        <w:t>JetBrains</w:t>
-      </w:r>
-      <w:proofErr w:type="spellEnd"/>
-      <w:r>
-        <w:t xml:space="preserve"> </w:t>
-      </w:r>
-      <w:proofErr w:type="spellStart"/>
-      <w:r>
-        <w:t>Rider</w:t>
-      </w:r>
-      <w:proofErr w:type="spellEnd"/>
-      <w:r>
-        <w:t xml:space="preserve">” iekļauj detalizētu </w:t>
-      </w:r>
-      <w:proofErr w:type="spellStart"/>
-      <w:r>
-        <w:t>atķļūdošanu</w:t>
-      </w:r>
-      <w:proofErr w:type="spellEnd"/>
-      <w:r>
-        <w:t xml:space="preserve">, kodu analīze, automātiskā aizpilde, u.t.t., taču netiks izmantota, jo šī programmatūra nav </w:t>
-      </w:r>
-      <w:proofErr w:type="spellStart"/>
-      <w:r>
-        <w:t>starpplatformu</w:t>
-      </w:r>
-      <w:proofErr w:type="spellEnd"/>
-      <w:r>
-        <w:t>, ierobežojoties uz “Windows” platformu, kuru autors neizmanto, tātad nepieejama programmatūra autoram.</w:t>
-      </w:r>
-    </w:p>
-    <w:p>
-      <w:r>
-        <w:t>Ja ietvars kā “</w:t>
-      </w:r>
-      <w:proofErr w:type="spellStart"/>
-      <w:r>
-        <w:t>Unreal</w:t>
-      </w:r>
-      <w:proofErr w:type="spellEnd"/>
-      <w:r>
-        <w:t xml:space="preserve"> </w:t>
-      </w:r>
-      <w:proofErr w:type="spellStart"/>
-      <w:r>
-        <w:t>Engine</w:t>
-      </w:r>
-      <w:proofErr w:type="spellEnd"/>
-      <w:r>
-        <w:t>” tiktu izmantota, kurā galvenā valoda ir “C++”, tiktu izmantotas izstrādes vides attiecīgi valodai kā “</w:t>
-      </w:r>
-      <w:proofErr w:type="spellStart"/>
-      <w:r>
-        <w:t>Qt</w:t>
-      </w:r>
-      <w:proofErr w:type="spellEnd"/>
-      <w:r>
-        <w:t xml:space="preserve"> </w:t>
-      </w:r>
-      <w:proofErr w:type="spellStart"/>
-      <w:r>
-        <w:t>Creator</w:t>
-      </w:r>
-      <w:proofErr w:type="spellEnd"/>
-      <w:r>
-        <w:t>”, kura ir pielāgota ietvara “</w:t>
-      </w:r>
-      <w:proofErr w:type="spellStart"/>
-      <w:r>
-        <w:t>Qt</w:t>
-      </w:r>
-      <w:proofErr w:type="spellEnd"/>
-      <w:r>
-        <w:t xml:space="preserve">” programmatūras izstrādei, taču iespējams izveidot projektus, kuras neizmanto minēto ietvaru, ņemot vērā to, ka funkcionalitāte un tās iespējas mazinās vai ne tik </w:t>
-      </w:r>
-      <w:proofErr w:type="spellStart"/>
-      <w:r>
-        <w:t>advancētas</w:t>
-      </w:r>
-      <w:proofErr w:type="spellEnd"/>
-      <w:r>
-        <w:t xml:space="preserve"> citiem projektiem,  vai “</w:t>
-      </w:r>
-      <w:proofErr w:type="spellStart"/>
-      <w:r>
-        <w:t>JetBrains</w:t>
-      </w:r>
-      <w:proofErr w:type="spellEnd"/>
-      <w:r>
-        <w:t xml:space="preserve"> </w:t>
-      </w:r>
-      <w:proofErr w:type="spellStart"/>
-      <w:r>
-        <w:t>CLion</w:t>
-      </w:r>
-      <w:proofErr w:type="spellEnd"/>
-      <w:r>
-        <w:t>”, kurai ir līdzīga funkcionalitāte ar atlasīto izstrādes vidi “”</w:t>
-      </w:r>
-      <w:proofErr w:type="spellStart"/>
-      <w:r>
-        <w:t>JetBrains</w:t>
-      </w:r>
-      <w:proofErr w:type="spellEnd"/>
-      <w:r>
-        <w:t xml:space="preserve"> </w:t>
-      </w:r>
-      <w:proofErr w:type="spellStart"/>
-      <w:r>
-        <w:t>Rider</w:t>
-      </w:r>
-      <w:proofErr w:type="spellEnd"/>
-      <w:r>
-        <w:t>” no “</w:t>
-      </w:r>
-      <w:proofErr w:type="spellStart"/>
-      <w:r>
-        <w:t>JetBrains</w:t>
-      </w:r>
-      <w:proofErr w:type="spellEnd"/>
-      <w:r>
-        <w:t>” programmatūru klāsta.</w:t>
-      </w:r>
-    </w:p>
-    <w:p>
-      <w:r>
-        <w:t>Arī iespējams ir izmantot teksta redaktoru “</w:t>
-      </w:r>
-      <w:proofErr w:type="spellStart"/>
-      <w:r>
-        <w:t>Visual</w:t>
-      </w:r>
-      <w:proofErr w:type="spellEnd"/>
-      <w:r>
-        <w:t xml:space="preserve"> </w:t>
-      </w:r>
-      <w:proofErr w:type="spellStart"/>
-      <w:r>
-        <w:t>Studio</w:t>
-      </w:r>
-      <w:proofErr w:type="spellEnd"/>
-      <w:r>
-        <w:t xml:space="preserve"> Code”, kura ar paplašinājumiem var izmantot kā izstrādes vidi, taču noklusētā funkcionalitāte ir ierobežota salīdzinot ar iepriekšējām izstrādes programmatūrām un nepieciešama papildus iestatīšana šai programmatūrai, kura nebūtu nepieciešama pārējām izstrādes vidēm atverot sākotnēji.</w:t>
+        <w:t>Tā kā valoda “C#” tiks izmantota, kura ir daļa no ietvara “.NET”, tiks izmantoti attiecīgas izstrādes programmatūras ar uzsvaru uz noteikto ietvaru un tās ekosistēmas. Populārākā izstrādes  vide tam ir “Visual Studio”, kura līdzīgi ar izvēlēto izstrādes vidi “JetBrains Rider” iekļauj detalizētu atķļūdošanu, kodu analīze, automātiskā aizpilde, u.t.t., taču netiks izmantota, jo šī programmatūra nav starpplatformu, ierobežojoties uz “Windows” platformu, kuru autors neizmanto, tātad nepieejama programmatūra autoram.</w:t>
+      </w:r>
+    </w:p>
+    <w:p>
+      <w:r>
+        <w:t>Ja ietvars kā “Unreal Engine” tiktu izmantota, kurā galvenā valoda ir “C++”, tiktu izmantotas izstrādes vides attiecīgi valodai kā “Qt Creator”, kura ir pielāgota ietvara “Qt” programmatūras izstrādei, taču iespējams izveidot projektus, kuras neizmanto minēto ietvaru, ņemot vērā to, ka funkcionalitāte un tās iespējas mazinās vai ne tik advancētas citiem projektiem,  vai “JetBrains CLion”, kurai ir līdzīga funkcionalitāte ar atlasīto izstrādes vidi “”JetBrains Rider” no “JetBrains” programmatūru klāsta.</w:t>
+      </w:r>
+    </w:p>
+    <w:p>
+      <w:r>
+        <w:t>Arī iespējams ir izmantot teksta redaktoru “Visual Studio Code”, kura ar paplašinājumiem var izmantot kā izstrādes vidi, taču noklusētā funkcionalitāte ir ierobežota salīdzinot ar iepriekšējām izstrādes programmatūrām un nepieciešama papildus iestatīšana šai programmatūrai, kura nebūtu nepieciešama pārējām izstrādes vidēm atverot sākotnēji.</w:t>
       </w:r>
     </w:p>
     <w:p>
@@ -10697,84 +10177,12 @@
     </w:p>
     <w:p>
       <w:r>
-        <w:t xml:space="preserve">Mazāk populāri pakalpojumi, kuri mitina </w:t>
-      </w:r>
-      <w:proofErr w:type="spellStart"/>
-      <w:r>
-        <w:t>avotkodu</w:t>
-      </w:r>
-      <w:proofErr w:type="spellEnd"/>
-      <w:r>
-        <w:t xml:space="preserve"> </w:t>
-      </w:r>
-      <w:proofErr w:type="spellStart"/>
-      <w:r>
-        <w:t>repozotorijus</w:t>
-      </w:r>
-      <w:proofErr w:type="spellEnd"/>
-      <w:r>
-        <w:t>, izmantojot “</w:t>
-      </w:r>
-      <w:proofErr w:type="spellStart"/>
-      <w:r>
-        <w:t>Git</w:t>
-      </w:r>
-      <w:proofErr w:type="spellEnd"/>
-      <w:r>
-        <w:t>” versiju kontroli, arī ir pieejami rīki, kura var automatizēt projekta kompilēšanu un pārbaudi, šādi rīki ir “</w:t>
-      </w:r>
-      <w:proofErr w:type="spellStart"/>
-      <w:r>
-        <w:t>GitLab</w:t>
-      </w:r>
-      <w:proofErr w:type="spellEnd"/>
-      <w:r>
-        <w:t>”, “</w:t>
-      </w:r>
-      <w:proofErr w:type="spellStart"/>
-      <w:r>
-        <w:t>Gitea</w:t>
-      </w:r>
-      <w:proofErr w:type="spellEnd"/>
-      <w:r>
-        <w:t>” un “</w:t>
-      </w:r>
-      <w:proofErr w:type="spellStart"/>
-      <w:r>
-        <w:t>Bitbucket</w:t>
-      </w:r>
-      <w:proofErr w:type="spellEnd"/>
-      <w:r>
-        <w:t>”, kuri ir īpaši pielāgota CI/CD izstrādes videi, taču prasa papildizmaksas, ja šādi rīki tiek palaisti šo pakalpojumu serveros vietā pašam lietotājam mitināt šos rīkus.</w:t>
-      </w:r>
-    </w:p>
-    <w:p>
-      <w:r>
-        <w:t>Taču arī ir pieejami pakalpojumi un rīki, kuri nav atkarīga no “</w:t>
-      </w:r>
-      <w:proofErr w:type="spellStart"/>
-      <w:r>
-        <w:t>Git</w:t>
-      </w:r>
-      <w:proofErr w:type="spellEnd"/>
-      <w:r>
-        <w:t>” versiju kontroles, bet kā pieejamu versiju kontroles programmatūru starp pārējām. Viens no šiem rīkiem ir “</w:t>
-      </w:r>
-      <w:proofErr w:type="spellStart"/>
-      <w:r>
-        <w:t>Azure</w:t>
-      </w:r>
-      <w:proofErr w:type="spellEnd"/>
-      <w:r>
-        <w:t xml:space="preserve"> </w:t>
-      </w:r>
-      <w:proofErr w:type="spellStart"/>
-      <w:r>
-        <w:t>Pipelines</w:t>
-      </w:r>
-      <w:proofErr w:type="spellEnd"/>
-      <w:r>
-        <w:t>”, kuras funkcionalitāte ir plašāka salīdzinot ar iepriekš minētiem rīkiem, taču tās plaša funkcionalitātes klāsts ir radīts lielākiem projektiem, kuri iespējams nebūs lielāko daļu paredzēts izmantošanai šī projekta nolūkiem tās apjoma dēļ un lielākas izmaksas, salīdzinot ar iepriekš minētiem rīkiem.</w:t>
+        <w:t>Mazāk populāri pakalpojumi, kuri mitina avotkodu repozotorijus, izmantojot “Git” versiju kontroli, arī ir pieejami rīki, kura var automatizēt projekta kompilēšanu un pārbaudi, šādi rīki ir “GitLab”, “Gitea” un “Bitbucket”, kuri ir īpaši pielāgota CI/CD izstrādes videi, taču prasa papildizmaksas, ja šādi rīki tiek palaisti šo pakalpojumu serveros vietā pašam lietotājam mitināt šos rīkus.</w:t>
+      </w:r>
+    </w:p>
+    <w:p>
+      <w:r>
+        <w:t>Taču arī ir pieejami pakalpojumi un rīki, kuri nav atkarīga no “Git” versiju kontroles, bet kā pieejamu versiju kontroles programmatūru starp pārējām. Viens no šiem rīkiem ir “Azure Pipelines”, kuras funkcionalitāte ir plašāka salīdzinot ar iepriekš minētiem rīkiem, taču tās plaša funkcionalitātes klāsts ir radīts lielākiem projektiem, kuri iespējams nebūs lielāko daļu paredzēts izmantošanai šī projekta nolūkiem tās apjoma dēļ un lielākas izmaksas, salīdzinot ar iepriekš minētiem rīkiem.</w:t>
       </w:r>
     </w:p>
     <w:p>
@@ -10900,66 +10308,10 @@
     </w:p>
     <w:p>
       <w:r>
-        <w:t>“</w:t>
-      </w:r>
-      <w:proofErr w:type="spellStart"/>
-      <w:r>
-        <w:t>SceneManager</w:t>
-      </w:r>
-      <w:proofErr w:type="spellEnd"/>
-      <w:r>
-        <w:t>” komponente pārvalda ainas un tās pārslēgšanu uz citām ainām un tā ir viena no komponentēm ar vizuālu izvadi, kā arī “</w:t>
-      </w:r>
-      <w:proofErr w:type="spellStart"/>
-      <w:r>
-        <w:t>SettingsWindow</w:t>
-      </w:r>
-      <w:proofErr w:type="spellEnd"/>
-      <w:r>
-        <w:t>” un “</w:t>
-      </w:r>
-      <w:proofErr w:type="spellStart"/>
-      <w:r>
-        <w:t>ExitDialog</w:t>
-      </w:r>
-      <w:proofErr w:type="spellEnd"/>
-      <w:r>
-        <w:t>” komponentes, kuras izvade ir tikai logi ar saviem attiecīgiem uzdevumiem, taču “</w:t>
-      </w:r>
-      <w:proofErr w:type="spellStart"/>
-      <w:r>
-        <w:t>ToastManager</w:t>
-      </w:r>
-      <w:proofErr w:type="spellEnd"/>
-      <w:r>
-        <w:t>” tikai izvada īslaicīgus paziņojumus, kuras pēc noteikta laika izzūd. “</w:t>
-      </w:r>
-      <w:proofErr w:type="spellStart"/>
-      <w:r>
-        <w:t>AudioManager</w:t>
-      </w:r>
-      <w:proofErr w:type="spellEnd"/>
-      <w:r>
-        <w:t>” pārvalda datorspēles galveno, mūzikas un skaņu efektu skaļumu, kā arī iestata fona mūzika katrai ainai.</w:t>
-      </w:r>
-      <w:r>
-        <w:t xml:space="preserve"> Datu, progresu un iestatījumu glabāšanu nodrošina “</w:t>
-      </w:r>
-      <w:proofErr w:type="spellStart"/>
-      <w:r>
-        <w:t>SaveManager</w:t>
-      </w:r>
-      <w:proofErr w:type="spellEnd"/>
-      <w:r>
-        <w:t>”, kura glabā progresa datus, un “</w:t>
-      </w:r>
-      <w:proofErr w:type="spellStart"/>
-      <w:r>
-        <w:t>SettingsManager</w:t>
-      </w:r>
-      <w:proofErr w:type="spellEnd"/>
-      <w:r>
-        <w:t>”, kura glabā un iestata iestatījumus visā spēlē, piemēram, skaļumu.</w:t>
+        <w:t>“SceneManager” komponente pārvalda ainas un tās pārslēgšanu uz citām ainām un tā ir viena no komponentēm ar vizuālu izvadi, kā arī “SettingsWindow” un “ExitDialog” komponentes, kuras izvade ir tikai logi ar saviem attiecīgiem uzdevumiem, taču “ToastManager” tikai izvada īslaicīgus paziņojumus, kuras pēc noteikta laika izzūd. “AudioManager” pārvalda datorspēles galveno, mūzikas un skaņu efektu skaļumu, kā arī iestata fona mūzika katrai ainai.</w:t>
+      </w:r>
+      <w:r>
+        <w:t xml:space="preserve"> Datu, progresu un iestatījumu glabāšanu nodrošina “SaveManager”, kura glabā progresa datus, un “SettingsManager”, kura glabā un iestata iestatījumus visā spēlē, piemēram, skaļumu.</w:t>
       </w:r>
     </w:p>
     <w:p>
@@ -11095,15 +10447,7 @@
     </w:p>
     <w:p>
       <w:r>
-        <w:t>“</w:t>
-      </w:r>
-      <w:proofErr w:type="spellStart"/>
-      <w:r>
-        <w:t>SceneManager</w:t>
-      </w:r>
-      <w:proofErr w:type="spellEnd"/>
-      <w:r>
-        <w:t xml:space="preserve">” komponente pārvalda </w:t>
+        <w:t xml:space="preserve">“SceneManager” komponente pārvalda </w:t>
       </w:r>
       <w:r>
         <w:t>norādīto (skat. 2. attēl</w:t>
@@ -11127,23 +10471,7 @@
         <w:t>)</w:t>
       </w:r>
       <w:r>
-        <w:t xml:space="preserve"> aina ir sākuma izvēlne, kurā spēlētājs var pārslēgt uz līmeņu atlases ainu “</w:t>
-      </w:r>
-      <w:proofErr w:type="spellStart"/>
-      <w:r>
-        <w:t>LevelSelection</w:t>
-      </w:r>
-      <w:proofErr w:type="spellEnd"/>
-      <w:r>
-        <w:t>”, lasīt šī projekta anotāciju, mainīt iestatījumus vai iziet no datorspēles. “</w:t>
-      </w:r>
-      <w:proofErr w:type="spellStart"/>
-      <w:r>
-        <w:t>LevelSelection</w:t>
-      </w:r>
-      <w:proofErr w:type="spellEnd"/>
-      <w:r>
-        <w:t xml:space="preserve">” </w:t>
+        <w:t xml:space="preserve"> aina ir sākuma izvēlne, kurā spēlētājs var pārslēgt uz līmeņu atlases ainu “LevelSelection”, lasīt šī projekta anotāciju, mainīt iestatījumus vai iziet no datorspēles. “LevelSelection” </w:t>
       </w:r>
       <w:r>
         <w:t>(</w:t>
@@ -11158,23 +10486,7 @@
         <w:t>aina norāda līmeņus</w:t>
       </w:r>
       <w:r>
-        <w:t xml:space="preserve">, kuri ir izvietoti kartē ar paveidiem un pieejamības </w:t>
-      </w:r>
-      <w:proofErr w:type="spellStart"/>
-      <w:r>
-        <w:t>stāvolkim</w:t>
-      </w:r>
-      <w:proofErr w:type="spellEnd"/>
-      <w:r>
-        <w:t>. “</w:t>
-      </w:r>
-      <w:proofErr w:type="spellStart"/>
-      <w:r>
-        <w:t>Battle</w:t>
-      </w:r>
-      <w:proofErr w:type="spellEnd"/>
-      <w:r>
-        <w:t>” (Spēles laukums) ain</w:t>
+        <w:t>, kuri ir izvietoti kartē ar paveidiem un pieejamības stāvolkim. “Battle” (Spēles laukums) ain</w:t>
       </w:r>
       <w:r>
         <w:t>ā ir spēle ar līmeņa nosacījumiem, objekti kartes laukumā un norādīti uzdevumi uzvarai</w:t>
@@ -11281,15 +10593,7 @@
     </w:p>
     <w:p>
       <w:r>
-        <w:t>“</w:t>
-      </w:r>
-      <w:proofErr w:type="spellStart"/>
-      <w:r>
-        <w:t>Map</w:t>
-      </w:r>
-      <w:proofErr w:type="spellEnd"/>
-      <w:r>
-        <w:t xml:space="preserve">” (Karte) komponente </w:t>
+        <w:t xml:space="preserve">“Map” (Karte) komponente </w:t>
       </w:r>
       <w:r>
         <w:t xml:space="preserve">(skat. 3. attēlu) </w:t>
@@ -11298,44 +10602,12 @@
         <w:t xml:space="preserve">ir šī projekta galvenā komponente un projekta mērķa pamats. Šajā komponentē ir slāņi, kurā atrodas topogrāfijas dati, objektu dati un dekorācijas, un šie slāņi paši par sevi neveic darbības izņemot uzdotās darbības atkarīgas no ainas. Kartes komponentē arī atrodas </w:t>
       </w:r>
       <w:r>
-        <w:t>pārējās komponentes, kuras izmanto slāņus darbību veikšanai, piemēram, “</w:t>
-      </w:r>
-      <w:proofErr w:type="spellStart"/>
-      <w:r>
-        <w:t>Selector</w:t>
-      </w:r>
-      <w:proofErr w:type="spellEnd"/>
-      <w:r>
-        <w:t>” (atlasītājs) komponente atlasa slāņu komponentes slāņu datus pēc norādītā punkta, “</w:t>
-      </w:r>
-      <w:proofErr w:type="spellStart"/>
-      <w:r>
-        <w:t>Camera</w:t>
-      </w:r>
-      <w:proofErr w:type="spellEnd"/>
-      <w:r>
-        <w:t>” (Kamera) komponente rāda slāņu fragmentus, kurus spēlētājs var mainīt kameras novietojumu, lai redzētu kartes citu fragmentu un “</w:t>
-      </w:r>
-      <w:proofErr w:type="spellStart"/>
-      <w:r>
-        <w:t>Projectiles</w:t>
-      </w:r>
-      <w:proofErr w:type="spellEnd"/>
-      <w:r>
-        <w:t>” (Lādiņi) komponente, kura simulē lādiņu kustību kartē un iegūst datus no slāņu komponentes pēc novietojuma no uguņošanas līdz nolaišanas, kuras aptver objektus un veic tām izmaiņas, piemēram, iznīcināšanu.</w:t>
-      </w:r>
-    </w:p>
-    <w:p>
-      <w:r>
-        <w:t>Slāņu komponentē atrodas slāņi, kuras izkārtojumi ir rūtiņu ailes. “</w:t>
-      </w:r>
-      <w:proofErr w:type="spellStart"/>
-      <w:r>
-        <w:t>Ground</w:t>
-      </w:r>
-      <w:proofErr w:type="spellEnd"/>
-      <w:r>
-        <w:t>” (Zeme) slāni</w:t>
+        <w:t>pārējās komponentes, kuras izmanto slāņus darbību veikšanai, piemēram, “Selector” (atlasītājs) komponente atlasa slāņu komponentes slāņu datus pēc norādītā punkta, “Camera” (Kamera) komponente rāda slāņu fragmentus, kurus spēlētājs var mainīt kameras novietojumu, lai redzētu kartes citu fragmentu un “Projectiles” (Lādiņi) komponente, kura simulē lādiņu kustību kartē un iegūst datus no slāņu komponentes pēc novietojuma no uguņošanas līdz nolaišanas, kuras aptver objektus un veic tām izmaiņas, piemēram, iznīcināšanu.</w:t>
+      </w:r>
+    </w:p>
+    <w:p>
+      <w:r>
+        <w:t>Slāņu komponentē atrodas slāņi, kuras izkārtojumi ir rūtiņu ailes. “Ground” (Zeme) slāni</w:t>
       </w:r>
       <w:r>
         <w:t>s</w:t>
@@ -11344,61 +10616,13 @@
         <w:t xml:space="preserve"> satur topogrāfisko informāciju kā augstumu</w:t>
       </w:r>
       <w:r>
-        <w:t xml:space="preserve"> laukuma punktā un </w:t>
-      </w:r>
-      <w:proofErr w:type="spellStart"/>
-      <w:r>
-        <w:t>pamataugstumu</w:t>
-      </w:r>
-      <w:proofErr w:type="spellEnd"/>
-      <w:r>
-        <w:t>, “</w:t>
-      </w:r>
-      <w:proofErr w:type="spellStart"/>
-      <w:r>
-        <w:t>Decoration</w:t>
-      </w:r>
-      <w:proofErr w:type="spellEnd"/>
-      <w:r>
-        <w:t>” (Dekorācija) slānis ievieto virs “</w:t>
-      </w:r>
-      <w:proofErr w:type="spellStart"/>
-      <w:r>
-        <w:t>Ground</w:t>
-      </w:r>
-      <w:proofErr w:type="spellEnd"/>
-      <w:r>
-        <w:t>” slāņa simbolus un dekoratīvos elementus, “</w:t>
-      </w:r>
-      <w:proofErr w:type="spellStart"/>
-      <w:r>
-        <w:t>Entites</w:t>
-      </w:r>
-      <w:proofErr w:type="spellEnd"/>
-      <w:r>
-        <w:t xml:space="preserve">” (Objekti) slānis satur objektus kā ierīces, mūrus un struktūras, kuras glabā īpašības, piemēram, azimuta leņķis, piederība spēlētājam vai pretiniekam un izturības punkti pirms sabrukšanas (skat. </w:t>
+        <w:t xml:space="preserve"> laukuma punktā un pamataugstumu, “Decoration” (Dekorācija) slānis ievieto virs “Ground” slāņa simbolus un dekoratīvos elementus, “Entites” (Objekti) slānis satur objektus kā ierīces, mūrus un struktūras, kuras glabā īpašības, piemēram, azimuta leņķis, piederība spēlētājam vai pretiniekam un izturības punkti pirms sabrukšanas (skat. </w:t>
       </w:r>
       <w:r>
         <w:t>7</w:t>
       </w:r>
       <w:r>
-        <w:t>. attēlu) un “</w:t>
-      </w:r>
-      <w:proofErr w:type="spellStart"/>
-      <w:r>
-        <w:t>Overlays</w:t>
-      </w:r>
-      <w:proofErr w:type="spellEnd"/>
-      <w:r>
-        <w:t xml:space="preserve">” (Uznirstošie) slānis, kurās izvieto indikatorus un </w:t>
-      </w:r>
-      <w:proofErr w:type="spellStart"/>
-      <w:r>
-        <w:t>aizsegumus</w:t>
-      </w:r>
-      <w:proofErr w:type="spellEnd"/>
-      <w:r>
-        <w:t xml:space="preserve"> kartē. </w:t>
+        <w:t xml:space="preserve">. attēlu) un “Overlays” (Uznirstošie) slānis, kurās izvieto indikatorus un aizsegumus kartē. </w:t>
       </w:r>
     </w:p>
     <w:p>
@@ -11593,26 +10817,10 @@
     </w:p>
     <w:p>
       <w:r>
-        <w:t>Katra aina, kuru parāda “</w:t>
-      </w:r>
-      <w:proofErr w:type="spellStart"/>
-      <w:r>
-        <w:t>SceneManager</w:t>
-      </w:r>
-      <w:proofErr w:type="spellEnd"/>
-      <w:r>
-        <w:t>” komponente, ir klase ar saviem mainīgajiem un  metodēm</w:t>
-      </w:r>
-      <w:r>
-        <w:t>. Ainu metodes var izsaukt komponentes metodes, tvert lietotāja ievadi un veikt darbības ar ievadi un komponentēm, piemēram, tvert peles klikšķi un “</w:t>
-      </w:r>
-      <w:proofErr w:type="spellStart"/>
-      <w:r>
-        <w:t>Map</w:t>
-      </w:r>
-      <w:proofErr w:type="spellEnd"/>
-      <w:r>
-        <w:t>” komponentē iegūt ailes informāciju no peles novietojuma</w:t>
+        <w:t>Katra aina, kuru parāda “SceneManager” komponente, ir klase ar saviem mainīgajiem un  metodēm</w:t>
+      </w:r>
+      <w:r>
+        <w:t>. Ainu metodes var izsaukt komponentes metodes, tvert lietotāja ievadi un veikt darbības ar ievadi un komponentēm, piemēram, tvert peles klikšķi un “Map” komponentē iegūt ailes informāciju no peles novietojuma</w:t>
       </w:r>
       <w:r>
         <w:t xml:space="preserve"> (skat. </w:t>
@@ -11753,39 +10961,7 @@
     </w:p>
     <w:p>
       <w:r>
-        <w:t xml:space="preserve">Kartes komponente arī ir klase, kura iekļauj </w:t>
-      </w:r>
-      <w:proofErr w:type="spellStart"/>
-      <w:r>
-        <w:t>apakškomponentes</w:t>
-      </w:r>
-      <w:proofErr w:type="spellEnd"/>
-      <w:r>
-        <w:t xml:space="preserve"> ar savām metodēm un mainīgajiem. Kartes klases darbības iekļauj ailes datu iegūšanu pēc pozīcijas un laukumu </w:t>
-      </w:r>
-      <w:proofErr w:type="spellStart"/>
-      <w:r>
-        <w:t>ielādi</w:t>
-      </w:r>
-      <w:proofErr w:type="spellEnd"/>
-      <w:r>
-        <w:t xml:space="preserve"> un eksportēšanu. Slāņu komponentes arī iekļauj minētās metodes noteiktam slānim, taču arī slāņa ailēm ir savas metodes un īpašības, piemēram, “</w:t>
-      </w:r>
-      <w:proofErr w:type="spellStart"/>
-      <w:r>
-        <w:t>Ground</w:t>
-      </w:r>
-      <w:proofErr w:type="spellEnd"/>
-      <w:r>
-        <w:t>” slāņa ailei augstums un “</w:t>
-      </w:r>
-      <w:proofErr w:type="spellStart"/>
-      <w:r>
-        <w:t>Entity</w:t>
-      </w:r>
-      <w:proofErr w:type="spellEnd"/>
-      <w:r>
-        <w:t>” slāņa ailes piederība. Pārējām komponentēm savas attiecīgas darbības, kuras ir atkarīgas no slāņu komponentēm</w:t>
+        <w:t>Kartes komponente arī ir klase, kura iekļauj apakškomponentes ar savām metodēm un mainīgajiem. Kartes klases darbības iekļauj ailes datu iegūšanu pēc pozīcijas un laukumu ielādi un eksportēšanu. Slāņu komponentes arī iekļauj minētās metodes noteiktam slānim, taču arī slāņa ailēm ir savas metodes un īpašības, piemēram, “Ground” slāņa ailei augstums un “Entity” slāņa ailes piederība. Pārējām komponentēm savas attiecīgas darbības, kuras ir atkarīgas no slāņu komponentēm</w:t>
       </w:r>
       <w:r>
         <w:t>.</w:t>
@@ -11881,47 +11057,7 @@
       </w:pPr>
       <w:r>
         <w:tab/>
-        <w:t>“</w:t>
-      </w:r>
-      <w:proofErr w:type="spellStart"/>
-      <w:r>
-        <w:t>Entity</w:t>
-      </w:r>
-      <w:proofErr w:type="spellEnd"/>
-      <w:r>
-        <w:t>” (Objekts) klase norāda kartē objektu, kuri var tikt pagriezti, iznīcināti, iestatīt garumus un vairāk īpašību. Šo klasi manto “</w:t>
-      </w:r>
-      <w:proofErr w:type="spellStart"/>
-      <w:r>
-        <w:t>Device</w:t>
-      </w:r>
-      <w:proofErr w:type="spellEnd"/>
-      <w:r>
-        <w:t>” (artilērijas ierīces), “</w:t>
-      </w:r>
-      <w:proofErr w:type="spellStart"/>
-      <w:r>
-        <w:t>Wall</w:t>
-      </w:r>
-      <w:proofErr w:type="spellEnd"/>
-      <w:r>
-        <w:t>” (siena) un “</w:t>
-      </w:r>
-      <w:proofErr w:type="spellStart"/>
-      <w:r>
-        <w:t>Structure</w:t>
-      </w:r>
-      <w:proofErr w:type="spellEnd"/>
-      <w:r>
-        <w:t>” (struktūra) klases ar savām īpašībām, it īpaši “</w:t>
-      </w:r>
-      <w:proofErr w:type="spellStart"/>
-      <w:r>
-        <w:t>Device</w:t>
-      </w:r>
-      <w:proofErr w:type="spellEnd"/>
-      <w:r>
-        <w:t>” klase, jo tā norāda munīciju skaitu, traversu, augstuma leņķi u.t.t.</w:t>
+        <w:t>“Entity” (Objekts) klase norāda kartē objektu, kuri var tikt pagriezti, iznīcināti, iestatīt garumus un vairāk īpašību. Šo klasi manto “Device” (artilērijas ierīces), “Wall” (siena) un “Structure” (struktūra) klases ar savām īpašībām, it īpaši “Device” klase, jo tā norāda munīciju skaitu, traversu, augstuma leņķi u.t.t.</w:t>
       </w:r>
       <w:r>
         <w:t xml:space="preserve"> (skat. 7. attēlu)</w:t>
@@ -11936,23 +11072,7 @@
       </w:pPr>
       <w:r>
         <w:tab/>
-        <w:t>Tās klases pamatīpašības ir azimuts, izturība (“</w:t>
-      </w:r>
-      <w:proofErr w:type="spellStart"/>
-      <w:r>
-        <w:t>integrity</w:t>
-      </w:r>
-      <w:proofErr w:type="spellEnd"/>
-      <w:r>
-        <w:t>”), spēlētāja piederošs, mērķis,  un iznīcināts, kā arī tai klasei un mantotājiem īpašību klase, kura norāda uz resursu, kura norāda tās objekta nemaināmās īpašības, piemēram, ierīcēm kalibrs, struktūrām izturības stadiju gariņi un visām klasēm izturības skala (“</w:t>
-      </w:r>
-      <w:proofErr w:type="spellStart"/>
-      <w:r>
-        <w:t>toughness</w:t>
-      </w:r>
-      <w:proofErr w:type="spellEnd"/>
-      <w:r>
-        <w:t>”), kura mazina objekta izturības mazināšanas faktoru.</w:t>
+        <w:t>Tās klases pamatīpašības ir azimuts, izturība (“integrity”), spēlētāja piederošs, mērķis,  un iznīcināts, kā arī tai klasei un mantotājiem īpašību klase, kura norāda uz resursu, kura norāda tās objekta nemaināmās īpašības, piemēram, ierīcēm kalibrs, struktūrām izturības stadiju gariņi un visām klasēm izturības skala (“toughness”), kura mazina objekta izturības mazināšanas faktoru.</w:t>
       </w:r>
     </w:p>
     <w:p>
@@ -12050,26 +11170,10 @@
         <w:t>L</w:t>
       </w:r>
       <w:r>
-        <w:t>ādiņu laukumā (“</w:t>
-      </w:r>
-      <w:proofErr w:type="spellStart"/>
-      <w:r>
-        <w:t>Projectiles</w:t>
-      </w:r>
-      <w:proofErr w:type="spellEnd"/>
-      <w:r>
-        <w:t xml:space="preserve">”) </w:t>
-      </w:r>
-      <w:r>
-        <w:t xml:space="preserve">lādiņiem ir savas īpašības un metodes, lai pēc iespējas </w:t>
-      </w:r>
-      <w:proofErr w:type="spellStart"/>
-      <w:r>
-        <w:t>attainotu</w:t>
-      </w:r>
-      <w:proofErr w:type="spellEnd"/>
-      <w:r>
-        <w:t xml:space="preserve"> lādiņu ballistiku gaisā</w:t>
+        <w:t xml:space="preserve">ādiņu laukumā (“Projectiles”) </w:t>
+      </w:r>
+      <w:r>
+        <w:t>lādiņiem ir savas īpašības un metodes, lai pēc iespējas attainotu lādiņu ballistiku gaisā</w:t>
       </w:r>
       <w:r>
         <w:t xml:space="preserve"> un objektu iznīcināšanu un bojāšanu nolaišanas uz zemes</w:t>
@@ -12613,15 +11717,7 @@
       <w:bookmarkStart w:id="47" w:name="_Toc230242323"/>
       <w:r>
         <w:lastRenderedPageBreak/>
-        <w:t xml:space="preserve">Kartes un tās </w:t>
-      </w:r>
-      <w:proofErr w:type="spellStart"/>
-      <w:r>
-        <w:t>apakškomponenšu</w:t>
-      </w:r>
-      <w:proofErr w:type="spellEnd"/>
-      <w:r>
-        <w:t xml:space="preserve"> dati</w:t>
+        <w:t>Kartes un tās apakškomponenšu dati</w:t>
       </w:r>
       <w:bookmarkEnd w:id="47"/>
     </w:p>
@@ -12633,15 +11729,7 @@
         <w:t>, piemēram, ailes izmēru, augstumu un sarežģīšanas iespējas</w:t>
       </w:r>
       <w:r>
-        <w:t xml:space="preserve">, kurus izmantos tās visas tās </w:t>
-      </w:r>
-      <w:proofErr w:type="spellStart"/>
-      <w:r>
-        <w:t>apakškomponentes</w:t>
-      </w:r>
-      <w:proofErr w:type="spellEnd"/>
-      <w:r>
-        <w:t>, kuras no dažam var būt savi dati glabāti kartes datos, it īpaši slāņu komponentēm (skat. 1</w:t>
+        <w:t>, kurus izmantos tās visas tās apakškomponentes, kuras no dažam var būt savi dati glabāti kartes datos, it īpaši slāņu komponentēm (skat. 1</w:t>
       </w:r>
       <w:r>
         <w:t>3</w:t>
@@ -12715,15 +11803,7 @@
         <w:pStyle w:val="Parakstszemobjekta"/>
       </w:pPr>
       <w:r>
-        <w:t xml:space="preserve">13. attēls. Kartes un </w:t>
-      </w:r>
-      <w:proofErr w:type="spellStart"/>
-      <w:r>
-        <w:t>apakškomponenšu</w:t>
-      </w:r>
-      <w:proofErr w:type="spellEnd"/>
-      <w:r>
-        <w:t xml:space="preserve"> dati</w:t>
+        <w:t>13. attēls. Kartes un apakškomponenšu dati</w:t>
       </w:r>
     </w:p>
     <w:p>
@@ -12741,15 +11821,7 @@
     </w:p>
     <w:p>
       <w:r>
-        <w:t>Slāņa ”</w:t>
-      </w:r>
-      <w:proofErr w:type="spellStart"/>
-      <w:r>
-        <w:t>Entities</w:t>
-      </w:r>
-      <w:proofErr w:type="spellEnd"/>
-      <w:r>
-        <w:t>” objektiem ir kopīgas nemaināmās īpašības, kurus izmanto paši slāņu objekti un citas klases pieejot tiem (skat. 1</w:t>
+        <w:t>Slāņa ”Entities” objektiem ir kopīgas nemaināmās īpašības, kurus izmanto paši slāņu objekti un citas klases pieejot tiem (skat. 1</w:t>
       </w:r>
       <w:r>
         <w:t>4</w:t>
@@ -12835,15 +11907,7 @@
     </w:p>
     <w:p>
       <w:r>
-        <w:t xml:space="preserve">Šajā sadaļā lietotājam skaidros šīs datorspēles lietojumu un tās </w:t>
-      </w:r>
-      <w:proofErr w:type="spellStart"/>
-      <w:r>
-        <w:t>saskarnes</w:t>
-      </w:r>
-      <w:proofErr w:type="spellEnd"/>
-      <w:r>
-        <w:t xml:space="preserve"> elementus ar ekrānuzņēmumiem un skaidrojošiem rādītājiem.</w:t>
+        <w:t>Šajā sadaļā lietotājam skaidros šīs datorspēles lietojumu un tās saskarnes elementus ar ekrānuzņēmumiem un skaidrojošiem rādītājiem.</w:t>
       </w:r>
     </w:p>
     <w:p>
@@ -12927,7 +11991,7 @@
           <w:noProof/>
         </w:rPr>
         <w:drawing>
-          <wp:inline distT="0" distB="0" distL="0" distR="0" wp14:anchorId="184F5E21" wp14:editId="37FF348F">
+          <wp:inline distT="0" distB="0" distL="0" distR="0" wp14:anchorId="184F5E21" wp14:editId="0F89BE7D">
             <wp:extent cx="4635610" cy="2846070"/>
             <wp:effectExtent l="0" t="0" r="0" b="0"/>
             <wp:docPr id="97138795" name="Picture 5"/>
@@ -13043,15 +12107,7 @@
         <w:t xml:space="preserve"> (4)</w:t>
       </w:r>
       <w:r>
-        <w:t xml:space="preserve">), kā arī zem apraksta </w:t>
-      </w:r>
-      <w:proofErr w:type="spellStart"/>
-      <w:r>
-        <w:t>iespējo</w:t>
-      </w:r>
-      <w:proofErr w:type="spellEnd"/>
-      <w:r>
-        <w:t xml:space="preserve"> vai atspējo pogu.</w:t>
+        <w:t>), kā arī zem apraksta iespējo vai atspējo pogu.</w:t>
       </w:r>
     </w:p>
     <w:p>
@@ -13064,7 +12120,7 @@
           <w:noProof/>
         </w:rPr>
         <w:drawing>
-          <wp:inline distT="0" distB="0" distL="0" distR="0" wp14:anchorId="5289E669" wp14:editId="6DA0418A">
+          <wp:inline distT="0" distB="0" distL="0" distR="0" wp14:anchorId="5289E669" wp14:editId="06E4B894">
             <wp:extent cx="5197221" cy="3190875"/>
             <wp:effectExtent l="0" t="0" r="3810" b="0"/>
             <wp:docPr id="1801011733" name="Picture 5"/>
@@ -13126,7 +12182,7 @@
           <w:noProof/>
         </w:rPr>
         <w:drawing>
-          <wp:inline distT="0" distB="0" distL="0" distR="0" wp14:anchorId="6AF8B356" wp14:editId="7FDA1D3A">
+          <wp:inline distT="0" distB="0" distL="0" distR="0" wp14:anchorId="6AF8B356" wp14:editId="5E6FED05">
             <wp:extent cx="5253990" cy="3225729"/>
             <wp:effectExtent l="0" t="0" r="3810" b="0"/>
             <wp:docPr id="1892648572" name="Picture 5"/>
@@ -13202,15 +12258,7 @@
         <w:t xml:space="preserve">Spēles laukuma ainā atrodas </w:t>
       </w:r>
       <w:r>
-        <w:t xml:space="preserve">vairākas </w:t>
-      </w:r>
-      <w:proofErr w:type="spellStart"/>
-      <w:r>
-        <w:t>saskarnes</w:t>
-      </w:r>
-      <w:proofErr w:type="spellEnd"/>
-      <w:r>
-        <w:t xml:space="preserve"> kontroles, gan visā ainā, gan atsevišķās stadijās. </w:t>
+        <w:t xml:space="preserve">vairākas saskarnes kontroles, gan visā ainā, gan atsevišķās stadijās. </w:t>
       </w:r>
     </w:p>
     <w:p>
@@ -13218,21 +12266,14 @@
         <w:pStyle w:val="Virsraksts3"/>
       </w:pPr>
       <w:bookmarkStart w:id="53" w:name="_Toc230242329"/>
-      <w:proofErr w:type="spellStart"/>
       <w:r>
         <w:t>Virsjosla</w:t>
       </w:r>
       <w:bookmarkEnd w:id="53"/>
-      <w:proofErr w:type="spellEnd"/>
-    </w:p>
-    <w:p>
-      <w:proofErr w:type="spellStart"/>
-      <w:r>
-        <w:t>Virsjoslā</w:t>
-      </w:r>
-      <w:proofErr w:type="spellEnd"/>
-      <w:r>
-        <w:t xml:space="preserve"> </w:t>
+    </w:p>
+    <w:p>
+      <w:r>
+        <w:t xml:space="preserve">Virsjoslā </w:t>
       </w:r>
       <w:r>
         <w:t xml:space="preserve">(skat. 16. attēlu) </w:t>
@@ -13268,13 +12309,8 @@
         <w:t xml:space="preserve"> (4)</w:t>
       </w:r>
       <w:r>
-        <w:t xml:space="preserve">, </w:t>
-      </w:r>
-      <w:proofErr w:type="spellStart"/>
-      <w:r>
-        <w:t>pamataugstums</w:t>
-      </w:r>
-      <w:proofErr w:type="spellEnd"/>
+        <w:t>, pamataugstums</w:t>
+      </w:r>
       <w:r>
         <w:t xml:space="preserve"> (5)</w:t>
       </w:r>
@@ -13319,7 +12355,7 @@
           <w:noProof/>
         </w:rPr>
         <w:drawing>
-          <wp:inline distT="0" distB="0" distL="0" distR="0" wp14:anchorId="7D3C05DD" wp14:editId="1E42B302">
+          <wp:inline distT="0" distB="0" distL="0" distR="0" wp14:anchorId="7D3C05DD" wp14:editId="1D9B0087">
             <wp:extent cx="6151880" cy="820420"/>
             <wp:effectExtent l="0" t="0" r="0" b="0"/>
             <wp:docPr id="1192359658" name="Attēls 1"/>
@@ -13372,7 +12408,7 @@
           <w:noProof/>
         </w:rPr>
         <w:drawing>
-          <wp:inline distT="0" distB="0" distL="0" distR="0" wp14:anchorId="6CFFB280" wp14:editId="65F25F66">
+          <wp:inline distT="0" distB="0" distL="0" distR="0" wp14:anchorId="6CFFB280" wp14:editId="7CA9EAA0">
             <wp:extent cx="6123214" cy="1428750"/>
             <wp:effectExtent l="0" t="0" r="0" b="0"/>
             <wp:docPr id="1604049363" name="Attēls 1"/>
@@ -13536,7 +12572,7 @@
           <w:noProof/>
         </w:rPr>
         <w:drawing>
-          <wp:inline distT="0" distB="0" distL="0" distR="0" wp14:anchorId="0CB2110C" wp14:editId="142B8DFA">
+          <wp:inline distT="0" distB="0" distL="0" distR="0" wp14:anchorId="0CB2110C" wp14:editId="6C61BD59">
             <wp:extent cx="5202313" cy="3194002"/>
             <wp:effectExtent l="0" t="0" r="0" b="6985"/>
             <wp:docPr id="78287740" name="Picture 5"/>
@@ -13779,15 +12815,7 @@
         <w:t xml:space="preserve"> Koriģēšanas logā arī norāda atlikušo lādiņu skaitu </w:t>
       </w:r>
       <w:r>
-        <w:t xml:space="preserve">vai atlikušās kārtas pirms </w:t>
-      </w:r>
-      <w:proofErr w:type="spellStart"/>
-      <w:r>
-        <w:t>pārlādes</w:t>
-      </w:r>
-      <w:proofErr w:type="spellEnd"/>
-      <w:r>
-        <w:t>.</w:t>
+        <w:t>vai atlikušās kārtas pirms pārlādes.</w:t>
       </w:r>
     </w:p>
     <w:p>
@@ -14025,7 +13053,7 @@
           <w:noProof/>
         </w:rPr>
         <w:drawing>
-          <wp:inline distT="0" distB="0" distL="0" distR="0" wp14:anchorId="183636F5" wp14:editId="74F272D0">
+          <wp:inline distT="0" distB="0" distL="0" distR="0" wp14:anchorId="183636F5" wp14:editId="33EED4AD">
             <wp:extent cx="6143625" cy="3486150"/>
             <wp:effectExtent l="0" t="0" r="0" b="0"/>
             <wp:docPr id="428480901" name="Attēls 5"/>
@@ -14576,7 +13604,7 @@
           <w:noProof/>
         </w:rPr>
         <w:drawing>
-          <wp:inline distT="0" distB="0" distL="0" distR="0" wp14:anchorId="5756904A" wp14:editId="6F56EDEC">
+          <wp:inline distT="0" distB="0" distL="0" distR="0" wp14:anchorId="5756904A" wp14:editId="4397DC65">
             <wp:extent cx="6143066" cy="3147695"/>
             <wp:effectExtent l="0" t="0" r="0" b="0"/>
             <wp:docPr id="772840116" name="Attēls 5"/>
@@ -14910,7 +13938,7 @@
           <w:noProof/>
         </w:rPr>
         <w:drawing>
-          <wp:inline distT="0" distB="0" distL="0" distR="0" wp14:anchorId="2800BEDB" wp14:editId="526B0977">
+          <wp:inline distT="0" distB="0" distL="0" distR="0" wp14:anchorId="2800BEDB" wp14:editId="297D3646">
             <wp:extent cx="6143625" cy="3486150"/>
             <wp:effectExtent l="0" t="0" r="9525" b="0"/>
             <wp:docPr id="7237126" name="Attēls 7"/>
@@ -14999,37 +14027,13 @@
     </w:p>
     <w:p>
       <w:r>
-        <w:t xml:space="preserve">Izstrādes laikā projektu jātestē un jāpārbauda funkcionalitātes pēc nepilnībām. Testēšana tiks veikta manuāli ar melnās un baltās kastes metodoloģijām, taču atsevišķas funkcionalitātes vai tās daļas testēšanu var veikt automātiski ar </w:t>
-      </w:r>
-      <w:proofErr w:type="spellStart"/>
-      <w:r>
-        <w:t>vienībtestēšanu</w:t>
-      </w:r>
-      <w:proofErr w:type="spellEnd"/>
-      <w:r>
-        <w:t>.</w:t>
+        <w:t>Izstrādes laikā projektu jātestē un jāpārbauda funkcionalitātes pēc nepilnībām. Testēšana tiks veikta manuāli ar melnās un baltās kastes metodoloģijām, taču atsevišķas funkcionalitātes vai tās daļas testēšanu var veikt automātiski ar vienībtestēšanu.</w:t>
       </w:r>
       <w:r>
         <w:t xml:space="preserve"> </w:t>
       </w:r>
       <w:r>
-        <w:t xml:space="preserve">Melnās kastes testēšana ietver pārbaudi no lietotāja skatupunkta, neredzot </w:t>
-      </w:r>
-      <w:proofErr w:type="spellStart"/>
-      <w:r>
-        <w:t>avotkodu</w:t>
-      </w:r>
-      <w:proofErr w:type="spellEnd"/>
-      <w:r>
-        <w:t xml:space="preserve"> vai atkļūdošanas informāciju, kamēr baltās kastes testēšana pārbauda </w:t>
-      </w:r>
-      <w:proofErr w:type="spellStart"/>
-      <w:r>
-        <w:t>avotkodu</w:t>
-      </w:r>
-      <w:proofErr w:type="spellEnd"/>
-      <w:r>
-        <w:t>.</w:t>
+        <w:t>Melnās kastes testēšana ietver pārbaudi no lietotāja skatupunkta, neredzot avotkodu vai atkļūdošanas informāciju, kamēr baltās kastes testēšana pārbauda avotkodu.</w:t>
       </w:r>
     </w:p>
     <w:p>
@@ -16230,7 +15234,7 @@
               <w:pStyle w:val="talbecontent"/>
             </w:pPr>
             <w:r>
-              <w:t>TP.SK.5</w:t>
+              <w:t>Lietotājs tiek pārvirzīts uz līmeņu atlases ainu</w:t>
             </w:r>
           </w:p>
         </w:tc>
@@ -16243,7 +15247,7 @@
               <w:pStyle w:val="talbecontent"/>
             </w:pPr>
             <w:r>
-              <w:t>Lietotājs tiek pārvirzīts uz līmeņu atlases ainu</w:t>
+              <w:t>Pārvirze uz līmeņu atlases ainu</w:t>
             </w:r>
           </w:p>
         </w:tc>
@@ -16256,7 +15260,7 @@
               <w:pStyle w:val="talbecontent"/>
             </w:pPr>
             <w:r>
-              <w:t>Pārvirze uz līmeņu atlases ainu</w:t>
+              <w:t>Lietotājs nospiež sākšanas pogu.</w:t>
             </w:r>
           </w:p>
         </w:tc>
@@ -16269,7 +15273,7 @@
               <w:pStyle w:val="talbecontent"/>
             </w:pPr>
             <w:r>
-              <w:t>Lietotājs nospiež sākšanas pogu.</w:t>
+              <w:t>Sākšanas poga</w:t>
             </w:r>
           </w:p>
         </w:tc>
@@ -16282,7 +15286,7 @@
               <w:pStyle w:val="talbecontent"/>
             </w:pPr>
             <w:r>
-              <w:t>Sākšanas poga</w:t>
+              <w:t>Lietotājam ir redzams līmeņa atlases aina bez klupēm</w:t>
             </w:r>
           </w:p>
         </w:tc>
@@ -16295,7 +15299,10 @@
               <w:pStyle w:val="talbecontent"/>
             </w:pPr>
             <w:r>
-              <w:t>Lietotājam ir redzams līmeņa atlases aina bez klupēm</w:t>
+              <w:t>PR.SK.</w:t>
+            </w:r>
+            <w:r>
+              <w:t>7</w:t>
             </w:r>
           </w:p>
         </w:tc>
@@ -16349,13 +15356,8 @@
               <w:pStyle w:val="talbecontent"/>
             </w:pPr>
             <w:r>
-              <w:t xml:space="preserve">Lietotājs gaida līdz </w:t>
-            </w:r>
-            <w:proofErr w:type="spellStart"/>
-            <w:r>
-              <w:t>ielādei</w:t>
-            </w:r>
-            <w:proofErr w:type="spellEnd"/>
+              <w:t>Lietotājs gaida līdz ielādei</w:t>
+            </w:r>
           </w:p>
         </w:tc>
         <w:tc>
@@ -16792,6 +15794,12 @@
             <w:pPr>
               <w:pStyle w:val="talbecontent"/>
             </w:pPr>
+            <w:r>
+              <w:t xml:space="preserve">Pārvirze </w:t>
+            </w:r>
+            <w:r>
+              <w:t>uz spēles laukuma ainu</w:t>
+            </w:r>
           </w:p>
         </w:tc>
         <w:tc>
@@ -16870,6 +15878,9 @@
             <w:pPr>
               <w:pStyle w:val="talbecontent"/>
             </w:pPr>
+            <w:r>
+              <w:t>Pauzes logs tiek atvērts</w:t>
+            </w:r>
           </w:p>
         </w:tc>
         <w:tc>
@@ -16936,6 +15947,7 @@
               <w:pStyle w:val="talbecontent"/>
             </w:pPr>
             <w:r>
+              <w:lastRenderedPageBreak/>
               <w:t>TP.SL.15</w:t>
             </w:r>
           </w:p>
@@ -16948,6 +15960,12 @@
             <w:pPr>
               <w:pStyle w:val="talbecontent"/>
             </w:pPr>
+            <w:r>
+              <w:t xml:space="preserve">Pauzes logs tiek </w:t>
+            </w:r>
+            <w:r>
+              <w:t>aizvērts</w:t>
+            </w:r>
           </w:p>
         </w:tc>
         <w:tc>
@@ -17026,6 +16044,12 @@
             <w:pPr>
               <w:pStyle w:val="talbecontent"/>
             </w:pPr>
+            <w:r>
+              <w:t xml:space="preserve">Spēles </w:t>
+            </w:r>
+            <w:r>
+              <w:t>laukums tiek atiestatīts pēc pieprasījuma</w:t>
+            </w:r>
           </w:p>
         </w:tc>
         <w:tc>
@@ -17092,7 +16116,7 @@
               <w:pStyle w:val="talbecontent"/>
             </w:pPr>
             <w:r>
-              <w:t>TP.SL.17</w:t>
+              <w:t>TP.SL.19</w:t>
             </w:r>
           </w:p>
         </w:tc>
@@ -17104,6 +16128,9 @@
             <w:pPr>
               <w:pStyle w:val="talbecontent"/>
             </w:pPr>
+            <w:r>
+              <w:t>Pārvirze uz līmeņa atlases ainu.</w:t>
+            </w:r>
           </w:p>
         </w:tc>
         <w:tc>
@@ -17114,6 +16141,9 @@
             <w:pPr>
               <w:pStyle w:val="talbecontent"/>
             </w:pPr>
+            <w:r>
+              <w:t>Pārvirze uz līmeņa atlases ainu</w:t>
+            </w:r>
           </w:p>
         </w:tc>
         <w:tc>
@@ -17124,6 +16154,9 @@
             <w:pPr>
               <w:pStyle w:val="talbecontent"/>
             </w:pPr>
+            <w:r>
+              <w:t>Lietotājs nospiež atgriešanas pogu</w:t>
+            </w:r>
           </w:p>
         </w:tc>
         <w:tc>
@@ -17134,6 +16167,9 @@
             <w:pPr>
               <w:pStyle w:val="talbecontent"/>
             </w:pPr>
+            <w:r>
+              <w:t>Atgriešanas poga</w:t>
+            </w:r>
           </w:p>
         </w:tc>
         <w:tc>
@@ -17144,6 +16180,9 @@
             <w:pPr>
               <w:pStyle w:val="talbecontent"/>
             </w:pPr>
+            <w:r>
+              <w:t>Lietotājs tiek pārvirzīts uz līmeņa atlases ainu</w:t>
+            </w:r>
           </w:p>
         </w:tc>
         <w:tc>
@@ -17155,7 +16194,7 @@
               <w:pStyle w:val="talbecontent"/>
             </w:pPr>
             <w:r>
-              <w:t>PR.SL.17</w:t>
+              <w:t>PR.SL.19</w:t>
             </w:r>
           </w:p>
         </w:tc>
@@ -17170,8 +16209,7 @@
               <w:pStyle w:val="talbecontent"/>
             </w:pPr>
             <w:r>
-              <w:lastRenderedPageBreak/>
-              <w:t>TP.SL.18</w:t>
+              <w:t>TP.SL.20</w:t>
             </w:r>
           </w:p>
         </w:tc>
@@ -17183,6 +16221,9 @@
             <w:pPr>
               <w:pStyle w:val="talbecontent"/>
             </w:pPr>
+            <w:r>
+              <w:t>Ievietošanai piedāvātā ierīce tiek atlasīta</w:t>
+            </w:r>
           </w:p>
         </w:tc>
         <w:tc>
@@ -17234,7 +16275,10 @@
               <w:pStyle w:val="talbecontent"/>
             </w:pPr>
             <w:r>
-              <w:t>PR.SL.18</w:t>
+              <w:t>PR.SL.2</w:t>
+            </w:r>
+            <w:r>
+              <w:t>1</w:t>
             </w:r>
           </w:p>
         </w:tc>
@@ -17249,7 +16293,7 @@
               <w:pStyle w:val="talbecontent"/>
             </w:pPr>
             <w:r>
-              <w:t>TP.SL.19</w:t>
+              <w:t>TP.SL.21</w:t>
             </w:r>
           </w:p>
         </w:tc>
@@ -17262,7 +16306,10 @@
               <w:pStyle w:val="talbecontent"/>
             </w:pPr>
             <w:r>
-              <w:t>Pārvirze uz līmeņa atlases ainu.</w:t>
+              <w:t>Spēlētāja i</w:t>
+            </w:r>
+            <w:r>
+              <w:t>erīce ievietota zem indikatora pēc peles nospiešanas</w:t>
             </w:r>
           </w:p>
         </w:tc>
@@ -17274,9 +16321,6 @@
             <w:pPr>
               <w:pStyle w:val="talbecontent"/>
             </w:pPr>
-            <w:r>
-              <w:t>Pārvirze uz līmeņa atlases ainu</w:t>
-            </w:r>
           </w:p>
         </w:tc>
         <w:tc>
@@ -17287,9 +16331,6 @@
             <w:pPr>
               <w:pStyle w:val="talbecontent"/>
             </w:pPr>
-            <w:r>
-              <w:t>Lietotājs nospiež atgriešanas pogu</w:t>
-            </w:r>
           </w:p>
         </w:tc>
         <w:tc>
@@ -17300,9 +16341,6 @@
             <w:pPr>
               <w:pStyle w:val="talbecontent"/>
             </w:pPr>
-            <w:r>
-              <w:t>Atgriešanas poga</w:t>
-            </w:r>
           </w:p>
         </w:tc>
         <w:tc>
@@ -17313,9 +16351,6 @@
             <w:pPr>
               <w:pStyle w:val="talbecontent"/>
             </w:pPr>
-            <w:r>
-              <w:t>Lietotājs tiek pārvirzīts uz līmeņa atlases ainu</w:t>
-            </w:r>
           </w:p>
         </w:tc>
         <w:tc>
@@ -17327,7 +16362,10 @@
               <w:pStyle w:val="talbecontent"/>
             </w:pPr>
             <w:r>
-              <w:t>PR.SL.19</w:t>
+              <w:t>PR.SL.2</w:t>
+            </w:r>
+            <w:r>
+              <w:t>2</w:t>
             </w:r>
           </w:p>
         </w:tc>
@@ -17342,7 +16380,7 @@
               <w:pStyle w:val="talbecontent"/>
             </w:pPr>
             <w:r>
-              <w:t>TP.SL.20</w:t>
+              <w:t>TP.SL.22</w:t>
             </w:r>
           </w:p>
         </w:tc>
@@ -17354,6 +16392,12 @@
             <w:pPr>
               <w:pStyle w:val="talbecontent"/>
             </w:pPr>
+            <w:r>
+              <w:t>Spēlētāja i</w:t>
+            </w:r>
+            <w:r>
+              <w:t>erīce noņemta zem indikatora pēc peles nospiešanas</w:t>
+            </w:r>
           </w:p>
         </w:tc>
         <w:tc>
@@ -17405,7 +16449,10 @@
               <w:pStyle w:val="talbecontent"/>
             </w:pPr>
             <w:r>
-              <w:t>PR.SL.20</w:t>
+              <w:t>PR.SL.2</w:t>
+            </w:r>
+            <w:r>
+              <w:t>3</w:t>
             </w:r>
           </w:p>
         </w:tc>
@@ -17420,7 +16467,7 @@
               <w:pStyle w:val="talbecontent"/>
             </w:pPr>
             <w:r>
-              <w:t>TP.SL.21</w:t>
+              <w:t>TP.SL.23</w:t>
             </w:r>
           </w:p>
         </w:tc>
@@ -17432,6 +16479,9 @@
             <w:pPr>
               <w:pStyle w:val="talbecontent"/>
             </w:pPr>
+            <w:r>
+              <w:t>Pārvirze uz ierīču koriģēšanas stadiju pēc ierīču ievietošanas</w:t>
+            </w:r>
           </w:p>
         </w:tc>
         <w:tc>
@@ -17483,7 +16533,10 @@
               <w:pStyle w:val="talbecontent"/>
             </w:pPr>
             <w:r>
-              <w:t>PR.SL.21</w:t>
+              <w:t>PR.SL.2</w:t>
+            </w:r>
+            <w:r>
+              <w:t>4</w:t>
             </w:r>
           </w:p>
         </w:tc>
@@ -17498,7 +16551,7 @@
               <w:pStyle w:val="talbecontent"/>
             </w:pPr>
             <w:r>
-              <w:t>TP.SL.22</w:t>
+              <w:t>TP.SL.24</w:t>
             </w:r>
           </w:p>
         </w:tc>
@@ -17510,6 +16563,15 @@
             <w:pPr>
               <w:pStyle w:val="talbecontent"/>
             </w:pPr>
+            <w:r>
+              <w:t xml:space="preserve">Spēlētāja ierīces atlasīšana pēc peles nospiešanas uz </w:t>
+            </w:r>
+            <w:r>
+              <w:t xml:space="preserve">piedāvātās </w:t>
+            </w:r>
+            <w:r>
+              <w:t>ierīces</w:t>
+            </w:r>
           </w:p>
         </w:tc>
         <w:tc>
@@ -17561,7 +16623,10 @@
               <w:pStyle w:val="talbecontent"/>
             </w:pPr>
             <w:r>
-              <w:t>PR.SL.22</w:t>
+              <w:t>PR.SL.2</w:t>
+            </w:r>
+            <w:r>
+              <w:t>5</w:t>
             </w:r>
           </w:p>
         </w:tc>
@@ -17576,7 +16641,8 @@
               <w:pStyle w:val="talbecontent"/>
             </w:pPr>
             <w:r>
-              <w:t>TP.SL.23</w:t>
+              <w:lastRenderedPageBreak/>
+              <w:t>TP.SL.25</w:t>
             </w:r>
           </w:p>
         </w:tc>
@@ -17588,6 +16654,18 @@
             <w:pPr>
               <w:pStyle w:val="talbecontent"/>
             </w:pPr>
+            <w:r>
+              <w:t>Spēlētāja ierīces atlas</w:t>
+            </w:r>
+            <w:r>
+              <w:t>es noņemšana</w:t>
+            </w:r>
+            <w:r>
+              <w:t xml:space="preserve"> pēc peles nospiešanas uz ierīces</w:t>
+            </w:r>
+            <w:r>
+              <w:t xml:space="preserve"> vai citā ailē</w:t>
+            </w:r>
           </w:p>
         </w:tc>
         <w:tc>
@@ -17639,7 +16717,10 @@
               <w:pStyle w:val="talbecontent"/>
             </w:pPr>
             <w:r>
-              <w:t>PR.SL.23</w:t>
+              <w:t>PR.SL.2</w:t>
+            </w:r>
+            <w:r>
+              <w:t>6</w:t>
             </w:r>
           </w:p>
         </w:tc>
@@ -17654,7 +16735,7 @@
               <w:pStyle w:val="talbecontent"/>
             </w:pPr>
             <w:r>
-              <w:t>TP.SL.24</w:t>
+              <w:t>TP.SL.26</w:t>
             </w:r>
           </w:p>
         </w:tc>
@@ -17666,6 +16747,9 @@
             <w:pPr>
               <w:pStyle w:val="talbecontent"/>
             </w:pPr>
+            <w:r>
+              <w:t>Atlasītās ierīces azimuta iestatīšana pēc atlases</w:t>
+            </w:r>
           </w:p>
         </w:tc>
         <w:tc>
@@ -17717,7 +16801,10 @@
               <w:pStyle w:val="talbecontent"/>
             </w:pPr>
             <w:r>
-              <w:t>PR.SL.24</w:t>
+              <w:t>PR.SL.2</w:t>
+            </w:r>
+            <w:r>
+              <w:t>7</w:t>
             </w:r>
           </w:p>
         </w:tc>
@@ -17732,7 +16819,7 @@
               <w:pStyle w:val="talbecontent"/>
             </w:pPr>
             <w:r>
-              <w:t>TP.SL.25</w:t>
+              <w:t>TP.SL.27</w:t>
             </w:r>
           </w:p>
         </w:tc>
@@ -17744,6 +16831,15 @@
             <w:pPr>
               <w:pStyle w:val="talbecontent"/>
             </w:pPr>
+            <w:r>
+              <w:t xml:space="preserve">Atlasītās ierīces </w:t>
+            </w:r>
+            <w:r>
+              <w:t>traversa</w:t>
+            </w:r>
+            <w:r>
+              <w:t xml:space="preserve"> iestatīšana pēc atlases</w:t>
+            </w:r>
           </w:p>
         </w:tc>
         <w:tc>
@@ -17795,7 +16891,10 @@
               <w:pStyle w:val="talbecontent"/>
             </w:pPr>
             <w:r>
-              <w:t>PR.SL.25</w:t>
+              <w:t>PR.SL.2</w:t>
+            </w:r>
+            <w:r>
+              <w:t>8</w:t>
             </w:r>
           </w:p>
         </w:tc>
@@ -17810,7 +16909,7 @@
               <w:pStyle w:val="talbecontent"/>
             </w:pPr>
             <w:r>
-              <w:t>TP.SL.26</w:t>
+              <w:t>TP.SL.28</w:t>
             </w:r>
           </w:p>
         </w:tc>
@@ -17822,6 +16921,15 @@
             <w:pPr>
               <w:pStyle w:val="talbecontent"/>
             </w:pPr>
+            <w:r>
+              <w:t xml:space="preserve">Atlasītās ierīces </w:t>
+            </w:r>
+            <w:r>
+              <w:t>augstuma leņķa</w:t>
+            </w:r>
+            <w:r>
+              <w:t xml:space="preserve"> iestatīšana pēc atlases</w:t>
+            </w:r>
           </w:p>
         </w:tc>
         <w:tc>
@@ -17873,7 +16981,10 @@
               <w:pStyle w:val="talbecontent"/>
             </w:pPr>
             <w:r>
-              <w:t>PR.SL.26</w:t>
+              <w:t>PR.SL.2</w:t>
+            </w:r>
+            <w:r>
+              <w:t>9</w:t>
             </w:r>
           </w:p>
         </w:tc>
@@ -17888,7 +16999,7 @@
               <w:pStyle w:val="talbecontent"/>
             </w:pPr>
             <w:r>
-              <w:t>TP.SL.27</w:t>
+              <w:t>TP.SL.29</w:t>
             </w:r>
           </w:p>
         </w:tc>
@@ -17900,6 +17011,15 @@
             <w:pPr>
               <w:pStyle w:val="talbecontent"/>
             </w:pPr>
+            <w:r>
+              <w:t xml:space="preserve">Atlasītās ierīces </w:t>
+            </w:r>
+            <w:r>
+              <w:t>šaušanas reizes</w:t>
+            </w:r>
+            <w:r>
+              <w:t xml:space="preserve"> iestatīšana pēc atlases</w:t>
+            </w:r>
           </w:p>
         </w:tc>
         <w:tc>
@@ -17951,7 +17071,10 @@
               <w:pStyle w:val="talbecontent"/>
             </w:pPr>
             <w:r>
-              <w:t>PR.SL.27</w:t>
+              <w:t>PR.SL.</w:t>
+            </w:r>
+            <w:r>
+              <w:t>30</w:t>
             </w:r>
           </w:p>
         </w:tc>
@@ -17966,7 +17089,7 @@
               <w:pStyle w:val="talbecontent"/>
             </w:pPr>
             <w:r>
-              <w:t>TP.SL.28</w:t>
+              <w:t>TP.SL.30</w:t>
             </w:r>
           </w:p>
         </w:tc>
@@ -17978,6 +17101,9 @@
             <w:pPr>
               <w:pStyle w:val="talbecontent"/>
             </w:pPr>
+            <w:r>
+              <w:t>Pārvirze uz uguņošanu</w:t>
+            </w:r>
           </w:p>
         </w:tc>
         <w:tc>
@@ -18029,7 +17155,10 @@
               <w:pStyle w:val="talbecontent"/>
             </w:pPr>
             <w:r>
-              <w:t>PR.SL.28</w:t>
+              <w:t>PR.SL.3</w:t>
+            </w:r>
+            <w:r>
+              <w:t>1</w:t>
             </w:r>
           </w:p>
         </w:tc>
@@ -18044,7 +17173,7 @@
               <w:pStyle w:val="talbecontent"/>
             </w:pPr>
             <w:r>
-              <w:t>TP.SL.29</w:t>
+              <w:t>TP.SL.31</w:t>
             </w:r>
           </w:p>
         </w:tc>
@@ -18056,6 +17185,9 @@
             <w:pPr>
               <w:pStyle w:val="talbecontent"/>
             </w:pPr>
+            <w:r>
+              <w:t>Izlūku izsaukšanas logs aizsegtu laukumu kartē dēļ.</w:t>
+            </w:r>
           </w:p>
         </w:tc>
         <w:tc>
@@ -18107,7 +17239,10 @@
               <w:pStyle w:val="talbecontent"/>
             </w:pPr>
             <w:r>
-              <w:t>PR.SL.29</w:t>
+              <w:t>PR.SL.3</w:t>
+            </w:r>
+            <w:r>
+              <w:t>2</w:t>
             </w:r>
           </w:p>
         </w:tc>
@@ -18122,7 +17257,7 @@
               <w:pStyle w:val="talbecontent"/>
             </w:pPr>
             <w:r>
-              <w:t>TP.SL.30</w:t>
+              <w:t>TP.SL.32</w:t>
             </w:r>
           </w:p>
         </w:tc>
@@ -18134,6 +17269,9 @@
             <w:pPr>
               <w:pStyle w:val="talbecontent"/>
             </w:pPr>
+            <w:r>
+              <w:t>Izlūku izsaukšana un pēc nejaušības aizsegtu laukumu noņemšana un pārvirze uz kādu stadiju.</w:t>
+            </w:r>
           </w:p>
         </w:tc>
         <w:tc>
@@ -18185,7 +17323,20 @@
               <w:pStyle w:val="talbecontent"/>
             </w:pPr>
             <w:r>
-              <w:t>PR.SL.30</w:t>
+              <w:t>PR.SL.3</w:t>
+            </w:r>
+            <w:r>
+              <w:t>3</w:t>
+            </w:r>
+          </w:p>
+          <w:p>
+            <w:pPr>
+              <w:tabs>
+                <w:tab w:val="left" w:pos="1291"/>
+              </w:tabs>
+            </w:pPr>
+            <w:r>
+              <w:tab/>
             </w:r>
           </w:p>
         </w:tc>
@@ -18200,7 +17351,8 @@
               <w:pStyle w:val="talbecontent"/>
             </w:pPr>
             <w:r>
-              <w:t>TP.SL.31</w:t>
+              <w:lastRenderedPageBreak/>
+              <w:t>TP.SL.33</w:t>
             </w:r>
           </w:p>
         </w:tc>
@@ -18212,6 +17364,15 @@
             <w:pPr>
               <w:pStyle w:val="talbecontent"/>
             </w:pPr>
+            <w:r>
+              <w:t xml:space="preserve">Pēc izlūku izsaukšanas </w:t>
+            </w:r>
+            <w:r>
+              <w:t>aizsegtie laukumi tiek noņemti un notiek pārvirze uz ierīču koriģēšanas stadiju</w:t>
+            </w:r>
+            <w:r>
+              <w:t xml:space="preserve"> (P = 0.33)</w:t>
+            </w:r>
           </w:p>
         </w:tc>
         <w:tc>
@@ -18263,7 +17424,15 @@
               <w:pStyle w:val="talbecontent"/>
             </w:pPr>
             <w:r>
-              <w:t>PR.SL.31</w:t>
+              <w:t>PR.SL.33</w:t>
+            </w:r>
+          </w:p>
+          <w:p>
+            <w:pPr>
+              <w:pStyle w:val="talbecontent"/>
+            </w:pPr>
+            <w:r>
+              <w:tab/>
             </w:r>
           </w:p>
         </w:tc>
@@ -18278,7 +17447,10 @@
               <w:pStyle w:val="talbecontent"/>
             </w:pPr>
             <w:r>
-              <w:t>TP.SL.32</w:t>
+              <w:t>TP.SL.3</w:t>
+            </w:r>
+            <w:r>
+              <w:t>4</w:t>
             </w:r>
           </w:p>
         </w:tc>
@@ -18290,6 +17462,15 @@
             <w:pPr>
               <w:pStyle w:val="talbecontent"/>
             </w:pPr>
+            <w:r>
+              <w:t xml:space="preserve">Pēc izlūku izsaukšanas aizsegtie laukumi tiek noņemti un notiek pārvirze uz </w:t>
+            </w:r>
+            <w:r>
+              <w:t xml:space="preserve">uguņošanas </w:t>
+            </w:r>
+            <w:r>
+              <w:t>stadiju (P = 0.33)</w:t>
+            </w:r>
           </w:p>
         </w:tc>
         <w:tc>
@@ -18341,8 +17522,13 @@
               <w:pStyle w:val="talbecontent"/>
             </w:pPr>
             <w:r>
-              <w:t>PR.SL.32</w:t>
-            </w:r>
+              <w:t>PR.SL.33</w:t>
+            </w:r>
+          </w:p>
+          <w:p>
+            <w:pPr>
+              <w:pStyle w:val="talbecontent"/>
+            </w:pPr>
           </w:p>
         </w:tc>
       </w:tr>
@@ -18356,7 +17542,10 @@
               <w:pStyle w:val="talbecontent"/>
             </w:pPr>
             <w:r>
-              <w:t>TP.SL.33</w:t>
+              <w:t>TP.SL.3</w:t>
+            </w:r>
+            <w:r>
+              <w:t>5</w:t>
             </w:r>
           </w:p>
         </w:tc>
@@ -18368,6 +17557,21 @@
             <w:pPr>
               <w:pStyle w:val="talbecontent"/>
             </w:pPr>
+            <w:r>
+              <w:t>Pēc izlūku izsaukšanas aizsegtie laukumi tiek noņemti un notiek pārvirze uz uguņošanas stadiju</w:t>
+            </w:r>
+            <w:r>
+              <w:t>, kurā pretinieks šauj pirmais</w:t>
+            </w:r>
+            <w:r>
+              <w:t xml:space="preserve"> (P = 0.</w:t>
+            </w:r>
+            <w:r>
+              <w:t>166</w:t>
+            </w:r>
+            <w:r>
+              <w:t>)</w:t>
+            </w:r>
           </w:p>
         </w:tc>
         <w:tc>
@@ -18421,6 +17625,11 @@
             <w:r>
               <w:t>PR.SL.33</w:t>
             </w:r>
+          </w:p>
+          <w:p>
+            <w:pPr>
+              <w:pStyle w:val="talbecontent"/>
+            </w:pPr>
           </w:p>
         </w:tc>
       </w:tr>
@@ -18434,7 +17643,10 @@
               <w:pStyle w:val="talbecontent"/>
             </w:pPr>
             <w:r>
-              <w:t>TP.SL.34</w:t>
+              <w:t>TP.SL.3</w:t>
+            </w:r>
+            <w:r>
+              <w:t>6</w:t>
             </w:r>
           </w:p>
         </w:tc>
@@ -18446,6 +17658,15 @@
             <w:pPr>
               <w:pStyle w:val="talbecontent"/>
             </w:pPr>
+            <w:r>
+              <w:t xml:space="preserve">Pēc izlūku izsaukšanas aizsegtie laukumi tiek noņemti un notiek pārvirze uz </w:t>
+            </w:r>
+            <w:r>
+              <w:t>koriģēšanas stadiju bez pretinieka ierīcēm</w:t>
+            </w:r>
+            <w:r>
+              <w:t xml:space="preserve"> (P = 0.166)</w:t>
+            </w:r>
           </w:p>
         </w:tc>
         <w:tc>
@@ -18497,8 +17718,13 @@
               <w:pStyle w:val="talbecontent"/>
             </w:pPr>
             <w:r>
-              <w:t>PR.SL.34</w:t>
-            </w:r>
+              <w:t>PR.SL.33</w:t>
+            </w:r>
+          </w:p>
+          <w:p>
+            <w:pPr>
+              <w:pStyle w:val="talbecontent"/>
+            </w:pPr>
           </w:p>
         </w:tc>
       </w:tr>
@@ -18512,7 +17738,11 @@
               <w:pStyle w:val="talbecontent"/>
             </w:pPr>
             <w:r>
-              <w:t>TP.SL.35</w:t>
+              <w:lastRenderedPageBreak/>
+              <w:t>TP.SL.3</w:t>
+            </w:r>
+            <w:r>
+              <w:t>7</w:t>
             </w:r>
           </w:p>
         </w:tc>
@@ -18524,6 +17754,27 @@
             <w:pPr>
               <w:pStyle w:val="talbecontent"/>
             </w:pPr>
+            <w:r>
+              <w:t xml:space="preserve">Pēc izlūku izsaukšanas aizsegtie laukumi </w:t>
+            </w:r>
+            <w:r>
+              <w:t>ne</w:t>
+            </w:r>
+            <w:r>
+              <w:t xml:space="preserve">tiek noņemti un notiek pārvirze uz </w:t>
+            </w:r>
+            <w:r>
+              <w:t>uguņošanas</w:t>
+            </w:r>
+            <w:r>
+              <w:t xml:space="preserve"> stadiju</w:t>
+            </w:r>
+            <w:r>
+              <w:t xml:space="preserve">, kurā pretinieks šauj pirmais </w:t>
+            </w:r>
+            <w:r>
+              <w:t>(P = 0.166)</w:t>
+            </w:r>
           </w:p>
         </w:tc>
         <w:tc>
@@ -18575,8 +17826,13 @@
               <w:pStyle w:val="talbecontent"/>
             </w:pPr>
             <w:r>
-              <w:t>PR.SL.35</w:t>
-            </w:r>
+              <w:t>PR.SL.33</w:t>
+            </w:r>
+          </w:p>
+          <w:p>
+            <w:pPr>
+              <w:pStyle w:val="talbecontent"/>
+            </w:pPr>
           </w:p>
         </w:tc>
       </w:tr>
@@ -18590,7 +17846,10 @@
               <w:pStyle w:val="talbecontent"/>
             </w:pPr>
             <w:r>
-              <w:t>TP.SL.36</w:t>
+              <w:t>TP.SL.3</w:t>
+            </w:r>
+            <w:r>
+              <w:t>8</w:t>
             </w:r>
           </w:p>
         </w:tc>
@@ -18602,6 +17861,21 @@
             <w:pPr>
               <w:pStyle w:val="talbecontent"/>
             </w:pPr>
+            <w:r>
+              <w:t xml:space="preserve">Pēc izlūku izsaukšanas aizsegtie laukumi netiek noņemti un notiek pārvirze uz </w:t>
+            </w:r>
+            <w:r>
+              <w:t>koriģēšanas</w:t>
+            </w:r>
+            <w:r>
+              <w:t xml:space="preserve"> stadiju</w:t>
+            </w:r>
+            <w:r>
+              <w:t xml:space="preserve"> bez pretinieka ierīcēm</w:t>
+            </w:r>
+            <w:r>
+              <w:t xml:space="preserve"> (P = 0.166)</w:t>
+            </w:r>
           </w:p>
         </w:tc>
         <w:tc>
@@ -18653,7 +17927,10 @@
               <w:pStyle w:val="talbecontent"/>
             </w:pPr>
             <w:r>
-              <w:t>PR.SL.36</w:t>
+              <w:t>PR.SL.3</w:t>
+            </w:r>
+            <w:r>
+              <w:t>3</w:t>
             </w:r>
           </w:p>
         </w:tc>
@@ -18668,7 +17945,10 @@
               <w:pStyle w:val="talbecontent"/>
             </w:pPr>
             <w:r>
-              <w:t>TP. SL.37</w:t>
+              <w:t>TP.SL.3</w:t>
+            </w:r>
+            <w:r>
+              <w:t>9</w:t>
             </w:r>
           </w:p>
         </w:tc>
@@ -18680,6 +17960,9 @@
             <w:pPr>
               <w:pStyle w:val="talbecontent"/>
             </w:pPr>
+            <w:r>
+              <w:t>Izlūku izsaukšanas izlaišana, tad pārvirze uz uguņošanas stadiju</w:t>
+            </w:r>
           </w:p>
         </w:tc>
         <w:tc>
@@ -18731,7 +18014,10 @@
               <w:pStyle w:val="talbecontent"/>
             </w:pPr>
             <w:r>
-              <w:t>PR. SL.37</w:t>
+              <w:t>PR.SL.3</w:t>
+            </w:r>
+            <w:r>
+              <w:t>4</w:t>
             </w:r>
           </w:p>
         </w:tc>
@@ -18746,7 +18032,10 @@
               <w:pStyle w:val="talbecontent"/>
             </w:pPr>
             <w:r>
-              <w:t>TP. SL.38</w:t>
+              <w:t>TP.SL.</w:t>
+            </w:r>
+            <w:r>
+              <w:t>40</w:t>
             </w:r>
           </w:p>
         </w:tc>
@@ -18758,6 +18047,9 @@
             <w:pPr>
               <w:pStyle w:val="talbecontent"/>
             </w:pPr>
+            <w:r>
+              <w:t>Spēlētāja ierīču uguņošana, tad pretinieka ierīču uguņošana</w:t>
+            </w:r>
           </w:p>
         </w:tc>
         <w:tc>
@@ -18809,7 +18101,7 @@
               <w:pStyle w:val="talbecontent"/>
             </w:pPr>
             <w:r>
-              <w:t>PR. SL.38</w:t>
+              <w:t>PR.SL.35</w:t>
             </w:r>
           </w:p>
         </w:tc>
@@ -18824,7 +18116,10 @@
               <w:pStyle w:val="talbecontent"/>
             </w:pPr>
             <w:r>
-              <w:t>TP. SL.39</w:t>
+              <w:t>TP.SL.</w:t>
+            </w:r>
+            <w:r>
+              <w:t>41</w:t>
             </w:r>
           </w:p>
         </w:tc>
@@ -18836,6 +18131,9 @@
             <w:pPr>
               <w:pStyle w:val="talbecontent"/>
             </w:pPr>
+            <w:r>
+              <w:t>Pretinieka ierīču uguņošana</w:t>
+            </w:r>
           </w:p>
         </w:tc>
         <w:tc>
@@ -18887,7 +18185,7 @@
               <w:pStyle w:val="talbecontent"/>
             </w:pPr>
             <w:r>
-              <w:t>PR. SL.39</w:t>
+              <w:t>PR.SL.35</w:t>
             </w:r>
           </w:p>
         </w:tc>
@@ -18902,7 +18200,11 @@
               <w:pStyle w:val="talbecontent"/>
             </w:pPr>
             <w:r>
-              <w:t>TP.SL.40</w:t>
+              <w:lastRenderedPageBreak/>
+              <w:t>TP.SL.</w:t>
+            </w:r>
+            <w:r>
+              <w:t>42</w:t>
             </w:r>
           </w:p>
         </w:tc>
@@ -18914,6 +18216,24 @@
             <w:pPr>
               <w:pStyle w:val="talbecontent"/>
             </w:pPr>
+            <w:r>
+              <w:t>P</w:t>
+            </w:r>
+            <w:r>
+              <w:t>ārvirze uz ierīču koriģēšanu</w:t>
+            </w:r>
+            <w:r>
+              <w:t xml:space="preserve"> pēc uguņošanas</w:t>
+            </w:r>
+            <w:r>
+              <w:t xml:space="preserve">, </w:t>
+            </w:r>
+            <w:r>
+              <w:t xml:space="preserve"> </w:t>
+            </w:r>
+            <w:r>
+              <w:t>ja spēle ir turpināma</w:t>
+            </w:r>
           </w:p>
         </w:tc>
         <w:tc>
@@ -18965,7 +18285,10 @@
               <w:pStyle w:val="talbecontent"/>
             </w:pPr>
             <w:r>
-              <w:t>PR.SL.40</w:t>
+              <w:t>PR.SL.3</w:t>
+            </w:r>
+            <w:r>
+              <w:t>6</w:t>
             </w:r>
           </w:p>
         </w:tc>
@@ -18980,7 +18303,10 @@
               <w:pStyle w:val="talbecontent"/>
             </w:pPr>
             <w:r>
-              <w:t>TP.VS.41</w:t>
+              <w:t>TP.SL.</w:t>
+            </w:r>
+            <w:r>
+              <w:t>43</w:t>
             </w:r>
           </w:p>
         </w:tc>
@@ -18992,6 +18318,21 @@
             <w:pPr>
               <w:pStyle w:val="talbecontent"/>
             </w:pPr>
+            <w:r>
+              <w:t>P</w:t>
+            </w:r>
+            <w:r>
+              <w:t>ārvirze uz rezultātiem</w:t>
+            </w:r>
+            <w:r>
+              <w:t xml:space="preserve"> </w:t>
+            </w:r>
+            <w:r>
+              <w:t>pēc uguņošanas</w:t>
+            </w:r>
+            <w:r>
+              <w:t>, ja spēle nav turpināma</w:t>
+            </w:r>
           </w:p>
         </w:tc>
         <w:tc>
@@ -19043,7 +18384,10 @@
               <w:pStyle w:val="talbecontent"/>
             </w:pPr>
             <w:r>
-              <w:t>PR.VS.41</w:t>
+              <w:t>PR.SL.3</w:t>
+            </w:r>
+            <w:r>
+              <w:t>6</w:t>
             </w:r>
           </w:p>
         </w:tc>
@@ -19058,8 +18402,10 @@
               <w:pStyle w:val="talbecontent"/>
             </w:pPr>
             <w:r>
-              <w:lastRenderedPageBreak/>
-              <w:t>TP.VS.42</w:t>
+              <w:t>TP.SL.</w:t>
+            </w:r>
+            <w:r>
+              <w:t>44</w:t>
             </w:r>
           </w:p>
         </w:tc>
@@ -19071,6 +18417,9 @@
             <w:pPr>
               <w:pStyle w:val="talbecontent"/>
             </w:pPr>
+            <w:r>
+              <w:t>Uzvaras logs pēc spēles uzvaras.</w:t>
+            </w:r>
           </w:p>
         </w:tc>
         <w:tc>
@@ -19122,7 +18471,10 @@
               <w:pStyle w:val="talbecontent"/>
             </w:pPr>
             <w:r>
-              <w:t>PR.VS.42</w:t>
+              <w:t>PR.SL.3</w:t>
+            </w:r>
+            <w:r>
+              <w:t>8</w:t>
             </w:r>
           </w:p>
         </w:tc>
@@ -19137,7 +18489,10 @@
               <w:pStyle w:val="talbecontent"/>
             </w:pPr>
             <w:r>
-              <w:t>TP.VS.43</w:t>
+              <w:t>TP.SL.</w:t>
+            </w:r>
+            <w:r>
+              <w:t>45</w:t>
             </w:r>
           </w:p>
         </w:tc>
@@ -19149,6 +18504,12 @@
             <w:pPr>
               <w:pStyle w:val="talbecontent"/>
             </w:pPr>
+            <w:r>
+              <w:t>Zaudēšanas</w:t>
+            </w:r>
+            <w:r>
+              <w:t xml:space="preserve"> logs pēc spēles uzvaras.</w:t>
+            </w:r>
           </w:p>
         </w:tc>
         <w:tc>
@@ -19200,7 +18561,10 @@
               <w:pStyle w:val="talbecontent"/>
             </w:pPr>
             <w:r>
-              <w:t>PR.VS.43</w:t>
+              <w:t>PR.SL.3</w:t>
+            </w:r>
+            <w:r>
+              <w:t>9</w:t>
             </w:r>
           </w:p>
         </w:tc>
@@ -19215,7 +18579,10 @@
               <w:pStyle w:val="talbecontent"/>
             </w:pPr>
             <w:r>
-              <w:t>TP.VS.44</w:t>
+              <w:t>TP. SL.4</w:t>
+            </w:r>
+            <w:r>
+              <w:t>6</w:t>
             </w:r>
           </w:p>
         </w:tc>
@@ -19227,6 +18594,9 @@
             <w:pPr>
               <w:pStyle w:val="talbecontent"/>
             </w:pPr>
+            <w:r>
+              <w:t>Spēles atsākšana pēc rezultātiem</w:t>
+            </w:r>
           </w:p>
         </w:tc>
         <w:tc>
@@ -19278,7 +18648,7 @@
               <w:pStyle w:val="talbecontent"/>
             </w:pPr>
             <w:r>
-              <w:t>PR.VS.44</w:t>
+              <w:t>PR. SL.40</w:t>
             </w:r>
           </w:p>
         </w:tc>
@@ -19293,7 +18663,7 @@
               <w:pStyle w:val="talbecontent"/>
             </w:pPr>
             <w:r>
-              <w:t>TP.VS.45</w:t>
+              <w:t>TP. SL.47</w:t>
             </w:r>
           </w:p>
         </w:tc>
@@ -19305,6 +18675,9 @@
             <w:pPr>
               <w:pStyle w:val="talbecontent"/>
             </w:pPr>
+            <w:r>
+              <w:t>Pārvirze uz līmeņu atlasi pēc rezultātiem</w:t>
+            </w:r>
           </w:p>
         </w:tc>
         <w:tc>
@@ -19356,7 +18729,7 @@
               <w:pStyle w:val="talbecontent"/>
             </w:pPr>
             <w:r>
-              <w:t>PR.VS.45</w:t>
+              <w:t>PR. SL.41</w:t>
             </w:r>
           </w:p>
         </w:tc>
@@ -19371,7 +18744,7 @@
               <w:pStyle w:val="talbecontent"/>
             </w:pPr>
             <w:r>
-              <w:t>TP.VS.46</w:t>
+              <w:t>TP.VS.48</w:t>
             </w:r>
           </w:p>
         </w:tc>
@@ -19383,6 +18756,9 @@
             <w:pPr>
               <w:pStyle w:val="talbecontent"/>
             </w:pPr>
+            <w:r>
+              <w:t xml:space="preserve">Galvenā skaļuma maiņa pēc iestatījuma loga atvēršanas. </w:t>
+            </w:r>
           </w:p>
         </w:tc>
         <w:tc>
@@ -19434,7 +18810,10 @@
               <w:pStyle w:val="talbecontent"/>
             </w:pPr>
             <w:r>
-              <w:t>PR.VS.46</w:t>
+              <w:t>PR.VS.4</w:t>
+            </w:r>
+            <w:r>
+              <w:t>3</w:t>
             </w:r>
           </w:p>
         </w:tc>
@@ -19449,7 +18828,7 @@
               <w:pStyle w:val="talbecontent"/>
             </w:pPr>
             <w:r>
-              <w:t>TP.VS.47</w:t>
+              <w:t>TP.VS.49</w:t>
             </w:r>
           </w:p>
         </w:tc>
@@ -19461,6 +18840,12 @@
             <w:pPr>
               <w:pStyle w:val="talbecontent"/>
             </w:pPr>
+            <w:r>
+              <w:t xml:space="preserve">Mūzikas </w:t>
+            </w:r>
+            <w:r>
+              <w:t>skaļuma maiņa pēc iestatījuma loga atvēršanas.</w:t>
+            </w:r>
           </w:p>
         </w:tc>
         <w:tc>
@@ -19512,7 +18897,10 @@
               <w:pStyle w:val="talbecontent"/>
             </w:pPr>
             <w:r>
-              <w:t>PR.VS.47</w:t>
+              <w:t>PR.VS.4</w:t>
+            </w:r>
+            <w:r>
+              <w:t>4</w:t>
             </w:r>
           </w:p>
         </w:tc>
@@ -19527,7 +18915,7 @@
               <w:pStyle w:val="talbecontent"/>
             </w:pPr>
             <w:r>
-              <w:t>TP.VS.48</w:t>
+              <w:t>TP.VS.50</w:t>
             </w:r>
           </w:p>
         </w:tc>
@@ -19540,7 +18928,10 @@
               <w:pStyle w:val="talbecontent"/>
             </w:pPr>
             <w:r>
-              <w:t>Datorspēle tiek aizvērta</w:t>
+              <w:t xml:space="preserve">Skaņas efektu </w:t>
+            </w:r>
+            <w:r>
+              <w:t>skaļuma maiņa pēc iestatījuma loga atvēršanas.</w:t>
             </w:r>
           </w:p>
         </w:tc>
@@ -19552,9 +18943,6 @@
             <w:pPr>
               <w:pStyle w:val="talbecontent"/>
             </w:pPr>
-            <w:r>
-              <w:t>Datorspēles aizvēršana</w:t>
-            </w:r>
           </w:p>
         </w:tc>
         <w:tc>
@@ -19565,12 +18953,6 @@
             <w:pPr>
               <w:pStyle w:val="talbecontent"/>
             </w:pPr>
-            <w:r>
-              <w:t>Lietotājs nospiež aizvēršanas pogu logā</w:t>
-            </w:r>
-            <w:r>
-              <w:t>, tad apstiprinājuma pogu</w:t>
-            </w:r>
           </w:p>
         </w:tc>
         <w:tc>
@@ -19581,9 +18963,6 @@
             <w:pPr>
               <w:pStyle w:val="talbecontent"/>
             </w:pPr>
-            <w:r>
-              <w:t>Apstiprinājuma poga dialoglogā</w:t>
-            </w:r>
           </w:p>
         </w:tc>
         <w:tc>
@@ -19594,9 +18973,6 @@
             <w:pPr>
               <w:pStyle w:val="talbecontent"/>
             </w:pPr>
-            <w:r>
-              <w:t>Spēle tiek aizvērta bez klupēm un saglabātiem datiem</w:t>
-            </w:r>
           </w:p>
         </w:tc>
         <w:tc>
@@ -19608,7 +18984,10 @@
               <w:pStyle w:val="talbecontent"/>
             </w:pPr>
             <w:r>
-              <w:t>PR.VS.48</w:t>
+              <w:t>PR.VS.4</w:t>
+            </w:r>
+            <w:r>
+              <w:t>5</w:t>
             </w:r>
           </w:p>
         </w:tc>
@@ -19623,7 +19002,8 @@
               <w:pStyle w:val="talbecontent"/>
             </w:pPr>
             <w:r>
-              <w:t>TP.VS.49</w:t>
+              <w:lastRenderedPageBreak/>
+              <w:t>TP.VS.51</w:t>
             </w:r>
           </w:p>
         </w:tc>
@@ -19636,8 +19016,110 @@
               <w:pStyle w:val="talbecontent"/>
             </w:pPr>
             <w:r>
+              <w:t>Datorspēle tiek aizvērta</w:t>
+            </w:r>
+            <w:r>
+              <w:t xml:space="preserve"> pēc apstiprinājuma</w:t>
+            </w:r>
+          </w:p>
+        </w:tc>
+        <w:tc>
+          <w:tcPr>
+            <w:tcW w:w="1937" w:type="dxa"/>
+          </w:tcPr>
+          <w:p>
+            <w:pPr>
+              <w:pStyle w:val="talbecontent"/>
+            </w:pPr>
+            <w:r>
+              <w:t>Datorspēles aizvēršana</w:t>
+            </w:r>
+          </w:p>
+        </w:tc>
+        <w:tc>
+          <w:tcPr>
+            <w:tcW w:w="1937" w:type="dxa"/>
+          </w:tcPr>
+          <w:p>
+            <w:pPr>
+              <w:pStyle w:val="talbecontent"/>
+            </w:pPr>
+            <w:r>
+              <w:t>Lietotājs nospiež aizvēršanas pogu logā, tad apstiprinājuma pogu</w:t>
+            </w:r>
+          </w:p>
+        </w:tc>
+        <w:tc>
+          <w:tcPr>
+            <w:tcW w:w="1938" w:type="dxa"/>
+          </w:tcPr>
+          <w:p>
+            <w:pPr>
+              <w:pStyle w:val="talbecontent"/>
+            </w:pPr>
+            <w:r>
+              <w:t>Apstiprinājuma poga dialoglogā</w:t>
+            </w:r>
+          </w:p>
+        </w:tc>
+        <w:tc>
+          <w:tcPr>
+            <w:tcW w:w="1938" w:type="dxa"/>
+          </w:tcPr>
+          <w:p>
+            <w:pPr>
+              <w:pStyle w:val="talbecontent"/>
+            </w:pPr>
+            <w:r>
+              <w:t>Spēle tiek aizvērta bez klupēm un saglabātiem datiem</w:t>
+            </w:r>
+          </w:p>
+        </w:tc>
+        <w:tc>
+          <w:tcPr>
+            <w:tcW w:w="1938" w:type="dxa"/>
+          </w:tcPr>
+          <w:p>
+            <w:pPr>
+              <w:pStyle w:val="talbecontent"/>
+            </w:pPr>
+            <w:r>
+              <w:t>PR.VS.4</w:t>
+            </w:r>
+            <w:r>
+              <w:t>8</w:t>
+            </w:r>
+          </w:p>
+        </w:tc>
+      </w:tr>
+      <w:tr>
+        <w:tc>
+          <w:tcPr>
+            <w:tcW w:w="1937" w:type="dxa"/>
+          </w:tcPr>
+          <w:p>
+            <w:pPr>
+              <w:pStyle w:val="talbecontent"/>
+            </w:pPr>
+            <w:r>
+              <w:t>TP.VS.52</w:t>
+            </w:r>
+          </w:p>
+        </w:tc>
+        <w:tc>
+          <w:tcPr>
+            <w:tcW w:w="1937" w:type="dxa"/>
+          </w:tcPr>
+          <w:p>
+            <w:pPr>
+              <w:pStyle w:val="talbecontent"/>
+            </w:pPr>
+            <w:r>
               <w:t>Datorspēles aizvēršana tiek atlikta</w:t>
             </w:r>
+            <w:r>
+              <w:t xml:space="preserve"> pēc atlikšanas pieprasījuma</w:t>
+            </w:r>
           </w:p>
         </w:tc>
         <w:tc>
@@ -19698,7 +19180,10 @@
               <w:pStyle w:val="talbecontent"/>
             </w:pPr>
             <w:r>
-              <w:t>PR.VS.49</w:t>
+              <w:t>PR.VS.</w:t>
+            </w:r>
+            <w:r>
+              <w:t>49</w:t>
             </w:r>
           </w:p>
         </w:tc>
@@ -19737,23 +19222,7 @@
         <w:t>Projekta ideja bija sākotnēji un šķietami vienkārši izstr</w:t>
       </w:r>
       <w:r>
-        <w:t>ādājama, ņemot vērā iepriekšējo pieredzi ar “</w:t>
-      </w:r>
-      <w:proofErr w:type="spellStart"/>
-      <w:r>
-        <w:t>Godot</w:t>
-      </w:r>
-      <w:proofErr w:type="spellEnd"/>
-      <w:r>
-        <w:t>” dzini, neskatoties, ka iepriekšējā pieredzē tikai biju veidojis projekta fragmentu un ar atsevišķu valodu “</w:t>
-      </w:r>
-      <w:proofErr w:type="spellStart"/>
-      <w:r>
-        <w:t>GDScript</w:t>
-      </w:r>
-      <w:proofErr w:type="spellEnd"/>
-      <w:r>
-        <w:t>”;</w:t>
+        <w:t>ādājama, ņemot vērā iepriekšējo pieredzi ar “Godot” dzini, neskatoties, ka iepriekšējā pieredzē tikai biju veidojis projekta fragmentu un ar atsevišķu valodu “GDScript”;</w:t>
       </w:r>
     </w:p>
     <w:p>
@@ -19810,15 +19279,7 @@
         </w:numPr>
       </w:pPr>
       <w:r>
-        <w:t>Izstrāde palika sarežģītāka kamēr vienlaicīgi mācījos izstrādāt ar “</w:t>
-      </w:r>
-      <w:proofErr w:type="spellStart"/>
-      <w:r>
-        <w:t>Godot</w:t>
-      </w:r>
-      <w:proofErr w:type="spellEnd"/>
-      <w:r>
-        <w:t>” ietvaru un “C#” programmēšanas valodu, taču arī uzzināju daudz jaunu iespēju izmantojot šo dzini un valodu;</w:t>
+        <w:t>Izstrāde palika sarežģītāka kamēr vienlaicīgi mācījos izstrādāt ar “Godot” ietvaru un “C#” programmēšanas valodu, taču arī uzzināju daudz jaunu iespēju izmantojot šo dzini un valodu;</w:t>
       </w:r>
     </w:p>
     <w:p>
@@ -19830,15 +19291,7 @@
         </w:numPr>
       </w:pPr>
       <w:r>
-        <w:t xml:space="preserve">Šī projekta izstrāde bija personīgi īstens objektorientētā programmēšanas pārbaudījums, jo izstrādes laikā vairākās reizes mēģināju ieviest </w:t>
-      </w:r>
-      <w:proofErr w:type="spellStart"/>
-      <w:r>
-        <w:t>advancētākus</w:t>
-      </w:r>
-      <w:proofErr w:type="spellEnd"/>
-      <w:r>
-        <w:t xml:space="preserve"> funkcionalitātes un īpatnības objektorientētās programmēšanas valodās un “C#” valodā pirms beigās izmantoju vienkāršākus risinājumus;</w:t>
+        <w:t>Šī projekta izstrāde bija personīgi īstens objektorientētā programmēšanas pārbaudījums, jo izstrādes laikā vairākās reizes mēģināju ieviest advancētākus funkcionalitātes un īpatnības objektorientētās programmēšanas valodās un “C#” valodā pirms beigās izmantoju vienkāršākus risinājumus;</w:t>
       </w:r>
     </w:p>
     <w:p>
@@ -19850,15 +19303,7 @@
         </w:numPr>
       </w:pPr>
       <w:r>
-        <w:t>Kad uzzināju jaunu funkcionalitāti “C#” valodā vai “</w:t>
-      </w:r>
-      <w:proofErr w:type="spellStart"/>
-      <w:r>
-        <w:t>Godot</w:t>
-      </w:r>
-      <w:proofErr w:type="spellEnd"/>
-      <w:r>
-        <w:t>” ietvarā, personīgi bija konflikti ar pašreizējo dizainu kodā un uzzināto iespēju, kuras var vienkāršot darbības gaitu izstrādē;</w:t>
+        <w:t>Kad uzzināju jaunu funkcionalitāti “C#” valodā vai “Godot” ietvarā, personīgi bija konflikti ar pašreizējo dizainu kodā un uzzināto iespēju, kuras var vienkāršot darbības gaitu izstrādē;</w:t>
       </w:r>
     </w:p>
     <w:p>
@@ -20356,15 +19801,7 @@
         <w:ind w:left="1134" w:hanging="283"/>
       </w:pPr>
       <w:r>
-        <w:t>“</w:t>
-      </w:r>
-      <w:proofErr w:type="spellStart"/>
-      <w:r>
-        <w:t>Godot</w:t>
-      </w:r>
-      <w:proofErr w:type="spellEnd"/>
-      <w:r>
-        <w:t xml:space="preserve"> ”</w:t>
+        <w:t>“Godot ”</w:t>
       </w:r>
     </w:p>
     <w:p>
@@ -20581,45 +20018,13 @@
         <w:pStyle w:val="Parakstszemobjekta"/>
       </w:pPr>
       <w:r>
-        <w:t xml:space="preserve">25. attēls. Kameras </w:t>
-      </w:r>
-      <w:proofErr w:type="spellStart"/>
-      <w:r>
-        <w:t>kalibrācija</w:t>
-      </w:r>
-      <w:proofErr w:type="spellEnd"/>
-      <w:r>
-        <w:t xml:space="preserve"> pēc kartes laukuma un </w:t>
-      </w:r>
-      <w:proofErr w:type="spellStart"/>
-      <w:r>
-        <w:t>repozicionēšana</w:t>
-      </w:r>
-      <w:proofErr w:type="spellEnd"/>
-      <w:r>
-        <w:t xml:space="preserve"> ar peles vilkšanas loģika</w:t>
+        <w:t>25. attēls. Kameras kalibrācija pēc kartes laukuma un repozicionēšana ar peles vilkšanas loģika</w:t>
       </w:r>
       <w:r>
         <w:t>.</w:t>
       </w:r>
       <w:r>
-        <w:t xml:space="preserve"> </w:t>
-      </w:r>
-      <w:proofErr w:type="spellStart"/>
-      <w:r>
-        <w:t>Kalibrācija</w:t>
-      </w:r>
-      <w:proofErr w:type="spellEnd"/>
-      <w:r>
-        <w:t xml:space="preserve"> arī ņem vērā </w:t>
-      </w:r>
-      <w:proofErr w:type="spellStart"/>
-      <w:r>
-        <w:t>augšpaneļa</w:t>
-      </w:r>
-      <w:proofErr w:type="spellEnd"/>
-      <w:r>
-        <w:t xml:space="preserve"> augstumu, kuru iestata ainas ar šo paneli.</w:t>
+        <w:t xml:space="preserve"> Kalibrācija arī ņem vērā augšpaneļa augstumu, kuru iestata ainas ar šo paneli.</w:t>
       </w:r>
       <w:r>
         <w:t xml:space="preserve"> </w:t>
@@ -20698,15 +20103,7 @@
         <w:pStyle w:val="Parakstszemobjekta"/>
       </w:pPr>
       <w:r>
-        <w:t xml:space="preserve">26. attēls. Ierīces īpašības spēles laukumā. Tajā iekļauj ierīces tekstūras kā ķermeni un galvu (piemēram, </w:t>
-      </w:r>
-      <w:proofErr w:type="spellStart"/>
-      <w:r>
-        <w:t>pašpropelējošas</w:t>
-      </w:r>
-      <w:proofErr w:type="spellEnd"/>
-      <w:r>
-        <w:t xml:space="preserve"> artilērijas ierīces) vai tikai galvu (piemēram, mortīras), kā arī tās ierīces īpašībās kā augstuma leņķu ierobežojumi, traversa ierobežojumi un lodes ātrums. </w:t>
+        <w:t xml:space="preserve">26. attēls. Ierīces īpašības spēles laukumā. Tajā iekļauj ierīces tekstūras kā ķermeni un galvu (piemēram, pašpropelējošas artilērijas ierīces) vai tikai galvu (piemēram, mortīras), kā arī tās ierīces īpašībās kā augstuma leņķu ierobežojumi, traversa ierobežojumi un lodes ātrums. </w:t>
       </w:r>
       <w:r>
         <w:t>Iekļautas arī lādiņu īpašības.</w:t>
@@ -20843,15 +20240,7 @@
         <w:pStyle w:val="Parakstszemobjekta"/>
       </w:pPr>
       <w:r>
-        <w:t xml:space="preserve">27. attēls. Uguņošanas stadijas fragments. Tiek sekota līdzi ierīces, kurus uguņo vai pārlādē pirms nākamām kārtām. Sekošanai līdzi, </w:t>
-      </w:r>
-      <w:proofErr w:type="spellStart"/>
-      <w:r>
-        <w:t>ashinhronu</w:t>
-      </w:r>
-      <w:proofErr w:type="spellEnd"/>
-      <w:r>
-        <w:t xml:space="preserve"> metožu dēļ, tiek izveidoti sekošanas mainīgie.</w:t>
+        <w:t>27. attēls. Uguņošanas stadijas fragments. Tiek sekota līdzi ierīces, kurus uguņo vai pārlādē pirms nākamām kārtām. Sekošanai līdzi, ashinhronu metožu dēļ, tiek izveidoti sekošanas mainīgie.</w:t>
       </w:r>
     </w:p>
     <w:p>

</xml_diff>

<commit_message>
heading 3 and comma
</commit_message>
<xml_diff>
--- a/Documentation/Dokumentācija.docx
+++ b/Documentation/Dokumentācija.docx
@@ -128,7 +128,13 @@
         <w:t>s</w:t>
       </w:r>
       <w:r>
-        <w:t>kolotājs, Kristaps Rāvalds</w:t>
+        <w:t>kolotājs</w:t>
+      </w:r>
+      <w:r>
+        <w:t xml:space="preserve">, </w:t>
+      </w:r>
+      <w:r>
+        <w:t>Kristaps Rāvalds</w:t>
       </w:r>
     </w:p>
     <w:p>
@@ -5723,7 +5729,7 @@
         <w:t>u</w:t>
       </w:r>
       <w:r>
-        <w:t>, izmantojot jau visiem pieejamas zināšanas, lai pēc iespējas precīzāk atainot tās darbības virzienus , un atvērta plašam lietotāju klāstam bez izmantošanas ierobežojumiem</w:t>
+        <w:t>, izmantojot jau visiem pieejamas zināšanas, lai pēc iespējas precīzāk atainot tās darbības virzienus, un atvērta plašam lietotāju klāstam bez izmantošanas ierobežojumiem</w:t>
       </w:r>
       <w:r>
         <w:t>.</w:t>
@@ -7536,7 +7542,6 @@
     <w:p>
       <w:pPr>
         <w:pStyle w:val="Virsraksts4"/>
-        <w:ind w:left="851" w:hanging="851"/>
       </w:pPr>
       <w:r>
         <w:t xml:space="preserve">Ierīču </w:t>
@@ -7878,7 +7883,6 @@
     <w:p>
       <w:pPr>
         <w:pStyle w:val="Virsraksts4"/>
-        <w:ind w:left="851" w:hanging="851"/>
       </w:pPr>
       <w:r>
         <w:t>Ierīču koriģēšana</w:t>
@@ -8481,7 +8485,6 @@
     <w:p>
       <w:pPr>
         <w:pStyle w:val="Virsraksts4"/>
-        <w:ind w:left="851" w:hanging="851"/>
       </w:pPr>
       <w:r>
         <w:t>Izlūku izsaukšana</w:t>
@@ -8730,9 +8733,6 @@
     <w:p>
       <w:pPr>
         <w:pStyle w:val="Virsraksts4"/>
-        <w:tabs>
-          <w:tab w:val="left" w:pos="851"/>
-        </w:tabs>
       </w:pPr>
       <w:r>
         <w:t>Uguņošana</w:t>
@@ -8986,7 +8986,6 @@
     <w:p>
       <w:pPr>
         <w:pStyle w:val="Virsraksts4"/>
-        <w:ind w:left="1418"/>
       </w:pPr>
       <w:r>
         <w:t>Rezultāti</w:t>
@@ -9326,7 +9325,6 @@
     <w:p>
       <w:pPr>
         <w:pStyle w:val="Virsraksts4"/>
-        <w:ind w:left="851" w:hanging="851"/>
       </w:pPr>
       <w:r>
         <w:t>Visā sistēmā</w:t>
@@ -9375,6 +9373,7 @@
         <w:rPr>
           <w:u w:val="single"/>
         </w:rPr>
+        <w:lastRenderedPageBreak/>
         <w:t>Izvaddati</w:t>
       </w:r>
       <w:r>
@@ -9406,7 +9405,6 @@
           <w:b/>
           <w:bCs/>
         </w:rPr>
-        <w:lastRenderedPageBreak/>
         <w:t>Galvenā skaļuma maiņa</w:t>
       </w:r>
     </w:p>
@@ -9863,7 +9861,6 @@
           <w:b/>
           <w:bCs/>
         </w:rPr>
-        <w:lastRenderedPageBreak/>
         <w:t>Spēles aizvēršanas atlikšana</w:t>
       </w:r>
     </w:p>
@@ -10123,6 +10120,7 @@
         </w:tabs>
       </w:pPr>
       <w:r>
+        <w:lastRenderedPageBreak/>
         <w:t>1)</w:t>
       </w:r>
       <w:r>
@@ -10137,7 +10135,6 @@
         </w:tabs>
       </w:pPr>
       <w:r>
-        <w:lastRenderedPageBreak/>
         <w:t>2)</w:t>
       </w:r>
       <w:r>
@@ -10402,17 +10399,14 @@
     </w:p>
     <w:p>
       <w:r>
+        <w:lastRenderedPageBreak/>
         <w:t xml:space="preserve">Ja </w:t>
       </w:r>
       <w:r>
         <w:t>dzinēj</w:t>
       </w:r>
       <w:r>
-        <w:t xml:space="preserve">s kā “Unreal Engine” tiktu izmantota, kurā galvenā valoda ir “C++”, tiktu izmantotas izstrādes vides attiecīgi valodai kā “Qt Creator”, kura ir pielāgota ietvara “Qt” </w:t>
-      </w:r>
-      <w:r>
-        <w:lastRenderedPageBreak/>
-        <w:t>programmatūras izstrādei, taču iespējams izveidot projektus, kuras neizmanto minēto ietvaru, ņemot vērā to, ka funkcionalitāte un tās iespējas mazinās vai ne tik advancētas citiem projektiem,  vai “JetBrains CLion”, kurai ir līdzīga funkcionalitāte ar atlasīto izstrādes vidi “”JetBrains Rider” no “JetBrains” programmatūru klāsta.</w:t>
+        <w:t>s kā “Unreal Engine” tiktu izmantota, kurā galvenā valoda ir “C++”, tiktu izmantotas izstrādes vides attiecīgi valodai kā “Qt Creator”, kura ir pielāgota ietvara “Qt” programmatūras izstrādei, taču iespējams izveidot projektus, kuras neizmanto minēto ietvaru, ņemot vērā to, ka funkcionalitāte un tās iespējas mazinās vai ne tik advancētas citiem projektiem,  vai “JetBrains CLion”, kurai ir līdzīga funkcionalitāte ar atlasīto izstrādes vidi “”JetBrains Rider” no “JetBrains” programmatūru klāsta.</w:t>
       </w:r>
     </w:p>
     <w:p>
@@ -11952,6 +11946,7 @@
         <w:pStyle w:val="Parakstszemobjekta"/>
       </w:pPr>
       <w:r>
+        <w:lastRenderedPageBreak/>
         <w:t>12. attēls. Līmeņu punkti</w:t>
       </w:r>
     </w:p>
@@ -11961,7 +11956,6 @@
       </w:pPr>
       <w:bookmarkStart w:id="47" w:name="_Toc230395214"/>
       <w:r>
-        <w:lastRenderedPageBreak/>
         <w:t>Kartes un tās apakškomponenšu dati</w:t>
       </w:r>
       <w:bookmarkEnd w:id="47"/>
@@ -13015,10 +13009,6 @@
     <w:p>
       <w:pPr>
         <w:pStyle w:val="Virsraksts4"/>
-        <w:tabs>
-          <w:tab w:val="clear" w:pos="709"/>
-        </w:tabs>
-        <w:ind w:left="851" w:hanging="851"/>
       </w:pPr>
       <w:r>
         <w:lastRenderedPageBreak/>
@@ -13106,10 +13096,6 @@
     <w:p>
       <w:pPr>
         <w:pStyle w:val="Virsraksts4"/>
-        <w:tabs>
-          <w:tab w:val="clear" w:pos="709"/>
-        </w:tabs>
-        <w:ind w:left="851" w:hanging="851"/>
       </w:pPr>
       <w:r>
         <w:t>Turpmākā koriģēšana</w:t>
@@ -30845,7 +30831,7 @@
   <w:abstractNum w:abstractNumId="25" w15:restartNumberingAfterBreak="0">
     <w:nsid w:val="664A78A8"/>
     <w:multiLevelType w:val="multilevel"/>
-    <w:tmpl w:val="623C2658"/>
+    <w:tmpl w:val="622CB624"/>
     <w:lvl w:ilvl="0">
       <w:start w:val="1"/>
       <w:numFmt w:val="decimal"/>
@@ -32516,7 +32502,7 @@
     <w:uiPriority w:val="9"/>
     <w:unhideWhenUsed/>
     <w:qFormat/>
-    <w:rsid w:val="00D71D33"/>
+    <w:rsid w:val="000C500B"/>
     <w:pPr>
       <w:keepNext/>
       <w:keepLines/>
@@ -32524,7 +32510,8 @@
         <w:ilvl w:val="2"/>
         <w:numId w:val="34"/>
       </w:numPr>
-      <w:spacing w:before="160" w:after="80"/>
+      <w:spacing w:before="240" w:after="240"/>
+      <w:ind w:left="709" w:hanging="709"/>
       <w:jc w:val="left"/>
       <w:outlineLvl w:val="2"/>
     </w:pPr>
@@ -32721,7 +32708,7 @@
     <w:basedOn w:val="Noklusjumarindkopasfonts"/>
     <w:link w:val="Virsraksts3"/>
     <w:uiPriority w:val="9"/>
-    <w:rsid w:val="00D71D33"/>
+    <w:rsid w:val="000C500B"/>
     <w:rPr>
       <w:rFonts w:ascii="Times New Roman" w:eastAsiaTheme="majorEastAsia" w:hAnsi="Times New Roman" w:cstheme="majorBidi"/>
       <w:b/>

</xml_diff>

<commit_message>
again in functions section
</commit_message>
<xml_diff>
--- a/Documentation/Dokumentācija.docx
+++ b/Documentation/Dokumentācija.docx
@@ -9395,9 +9395,20 @@
     </w:p>
     <w:p>
       <w:pPr>
+        <w:ind w:left="131" w:firstLine="720"/>
+      </w:pPr>
+    </w:p>
+    <w:p>
+      <w:pPr>
+        <w:ind w:left="131" w:firstLine="720"/>
+      </w:pPr>
+    </w:p>
+    <w:p>
+      <w:pPr>
         <w:pStyle w:val="Heading4"/>
       </w:pPr>
       <w:r>
+        <w:lastRenderedPageBreak/>
         <w:t>Visā sistēmā</w:t>
       </w:r>
     </w:p>
@@ -9444,7 +9455,6 @@
         <w:rPr>
           <w:u w:val="single"/>
         </w:rPr>
-        <w:lastRenderedPageBreak/>
         <w:t>Izvaddati</w:t>
       </w:r>
       <w:r>
@@ -9823,6 +9833,8 @@
         <w:t>: Vaicājuma logs ar iespējām iziet vai atlikt.</w:t>
       </w:r>
     </w:p>
+    <w:p/>
+    <w:p/>
     <w:p>
       <w:pPr>
         <w:pStyle w:val="ListParagraph"/>
@@ -9841,6 +9853,7 @@
           <w:b/>
           <w:bCs/>
         </w:rPr>
+        <w:lastRenderedPageBreak/>
         <w:t>Spēles aizvēršana</w:t>
       </w:r>
     </w:p>
@@ -9930,7 +9943,6 @@
           <w:b/>
           <w:bCs/>
         </w:rPr>
-        <w:lastRenderedPageBreak/>
         <w:t>Spēles aizvēršanas atlikšana</w:t>
       </w:r>
     </w:p>
@@ -10167,27 +10179,6 @@
         <w:tab/>
         <w:t>Lietotāja ievadei jābūt pārbaudītiem pēc paredzētās ievades nolūkiem, kā datu veids, izmēru ierobežojumi u.tml.</w:t>
       </w:r>
-    </w:p>
-    <w:p>
-      <w:pPr>
-        <w:tabs>
-          <w:tab w:val="left" w:pos="1134"/>
-        </w:tabs>
-      </w:pPr>
-    </w:p>
-    <w:p>
-      <w:pPr>
-        <w:tabs>
-          <w:tab w:val="left" w:pos="1134"/>
-        </w:tabs>
-      </w:pPr>
-    </w:p>
-    <w:p>
-      <w:pPr>
-        <w:tabs>
-          <w:tab w:val="left" w:pos="1134"/>
-        </w:tabs>
-      </w:pPr>
     </w:p>
     <w:p>
       <w:pPr>
@@ -33757,7 +33748,7 @@
 </file>
 
 <file path=customXml/itemProps1.xml><?xml version="1.0" encoding="utf-8"?>
-<ds:datastoreItem xmlns:ds="http://schemas.openxmlformats.org/officeDocument/2006/customXml" ds:itemID="{B550A5AF-8355-40DD-BD43-8AA18A20DEB2}">
+<ds:datastoreItem xmlns:ds="http://schemas.openxmlformats.org/officeDocument/2006/customXml" ds:itemID="{A3754CDB-2B32-4F68-8520-32D9D7C07F8C}">
   <ds:schemaRefs>
     <ds:schemaRef ds:uri="http://schemas.openxmlformats.org/officeDocument/2006/bibliography"/>
   </ds:schemaRefs>

</xml_diff>